<commit_message>
Add a second pass that recovers transcript investment themes.
Keep quick-comment valuations, and add price levels, equipment watchpoints, datacenter financing, the 2028 peak-out split, and the AI-versus-stock clock when the source still contains the anchor phrases.

Co-authored-by: choijunh-cloud <choijunh-cloud@users.noreply.github.com>
</commit_message>
<xml_diff>
--- a/lectures/투자인사이트 증류.docx
+++ b/lectures/투자인사이트 증류.docx
@@ -448,6 +448,204 @@
           <w:sz w:val="21"/>
         </w:rPr>
         <w:t>다만 유가 $100+ → 인플레이션과 Fed 추가 긴축 리스크가 완전히 해소된 것은 아님</w:t>
+      </w:r>
+    </w:p>
+    <w:p>
+      <w:pPr>
+        <w:spacing w:after="40" w:before="0" w:line="269" w:lineRule="auto"/>
+        <w:ind w:left="312" w:hanging="198"/>
+      </w:pPr>
+      <w:r>
+        <w:rPr>
+          <w:rFonts w:ascii="맑은 고딕" w:hAnsi="맑은 고딕" w:eastAsia="맑은 고딕"/>
+          <w:b w:val="0"/>
+          <w:color w:val="1E407C"/>
+          <w:sz w:val="21"/>
+        </w:rPr>
+        <w:t xml:space="preserve">• </w:t>
+      </w:r>
+      <w:r>
+        <w:rPr>
+          <w:rFonts w:ascii="맑은 고딕" w:hAnsi="맑은 고딕" w:eastAsia="맑은 고딕"/>
+          <w:b/>
+          <w:color w:val="1A1A1A"/>
+          <w:sz w:val="21"/>
+        </w:rPr>
+        <w:t xml:space="preserve">추출  </w:t>
+      </w:r>
+      <w:r>
+        <w:rPr>
+          <w:rFonts w:ascii="맑은 고딕" w:hAnsi="맑은 고딕" w:eastAsia="맑은 고딕"/>
+          <w:b w:val="0"/>
+          <w:color w:val="1A1A1A"/>
+          <w:sz w:val="21"/>
+        </w:rPr>
+        <w:t>8월 근원 PCE 3.008%는 개정 효과다. 개정 7월 2.983%에서 사실상 보합이고, 3개월 연율은 약 2.05%, 6개월 연율은 약 2.74%다.</w:t>
+      </w:r>
+    </w:p>
+    <w:p>
+      <w:pPr>
+        <w:spacing w:after="40" w:before="0" w:line="269" w:lineRule="auto"/>
+        <w:ind w:left="312" w:hanging="198"/>
+      </w:pPr>
+      <w:r>
+        <w:rPr>
+          <w:rFonts w:ascii="맑은 고딕" w:hAnsi="맑은 고딕" w:eastAsia="맑은 고딕"/>
+          <w:b w:val="0"/>
+          <w:color w:val="1E407C"/>
+          <w:sz w:val="21"/>
+        </w:rPr>
+        <w:t xml:space="preserve">• </w:t>
+      </w:r>
+      <w:r>
+        <w:rPr>
+          <w:rFonts w:ascii="맑은 고딕" w:hAnsi="맑은 고딕" w:eastAsia="맑은 고딕"/>
+          <w:b/>
+          <w:color w:val="1A1A1A"/>
+          <w:sz w:val="21"/>
+        </w:rPr>
+        <w:t xml:space="preserve">추출  </w:t>
+      </w:r>
+      <w:r>
+        <w:rPr>
+          <w:rFonts w:ascii="맑은 고딕" w:hAnsi="맑은 고딕" w:eastAsia="맑은 고딕"/>
+          <w:b w:val="0"/>
+          <w:color w:val="1A1A1A"/>
+          <w:sz w:val="21"/>
+        </w:rPr>
+        <w:t>고용 3개월 평균은 약 5만 명이고, 직전 두 달 합산 6만 명 하향이 있다. 전월은 13.3만 명이다.</w:t>
+      </w:r>
+    </w:p>
+    <w:p>
+      <w:pPr>
+        <w:spacing w:after="40" w:before="0" w:line="269" w:lineRule="auto"/>
+        <w:ind w:left="312" w:hanging="198"/>
+      </w:pPr>
+      <w:r>
+        <w:rPr>
+          <w:rFonts w:ascii="맑은 고딕" w:hAnsi="맑은 고딕" w:eastAsia="맑은 고딕"/>
+          <w:b w:val="0"/>
+          <w:color w:val="1E407C"/>
+          <w:sz w:val="21"/>
+        </w:rPr>
+        <w:t xml:space="preserve">• </w:t>
+      </w:r>
+      <w:r>
+        <w:rPr>
+          <w:rFonts w:ascii="맑은 고딕" w:hAnsi="맑은 고딕" w:eastAsia="맑은 고딕"/>
+          <w:b/>
+          <w:color w:val="1A1A1A"/>
+          <w:sz w:val="21"/>
+        </w:rPr>
+        <w:t xml:space="preserve">추출  </w:t>
+      </w:r>
+      <w:r>
+        <w:rPr>
+          <w:rFonts w:ascii="맑은 고딕" w:hAnsi="맑은 고딕" w:eastAsia="맑은 고딕"/>
+          <w:b w:val="0"/>
+          <w:color w:val="1A1A1A"/>
+          <w:sz w:val="21"/>
+        </w:rPr>
+        <w:t>9월 11일부터 10월 2일까지 금리가 +30bp인 동안 SOX +11%, 마이크론 +10.2%, 코스닥 +8.9%였다.</w:t>
+      </w:r>
+    </w:p>
+    <w:p>
+      <w:pPr>
+        <w:spacing w:after="40" w:before="0" w:line="269" w:lineRule="auto"/>
+        <w:ind w:left="312" w:hanging="198"/>
+      </w:pPr>
+      <w:r>
+        <w:rPr>
+          <w:rFonts w:ascii="맑은 고딕" w:hAnsi="맑은 고딕" w:eastAsia="맑은 고딕"/>
+          <w:b w:val="0"/>
+          <w:color w:val="1E407C"/>
+          <w:sz w:val="21"/>
+        </w:rPr>
+        <w:t xml:space="preserve">• </w:t>
+      </w:r>
+      <w:r>
+        <w:rPr>
+          <w:rFonts w:ascii="맑은 고딕" w:hAnsi="맑은 고딕" w:eastAsia="맑은 고딕"/>
+          <w:b/>
+          <w:color w:val="1A1A1A"/>
+          <w:sz w:val="21"/>
+        </w:rPr>
+        <w:t xml:space="preserve">추출  </w:t>
+      </w:r>
+      <w:r>
+        <w:rPr>
+          <w:rFonts w:ascii="맑은 고딕" w:hAnsi="맑은 고딕" w:eastAsia="맑은 고딕"/>
+          <w:b w:val="0"/>
+          <w:color w:val="1A1A1A"/>
+          <w:sz w:val="21"/>
+        </w:rPr>
+        <w:t>고용 쇼크의 프레임은 Bad Jobs, Good Stocks다. 침체보다 인상 확률 하락으로 읽혔다.</w:t>
+      </w:r>
+    </w:p>
+    <w:p>
+      <w:pPr>
+        <w:spacing w:after="40" w:before="0" w:line="269" w:lineRule="auto"/>
+        <w:ind w:left="312" w:hanging="198"/>
+      </w:pPr>
+      <w:r>
+        <w:rPr>
+          <w:rFonts w:ascii="맑은 고딕" w:hAnsi="맑은 고딕" w:eastAsia="맑은 고딕"/>
+          <w:b w:val="0"/>
+          <w:color w:val="1E407C"/>
+          <w:sz w:val="21"/>
+        </w:rPr>
+        <w:t xml:space="preserve">• </w:t>
+      </w:r>
+      <w:r>
+        <w:rPr>
+          <w:rFonts w:ascii="맑은 고딕" w:hAnsi="맑은 고딕" w:eastAsia="맑은 고딕"/>
+          <w:b/>
+          <w:color w:val="1A1A1A"/>
+          <w:sz w:val="21"/>
+        </w:rPr>
+        <w:t xml:space="preserve">추출  </w:t>
+      </w:r>
+      <w:r>
+        <w:rPr>
+          <w:rFonts w:ascii="맑은 고딕" w:hAnsi="맑은 고딕" w:eastAsia="맑은 고딕"/>
+          <w:b w:val="0"/>
+          <w:color w:val="1A1A1A"/>
+          <w:sz w:val="21"/>
+        </w:rPr>
+        <w:t>10월 동결만으로 지수 전체가 한 단계 오르기는 제한적이다. 초과수익은 AI 직접·간접 노출로 적혀 있다.</w:t>
+      </w:r>
+    </w:p>
+    <w:p>
+      <w:pPr>
+        <w:spacing w:after="40" w:before="0" w:line="269" w:lineRule="auto"/>
+        <w:ind w:left="312" w:hanging="198"/>
+      </w:pPr>
+      <w:r>
+        <w:rPr>
+          <w:rFonts w:ascii="맑은 고딕" w:hAnsi="맑은 고딕" w:eastAsia="맑은 고딕"/>
+          <w:b w:val="0"/>
+          <w:color w:val="1E407C"/>
+          <w:sz w:val="21"/>
+        </w:rPr>
+        <w:t xml:space="preserve">• </w:t>
+      </w:r>
+      <w:r>
+        <w:rPr>
+          <w:rFonts w:ascii="맑은 고딕" w:hAnsi="맑은 고딕" w:eastAsia="맑은 고딕"/>
+          <w:b/>
+          <w:color w:val="1A1A1A"/>
+          <w:sz w:val="21"/>
+        </w:rPr>
+        <w:t xml:space="preserve">추출  </w:t>
+      </w:r>
+      <w:r>
+        <w:rPr>
+          <w:rFonts w:ascii="맑은 고딕" w:hAnsi="맑은 고딕" w:eastAsia="맑은 고딕"/>
+          <w:b w:val="0"/>
+          <w:color w:val="1A1A1A"/>
+          <w:sz w:val="21"/>
+        </w:rPr>
+        <w:t>데이비드 저보스는 높은 장기금리를 새 정상으로 두기보다, 재무부 국채 바이백으로 시간을 벌고 생산성 개선이 물가를 낮추기를 기다린다는 쪽이다.</w:t>
       </w:r>
     </w:p>
     <w:p>
@@ -1336,6 +1534,105 @@
     </w:p>
     <w:p>
       <w:pPr>
+        <w:spacing w:after="40" w:before="0" w:line="269" w:lineRule="auto"/>
+        <w:ind w:left="312" w:hanging="198"/>
+      </w:pPr>
+      <w:r>
+        <w:rPr>
+          <w:rFonts w:ascii="맑은 고딕" w:hAnsi="맑은 고딕" w:eastAsia="맑은 고딕"/>
+          <w:b w:val="0"/>
+          <w:color w:val="1E407C"/>
+          <w:sz w:val="21"/>
+        </w:rPr>
+        <w:t xml:space="preserve">• </w:t>
+      </w:r>
+      <w:r>
+        <w:rPr>
+          <w:rFonts w:ascii="맑은 고딕" w:hAnsi="맑은 고딕" w:eastAsia="맑은 고딕"/>
+          <w:b/>
+          <w:color w:val="1A1A1A"/>
+          <w:sz w:val="21"/>
+        </w:rPr>
+        <w:t xml:space="preserve">추출  </w:t>
+      </w:r>
+      <w:r>
+        <w:rPr>
+          <w:rFonts w:ascii="맑은 고딕" w:hAnsi="맑은 고딕" w:eastAsia="맑은 고딕"/>
+          <w:b w:val="0"/>
+          <w:color w:val="1A1A1A"/>
+          <w:sz w:val="21"/>
+        </w:rPr>
+        <w:t>컨센서스 환율 1480원을 1370원으로 낮추면 이익 컨센서스가 약 10% 내려갈 수 있다.</w:t>
+      </w:r>
+    </w:p>
+    <w:p>
+      <w:pPr>
+        <w:spacing w:after="40" w:before="0" w:line="269" w:lineRule="auto"/>
+        <w:ind w:left="312" w:hanging="198"/>
+      </w:pPr>
+      <w:r>
+        <w:rPr>
+          <w:rFonts w:ascii="맑은 고딕" w:hAnsi="맑은 고딕" w:eastAsia="맑은 고딕"/>
+          <w:b w:val="0"/>
+          <w:color w:val="1E407C"/>
+          <w:sz w:val="21"/>
+        </w:rPr>
+        <w:t xml:space="preserve">• </w:t>
+      </w:r>
+      <w:r>
+        <w:rPr>
+          <w:rFonts w:ascii="맑은 고딕" w:hAnsi="맑은 고딕" w:eastAsia="맑은 고딕"/>
+          <w:b/>
+          <w:color w:val="1A1A1A"/>
+          <w:sz w:val="21"/>
+        </w:rPr>
+        <w:t xml:space="preserve">추출  </w:t>
+      </w:r>
+      <w:r>
+        <w:rPr>
+          <w:rFonts w:ascii="맑은 고딕" w:hAnsi="맑은 고딕" w:eastAsia="맑은 고딕"/>
+          <w:b w:val="0"/>
+          <w:color w:val="1A1A1A"/>
+          <w:sz w:val="21"/>
+        </w:rPr>
+        <w:t>ADR 프리미엄이 30%면 본주 202만 원, 20%면 219만 원으로 적혀 있다.</w:t>
+      </w:r>
+    </w:p>
+    <w:p>
+      <w:pPr>
+        <w:spacing w:after="40" w:before="0" w:line="269" w:lineRule="auto"/>
+        <w:ind w:left="312" w:hanging="198"/>
+      </w:pPr>
+      <w:r>
+        <w:rPr>
+          <w:rFonts w:ascii="맑은 고딕" w:hAnsi="맑은 고딕" w:eastAsia="맑은 고딕"/>
+          <w:b w:val="0"/>
+          <w:color w:val="1E407C"/>
+          <w:sz w:val="21"/>
+        </w:rPr>
+        <w:t xml:space="preserve">• </w:t>
+      </w:r>
+      <w:r>
+        <w:rPr>
+          <w:rFonts w:ascii="맑은 고딕" w:hAnsi="맑은 고딕" w:eastAsia="맑은 고딕"/>
+          <w:b/>
+          <w:color w:val="1A1A1A"/>
+          <w:sz w:val="21"/>
+        </w:rPr>
+        <w:t xml:space="preserve">추출  </w:t>
+      </w:r>
+      <w:r>
+        <w:rPr>
+          <w:rFonts w:ascii="맑은 고딕" w:hAnsi="맑은 고딕" w:eastAsia="맑은 고딕"/>
+          <w:b w:val="0"/>
+          <w:color w:val="1A1A1A"/>
+          <w:sz w:val="21"/>
+        </w:rPr>
+        <w:t>마이크론 대비 과거 할인율 밴드는 -20~-50%다.</w:t>
+      </w:r>
+    </w:p>
+    <w:p>
+      <w:pPr>
         <w:spacing w:before="240" w:after="120" w:line="276" w:lineRule="auto"/>
         <w:jc w:val="left"/>
         <w:pBdr>
@@ -1878,6 +2175,72 @@
     </w:p>
     <w:p>
       <w:pPr>
+        <w:spacing w:after="40" w:before="0" w:line="269" w:lineRule="auto"/>
+        <w:ind w:left="312" w:hanging="198"/>
+      </w:pPr>
+      <w:r>
+        <w:rPr>
+          <w:rFonts w:ascii="맑은 고딕" w:hAnsi="맑은 고딕" w:eastAsia="맑은 고딕"/>
+          <w:b w:val="0"/>
+          <w:color w:val="1E407C"/>
+          <w:sz w:val="21"/>
+        </w:rPr>
+        <w:t xml:space="preserve">• </w:t>
+      </w:r>
+      <w:r>
+        <w:rPr>
+          <w:rFonts w:ascii="맑은 고딕" w:hAnsi="맑은 고딕" w:eastAsia="맑은 고딕"/>
+          <w:b/>
+          <w:color w:val="1A1A1A"/>
+          <w:sz w:val="21"/>
+        </w:rPr>
+        <w:t xml:space="preserve">추출  </w:t>
+      </w:r>
+      <w:r>
+        <w:rPr>
+          <w:rFonts w:ascii="맑은 고딕" w:hAnsi="맑은 고딕" w:eastAsia="맑은 고딕"/>
+          <w:b w:val="0"/>
+          <w:color w:val="1A1A1A"/>
+          <w:sz w:val="21"/>
+        </w:rPr>
+        <w:t>WDC 실제 PER 경로는 11.2배 → 22.9배 → 33.8배 → 17.5배다.</w:t>
+      </w:r>
+    </w:p>
+    <w:p>
+      <w:pPr>
+        <w:spacing w:after="40" w:before="0" w:line="269" w:lineRule="auto"/>
+        <w:ind w:left="312" w:hanging="198"/>
+      </w:pPr>
+      <w:r>
+        <w:rPr>
+          <w:rFonts w:ascii="맑은 고딕" w:hAnsi="맑은 고딕" w:eastAsia="맑은 고딕"/>
+          <w:b w:val="0"/>
+          <w:color w:val="1E407C"/>
+          <w:sz w:val="21"/>
+        </w:rPr>
+        <w:t xml:space="preserve">• </w:t>
+      </w:r>
+      <w:r>
+        <w:rPr>
+          <w:rFonts w:ascii="맑은 고딕" w:hAnsi="맑은 고딕" w:eastAsia="맑은 고딕"/>
+          <w:b/>
+          <w:color w:val="1A1A1A"/>
+          <w:sz w:val="21"/>
+        </w:rPr>
+        <w:t xml:space="preserve">추출  </w:t>
+      </w:r>
+      <w:r>
+        <w:rPr>
+          <w:rFonts w:ascii="맑은 고딕" w:hAnsi="맑은 고딕" w:eastAsia="맑은 고딕"/>
+          <w:b w:val="0"/>
+          <w:color w:val="1A1A1A"/>
+          <w:sz w:val="21"/>
+        </w:rPr>
+        <w:t>도시바 점유율이 30%까지 가면 WDC·시게이트 합산 점유율은 86%에서 70%로 낮아질 수 있다는 상상이다.</w:t>
+      </w:r>
+    </w:p>
+    <w:p>
+      <w:pPr>
         <w:spacing w:before="240" w:after="120" w:line="276" w:lineRule="auto"/>
         <w:jc w:val="left"/>
         <w:pBdr>
@@ -2039,6 +2402,237 @@
           <w:sz w:val="21"/>
         </w:rPr>
         <w:t>단순한 테마 순환이라기보다, AI 데이터센터의 네트워크 병목이 본격적으로 부각되면서 800G→1.6T→3.2T로 광통신 시장의 TAM이 확대된다는 논리가 핵심입니다.</w:t>
+      </w:r>
+    </w:p>
+    <w:p>
+      <w:pPr>
+        <w:spacing w:after="40" w:before="0" w:line="269" w:lineRule="auto"/>
+        <w:ind w:left="312" w:hanging="198"/>
+      </w:pPr>
+      <w:r>
+        <w:rPr>
+          <w:rFonts w:ascii="맑은 고딕" w:hAnsi="맑은 고딕" w:eastAsia="맑은 고딕"/>
+          <w:b w:val="0"/>
+          <w:color w:val="1E407C"/>
+          <w:sz w:val="21"/>
+        </w:rPr>
+        <w:t xml:space="preserve">• </w:t>
+      </w:r>
+      <w:r>
+        <w:rPr>
+          <w:rFonts w:ascii="맑은 고딕" w:hAnsi="맑은 고딕" w:eastAsia="맑은 고딕"/>
+          <w:b/>
+          <w:color w:val="1A1A1A"/>
+          <w:sz w:val="21"/>
+        </w:rPr>
+        <w:t xml:space="preserve">추출  </w:t>
+      </w:r>
+      <w:r>
+        <w:rPr>
+          <w:rFonts w:ascii="맑은 고딕" w:hAnsi="맑은 고딕" w:eastAsia="맑은 고딕"/>
+          <w:b w:val="0"/>
+          <w:color w:val="1A1A1A"/>
+          <w:sz w:val="21"/>
+        </w:rPr>
+        <w:t>3.2T의 65% 미국산 BOM 시나리오에서는 중국 모듈 조립이 남아도 미국 DSP·레이저 탑재가 늘어날 수 있다. 단기 실적의 핵은 중국 규제가 아니다.</w:t>
+      </w:r>
+    </w:p>
+    <w:p>
+      <w:pPr>
+        <w:spacing w:after="40" w:before="0" w:line="269" w:lineRule="auto"/>
+        <w:ind w:left="312" w:hanging="198"/>
+      </w:pPr>
+      <w:r>
+        <w:rPr>
+          <w:rFonts w:ascii="맑은 고딕" w:hAnsi="맑은 고딕" w:eastAsia="맑은 고딕"/>
+          <w:b w:val="0"/>
+          <w:color w:val="1E407C"/>
+          <w:sz w:val="21"/>
+        </w:rPr>
+        <w:t xml:space="preserve">• </w:t>
+      </w:r>
+      <w:r>
+        <w:rPr>
+          <w:rFonts w:ascii="맑은 고딕" w:hAnsi="맑은 고딕" w:eastAsia="맑은 고딕"/>
+          <w:b/>
+          <w:color w:val="1A1A1A"/>
+          <w:sz w:val="21"/>
+        </w:rPr>
+        <w:t xml:space="preserve">추출  </w:t>
+      </w:r>
+      <w:r>
+        <w:rPr>
+          <w:rFonts w:ascii="맑은 고딕" w:hAnsi="맑은 고딕" w:eastAsia="맑은 고딕"/>
+          <w:b w:val="0"/>
+          <w:color w:val="1A1A1A"/>
+          <w:sz w:val="21"/>
+        </w:rPr>
+        <w:t>크레도는 DustPhotonics 인수로 실리콘포토닉스까지 갖췄고, 1.6T ZeroFlap 트랜시버를 냈다. FY27 광통신 매출은 6억 달러 이상으로 적혀 있다.</w:t>
+      </w:r>
+    </w:p>
+    <w:p>
+      <w:pPr>
+        <w:spacing w:after="40" w:before="0" w:line="269" w:lineRule="auto"/>
+        <w:ind w:left="312" w:hanging="198"/>
+      </w:pPr>
+      <w:r>
+        <w:rPr>
+          <w:rFonts w:ascii="맑은 고딕" w:hAnsi="맑은 고딕" w:eastAsia="맑은 고딕"/>
+          <w:b w:val="0"/>
+          <w:color w:val="1E407C"/>
+          <w:sz w:val="21"/>
+        </w:rPr>
+        <w:t xml:space="preserve">• </w:t>
+      </w:r>
+      <w:r>
+        <w:rPr>
+          <w:rFonts w:ascii="맑은 고딕" w:hAnsi="맑은 고딕" w:eastAsia="맑은 고딕"/>
+          <w:b/>
+          <w:color w:val="1A1A1A"/>
+          <w:sz w:val="21"/>
+        </w:rPr>
+        <w:t xml:space="preserve">추출  </w:t>
+      </w:r>
+      <w:r>
+        <w:rPr>
+          <w:rFonts w:ascii="맑은 고딕" w:hAnsi="맑은 고딕" w:eastAsia="맑은 고딕"/>
+          <w:b w:val="0"/>
+          <w:color w:val="1A1A1A"/>
+          <w:sz w:val="21"/>
+        </w:rPr>
+        <w:t>코히런트는 PhotonLink와 InP 공급이, 루멘텀은 레이저가 근거로 붙는다. BofA는 다년 수요와 공급 부족을 배경으로 적었다.</w:t>
+      </w:r>
+    </w:p>
+    <w:p>
+      <w:pPr>
+        <w:spacing w:after="40" w:before="0" w:line="269" w:lineRule="auto"/>
+        <w:ind w:left="312" w:hanging="198"/>
+      </w:pPr>
+      <w:r>
+        <w:rPr>
+          <w:rFonts w:ascii="맑은 고딕" w:hAnsi="맑은 고딕" w:eastAsia="맑은 고딕"/>
+          <w:b w:val="0"/>
+          <w:color w:val="1E407C"/>
+          <w:sz w:val="21"/>
+        </w:rPr>
+        <w:t xml:space="preserve">• </w:t>
+      </w:r>
+      <w:r>
+        <w:rPr>
+          <w:rFonts w:ascii="맑은 고딕" w:hAnsi="맑은 고딕" w:eastAsia="맑은 고딕"/>
+          <w:b/>
+          <w:color w:val="1A1A1A"/>
+          <w:sz w:val="21"/>
+        </w:rPr>
+        <w:t xml:space="preserve">추출  </w:t>
+      </w:r>
+      <w:r>
+        <w:rPr>
+          <w:rFonts w:ascii="맑은 고딕" w:hAnsi="맑은 고딕" w:eastAsia="맑은 고딕"/>
+          <w:b w:val="0"/>
+          <w:color w:val="1A1A1A"/>
+          <w:sz w:val="21"/>
+        </w:rPr>
+        <w:t>두산 전자BG는 베라 루빈 울트라까지 HVLP4라 마진 스퀴즈 우려가 제한적이고, 중국 광모듈 규제에 빠진 주가는 과민반응으로 적혀 있다.</w:t>
+      </w:r>
+    </w:p>
+    <w:p>
+      <w:pPr>
+        <w:spacing w:after="40" w:before="0" w:line="269" w:lineRule="auto"/>
+        <w:ind w:left="312" w:hanging="198"/>
+      </w:pPr>
+      <w:r>
+        <w:rPr>
+          <w:rFonts w:ascii="맑은 고딕" w:hAnsi="맑은 고딕" w:eastAsia="맑은 고딕"/>
+          <w:b w:val="0"/>
+          <w:color w:val="1E407C"/>
+          <w:sz w:val="21"/>
+        </w:rPr>
+        <w:t xml:space="preserve">• </w:t>
+      </w:r>
+      <w:r>
+        <w:rPr>
+          <w:rFonts w:ascii="맑은 고딕" w:hAnsi="맑은 고딕" w:eastAsia="맑은 고딕"/>
+          <w:b/>
+          <w:color w:val="1A1A1A"/>
+          <w:sz w:val="21"/>
+        </w:rPr>
+        <w:t xml:space="preserve">추출  </w:t>
+      </w:r>
+      <w:r>
+        <w:rPr>
+          <w:rFonts w:ascii="맑은 고딕" w:hAnsi="맑은 고딕" w:eastAsia="맑은 고딕"/>
+          <w:b w:val="0"/>
+          <w:color w:val="1A1A1A"/>
+          <w:sz w:val="21"/>
+        </w:rPr>
+        <w:t>수혜 사슬은 GPU(엔비디아), 스위치(브로드컴), 구리·DSP(크레도), 레이저(루멘텀), 레이저·소재·트랜시버(코히런트)로 적혀 있다.</w:t>
+      </w:r>
+    </w:p>
+    <w:p>
+      <w:pPr>
+        <w:spacing w:after="40" w:before="0" w:line="269" w:lineRule="auto"/>
+        <w:ind w:left="312" w:hanging="198"/>
+      </w:pPr>
+      <w:r>
+        <w:rPr>
+          <w:rFonts w:ascii="맑은 고딕" w:hAnsi="맑은 고딕" w:eastAsia="맑은 고딕"/>
+          <w:b w:val="0"/>
+          <w:color w:val="1E407C"/>
+          <w:sz w:val="21"/>
+        </w:rPr>
+        <w:t xml:space="preserve">• </w:t>
+      </w:r>
+      <w:r>
+        <w:rPr>
+          <w:rFonts w:ascii="맑은 고딕" w:hAnsi="맑은 고딕" w:eastAsia="맑은 고딕"/>
+          <w:b/>
+          <w:color w:val="1A1A1A"/>
+          <w:sz w:val="21"/>
+        </w:rPr>
+        <w:t xml:space="preserve">추출  </w:t>
+      </w:r>
+      <w:r>
+        <w:rPr>
+          <w:rFonts w:ascii="맑은 고딕" w:hAnsi="맑은 고딕" w:eastAsia="맑은 고딕"/>
+          <w:b w:val="0"/>
+          <w:color w:val="1A1A1A"/>
+          <w:sz w:val="21"/>
+        </w:rPr>
+        <w:t>크레도 FY2027 매출 성장률 가이던스는 85% 이상이다.</w:t>
+      </w:r>
+    </w:p>
+    <w:p>
+      <w:pPr>
+        <w:spacing w:after="40" w:before="0" w:line="269" w:lineRule="auto"/>
+        <w:ind w:left="312" w:hanging="198"/>
+      </w:pPr>
+      <w:r>
+        <w:rPr>
+          <w:rFonts w:ascii="맑은 고딕" w:hAnsi="맑은 고딕" w:eastAsia="맑은 고딕"/>
+          <w:b w:val="0"/>
+          <w:color w:val="1E407C"/>
+          <w:sz w:val="21"/>
+        </w:rPr>
+        <w:t xml:space="preserve">• </w:t>
+      </w:r>
+      <w:r>
+        <w:rPr>
+          <w:rFonts w:ascii="맑은 고딕" w:hAnsi="맑은 고딕" w:eastAsia="맑은 고딕"/>
+          <w:b/>
+          <w:color w:val="1A1A1A"/>
+          <w:sz w:val="21"/>
+        </w:rPr>
+        <w:t xml:space="preserve">추출  </w:t>
+      </w:r>
+      <w:r>
+        <w:rPr>
+          <w:rFonts w:ascii="맑은 고딕" w:hAnsi="맑은 고딕" w:eastAsia="맑은 고딕"/>
+          <w:b w:val="0"/>
+          <w:color w:val="1A1A1A"/>
+          <w:sz w:val="21"/>
+        </w:rPr>
+        <w:t>번스타인 코히런트 목표주가는 $350다. 고객 인게이지먼트는 20개로 적혀 있다.</w:t>
       </w:r>
     </w:p>
     <w:p>
@@ -2208,6 +2802,39 @@
     </w:p>
     <w:p>
       <w:pPr>
+        <w:spacing w:after="40" w:before="0" w:line="269" w:lineRule="auto"/>
+        <w:ind w:left="312" w:hanging="198"/>
+      </w:pPr>
+      <w:r>
+        <w:rPr>
+          <w:rFonts w:ascii="맑은 고딕" w:hAnsi="맑은 고딕" w:eastAsia="맑은 고딕"/>
+          <w:b w:val="0"/>
+          <w:color w:val="1E407C"/>
+          <w:sz w:val="21"/>
+        </w:rPr>
+        <w:t xml:space="preserve">• </w:t>
+      </w:r>
+      <w:r>
+        <w:rPr>
+          <w:rFonts w:ascii="맑은 고딕" w:hAnsi="맑은 고딕" w:eastAsia="맑은 고딕"/>
+          <w:b/>
+          <w:color w:val="1A1A1A"/>
+          <w:sz w:val="21"/>
+        </w:rPr>
+        <w:t xml:space="preserve">추출  </w:t>
+      </w:r>
+      <w:r>
+        <w:rPr>
+          <w:rFonts w:ascii="맑은 고딕" w:hAnsi="맑은 고딕" w:eastAsia="맑은 고딕"/>
+          <w:b w:val="0"/>
+          <w:color w:val="1A1A1A"/>
+          <w:sz w:val="21"/>
+        </w:rPr>
+        <w:t>인텍플러스 수주잔고는 2분기 1,261억에서 3분기 말 1,700억, 4분기 신규 1,000억 전망이다. 외국인 지분은 0%에서 4.3%다.</w:t>
+      </w:r>
+    </w:p>
+    <w:p>
+      <w:pPr>
         <w:spacing w:before="240" w:after="120" w:line="276" w:lineRule="auto"/>
         <w:jc w:val="left"/>
         <w:pBdr>
@@ -2369,6 +2996,39 @@
           <w:sz w:val="21"/>
         </w:rPr>
         <w:t>154kV 신공장으로 제품·고객 확장 → 수주 경쟁력 강화</w:t>
+      </w:r>
+    </w:p>
+    <w:p>
+      <w:pPr>
+        <w:spacing w:after="40" w:before="0" w:line="269" w:lineRule="auto"/>
+        <w:ind w:left="312" w:hanging="198"/>
+      </w:pPr>
+      <w:r>
+        <w:rPr>
+          <w:rFonts w:ascii="맑은 고딕" w:hAnsi="맑은 고딕" w:eastAsia="맑은 고딕"/>
+          <w:b w:val="0"/>
+          <w:color w:val="1E407C"/>
+          <w:sz w:val="21"/>
+        </w:rPr>
+        <w:t xml:space="preserve">• </w:t>
+      </w:r>
+      <w:r>
+        <w:rPr>
+          <w:rFonts w:ascii="맑은 고딕" w:hAnsi="맑은 고딕" w:eastAsia="맑은 고딕"/>
+          <w:b/>
+          <w:color w:val="1A1A1A"/>
+          <w:sz w:val="21"/>
+        </w:rPr>
+        <w:t xml:space="preserve">추출  </w:t>
+      </w:r>
+      <w:r>
+        <w:rPr>
+          <w:rFonts w:ascii="맑은 고딕" w:hAnsi="맑은 고딕" w:eastAsia="맑은 고딕"/>
+          <w:b w:val="0"/>
+          <w:color w:val="1A1A1A"/>
+          <w:sz w:val="21"/>
+        </w:rPr>
+        <w:t>산일전기 영업이익률은 FY26 37.5%에서 FY28 40.7%다. 2028년 154kV 양산과 블룸에너지 벤더 등록이 적혀 있다.</w:t>
       </w:r>
     </w:p>
     <w:p>
@@ -2538,6 +3198,72 @@
     </w:p>
     <w:p>
       <w:pPr>
+        <w:spacing w:after="40" w:before="0" w:line="269" w:lineRule="auto"/>
+        <w:ind w:left="312" w:hanging="198"/>
+      </w:pPr>
+      <w:r>
+        <w:rPr>
+          <w:rFonts w:ascii="맑은 고딕" w:hAnsi="맑은 고딕" w:eastAsia="맑은 고딕"/>
+          <w:b w:val="0"/>
+          <w:color w:val="1E407C"/>
+          <w:sz w:val="21"/>
+        </w:rPr>
+        <w:t xml:space="preserve">• </w:t>
+      </w:r>
+      <w:r>
+        <w:rPr>
+          <w:rFonts w:ascii="맑은 고딕" w:hAnsi="맑은 고딕" w:eastAsia="맑은 고딕"/>
+          <w:b/>
+          <w:color w:val="1A1A1A"/>
+          <w:sz w:val="21"/>
+        </w:rPr>
+        <w:t xml:space="preserve">추출  </w:t>
+      </w:r>
+      <w:r>
+        <w:rPr>
+          <w:rFonts w:ascii="맑은 고딕" w:hAnsi="맑은 고딕" w:eastAsia="맑은 고딕"/>
+          <w:b w:val="0"/>
+          <w:color w:val="1A1A1A"/>
+          <w:sz w:val="21"/>
+        </w:rPr>
+        <w:t>추론 수요로 A100/H100이 현금흐름을 이어 간다는 점이, 1960년대 컴퓨터 리스 버블과 다른 부분으로 적혀 있다.</w:t>
+      </w:r>
+    </w:p>
+    <w:p>
+      <w:pPr>
+        <w:spacing w:after="40" w:before="0" w:line="269" w:lineRule="auto"/>
+        <w:ind w:left="312" w:hanging="198"/>
+      </w:pPr>
+      <w:r>
+        <w:rPr>
+          <w:rFonts w:ascii="맑은 고딕" w:hAnsi="맑은 고딕" w:eastAsia="맑은 고딕"/>
+          <w:b w:val="0"/>
+          <w:color w:val="1E407C"/>
+          <w:sz w:val="21"/>
+        </w:rPr>
+        <w:t xml:space="preserve">• </w:t>
+      </w:r>
+      <w:r>
+        <w:rPr>
+          <w:rFonts w:ascii="맑은 고딕" w:hAnsi="맑은 고딕" w:eastAsia="맑은 고딕"/>
+          <w:b/>
+          <w:color w:val="1A1A1A"/>
+          <w:sz w:val="21"/>
+        </w:rPr>
+        <w:t xml:space="preserve">추출  </w:t>
+      </w:r>
+      <w:r>
+        <w:rPr>
+          <w:rFonts w:ascii="맑은 고딕" w:hAnsi="맑은 고딕" w:eastAsia="맑은 고딕"/>
+          <w:b w:val="0"/>
+          <w:color w:val="1A1A1A"/>
+          <w:sz w:val="21"/>
+        </w:rPr>
+        <w:t>수명 가정이 갈리는 이름은 NVIDIA · CoreWeave · Oracle · Microsoft · Meta다.</w:t>
+      </w:r>
+    </w:p>
+    <w:p>
+      <w:pPr>
         <w:spacing w:before="240" w:after="120" w:line="276" w:lineRule="auto"/>
         <w:jc w:val="left"/>
         <w:pBdr>
@@ -2600,6 +3326,987 @@
           <w:sz w:val="21"/>
         </w:rPr>
         <w:t>AI쪽 50~60% (삼전닉스 30~40% 소부장 20%)</w:t>
+      </w:r>
+    </w:p>
+    <w:p>
+      <w:pPr>
+        <w:spacing w:after="40" w:before="0" w:line="269" w:lineRule="auto"/>
+        <w:ind w:left="312" w:hanging="198"/>
+      </w:pPr>
+      <w:r>
+        <w:rPr>
+          <w:rFonts w:ascii="맑은 고딕" w:hAnsi="맑은 고딕" w:eastAsia="맑은 고딕"/>
+          <w:b w:val="0"/>
+          <w:color w:val="1E407C"/>
+          <w:sz w:val="21"/>
+        </w:rPr>
+        <w:t xml:space="preserve">• </w:t>
+      </w:r>
+      <w:r>
+        <w:rPr>
+          <w:rFonts w:ascii="맑은 고딕" w:hAnsi="맑은 고딕" w:eastAsia="맑은 고딕"/>
+          <w:b/>
+          <w:color w:val="1A1A1A"/>
+          <w:sz w:val="21"/>
+        </w:rPr>
+        <w:t xml:space="preserve">추출  </w:t>
+      </w:r>
+      <w:r>
+        <w:rPr>
+          <w:rFonts w:ascii="맑은 고딕" w:hAnsi="맑은 고딕" w:eastAsia="맑은 고딕"/>
+          <w:b w:val="0"/>
+          <w:color w:val="1A1A1A"/>
+          <w:sz w:val="21"/>
+        </w:rPr>
+        <w:t>8월에서 9월로 코스닥 거래대금은 +8.7%, 코스피는 -25%, 코스닥 비중은 19%에서 28%다.</w:t>
+      </w:r>
+    </w:p>
+    <w:p>
+      <w:pPr>
+        <w:spacing w:before="240" w:after="120" w:line="276" w:lineRule="auto"/>
+        <w:jc w:val="left"/>
+        <w:pBdr>
+          <w:bottom w:val="single" w:sz="12" w:space="3" w:color="0F2043"/>
+        </w:pBdr>
+      </w:pPr>
+      <w:r>
+        <w:rPr>
+          <w:rFonts w:ascii="맑은 고딕" w:hAnsi="맑은 고딕" w:eastAsia="맑은 고딕"/>
+          <w:b/>
+          <w:color w:val="0F2043"/>
+          <w:sz w:val="32"/>
+        </w:rPr>
+        <w:t>2차 분석</w:t>
+      </w:r>
+    </w:p>
+    <w:p>
+      <w:pPr>
+        <w:spacing w:before="0" w:after="120" w:line="276" w:lineRule="auto"/>
+        <w:jc w:val="left"/>
+      </w:pPr>
+      <w:r>
+        <w:rPr>
+          <w:rFonts w:ascii="맑은 고딕" w:hAnsi="맑은 고딕" w:eastAsia="맑은 고딕"/>
+          <w:b w:val="0"/>
+          <w:color w:val="4B5563"/>
+          <w:sz w:val="21"/>
+        </w:rPr>
+        <w:t>퀵코멘트 표에 없던 녹취와 맥락이다. 원문에 앵커가 있는 문장만 남긴다.</w:t>
+      </w:r>
+    </w:p>
+    <w:p>
+      <w:pPr>
+        <w:spacing w:before="160" w:after="60" w:line="276" w:lineRule="auto"/>
+        <w:jc w:val="left"/>
+      </w:pPr>
+      <w:r>
+        <w:rPr>
+          <w:rFonts w:ascii="맑은 고딕" w:hAnsi="맑은 고딕" w:eastAsia="맑은 고딕"/>
+          <w:b/>
+          <w:color w:val="1E407C"/>
+          <w:sz w:val="26"/>
+        </w:rPr>
+        <w:t>가격대와 수급</w:t>
+      </w:r>
+    </w:p>
+    <w:p>
+      <w:pPr>
+        <w:spacing w:after="40" w:before="0" w:line="269" w:lineRule="auto"/>
+        <w:ind w:left="312" w:hanging="198"/>
+      </w:pPr>
+      <w:r>
+        <w:rPr>
+          <w:rFonts w:ascii="맑은 고딕" w:hAnsi="맑은 고딕" w:eastAsia="맑은 고딕"/>
+          <w:b w:val="0"/>
+          <w:color w:val="1E407C"/>
+          <w:sz w:val="21"/>
+        </w:rPr>
+        <w:t xml:space="preserve">• </w:t>
+      </w:r>
+      <w:r>
+        <w:rPr>
+          <w:rFonts w:ascii="맑은 고딕" w:hAnsi="맑은 고딕" w:eastAsia="맑은 고딕"/>
+          <w:b w:val="0"/>
+          <w:color w:val="1A1A1A"/>
+          <w:sz w:val="21"/>
+        </w:rPr>
+        <w:t>삼성전자의 다음 가격대는 28만 원, 그중 28만 5,000원 돌파다. 하이닉스는 190만 원 돌파다.</w:t>
+      </w:r>
+    </w:p>
+    <w:p>
+      <w:pPr>
+        <w:spacing w:after="40" w:before="0" w:line="269" w:lineRule="auto"/>
+        <w:ind w:left="312" w:hanging="198"/>
+      </w:pPr>
+      <w:r>
+        <w:rPr>
+          <w:rFonts w:ascii="맑은 고딕" w:hAnsi="맑은 고딕" w:eastAsia="맑은 고딕"/>
+          <w:b w:val="0"/>
+          <w:color w:val="1E407C"/>
+          <w:sz w:val="21"/>
+        </w:rPr>
+        <w:t xml:space="preserve">• </w:t>
+      </w:r>
+      <w:r>
+        <w:rPr>
+          <w:rFonts w:ascii="맑은 고딕" w:hAnsi="맑은 고딕" w:eastAsia="맑은 고딕"/>
+          <w:b w:val="0"/>
+          <w:color w:val="1A1A1A"/>
+          <w:sz w:val="21"/>
+        </w:rPr>
+        <w:t>자사주 매수는 하락을 받아 주는 자리이지 상승 재료가 아니다. 하이닉스 자사주는 10월 15일까지이고, 매수가 끝난 뒤가 수급 시험으로 적혀 있다.</w:t>
+      </w:r>
+    </w:p>
+    <w:p>
+      <w:pPr>
+        <w:spacing w:after="40" w:before="0" w:line="269" w:lineRule="auto"/>
+        <w:ind w:left="312" w:hanging="198"/>
+      </w:pPr>
+      <w:r>
+        <w:rPr>
+          <w:rFonts w:ascii="맑은 고딕" w:hAnsi="맑은 고딕" w:eastAsia="맑은 고딕"/>
+          <w:b w:val="0"/>
+          <w:color w:val="1E407C"/>
+          <w:sz w:val="21"/>
+        </w:rPr>
+        <w:t xml:space="preserve">• </w:t>
+      </w:r>
+      <w:r>
+        <w:rPr>
+          <w:rFonts w:ascii="맑은 고딕" w:hAnsi="맑은 고딕" w:eastAsia="맑은 고딕"/>
+          <w:b w:val="0"/>
+          <w:color w:val="1A1A1A"/>
+          <w:sz w:val="21"/>
+        </w:rPr>
+        <w:t>마이크론은 고점 대비 낙폭이 약 13%까지 좁혀졌고, 하이닉스는 고점 대비 30% 넘게 벌어져 있다는 비교가 나온다.</w:t>
+      </w:r>
+    </w:p>
+    <w:p>
+      <w:pPr>
+        <w:spacing w:after="40" w:before="0" w:line="269" w:lineRule="auto"/>
+        <w:ind w:left="312" w:hanging="198"/>
+      </w:pPr>
+      <w:r>
+        <w:rPr>
+          <w:rFonts w:ascii="맑은 고딕" w:hAnsi="맑은 고딕" w:eastAsia="맑은 고딕"/>
+          <w:b w:val="0"/>
+          <w:color w:val="1E407C"/>
+          <w:sz w:val="21"/>
+        </w:rPr>
+        <w:t xml:space="preserve">• </w:t>
+      </w:r>
+      <w:r>
+        <w:rPr>
+          <w:rFonts w:ascii="맑은 고딕" w:hAnsi="맑은 고딕" w:eastAsia="맑은 고딕"/>
+          <w:b w:val="0"/>
+          <w:color w:val="1A1A1A"/>
+          <w:sz w:val="21"/>
+        </w:rPr>
+        <w:t>장비 사이클은 5년으로 보고, 그 안에서 주가는 종목마다 먼저 가고 늦게 간다. 초보는 소부장 ETF가 편하다는 코멘트다.</w:t>
+      </w:r>
+    </w:p>
+    <w:p>
+      <w:pPr>
+        <w:spacing w:after="40" w:before="0" w:line="269" w:lineRule="auto"/>
+        <w:ind w:left="312" w:hanging="198"/>
+      </w:pPr>
+      <w:r>
+        <w:rPr>
+          <w:rFonts w:ascii="맑은 고딕" w:hAnsi="맑은 고딕" w:eastAsia="맑은 고딕"/>
+          <w:b w:val="0"/>
+          <w:color w:val="1E407C"/>
+          <w:sz w:val="21"/>
+        </w:rPr>
+        <w:t xml:space="preserve">• </w:t>
+      </w:r>
+      <w:r>
+        <w:rPr>
+          <w:rFonts w:ascii="맑은 고딕" w:hAnsi="맑은 고딕" w:eastAsia="맑은 고딕"/>
+          <w:b w:val="0"/>
+          <w:color w:val="1A1A1A"/>
+          <w:sz w:val="21"/>
+        </w:rPr>
+        <w:t>미국 국채 금리 급등은 헤지펀드가 레버리지로 금리 하락에 베팅했다가 손절한 흐름으로 적혀 있고, 금리는 추가로 안정될 수 있다는 쪽이다.</w:t>
+      </w:r>
+    </w:p>
+    <w:p>
+      <w:pPr>
+        <w:spacing w:before="160" w:after="60" w:line="276" w:lineRule="auto"/>
+        <w:jc w:val="left"/>
+      </w:pPr>
+      <w:r>
+        <w:rPr>
+          <w:rFonts w:ascii="맑은 고딕" w:hAnsi="맑은 고딕" w:eastAsia="맑은 고딕"/>
+          <w:b/>
+          <w:color w:val="1E407C"/>
+          <w:sz w:val="26"/>
+        </w:rPr>
+        <w:t>소부장 운용</w:t>
+      </w:r>
+    </w:p>
+    <w:p>
+      <w:pPr>
+        <w:spacing w:after="40" w:before="0" w:line="269" w:lineRule="auto"/>
+        <w:ind w:left="312" w:hanging="198"/>
+      </w:pPr>
+      <w:r>
+        <w:rPr>
+          <w:rFonts w:ascii="맑은 고딕" w:hAnsi="맑은 고딕" w:eastAsia="맑은 고딕"/>
+          <w:b w:val="0"/>
+          <w:color w:val="1E407C"/>
+          <w:sz w:val="21"/>
+        </w:rPr>
+        <w:t xml:space="preserve">• </w:t>
+      </w:r>
+      <w:r>
+        <w:rPr>
+          <w:rFonts w:ascii="맑은 고딕" w:hAnsi="맑은 고딕" w:eastAsia="맑은 고딕"/>
+          <w:b w:val="0"/>
+          <w:color w:val="1A1A1A"/>
+          <w:sz w:val="21"/>
+        </w:rPr>
+        <w:t>전공정 핵심은 증착이다. 원익IPS·유진테크·주성 중 원익IPS가 시가총액과 매물 면에서 더 편한 후보로 적혀 있다.</w:t>
+      </w:r>
+    </w:p>
+    <w:p>
+      <w:pPr>
+        <w:spacing w:after="40" w:before="0" w:line="269" w:lineRule="auto"/>
+        <w:ind w:left="312" w:hanging="198"/>
+      </w:pPr>
+      <w:r>
+        <w:rPr>
+          <w:rFonts w:ascii="맑은 고딕" w:hAnsi="맑은 고딕" w:eastAsia="맑은 고딕"/>
+          <w:b w:val="0"/>
+          <w:color w:val="1E407C"/>
+          <w:sz w:val="21"/>
+        </w:rPr>
+        <w:t xml:space="preserve">• </w:t>
+      </w:r>
+      <w:r>
+        <w:rPr>
+          <w:rFonts w:ascii="맑은 고딕" w:hAnsi="맑은 고딕" w:eastAsia="맑은 고딕"/>
+          <w:b w:val="0"/>
+          <w:color w:val="1A1A1A"/>
+          <w:sz w:val="21"/>
+        </w:rPr>
+        <w:t>주성엔지니어링은 실적이 확인되기 전에는 믿음이 약하다는 코멘트다.</w:t>
+      </w:r>
+    </w:p>
+    <w:p>
+      <w:pPr>
+        <w:spacing w:after="40" w:before="0" w:line="269" w:lineRule="auto"/>
+        <w:ind w:left="312" w:hanging="198"/>
+      </w:pPr>
+      <w:r>
+        <w:rPr>
+          <w:rFonts w:ascii="맑은 고딕" w:hAnsi="맑은 고딕" w:eastAsia="맑은 고딕"/>
+          <w:b w:val="0"/>
+          <w:color w:val="1E407C"/>
+          <w:sz w:val="21"/>
+        </w:rPr>
+        <w:t xml:space="preserve">• </w:t>
+      </w:r>
+      <w:r>
+        <w:rPr>
+          <w:rFonts w:ascii="맑은 고딕" w:hAnsi="맑은 고딕" w:eastAsia="맑은 고딕"/>
+          <w:b w:val="0"/>
+          <w:color w:val="1A1A1A"/>
+          <w:sz w:val="21"/>
+        </w:rPr>
+        <w:t>원익IPS가 12만 원까지 밀리는 자리는 관심 구간으로 적혀 있다.</w:t>
+      </w:r>
+    </w:p>
+    <w:p>
+      <w:pPr>
+        <w:spacing w:after="40" w:before="0" w:line="269" w:lineRule="auto"/>
+        <w:ind w:left="312" w:hanging="198"/>
+      </w:pPr>
+      <w:r>
+        <w:rPr>
+          <w:rFonts w:ascii="맑은 고딕" w:hAnsi="맑은 고딕" w:eastAsia="맑은 고딕"/>
+          <w:b w:val="0"/>
+          <w:color w:val="1E407C"/>
+          <w:sz w:val="21"/>
+        </w:rPr>
+        <w:t xml:space="preserve">• </w:t>
+      </w:r>
+      <w:r>
+        <w:rPr>
+          <w:rFonts w:ascii="맑은 고딕" w:hAnsi="맑은 고딕" w:eastAsia="맑은 고딕"/>
+          <w:b w:val="0"/>
+          <w:color w:val="1A1A1A"/>
+          <w:sz w:val="21"/>
+        </w:rPr>
+        <w:t>고압수소어닐은 HPSP가 세 자리에서 1위라는 이유로 핵심 후보에 들어 있다.</w:t>
+      </w:r>
+    </w:p>
+    <w:p>
+      <w:pPr>
+        <w:spacing w:after="40" w:before="0" w:line="269" w:lineRule="auto"/>
+        <w:ind w:left="312" w:hanging="198"/>
+      </w:pPr>
+      <w:r>
+        <w:rPr>
+          <w:rFonts w:ascii="맑은 고딕" w:hAnsi="맑은 고딕" w:eastAsia="맑은 고딕"/>
+          <w:b w:val="0"/>
+          <w:color w:val="1E407C"/>
+          <w:sz w:val="21"/>
+        </w:rPr>
+        <w:t xml:space="preserve">• </w:t>
+      </w:r>
+      <w:r>
+        <w:rPr>
+          <w:rFonts w:ascii="맑은 고딕" w:hAnsi="맑은 고딕" w:eastAsia="맑은 고딕"/>
+          <w:b w:val="0"/>
+          <w:color w:val="1A1A1A"/>
+          <w:sz w:val="21"/>
+        </w:rPr>
+        <w:t>식각·세정 쪽 관심 이름은 PSK다.</w:t>
+      </w:r>
+    </w:p>
+    <w:p>
+      <w:pPr>
+        <w:spacing w:after="40" w:before="0" w:line="269" w:lineRule="auto"/>
+        <w:ind w:left="312" w:hanging="198"/>
+      </w:pPr>
+      <w:r>
+        <w:rPr>
+          <w:rFonts w:ascii="맑은 고딕" w:hAnsi="맑은 고딕" w:eastAsia="맑은 고딕"/>
+          <w:b w:val="0"/>
+          <w:color w:val="1E407C"/>
+          <w:sz w:val="21"/>
+        </w:rPr>
+        <w:t xml:space="preserve">• </w:t>
+      </w:r>
+      <w:r>
+        <w:rPr>
+          <w:rFonts w:ascii="맑은 고딕" w:hAnsi="맑은 고딕" w:eastAsia="맑은 고딕"/>
+          <w:b w:val="0"/>
+          <w:color w:val="1A1A1A"/>
+          <w:sz w:val="21"/>
+        </w:rPr>
+        <w:t>후공정 핵심은 한미반도체와 리노공업이다. 프로브카드 대장 TSE는 조정을 기다리라는 쪽이다.</w:t>
+      </w:r>
+    </w:p>
+    <w:p>
+      <w:pPr>
+        <w:spacing w:after="40" w:before="0" w:line="269" w:lineRule="auto"/>
+        <w:ind w:left="312" w:hanging="198"/>
+      </w:pPr>
+      <w:r>
+        <w:rPr>
+          <w:rFonts w:ascii="맑은 고딕" w:hAnsi="맑은 고딕" w:eastAsia="맑은 고딕"/>
+          <w:b w:val="0"/>
+          <w:color w:val="1E407C"/>
+          <w:sz w:val="21"/>
+        </w:rPr>
+        <w:t xml:space="preserve">• </w:t>
+      </w:r>
+      <w:r>
+        <w:rPr>
+          <w:rFonts w:ascii="맑은 고딕" w:hAnsi="맑은 고딕" w:eastAsia="맑은 고딕"/>
+          <w:b w:val="0"/>
+          <w:color w:val="1A1A1A"/>
+          <w:sz w:val="21"/>
+        </w:rPr>
+        <w:t>소재는 솔브레인, 동진쎄미켐, 한솔케미칼 중 하나를 보면 된다는 압축이다.</w:t>
+      </w:r>
+    </w:p>
+    <w:p>
+      <w:pPr>
+        <w:spacing w:after="40" w:before="0" w:line="269" w:lineRule="auto"/>
+        <w:ind w:left="312" w:hanging="198"/>
+      </w:pPr>
+      <w:r>
+        <w:rPr>
+          <w:rFonts w:ascii="맑은 고딕" w:hAnsi="맑은 고딕" w:eastAsia="맑은 고딕"/>
+          <w:b w:val="0"/>
+          <w:color w:val="1E407C"/>
+          <w:sz w:val="21"/>
+        </w:rPr>
+        <w:t xml:space="preserve">• </w:t>
+      </w:r>
+      <w:r>
+        <w:rPr>
+          <w:rFonts w:ascii="맑은 고딕" w:hAnsi="맑은 고딕" w:eastAsia="맑은 고딕"/>
+          <w:b w:val="0"/>
+          <w:color w:val="1A1A1A"/>
+          <w:sz w:val="21"/>
+        </w:rPr>
+        <w:t>삼성전기는 내년 약 39~40배, 2028년을 당기면 약 25배라는 설명이다. 심텍 내년 18배 대비 대덕전자(TLB)는 16.8배다.</w:t>
+      </w:r>
+    </w:p>
+    <w:p>
+      <w:pPr>
+        <w:spacing w:after="40" w:before="0" w:line="269" w:lineRule="auto"/>
+        <w:ind w:left="312" w:hanging="198"/>
+      </w:pPr>
+      <w:r>
+        <w:rPr>
+          <w:rFonts w:ascii="맑은 고딕" w:hAnsi="맑은 고딕" w:eastAsia="맑은 고딕"/>
+          <w:b w:val="0"/>
+          <w:color w:val="1E407C"/>
+          <w:sz w:val="21"/>
+        </w:rPr>
+        <w:t xml:space="preserve">• </w:t>
+      </w:r>
+      <w:r>
+        <w:rPr>
+          <w:rFonts w:ascii="맑은 고딕" w:hAnsi="맑은 고딕" w:eastAsia="맑은 고딕"/>
+          <w:b w:val="0"/>
+          <w:color w:val="1A1A1A"/>
+          <w:sz w:val="21"/>
+        </w:rPr>
+        <w:t>유리기판은 엔비디아 검토 단계다. 양산 언급은 2029~2030년, FC-BGA 치환은 2033년 전후다. 필옵틱스는 4만 5,000원대와 급등 때마다 비중을 줄이라는 코멘트다.</w:t>
+      </w:r>
+    </w:p>
+    <w:p>
+      <w:pPr>
+        <w:spacing w:before="160" w:after="60" w:line="276" w:lineRule="auto"/>
+        <w:jc w:val="left"/>
+      </w:pPr>
+      <w:r>
+        <w:rPr>
+          <w:rFonts w:ascii="맑은 고딕" w:hAnsi="맑은 고딕" w:eastAsia="맑은 고딕"/>
+          <w:b/>
+          <w:color w:val="1E407C"/>
+          <w:sz w:val="26"/>
+        </w:rPr>
+        <w:t>데이터센터 금융과 전력</w:t>
+      </w:r>
+    </w:p>
+    <w:p>
+      <w:pPr>
+        <w:spacing w:after="40" w:before="0" w:line="269" w:lineRule="auto"/>
+        <w:ind w:left="312" w:hanging="198"/>
+      </w:pPr>
+      <w:r>
+        <w:rPr>
+          <w:rFonts w:ascii="맑은 고딕" w:hAnsi="맑은 고딕" w:eastAsia="맑은 고딕"/>
+          <w:b w:val="0"/>
+          <w:color w:val="1E407C"/>
+          <w:sz w:val="21"/>
+        </w:rPr>
+        <w:t xml:space="preserve">• </w:t>
+      </w:r>
+      <w:r>
+        <w:rPr>
+          <w:rFonts w:ascii="맑은 고딕" w:hAnsi="맑은 고딕" w:eastAsia="맑은 고딕"/>
+          <w:b w:val="0"/>
+          <w:color w:val="1A1A1A"/>
+          <w:sz w:val="21"/>
+        </w:rPr>
+        <w:t>뉴멕시코 프로젝트 주피터는 2.4GW다. 총 210억 달러 중 자기자본은 약 30억 달러, 건설 대출은 180억 달러로 적혀 있다.</w:t>
+      </w:r>
+    </w:p>
+    <w:p>
+      <w:pPr>
+        <w:spacing w:after="40" w:before="0" w:line="269" w:lineRule="auto"/>
+        <w:ind w:left="312" w:hanging="198"/>
+      </w:pPr>
+      <w:r>
+        <w:rPr>
+          <w:rFonts w:ascii="맑은 고딕" w:hAnsi="맑은 고딕" w:eastAsia="맑은 고딕"/>
+          <w:b w:val="0"/>
+          <w:color w:val="1E407C"/>
+          <w:sz w:val="21"/>
+        </w:rPr>
+        <w:t xml:space="preserve">• </w:t>
+      </w:r>
+      <w:r>
+        <w:rPr>
+          <w:rFonts w:ascii="맑은 고딕" w:hAnsi="맑은 고딕" w:eastAsia="맑은 고딕"/>
+          <w:b w:val="0"/>
+          <w:color w:val="1A1A1A"/>
+          <w:sz w:val="21"/>
+        </w:rPr>
+        <w:t>180억 달러 건설 대출은 오라클 장부 밖이다.</w:t>
+      </w:r>
+    </w:p>
+    <w:p>
+      <w:pPr>
+        <w:spacing w:after="40" w:before="0" w:line="269" w:lineRule="auto"/>
+        <w:ind w:left="312" w:hanging="198"/>
+      </w:pPr>
+      <w:r>
+        <w:rPr>
+          <w:rFonts w:ascii="맑은 고딕" w:hAnsi="맑은 고딕" w:eastAsia="맑은 고딕"/>
+          <w:b w:val="0"/>
+          <w:color w:val="1E407C"/>
+          <w:sz w:val="21"/>
+        </w:rPr>
+        <w:t xml:space="preserve">• </w:t>
+      </w:r>
+      <w:r>
+        <w:rPr>
+          <w:rFonts w:ascii="맑은 고딕" w:hAnsi="맑은 고딕" w:eastAsia="맑은 고딕"/>
+          <w:b w:val="0"/>
+          <w:color w:val="1A1A1A"/>
+          <w:sz w:val="21"/>
+        </w:rPr>
+        <w:t>공사 지연을 이유로 임대료를 못 낸다는 선언이 나온다.</w:t>
+      </w:r>
+    </w:p>
+    <w:p>
+      <w:pPr>
+        <w:spacing w:after="40" w:before="0" w:line="269" w:lineRule="auto"/>
+        <w:ind w:left="312" w:hanging="198"/>
+      </w:pPr>
+      <w:r>
+        <w:rPr>
+          <w:rFonts w:ascii="맑은 고딕" w:hAnsi="맑은 고딕" w:eastAsia="맑은 고딕"/>
+          <w:b w:val="0"/>
+          <w:color w:val="1E407C"/>
+          <w:sz w:val="21"/>
+        </w:rPr>
+        <w:t xml:space="preserve">• </w:t>
+      </w:r>
+      <w:r>
+        <w:rPr>
+          <w:rFonts w:ascii="맑은 고딕" w:hAnsi="맑은 고딕" w:eastAsia="맑은 고딕"/>
+          <w:b w:val="0"/>
+          <w:color w:val="1A1A1A"/>
+          <w:sz w:val="21"/>
+        </w:rPr>
+        <w:t>오라클은 하이퍼스케일러 중 신용등급이 가장 아래이고, 한 단계 더 내려가면 투기등급이라는 설명이다.</w:t>
+      </w:r>
+    </w:p>
+    <w:p>
+      <w:pPr>
+        <w:spacing w:after="40" w:before="0" w:line="269" w:lineRule="auto"/>
+        <w:ind w:left="312" w:hanging="198"/>
+      </w:pPr>
+      <w:r>
+        <w:rPr>
+          <w:rFonts w:ascii="맑은 고딕" w:hAnsi="맑은 고딕" w:eastAsia="맑은 고딕"/>
+          <w:b w:val="0"/>
+          <w:color w:val="1E407C"/>
+          <w:sz w:val="21"/>
+        </w:rPr>
+        <w:t xml:space="preserve">• </w:t>
+      </w:r>
+      <w:r>
+        <w:rPr>
+          <w:rFonts w:ascii="맑은 고딕" w:hAnsi="맑은 고딕" w:eastAsia="맑은 고딕"/>
+          <w:b w:val="0"/>
+          <w:color w:val="1A1A1A"/>
+          <w:sz w:val="21"/>
+        </w:rPr>
+        <w:t>인허가와 주민 반대는 주피터만의 일이 아니다. 버지니아·텍사스와 11월 중간선거가 같이 적혀 있다.</w:t>
+      </w:r>
+    </w:p>
+    <w:p>
+      <w:pPr>
+        <w:spacing w:after="40" w:before="0" w:line="269" w:lineRule="auto"/>
+        <w:ind w:left="312" w:hanging="198"/>
+      </w:pPr>
+      <w:r>
+        <w:rPr>
+          <w:rFonts w:ascii="맑은 고딕" w:hAnsi="맑은 고딕" w:eastAsia="맑은 고딕"/>
+          <w:b w:val="0"/>
+          <w:color w:val="1E407C"/>
+          <w:sz w:val="21"/>
+        </w:rPr>
+        <w:t xml:space="preserve">• </w:t>
+      </w:r>
+      <w:r>
+        <w:rPr>
+          <w:rFonts w:ascii="맑은 고딕" w:hAnsi="맑은 고딕" w:eastAsia="맑은 고딕"/>
+          <w:b w:val="0"/>
+          <w:color w:val="1A1A1A"/>
+          <w:sz w:val="21"/>
+        </w:rPr>
+        <w:t>미국 발전 예비율은 약 30%로 언급된다. 병목은 발전량 자체보다, 데이터센터를 지으려는 지역의 송전과 인허가다.</w:t>
+      </w:r>
+    </w:p>
+    <w:p>
+      <w:pPr>
+        <w:spacing w:after="40" w:before="0" w:line="269" w:lineRule="auto"/>
+        <w:ind w:left="312" w:hanging="198"/>
+      </w:pPr>
+      <w:r>
+        <w:rPr>
+          <w:rFonts w:ascii="맑은 고딕" w:hAnsi="맑은 고딕" w:eastAsia="맑은 고딕"/>
+          <w:b w:val="0"/>
+          <w:color w:val="1E407C"/>
+          <w:sz w:val="21"/>
+        </w:rPr>
+        <w:t xml:space="preserve">• </w:t>
+      </w:r>
+      <w:r>
+        <w:rPr>
+          <w:rFonts w:ascii="맑은 고딕" w:hAnsi="맑은 고딕" w:eastAsia="맑은 고딕"/>
+          <w:b w:val="0"/>
+          <w:color w:val="1A1A1A"/>
+          <w:sz w:val="21"/>
+        </w:rPr>
+        <w:t>다음 일정은 10월 말 하이퍼스케일러 실적과 11월 3일 미국 중간선거다. 결과 자체보다 확인되던 이벤트가 지나간 뒤를 본다는 코멘트다.</w:t>
+      </w:r>
+    </w:p>
+    <w:p>
+      <w:pPr>
+        <w:spacing w:before="160" w:after="60" w:line="276" w:lineRule="auto"/>
+        <w:jc w:val="left"/>
+      </w:pPr>
+      <w:r>
+        <w:rPr>
+          <w:rFonts w:ascii="맑은 고딕" w:hAnsi="맑은 고딕" w:eastAsia="맑은 고딕"/>
+          <w:b/>
+          <w:color w:val="1E407C"/>
+          <w:sz w:val="26"/>
+        </w:rPr>
+        <w:t>피크아웃과 2028</w:t>
+      </w:r>
+    </w:p>
+    <w:p>
+      <w:pPr>
+        <w:spacing w:after="40" w:before="0" w:line="269" w:lineRule="auto"/>
+        <w:ind w:left="312" w:hanging="198"/>
+      </w:pPr>
+      <w:r>
+        <w:rPr>
+          <w:rFonts w:ascii="맑은 고딕" w:hAnsi="맑은 고딕" w:eastAsia="맑은 고딕"/>
+          <w:b w:val="0"/>
+          <w:color w:val="1E407C"/>
+          <w:sz w:val="21"/>
+        </w:rPr>
+        <w:t xml:space="preserve">• </w:t>
+      </w:r>
+      <w:r>
+        <w:rPr>
+          <w:rFonts w:ascii="맑은 고딕" w:hAnsi="맑은 고딕" w:eastAsia="맑은 고딕"/>
+          <w:b w:val="0"/>
+          <w:color w:val="1A1A1A"/>
+          <w:sz w:val="21"/>
+        </w:rPr>
+        <w:t>하이닉스 400만 원 시나리오의 조건은 영업이익률 80%와 장기계약 비중 40%다. 마이크론 실적은 그 숫자가 불가능하지 않다는 근거로 쓰였다.</w:t>
+      </w:r>
+    </w:p>
+    <w:p>
+      <w:pPr>
+        <w:spacing w:after="40" w:before="0" w:line="269" w:lineRule="auto"/>
+        <w:ind w:left="312" w:hanging="198"/>
+      </w:pPr>
+      <w:r>
+        <w:rPr>
+          <w:rFonts w:ascii="맑은 고딕" w:hAnsi="맑은 고딕" w:eastAsia="맑은 고딕"/>
+          <w:b w:val="0"/>
+          <w:color w:val="1E407C"/>
+          <w:sz w:val="21"/>
+        </w:rPr>
+        <w:t xml:space="preserve">• </w:t>
+      </w:r>
+      <w:r>
+        <w:rPr>
+          <w:rFonts w:ascii="맑은 고딕" w:hAnsi="맑은 고딕" w:eastAsia="맑은 고딕"/>
+          <w:b w:val="0"/>
+          <w:color w:val="1A1A1A"/>
+          <w:sz w:val="21"/>
+        </w:rPr>
+        <w:t>7월 말 이후, 2028년에도 15% 이상 성장으로 분류된 종목은 약 26% 올랐고, 2027년 피크아웃으로 분류된 쪽은 약 14% 올랐다. 싼 PER은 2028년 증익률 둔화에 대한 질문으로 적혀 있다.</w:t>
+      </w:r>
+    </w:p>
+    <w:p>
+      <w:pPr>
+        <w:spacing w:after="40" w:before="0" w:line="269" w:lineRule="auto"/>
+        <w:ind w:left="312" w:hanging="198"/>
+      </w:pPr>
+      <w:r>
+        <w:rPr>
+          <w:rFonts w:ascii="맑은 고딕" w:hAnsi="맑은 고딕" w:eastAsia="맑은 고딕"/>
+          <w:b w:val="0"/>
+          <w:color w:val="1E407C"/>
+          <w:sz w:val="21"/>
+        </w:rPr>
+        <w:t xml:space="preserve">• </w:t>
+      </w:r>
+      <w:r>
+        <w:rPr>
+          <w:rFonts w:ascii="맑은 고딕" w:hAnsi="맑은 고딕" w:eastAsia="맑은 고딕"/>
+          <w:b w:val="0"/>
+          <w:color w:val="1A1A1A"/>
+          <w:sz w:val="21"/>
+        </w:rPr>
+        <w:t>이익보다 현금이 팩트라는 프레임이다. 하이퍼스케일러 프리캐시플로가 말라 있으면 반도체 매수 여력이 할인율과 함께 의심받는다.</w:t>
+      </w:r>
+    </w:p>
+    <w:p>
+      <w:pPr>
+        <w:spacing w:after="40" w:before="0" w:line="269" w:lineRule="auto"/>
+        <w:ind w:left="312" w:hanging="198"/>
+      </w:pPr>
+      <w:r>
+        <w:rPr>
+          <w:rFonts w:ascii="맑은 고딕" w:hAnsi="맑은 고딕" w:eastAsia="맑은 고딕"/>
+          <w:b w:val="0"/>
+          <w:color w:val="1E407C"/>
+          <w:sz w:val="21"/>
+        </w:rPr>
+        <w:t xml:space="preserve">• </w:t>
+      </w:r>
+      <w:r>
+        <w:rPr>
+          <w:rFonts w:ascii="맑은 고딕" w:hAnsi="맑은 고딕" w:eastAsia="맑은 고딕"/>
+          <w:b w:val="0"/>
+          <w:color w:val="1A1A1A"/>
+          <w:sz w:val="21"/>
+        </w:rPr>
+        <w:t>솔리다임 중복상장은 일단 진정됐고, 하이닉스는 아직 결정된 바 없다고 말했다.</w:t>
+      </w:r>
+    </w:p>
+    <w:p>
+      <w:pPr>
+        <w:spacing w:after="40" w:before="0" w:line="269" w:lineRule="auto"/>
+        <w:ind w:left="312" w:hanging="198"/>
+      </w:pPr>
+      <w:r>
+        <w:rPr>
+          <w:rFonts w:ascii="맑은 고딕" w:hAnsi="맑은 고딕" w:eastAsia="맑은 고딕"/>
+          <w:b w:val="0"/>
+          <w:color w:val="1E407C"/>
+          <w:sz w:val="21"/>
+        </w:rPr>
+        <w:t xml:space="preserve">• </w:t>
+      </w:r>
+      <w:r>
+        <w:rPr>
+          <w:rFonts w:ascii="맑은 고딕" w:hAnsi="맑은 고딕" w:eastAsia="맑은 고딕"/>
+          <w:b w:val="0"/>
+          <w:color w:val="1A1A1A"/>
+          <w:sz w:val="21"/>
+        </w:rPr>
+        <w:t>의무공개매수 범위를 넓히는 조치는 처리가 보류됐다.</w:t>
+      </w:r>
+    </w:p>
+    <w:p>
+      <w:pPr>
+        <w:spacing w:after="40" w:before="0" w:line="269" w:lineRule="auto"/>
+        <w:ind w:left="312" w:hanging="198"/>
+      </w:pPr>
+      <w:r>
+        <w:rPr>
+          <w:rFonts w:ascii="맑은 고딕" w:hAnsi="맑은 고딕" w:eastAsia="맑은 고딕"/>
+          <w:b w:val="0"/>
+          <w:color w:val="1E407C"/>
+          <w:sz w:val="21"/>
+        </w:rPr>
+        <w:t xml:space="preserve">• </w:t>
+      </w:r>
+      <w:r>
+        <w:rPr>
+          <w:rFonts w:ascii="맑은 고딕" w:hAnsi="맑은 고딕" w:eastAsia="맑은 고딕"/>
+          <w:b w:val="0"/>
+          <w:color w:val="1A1A1A"/>
+          <w:sz w:val="21"/>
+        </w:rPr>
+        <w:t>10년물 5.5%는 과거 투자 사이클에서 주가를 제약하던 구간에 대응되는 스트레스 라인으로 적혀 있다. 최근 금리 상승분 상당수는 물가가 아니라 실질금리다.</w:t>
+      </w:r>
+    </w:p>
+    <w:p>
+      <w:pPr>
+        <w:spacing w:after="40" w:before="0" w:line="269" w:lineRule="auto"/>
+        <w:ind w:left="312" w:hanging="198"/>
+      </w:pPr>
+      <w:r>
+        <w:rPr>
+          <w:rFonts w:ascii="맑은 고딕" w:hAnsi="맑은 고딕" w:eastAsia="맑은 고딕"/>
+          <w:b w:val="0"/>
+          <w:color w:val="1E407C"/>
+          <w:sz w:val="21"/>
+        </w:rPr>
+        <w:t xml:space="preserve">• </w:t>
+      </w:r>
+      <w:r>
+        <w:rPr>
+          <w:rFonts w:ascii="맑은 고딕" w:hAnsi="맑은 고딕" w:eastAsia="맑은 고딕"/>
+          <w:b w:val="0"/>
+          <w:color w:val="1A1A1A"/>
+          <w:sz w:val="21"/>
+        </w:rPr>
+        <w:t>약한 고리로 프랑스 국채가 언급된다. 한국은 선행지수가 오르는데 동행지수가 못 따라오는 괴리가 있다. 지수 방향 베팅보다 2028년에 과실이 나오는 선행투자를 고르라는 결론이다.</w:t>
+      </w:r>
+    </w:p>
+    <w:p>
+      <w:pPr>
+        <w:spacing w:before="160" w:after="60" w:line="276" w:lineRule="auto"/>
+        <w:jc w:val="left"/>
+      </w:pPr>
+      <w:r>
+        <w:rPr>
+          <w:rFonts w:ascii="맑은 고딕" w:hAnsi="맑은 고딕" w:eastAsia="맑은 고딕"/>
+          <w:b/>
+          <w:color w:val="1E407C"/>
+          <w:sz w:val="26"/>
+        </w:rPr>
+        <w:t>수출 체급과 AI 시계</w:t>
+      </w:r>
+    </w:p>
+    <w:p>
+      <w:pPr>
+        <w:spacing w:after="40" w:before="0" w:line="269" w:lineRule="auto"/>
+        <w:ind w:left="312" w:hanging="198"/>
+      </w:pPr>
+      <w:r>
+        <w:rPr>
+          <w:rFonts w:ascii="맑은 고딕" w:hAnsi="맑은 고딕" w:eastAsia="맑은 고딕"/>
+          <w:b w:val="0"/>
+          <w:color w:val="1E407C"/>
+          <w:sz w:val="21"/>
+        </w:rPr>
+        <w:t xml:space="preserve">• </w:t>
+      </w:r>
+      <w:r>
+        <w:rPr>
+          <w:rFonts w:ascii="맑은 고딕" w:hAnsi="맑은 고딕" w:eastAsia="맑은 고딕"/>
+          <w:b w:val="0"/>
+          <w:color w:val="1A1A1A"/>
+          <w:sz w:val="21"/>
+        </w:rPr>
+        <w:t>화장품·바이오 수출은 좋지만, 화장품은 전체 수출의 약 2%라 지수 주도 자리는 아니다.</w:t>
+      </w:r>
+    </w:p>
+    <w:p>
+      <w:pPr>
+        <w:spacing w:after="40" w:before="0" w:line="269" w:lineRule="auto"/>
+        <w:ind w:left="312" w:hanging="198"/>
+      </w:pPr>
+      <w:r>
+        <w:rPr>
+          <w:rFonts w:ascii="맑은 고딕" w:hAnsi="맑은 고딕" w:eastAsia="맑은 고딕"/>
+          <w:b w:val="0"/>
+          <w:color w:val="1E407C"/>
+          <w:sz w:val="21"/>
+        </w:rPr>
+        <w:t xml:space="preserve">• </w:t>
+      </w:r>
+      <w:r>
+        <w:rPr>
+          <w:rFonts w:ascii="맑은 고딕" w:hAnsi="맑은 고딕" w:eastAsia="맑은 고딕"/>
+          <w:b w:val="0"/>
+          <w:color w:val="1A1A1A"/>
+          <w:sz w:val="21"/>
+        </w:rPr>
+        <w:t>화장품 수출이 사상 최대인데도 주가가 쉰 이유는 성장 속도 둔화와 환율·원가 의심이다. 퀄리티 종목은 그 의심이 가격에 반영될 때 본다는 코멘트다. 구조적 악화로 단정하지는 않는다.</w:t>
+      </w:r>
+    </w:p>
+    <w:p>
+      <w:pPr>
+        <w:spacing w:after="40" w:before="0" w:line="269" w:lineRule="auto"/>
+        <w:ind w:left="312" w:hanging="198"/>
+      </w:pPr>
+      <w:r>
+        <w:rPr>
+          <w:rFonts w:ascii="맑은 고딕" w:hAnsi="맑은 고딕" w:eastAsia="맑은 고딕"/>
+          <w:b w:val="0"/>
+          <w:color w:val="1E407C"/>
+          <w:sz w:val="21"/>
+        </w:rPr>
+        <w:t xml:space="preserve">• </w:t>
+      </w:r>
+      <w:r>
+        <w:rPr>
+          <w:rFonts w:ascii="맑은 고딕" w:hAnsi="맑은 고딕" w:eastAsia="맑은 고딕"/>
+          <w:b w:val="0"/>
+          <w:color w:val="1A1A1A"/>
+          <w:sz w:val="21"/>
+        </w:rPr>
+        <w:t>GPU 임대료는 안정적이고 토큰 가격은 내려간다. 토큰 가격 하락은 제품 가격 하락이 아니라 원가 하락으로 읽는 시각이 있다.</w:t>
+      </w:r>
+    </w:p>
+    <w:p>
+      <w:pPr>
+        <w:spacing w:after="40" w:before="0" w:line="269" w:lineRule="auto"/>
+        <w:ind w:left="312" w:hanging="198"/>
+      </w:pPr>
+      <w:r>
+        <w:rPr>
+          <w:rFonts w:ascii="맑은 고딕" w:hAnsi="맑은 고딕" w:eastAsia="맑은 고딕"/>
+          <w:b w:val="0"/>
+          <w:color w:val="1E407C"/>
+          <w:sz w:val="21"/>
+        </w:rPr>
+        <w:t xml:space="preserve">• </w:t>
+      </w:r>
+      <w:r>
+        <w:rPr>
+          <w:rFonts w:ascii="맑은 고딕" w:hAnsi="맑은 고딕" w:eastAsia="맑은 고딕"/>
+          <w:b w:val="0"/>
+          <w:color w:val="1A1A1A"/>
+          <w:sz w:val="21"/>
+        </w:rPr>
+        <w:t>학습보다 추론 사용이 늘면 메모리 용량 수요가 따라온다는 설명이 있다.</w:t>
+      </w:r>
+    </w:p>
+    <w:p>
+      <w:pPr>
+        <w:spacing w:after="40" w:before="0" w:line="269" w:lineRule="auto"/>
+        <w:ind w:left="312" w:hanging="198"/>
+      </w:pPr>
+      <w:r>
+        <w:rPr>
+          <w:rFonts w:ascii="맑은 고딕" w:hAnsi="맑은 고딕" w:eastAsia="맑은 고딕"/>
+          <w:b w:val="0"/>
+          <w:color w:val="1E407C"/>
+          <w:sz w:val="21"/>
+        </w:rPr>
+        <w:t xml:space="preserve">• </w:t>
+      </w:r>
+      <w:r>
+        <w:rPr>
+          <w:rFonts w:ascii="맑은 고딕" w:hAnsi="맑은 고딕" w:eastAsia="맑은 고딕"/>
+          <w:b w:val="0"/>
+          <w:color w:val="1A1A1A"/>
+          <w:sz w:val="21"/>
+        </w:rPr>
+        <w:t>피지컬 AI는 산업 전선이 넓어지는 이야기다. 주가는 이미 한 번 선반영된 뒤 고점 대비 크게 빠진 상태로, 눈에 보이는 상용화와 주가 시계는 따로 둔다.</w:t>
+      </w:r>
+    </w:p>
+    <w:p>
+      <w:pPr>
+        <w:spacing w:after="40" w:before="0" w:line="269" w:lineRule="auto"/>
+        <w:ind w:left="312" w:hanging="198"/>
+      </w:pPr>
+      <w:r>
+        <w:rPr>
+          <w:rFonts w:ascii="맑은 고딕" w:hAnsi="맑은 고딕" w:eastAsia="맑은 고딕"/>
+          <w:b w:val="0"/>
+          <w:color w:val="1E407C"/>
+          <w:sz w:val="21"/>
+        </w:rPr>
+        <w:t xml:space="preserve">• </w:t>
+      </w:r>
+      <w:r>
+        <w:rPr>
+          <w:rFonts w:ascii="맑은 고딕" w:hAnsi="맑은 고딕" w:eastAsia="맑은 고딕"/>
+          <w:b w:val="0"/>
+          <w:color w:val="1A1A1A"/>
+          <w:sz w:val="21"/>
+        </w:rPr>
+        <w:t>고점 매도는 맞히기 어렵다는 전제로, 줄이려면 내년 봄까지 나눠 팔라는 조언이 있다. 횡보 구간에서는 배당으로 시간을 버티는 선택도 적혀 있다.</w:t>
+      </w:r>
+    </w:p>
+    <w:p>
+      <w:pPr>
+        <w:spacing w:after="40" w:before="0" w:line="269" w:lineRule="auto"/>
+        <w:ind w:left="312" w:hanging="198"/>
+      </w:pPr>
+      <w:r>
+        <w:rPr>
+          <w:rFonts w:ascii="맑은 고딕" w:hAnsi="맑은 고딕" w:eastAsia="맑은 고딕"/>
+          <w:b w:val="0"/>
+          <w:color w:val="1E407C"/>
+          <w:sz w:val="21"/>
+        </w:rPr>
+        <w:t xml:space="preserve">• </w:t>
+      </w:r>
+      <w:r>
+        <w:rPr>
+          <w:rFonts w:ascii="맑은 고딕" w:hAnsi="맑은 고딕" w:eastAsia="맑은 고딕"/>
+          <w:b w:val="0"/>
+          <w:color w:val="1A1A1A"/>
+          <w:sz w:val="21"/>
+        </w:rPr>
+        <w:t>미국 지수가 신고가인 동안, 중간선거 전까지 오를 때마다 현금을 조금씩 만들라는 월간 코멘트가 있다.</w:t>
       </w:r>
     </w:p>
     <w:p>
@@ -2762,6 +4469,102 @@
           <w:sz w:val="21"/>
         </w:rPr>
         <w:t>연휴 뒤에 종목장이 지속 전개될 가능성에 무게를 둡니다.</w:t>
+      </w:r>
+    </w:p>
+    <w:p>
+      <w:pPr>
+        <w:spacing w:after="40" w:before="0" w:line="269" w:lineRule="auto"/>
+        <w:ind w:left="312" w:hanging="198"/>
+      </w:pPr>
+      <w:r>
+        <w:rPr>
+          <w:rFonts w:ascii="맑은 고딕" w:hAnsi="맑은 고딕" w:eastAsia="맑은 고딕"/>
+          <w:b w:val="0"/>
+          <w:color w:val="1E407C"/>
+          <w:sz w:val="21"/>
+        </w:rPr>
+        <w:t xml:space="preserve">• </w:t>
+      </w:r>
+      <w:r>
+        <w:rPr>
+          <w:rFonts w:ascii="맑은 고딕" w:hAnsi="맑은 고딕" w:eastAsia="맑은 고딕"/>
+          <w:b w:val="0"/>
+          <w:color w:val="1A1A1A"/>
+          <w:sz w:val="21"/>
+        </w:rPr>
+        <w:t>하이닉스 400만 원은 영업이익률 80%와 장기계약 비중 40%가 같이 나올 때의 시나리오다.</w:t>
+      </w:r>
+    </w:p>
+    <w:p>
+      <w:pPr>
+        <w:spacing w:after="40" w:before="0" w:line="269" w:lineRule="auto"/>
+        <w:ind w:left="312" w:hanging="198"/>
+      </w:pPr>
+      <w:r>
+        <w:rPr>
+          <w:rFonts w:ascii="맑은 고딕" w:hAnsi="맑은 고딕" w:eastAsia="맑은 고딕"/>
+          <w:b w:val="0"/>
+          <w:color w:val="1E407C"/>
+          <w:sz w:val="21"/>
+        </w:rPr>
+        <w:t xml:space="preserve">• </w:t>
+      </w:r>
+      <w:r>
+        <w:rPr>
+          <w:rFonts w:ascii="맑은 고딕" w:hAnsi="맑은 고딕" w:eastAsia="맑은 고딕"/>
+          <w:b w:val="0"/>
+          <w:color w:val="1A1A1A"/>
+          <w:sz w:val="21"/>
+        </w:rPr>
+        <w:t>하이닉스 자사주 매수 종료 시점은 10월 15일로 적혀 있다.</w:t>
+      </w:r>
+    </w:p>
+    <w:p>
+      <w:pPr>
+        <w:spacing w:after="40" w:before="0" w:line="269" w:lineRule="auto"/>
+        <w:ind w:left="312" w:hanging="198"/>
+      </w:pPr>
+      <w:r>
+        <w:rPr>
+          <w:rFonts w:ascii="맑은 고딕" w:hAnsi="맑은 고딕" w:eastAsia="맑은 고딕"/>
+          <w:b w:val="0"/>
+          <w:color w:val="1E407C"/>
+          <w:sz w:val="21"/>
+        </w:rPr>
+        <w:t xml:space="preserve">• </w:t>
+      </w:r>
+      <w:r>
+        <w:rPr>
+          <w:rFonts w:ascii="맑은 고딕" w:hAnsi="맑은 고딕" w:eastAsia="맑은 고딕"/>
+          <w:b w:val="0"/>
+          <w:color w:val="1A1A1A"/>
+          <w:sz w:val="21"/>
+        </w:rPr>
+        <w:t>10년물 5.5%는 투자 사이클을 제약할 수 있는 구간으로 적혀 있다.</w:t>
+      </w:r>
+    </w:p>
+    <w:p>
+      <w:pPr>
+        <w:spacing w:after="40" w:before="0" w:line="269" w:lineRule="auto"/>
+        <w:ind w:left="312" w:hanging="198"/>
+      </w:pPr>
+      <w:r>
+        <w:rPr>
+          <w:rFonts w:ascii="맑은 고딕" w:hAnsi="맑은 고딕" w:eastAsia="맑은 고딕"/>
+          <w:b w:val="0"/>
+          <w:color w:val="1E407C"/>
+          <w:sz w:val="21"/>
+        </w:rPr>
+        <w:t xml:space="preserve">• </w:t>
+      </w:r>
+      <w:r>
+        <w:rPr>
+          <w:rFonts w:ascii="맑은 고딕" w:hAnsi="맑은 고딕" w:eastAsia="맑은 고딕"/>
+          <w:b w:val="0"/>
+          <w:color w:val="1A1A1A"/>
+          <w:sz w:val="21"/>
+        </w:rPr>
+        <w:t>11월 3일 미국 중간선거와 그 전 하이퍼스케일러 실적이 다음 확인 일정이다.</w:t>
       </w:r>
     </w:p>
     <w:p>

</xml_diff>

<commit_message>
Distill the five broadcast dialogues as their own sections.
Cut the paste into the Lee, Yeolmae, Jiwon, Yun, and Hyojin talks and keep a point only when its anchor sits inside that show.

Co-authored-by: choijunh-cloud <choijunh-cloud@users.noreply.github.com>
</commit_message>
<xml_diff>
--- a/lectures/투자인사이트 증류.docx
+++ b/lectures/투자인사이트 증류.docx
@@ -3376,6 +3376,1266 @@
           <w:color w:val="0F2043"/>
           <w:sz w:val="32"/>
         </w:rPr>
+        <w:t>유튜브·방송 대담</w:t>
+      </w:r>
+    </w:p>
+    <w:p>
+      <w:pPr>
+        <w:spacing w:before="0" w:after="120" w:line="276" w:lineRule="auto"/>
+        <w:jc w:val="left"/>
+      </w:pPr>
+      <w:r>
+        <w:rPr>
+          <w:rFonts w:ascii="맑은 고딕" w:hAnsi="맑은 고딕" w:eastAsia="맑은 고딕"/>
+          <w:b w:val="0"/>
+          <w:color w:val="4B5563"/>
+          <w:sz w:val="21"/>
+        </w:rPr>
+        <w:t>퀵코멘트와 따로 나눈 녹취다. 그 방송 안에 앵커가 있는 문장만 남긴다.</w:t>
+      </w:r>
+    </w:p>
+    <w:p>
+      <w:pPr>
+        <w:spacing w:before="160" w:after="60" w:line="276" w:lineRule="auto"/>
+        <w:jc w:val="left"/>
+      </w:pPr>
+      <w:r>
+        <w:rPr>
+          <w:rFonts w:ascii="맑은 고딕" w:hAnsi="맑은 고딕" w:eastAsia="맑은 고딕"/>
+          <w:b/>
+          <w:color w:val="1E407C"/>
+          <w:sz w:val="26"/>
+        </w:rPr>
+        <w:t>이선엽 · 이기는 투자사령부 (10월 2일)</w:t>
+      </w:r>
+    </w:p>
+    <w:p>
+      <w:pPr>
+        <w:spacing w:after="40" w:before="0" w:line="269" w:lineRule="auto"/>
+        <w:ind w:left="312" w:hanging="198"/>
+      </w:pPr>
+      <w:r>
+        <w:rPr>
+          <w:rFonts w:ascii="맑은 고딕" w:hAnsi="맑은 고딕" w:eastAsia="맑은 고딕"/>
+          <w:b w:val="0"/>
+          <w:color w:val="1E407C"/>
+          <w:sz w:val="21"/>
+        </w:rPr>
+        <w:t xml:space="preserve">• </w:t>
+      </w:r>
+      <w:r>
+        <w:rPr>
+          <w:rFonts w:ascii="맑은 고딕" w:hAnsi="맑은 고딕" w:eastAsia="맑은 고딕"/>
+          <w:b w:val="0"/>
+          <w:color w:val="1A1A1A"/>
+          <w:sz w:val="21"/>
+        </w:rPr>
+        <w:t>10월 1일 코스피는 약 1.95%, 2일은 약 0.46%였다. 지수는 잔잔하고 종목 간 움직임이 세며, 코스닥은 하루 쉬어 간다는 진행이다.</w:t>
+      </w:r>
+    </w:p>
+    <w:p>
+      <w:pPr>
+        <w:spacing w:after="40" w:before="0" w:line="269" w:lineRule="auto"/>
+        <w:ind w:left="312" w:hanging="198"/>
+      </w:pPr>
+      <w:r>
+        <w:rPr>
+          <w:rFonts w:ascii="맑은 고딕" w:hAnsi="맑은 고딕" w:eastAsia="맑은 고딕"/>
+          <w:b w:val="0"/>
+          <w:color w:val="1E407C"/>
+          <w:sz w:val="21"/>
+        </w:rPr>
+        <w:t xml:space="preserve">• </w:t>
+      </w:r>
+      <w:r>
+        <w:rPr>
+          <w:rFonts w:ascii="맑은 고딕" w:hAnsi="맑은 고딕" w:eastAsia="맑은 고딕"/>
+          <w:b w:val="0"/>
+          <w:color w:val="1A1A1A"/>
+          <w:sz w:val="21"/>
+        </w:rPr>
+        <w:t>미국 10년물은 5.3%까지 올랐다가 5.2% 초반으로 밀렸다. 5.2~5.1%에서 행보하면 실적 시즌에 반도체·소부장·전력으로 압축되며 오를 수 있다는 쪽이다.</w:t>
+      </w:r>
+    </w:p>
+    <w:p>
+      <w:pPr>
+        <w:spacing w:after="40" w:before="0" w:line="269" w:lineRule="auto"/>
+        <w:ind w:left="312" w:hanging="198"/>
+      </w:pPr>
+      <w:r>
+        <w:rPr>
+          <w:rFonts w:ascii="맑은 고딕" w:hAnsi="맑은 고딕" w:eastAsia="맑은 고딕"/>
+          <w:b w:val="0"/>
+          <w:color w:val="1E407C"/>
+          <w:sz w:val="21"/>
+        </w:rPr>
+        <w:t xml:space="preserve">• </w:t>
+      </w:r>
+      <w:r>
+        <w:rPr>
+          <w:rFonts w:ascii="맑은 고딕" w:hAnsi="맑은 고딕" w:eastAsia="맑은 고딕"/>
+          <w:b w:val="0"/>
+          <w:color w:val="1A1A1A"/>
+          <w:sz w:val="21"/>
+        </w:rPr>
+        <w:t>삼성전자 매물대는 28만 원, 그중 28만 5,000원 돌파다. 하이닉스는 190만 원 돌파다.</w:t>
+      </w:r>
+    </w:p>
+    <w:p>
+      <w:pPr>
+        <w:spacing w:after="40" w:before="0" w:line="269" w:lineRule="auto"/>
+        <w:ind w:left="312" w:hanging="198"/>
+      </w:pPr>
+      <w:r>
+        <w:rPr>
+          <w:rFonts w:ascii="맑은 고딕" w:hAnsi="맑은 고딕" w:eastAsia="맑은 고딕"/>
+          <w:b w:val="0"/>
+          <w:color w:val="1E407C"/>
+          <w:sz w:val="21"/>
+        </w:rPr>
+        <w:t xml:space="preserve">• </w:t>
+      </w:r>
+      <w:r>
+        <w:rPr>
+          <w:rFonts w:ascii="맑은 고딕" w:hAnsi="맑은 고딕" w:eastAsia="맑은 고딕"/>
+          <w:b w:val="0"/>
+          <w:color w:val="1A1A1A"/>
+          <w:sz w:val="21"/>
+        </w:rPr>
+        <w:t>자사주 매수는 하락 방어이지 상승 재료가 아니다. 하이닉스 자사주는 10월 15일까지이고, 끝난 뒤가 수급 시험이다.</w:t>
+      </w:r>
+    </w:p>
+    <w:p>
+      <w:pPr>
+        <w:spacing w:after="40" w:before="0" w:line="269" w:lineRule="auto"/>
+        <w:ind w:left="312" w:hanging="198"/>
+      </w:pPr>
+      <w:r>
+        <w:rPr>
+          <w:rFonts w:ascii="맑은 고딕" w:hAnsi="맑은 고딕" w:eastAsia="맑은 고딕"/>
+          <w:b w:val="0"/>
+          <w:color w:val="1E407C"/>
+          <w:sz w:val="21"/>
+        </w:rPr>
+        <w:t xml:space="preserve">• </w:t>
+      </w:r>
+      <w:r>
+        <w:rPr>
+          <w:rFonts w:ascii="맑은 고딕" w:hAnsi="맑은 고딕" w:eastAsia="맑은 고딕"/>
+          <w:b w:val="0"/>
+          <w:color w:val="1A1A1A"/>
+          <w:sz w:val="21"/>
+        </w:rPr>
+        <w:t>마이크론은 고점 대비 약 13%까지 좁혀졌고, 하이닉스는 고점 대비 30% 넘게 벌어져 있다. 격차가 이 정도로 유지되기는 어렵다는 비교다.</w:t>
+      </w:r>
+    </w:p>
+    <w:p>
+      <w:pPr>
+        <w:spacing w:after="40" w:before="0" w:line="269" w:lineRule="auto"/>
+        <w:ind w:left="312" w:hanging="198"/>
+      </w:pPr>
+      <w:r>
+        <w:rPr>
+          <w:rFonts w:ascii="맑은 고딕" w:hAnsi="맑은 고딕" w:eastAsia="맑은 고딕"/>
+          <w:b w:val="0"/>
+          <w:color w:val="1E407C"/>
+          <w:sz w:val="21"/>
+        </w:rPr>
+        <w:t xml:space="preserve">• </w:t>
+      </w:r>
+      <w:r>
+        <w:rPr>
+          <w:rFonts w:ascii="맑은 고딕" w:hAnsi="맑은 고딕" w:eastAsia="맑은 고딕"/>
+          <w:b w:val="0"/>
+          <w:color w:val="1A1A1A"/>
+          <w:sz w:val="21"/>
+        </w:rPr>
+        <w:t>장비 사이클은 5년, 주가는 그 안에서 종목마다 순환한다. 추격보다 이격 조정이고, 초보는 소부장 ETF가 편하다.</w:t>
+      </w:r>
+    </w:p>
+    <w:p>
+      <w:pPr>
+        <w:spacing w:after="40" w:before="0" w:line="269" w:lineRule="auto"/>
+        <w:ind w:left="312" w:hanging="198"/>
+      </w:pPr>
+      <w:r>
+        <w:rPr>
+          <w:rFonts w:ascii="맑은 고딕" w:hAnsi="맑은 고딕" w:eastAsia="맑은 고딕"/>
+          <w:b w:val="0"/>
+          <w:color w:val="1E407C"/>
+          <w:sz w:val="21"/>
+        </w:rPr>
+        <w:t xml:space="preserve">• </w:t>
+      </w:r>
+      <w:r>
+        <w:rPr>
+          <w:rFonts w:ascii="맑은 고딕" w:hAnsi="맑은 고딕" w:eastAsia="맑은 고딕"/>
+          <w:b w:val="0"/>
+          <w:color w:val="1A1A1A"/>
+          <w:sz w:val="21"/>
+        </w:rPr>
+        <w:t>위에 산 물량을 메우는 물타기와, 살아 있는 추세에 나눠 담는 불타기를 구분한다.</w:t>
+      </w:r>
+    </w:p>
+    <w:p>
+      <w:pPr>
+        <w:spacing w:after="40" w:before="0" w:line="269" w:lineRule="auto"/>
+        <w:ind w:left="312" w:hanging="198"/>
+      </w:pPr>
+      <w:r>
+        <w:rPr>
+          <w:rFonts w:ascii="맑은 고딕" w:hAnsi="맑은 고딕" w:eastAsia="맑은 고딕"/>
+          <w:b w:val="0"/>
+          <w:color w:val="1E407C"/>
+          <w:sz w:val="21"/>
+        </w:rPr>
+        <w:t xml:space="preserve">• </w:t>
+      </w:r>
+      <w:r>
+        <w:rPr>
+          <w:rFonts w:ascii="맑은 고딕" w:hAnsi="맑은 고딕" w:eastAsia="맑은 고딕"/>
+          <w:b w:val="0"/>
+          <w:color w:val="1A1A1A"/>
+          <w:sz w:val="21"/>
+        </w:rPr>
+        <w:t>전공정 핵심은 증착이다. 원익IPS·유진테크·주성 중 원익IPS가 편하고, 12만 원까지 밀리면 관심 구간이다. 주성은 실적 확인 전이다.</w:t>
+      </w:r>
+    </w:p>
+    <w:p>
+      <w:pPr>
+        <w:spacing w:after="40" w:before="0" w:line="269" w:lineRule="auto"/>
+        <w:ind w:left="312" w:hanging="198"/>
+      </w:pPr>
+      <w:r>
+        <w:rPr>
+          <w:rFonts w:ascii="맑은 고딕" w:hAnsi="맑은 고딕" w:eastAsia="맑은 고딕"/>
+          <w:b w:val="0"/>
+          <w:color w:val="1E407C"/>
+          <w:sz w:val="21"/>
+        </w:rPr>
+        <w:t xml:space="preserve">• </w:t>
+      </w:r>
+      <w:r>
+        <w:rPr>
+          <w:rFonts w:ascii="맑은 고딕" w:hAnsi="맑은 고딕" w:eastAsia="맑은 고딕"/>
+          <w:b w:val="0"/>
+          <w:color w:val="1A1A1A"/>
+          <w:sz w:val="21"/>
+        </w:rPr>
+        <w:t>HPSP는 고압수소어닐, 식각·세정은 PSK, 후공정은 한미반도체·리노공업이다. TSE는 조정을 기다리고, 소재는 솔브레인·동진쎄미켐·한솔케미칼 중 하나다.</w:t>
+      </w:r>
+    </w:p>
+    <w:p>
+      <w:pPr>
+        <w:spacing w:after="40" w:before="0" w:line="269" w:lineRule="auto"/>
+        <w:ind w:left="312" w:hanging="198"/>
+      </w:pPr>
+      <w:r>
+        <w:rPr>
+          <w:rFonts w:ascii="맑은 고딕" w:hAnsi="맑은 고딕" w:eastAsia="맑은 고딕"/>
+          <w:b w:val="0"/>
+          <w:color w:val="1E407C"/>
+          <w:sz w:val="21"/>
+        </w:rPr>
+        <w:t xml:space="preserve">• </w:t>
+      </w:r>
+      <w:r>
+        <w:rPr>
+          <w:rFonts w:ascii="맑은 고딕" w:hAnsi="맑은 고딕" w:eastAsia="맑은 고딕"/>
+          <w:b w:val="0"/>
+          <w:color w:val="1A1A1A"/>
+          <w:sz w:val="21"/>
+        </w:rPr>
+        <w:t>삼성전기는 내년 약 40배, 2028년을 당기면 약 25배다. 대덕전자는 16.8배로 심텍 18배보다 낮다. 유리기판·필옵틱스는 4만 5,000원대와 급등 때마다 정리하는 자리다.</w:t>
+      </w:r>
+    </w:p>
+    <w:p>
+      <w:pPr>
+        <w:spacing w:before="160" w:after="60" w:line="276" w:lineRule="auto"/>
+        <w:jc w:val="left"/>
+      </w:pPr>
+      <w:r>
+        <w:rPr>
+          <w:rFonts w:ascii="맑은 고딕" w:hAnsi="맑은 고딕" w:eastAsia="맑은 고딕"/>
+          <w:b/>
+          <w:color w:val="1E407C"/>
+          <w:sz w:val="26"/>
+        </w:rPr>
+        <w:t>김열매 · AI와 데이터센터 대담</w:t>
+      </w:r>
+    </w:p>
+    <w:p>
+      <w:pPr>
+        <w:spacing w:after="40" w:before="0" w:line="269" w:lineRule="auto"/>
+        <w:ind w:left="312" w:hanging="198"/>
+      </w:pPr>
+      <w:r>
+        <w:rPr>
+          <w:rFonts w:ascii="맑은 고딕" w:hAnsi="맑은 고딕" w:eastAsia="맑은 고딕"/>
+          <w:b w:val="0"/>
+          <w:color w:val="1E407C"/>
+          <w:sz w:val="21"/>
+        </w:rPr>
+        <w:t xml:space="preserve">• </w:t>
+      </w:r>
+      <w:r>
+        <w:rPr>
+          <w:rFonts w:ascii="맑은 고딕" w:hAnsi="맑은 고딕" w:eastAsia="맑은 고딕"/>
+          <w:b w:val="0"/>
+          <w:color w:val="1A1A1A"/>
+          <w:sz w:val="21"/>
+        </w:rPr>
+        <w:t>빅테크 설비투자는 직전 5년 대비 최근 5년이 약 9배다. 돈은 AI로 가고, 한국 반도체와 전력·인프라가 그 수혜로 언급된다.</w:t>
+      </w:r>
+    </w:p>
+    <w:p>
+      <w:pPr>
+        <w:spacing w:after="40" w:before="0" w:line="269" w:lineRule="auto"/>
+        <w:ind w:left="312" w:hanging="198"/>
+      </w:pPr>
+      <w:r>
+        <w:rPr>
+          <w:rFonts w:ascii="맑은 고딕" w:hAnsi="맑은 고딕" w:eastAsia="맑은 고딕"/>
+          <w:b w:val="0"/>
+          <w:color w:val="1E407C"/>
+          <w:sz w:val="21"/>
+        </w:rPr>
+        <w:t xml:space="preserve">• </w:t>
+      </w:r>
+      <w:r>
+        <w:rPr>
+          <w:rFonts w:ascii="맑은 고딕" w:hAnsi="맑은 고딕" w:eastAsia="맑은 고딕"/>
+          <w:b w:val="0"/>
+          <w:color w:val="1A1A1A"/>
+          <w:sz w:val="21"/>
+        </w:rPr>
+        <w:t>속도 조절은 서로 멈추자는 담합에 가깝다. 2등으로 밀리는 것이 확실한 게임이고 중국이 멈추지 않으면 유지되기 어렵다는 쪽이다.</w:t>
+      </w:r>
+    </w:p>
+    <w:p>
+      <w:pPr>
+        <w:spacing w:after="40" w:before="0" w:line="269" w:lineRule="auto"/>
+        <w:ind w:left="312" w:hanging="198"/>
+      </w:pPr>
+      <w:r>
+        <w:rPr>
+          <w:rFonts w:ascii="맑은 고딕" w:hAnsi="맑은 고딕" w:eastAsia="맑은 고딕"/>
+          <w:b w:val="0"/>
+          <w:color w:val="1E407C"/>
+          <w:sz w:val="21"/>
+        </w:rPr>
+        <w:t xml:space="preserve">• </w:t>
+      </w:r>
+      <w:r>
+        <w:rPr>
+          <w:rFonts w:ascii="맑은 고딕" w:hAnsi="맑은 고딕" w:eastAsia="맑은 고딕"/>
+          <w:b w:val="0"/>
+          <w:color w:val="1A1A1A"/>
+          <w:sz w:val="21"/>
+        </w:rPr>
+        <w:t>중국이 AI·로봇을 밀어붙이는 이유로 인구 감소와 군사 활용이 나온다. 유닛트리 로봇은 내년 4만 대, 다른 언급은 7만 대까지 간다.</w:t>
+      </w:r>
+    </w:p>
+    <w:p>
+      <w:pPr>
+        <w:spacing w:after="40" w:before="0" w:line="269" w:lineRule="auto"/>
+        <w:ind w:left="312" w:hanging="198"/>
+      </w:pPr>
+      <w:r>
+        <w:rPr>
+          <w:rFonts w:ascii="맑은 고딕" w:hAnsi="맑은 고딕" w:eastAsia="맑은 고딕"/>
+          <w:b w:val="0"/>
+          <w:color w:val="1E407C"/>
+          <w:sz w:val="21"/>
+        </w:rPr>
+        <w:t xml:space="preserve">• </w:t>
+      </w:r>
+      <w:r>
+        <w:rPr>
+          <w:rFonts w:ascii="맑은 고딕" w:hAnsi="맑은 고딕" w:eastAsia="맑은 고딕"/>
+          <w:b w:val="0"/>
+          <w:color w:val="1A1A1A"/>
+          <w:sz w:val="21"/>
+        </w:rPr>
+        <w:t>에이전트 보안 사고는 현실이다. 그래도 미국은 사고를 감수하고 깔아 보는 선택에 가깝고, 규제만으로 레이스가 멈춘다고 보지 않는다.</w:t>
+      </w:r>
+    </w:p>
+    <w:p>
+      <w:pPr>
+        <w:spacing w:after="40" w:before="0" w:line="269" w:lineRule="auto"/>
+        <w:ind w:left="312" w:hanging="198"/>
+      </w:pPr>
+      <w:r>
+        <w:rPr>
+          <w:rFonts w:ascii="맑은 고딕" w:hAnsi="맑은 고딕" w:eastAsia="맑은 고딕"/>
+          <w:b w:val="0"/>
+          <w:color w:val="1E407C"/>
+          <w:sz w:val="21"/>
+        </w:rPr>
+        <w:t xml:space="preserve">• </w:t>
+      </w:r>
+      <w:r>
+        <w:rPr>
+          <w:rFonts w:ascii="맑은 고딕" w:hAnsi="맑은 고딕" w:eastAsia="맑은 고딕"/>
+          <w:b w:val="0"/>
+          <w:color w:val="1A1A1A"/>
+          <w:sz w:val="21"/>
+        </w:rPr>
+        <w:t>오픈AI가 흔들려도 인수자가 나올 수 있다. 미국 빅테크 시가총액이 커서, 기술만 있으면 증자로 살 수 있다는 비유다.</w:t>
+      </w:r>
+    </w:p>
+    <w:p>
+      <w:pPr>
+        <w:spacing w:after="40" w:before="0" w:line="269" w:lineRule="auto"/>
+        <w:ind w:left="312" w:hanging="198"/>
+      </w:pPr>
+      <w:r>
+        <w:rPr>
+          <w:rFonts w:ascii="맑은 고딕" w:hAnsi="맑은 고딕" w:eastAsia="맑은 고딕"/>
+          <w:b w:val="0"/>
+          <w:color w:val="1E407C"/>
+          <w:sz w:val="21"/>
+        </w:rPr>
+        <w:t xml:space="preserve">• </w:t>
+      </w:r>
+      <w:r>
+        <w:rPr>
+          <w:rFonts w:ascii="맑은 고딕" w:hAnsi="맑은 고딕" w:eastAsia="맑은 고딕"/>
+          <w:b w:val="0"/>
+          <w:color w:val="1A1A1A"/>
+          <w:sz w:val="21"/>
+        </w:rPr>
+        <w:t>주피터는 2.4GW, 총 210억 달러 중 자기자본 약 30억 달러·건설 대출 180억 달러다. 대출은 오라클 장부 밖이고, 공사 지연 시 임대료를 못 낸다는 선언이 나왔다.</w:t>
+      </w:r>
+    </w:p>
+    <w:p>
+      <w:pPr>
+        <w:spacing w:after="40" w:before="0" w:line="269" w:lineRule="auto"/>
+        <w:ind w:left="312" w:hanging="198"/>
+      </w:pPr>
+      <w:r>
+        <w:rPr>
+          <w:rFonts w:ascii="맑은 고딕" w:hAnsi="맑은 고딕" w:eastAsia="맑은 고딕"/>
+          <w:b w:val="0"/>
+          <w:color w:val="1E407C"/>
+          <w:sz w:val="21"/>
+        </w:rPr>
+        <w:t xml:space="preserve">• </w:t>
+      </w:r>
+      <w:r>
+        <w:rPr>
+          <w:rFonts w:ascii="맑은 고딕" w:hAnsi="맑은 고딕" w:eastAsia="맑은 고딕"/>
+          <w:b w:val="0"/>
+          <w:color w:val="1A1A1A"/>
+          <w:sz w:val="21"/>
+        </w:rPr>
+        <w:t>오라클은 하이퍼스케일러 중 신용등급이 가장 아래다. 한 단계 더 내려가면 투기등급이라는 설명이고, 여기가 버티면 나머지를 덜 걱정해도 된다는 모니터링 대상이다.</w:t>
+      </w:r>
+    </w:p>
+    <w:p>
+      <w:pPr>
+        <w:spacing w:after="40" w:before="0" w:line="269" w:lineRule="auto"/>
+        <w:ind w:left="312" w:hanging="198"/>
+      </w:pPr>
+      <w:r>
+        <w:rPr>
+          <w:rFonts w:ascii="맑은 고딕" w:hAnsi="맑은 고딕" w:eastAsia="맑은 고딕"/>
+          <w:b w:val="0"/>
+          <w:color w:val="1E407C"/>
+          <w:sz w:val="21"/>
+        </w:rPr>
+        <w:t xml:space="preserve">• </w:t>
+      </w:r>
+      <w:r>
+        <w:rPr>
+          <w:rFonts w:ascii="맑은 고딕" w:hAnsi="맑은 고딕" w:eastAsia="맑은 고딕"/>
+          <w:b w:val="0"/>
+          <w:color w:val="1A1A1A"/>
+          <w:sz w:val="21"/>
+        </w:rPr>
+        <w:t>GPU 임대료는 안정적이고 토큰 가격은 내려간다. 토큰 가격 하락은 원가로 읽힌다. 미국 발전 예비율은 약 30%이고, 병목은 데이터센터를 두려는 지역의 송전·인허가다.</w:t>
+      </w:r>
+    </w:p>
+    <w:p>
+      <w:pPr>
+        <w:spacing w:after="40" w:before="0" w:line="269" w:lineRule="auto"/>
+        <w:ind w:left="312" w:hanging="198"/>
+      </w:pPr>
+      <w:r>
+        <w:rPr>
+          <w:rFonts w:ascii="맑은 고딕" w:hAnsi="맑은 고딕" w:eastAsia="맑은 고딕"/>
+          <w:b w:val="0"/>
+          <w:color w:val="1E407C"/>
+          <w:sz w:val="21"/>
+        </w:rPr>
+        <w:t xml:space="preserve">• </w:t>
+      </w:r>
+      <w:r>
+        <w:rPr>
+          <w:rFonts w:ascii="맑은 고딕" w:hAnsi="맑은 고딕" w:eastAsia="맑은 고딕"/>
+          <w:b w:val="0"/>
+          <w:color w:val="1A1A1A"/>
+          <w:sz w:val="21"/>
+        </w:rPr>
+        <w:t>10월은 중간선거 전까지 버틴다는 월간 코멘트가 있다. 미국 지수가 신고가면 오를 때마다 현금을 조금 만든다. 주식 100%라면 10월 말 현금 10~20%가 7대 3에 가깝다.</w:t>
+      </w:r>
+    </w:p>
+    <w:p>
+      <w:pPr>
+        <w:spacing w:after="40" w:before="0" w:line="269" w:lineRule="auto"/>
+        <w:ind w:left="312" w:hanging="198"/>
+      </w:pPr>
+      <w:r>
+        <w:rPr>
+          <w:rFonts w:ascii="맑은 고딕" w:hAnsi="맑은 고딕" w:eastAsia="맑은 고딕"/>
+          <w:b w:val="0"/>
+          <w:color w:val="1E407C"/>
+          <w:sz w:val="21"/>
+        </w:rPr>
+        <w:t xml:space="preserve">• </w:t>
+      </w:r>
+      <w:r>
+        <w:rPr>
+          <w:rFonts w:ascii="맑은 고딕" w:hAnsi="맑은 고딕" w:eastAsia="맑은 고딕"/>
+          <w:b w:val="0"/>
+          <w:color w:val="1A1A1A"/>
+          <w:sz w:val="21"/>
+        </w:rPr>
+        <w:t>유럽은 기존에 잘하던 산업 외에, 새로 세계를 이끄는 항목이 잘 안 보인다는 평가다.</w:t>
+      </w:r>
+    </w:p>
+    <w:p>
+      <w:pPr>
+        <w:spacing w:before="160" w:after="60" w:line="276" w:lineRule="auto"/>
+        <w:jc w:val="left"/>
+      </w:pPr>
+      <w:r>
+        <w:rPr>
+          <w:rFonts w:ascii="맑은 고딕" w:hAnsi="맑은 고딕" w:eastAsia="맑은 고딕"/>
+          <w:b/>
+          <w:color w:val="1E407C"/>
+          <w:sz w:val="26"/>
+        </w:rPr>
+        <w:t>이지원 · 주말 인터뷰 (외국인 수급)</w:t>
+      </w:r>
+    </w:p>
+    <w:p>
+      <w:pPr>
+        <w:spacing w:after="40" w:before="0" w:line="269" w:lineRule="auto"/>
+        <w:ind w:left="312" w:hanging="198"/>
+      </w:pPr>
+      <w:r>
+        <w:rPr>
+          <w:rFonts w:ascii="맑은 고딕" w:hAnsi="맑은 고딕" w:eastAsia="맑은 고딕"/>
+          <w:b w:val="0"/>
+          <w:color w:val="1E407C"/>
+          <w:sz w:val="21"/>
+        </w:rPr>
+        <w:t xml:space="preserve">• </w:t>
+      </w:r>
+      <w:r>
+        <w:rPr>
+          <w:rFonts w:ascii="맑은 고딕" w:hAnsi="맑은 고딕" w:eastAsia="맑은 고딕"/>
+          <w:b w:val="0"/>
+          <w:color w:val="1A1A1A"/>
+          <w:sz w:val="21"/>
+        </w:rPr>
+        <w:t>추석 이후 외국인의 코스피 매도가 수조 원이다. 순매도로 보이지만 외국인을 한 주체로 보면 안 된다.</w:t>
+      </w:r>
+    </w:p>
+    <w:p>
+      <w:pPr>
+        <w:spacing w:after="40" w:before="0" w:line="269" w:lineRule="auto"/>
+        <w:ind w:left="312" w:hanging="198"/>
+      </w:pPr>
+      <w:r>
+        <w:rPr>
+          <w:rFonts w:ascii="맑은 고딕" w:hAnsi="맑은 고딕" w:eastAsia="맑은 고딕"/>
+          <w:b w:val="0"/>
+          <w:color w:val="1E407C"/>
+          <w:sz w:val="21"/>
+        </w:rPr>
+        <w:t xml:space="preserve">• </w:t>
+      </w:r>
+      <w:r>
+        <w:rPr>
+          <w:rFonts w:ascii="맑은 고딕" w:hAnsi="맑은 고딕" w:eastAsia="맑은 고딕"/>
+          <w:b w:val="0"/>
+          <w:color w:val="1A1A1A"/>
+          <w:sz w:val="21"/>
+        </w:rPr>
+        <w:t>7월 29일 저점 이후 개인이 코스피에서 약 25조 원, 삼성전자 약 4,400만 주, 하이닉스 약 700만 주를 팔았다. 매도의 큰 주체는 개인이다.</w:t>
+      </w:r>
+    </w:p>
+    <w:p>
+      <w:pPr>
+        <w:spacing w:after="40" w:before="0" w:line="269" w:lineRule="auto"/>
+        <w:ind w:left="312" w:hanging="198"/>
+      </w:pPr>
+      <w:r>
+        <w:rPr>
+          <w:rFonts w:ascii="맑은 고딕" w:hAnsi="맑은 고딕" w:eastAsia="맑은 고딕"/>
+          <w:b w:val="0"/>
+          <w:color w:val="1E407C"/>
+          <w:sz w:val="21"/>
+        </w:rPr>
+        <w:t xml:space="preserve">• </w:t>
+      </w:r>
+      <w:r>
+        <w:rPr>
+          <w:rFonts w:ascii="맑은 고딕" w:hAnsi="맑은 고딕" w:eastAsia="맑은 고딕"/>
+          <w:b w:val="0"/>
+          <w:color w:val="1A1A1A"/>
+          <w:sz w:val="21"/>
+        </w:rPr>
+        <w:t>패시브 매도는 계속이고, 중장기 펀드 매수는 그 속에 가려 순매도로만 보인다. 중장기 자금은 단기 변동성을 크게 만들지 않는다.</w:t>
+      </w:r>
+    </w:p>
+    <w:p>
+      <w:pPr>
+        <w:spacing w:after="40" w:before="0" w:line="269" w:lineRule="auto"/>
+        <w:ind w:left="312" w:hanging="198"/>
+      </w:pPr>
+      <w:r>
+        <w:rPr>
+          <w:rFonts w:ascii="맑은 고딕" w:hAnsi="맑은 고딕" w:eastAsia="맑은 고딕"/>
+          <w:b w:val="0"/>
+          <w:color w:val="1E407C"/>
+          <w:sz w:val="21"/>
+        </w:rPr>
+        <w:t xml:space="preserve">• </w:t>
+      </w:r>
+      <w:r>
+        <w:rPr>
+          <w:rFonts w:ascii="맑은 고딕" w:hAnsi="맑은 고딕" w:eastAsia="맑은 고딕"/>
+          <w:b w:val="0"/>
+          <w:color w:val="1A1A1A"/>
+          <w:sz w:val="21"/>
+        </w:rPr>
+        <w:t>환율이 대형주 이익에 주는 민감도는 과거보다 줄었다. 삼성 영업이익 규모가 커져, 환율로 깎이는 금액이 전체에서 차지하는 비중이 작아졌다는 계산이다. 소부장은 헤지와 해외 생산이 약해 여전히 민감하다.</w:t>
+      </w:r>
+    </w:p>
+    <w:p>
+      <w:pPr>
+        <w:spacing w:after="40" w:before="0" w:line="269" w:lineRule="auto"/>
+        <w:ind w:left="312" w:hanging="198"/>
+      </w:pPr>
+      <w:r>
+        <w:rPr>
+          <w:rFonts w:ascii="맑은 고딕" w:hAnsi="맑은 고딕" w:eastAsia="맑은 고딕"/>
+          <w:b w:val="0"/>
+          <w:color w:val="1E407C"/>
+          <w:sz w:val="21"/>
+        </w:rPr>
+        <w:t xml:space="preserve">• </w:t>
+      </w:r>
+      <w:r>
+        <w:rPr>
+          <w:rFonts w:ascii="맑은 고딕" w:hAnsi="맑은 고딕" w:eastAsia="맑은 고딕"/>
+          <w:b w:val="0"/>
+          <w:color w:val="1A1A1A"/>
+          <w:sz w:val="21"/>
+        </w:rPr>
+        <w:t>원·달러 1,500원대는 과거에는 외국인 장기자금의 매수 구간이었다. 이번에는 패시브 매도가 커서 그 매수가 순매수로 드러나지 않았다.</w:t>
+      </w:r>
+    </w:p>
+    <w:p>
+      <w:pPr>
+        <w:spacing w:after="40" w:before="0" w:line="269" w:lineRule="auto"/>
+        <w:ind w:left="312" w:hanging="198"/>
+      </w:pPr>
+      <w:r>
+        <w:rPr>
+          <w:rFonts w:ascii="맑은 고딕" w:hAnsi="맑은 고딕" w:eastAsia="맑은 고딕"/>
+          <w:b w:val="0"/>
+          <w:color w:val="1E407C"/>
+          <w:sz w:val="21"/>
+        </w:rPr>
+        <w:t xml:space="preserve">• </w:t>
+      </w:r>
+      <w:r>
+        <w:rPr>
+          <w:rFonts w:ascii="맑은 고딕" w:hAnsi="맑은 고딕" w:eastAsia="맑은 고딕"/>
+          <w:b w:val="0"/>
+          <w:color w:val="1A1A1A"/>
+          <w:sz w:val="21"/>
+        </w:rPr>
+        <w:t>오후 2시 전후 선물 청산과 월·목 위클리 옵션은 당일 변동성이다. 펀더멘털 추세와는 별개로 본다.</w:t>
+      </w:r>
+    </w:p>
+    <w:p>
+      <w:pPr>
+        <w:spacing w:after="40" w:before="0" w:line="269" w:lineRule="auto"/>
+        <w:ind w:left="312" w:hanging="198"/>
+      </w:pPr>
+      <w:r>
+        <w:rPr>
+          <w:rFonts w:ascii="맑은 고딕" w:hAnsi="맑은 고딕" w:eastAsia="맑은 고딕"/>
+          <w:b w:val="0"/>
+          <w:color w:val="1E407C"/>
+          <w:sz w:val="21"/>
+        </w:rPr>
+        <w:t xml:space="preserve">• </w:t>
+      </w:r>
+      <w:r>
+        <w:rPr>
+          <w:rFonts w:ascii="맑은 고딕" w:hAnsi="맑은 고딕" w:eastAsia="맑은 고딕"/>
+          <w:b w:val="0"/>
+          <w:color w:val="1A1A1A"/>
+          <w:sz w:val="21"/>
+        </w:rPr>
+        <w:t>9월에 매크로 악재가 쏟아졌는데 시장이 급락하지 않은 것이 상방 근거로 쓰인다. 엇박자 구간에서는 추격 매수와 공포 매도를 피한다.</w:t>
+      </w:r>
+    </w:p>
+    <w:p>
+      <w:pPr>
+        <w:spacing w:after="40" w:before="0" w:line="269" w:lineRule="auto"/>
+        <w:ind w:left="312" w:hanging="198"/>
+      </w:pPr>
+      <w:r>
+        <w:rPr>
+          <w:rFonts w:ascii="맑은 고딕" w:hAnsi="맑은 고딕" w:eastAsia="맑은 고딕"/>
+          <w:b w:val="0"/>
+          <w:color w:val="1E407C"/>
+          <w:sz w:val="21"/>
+        </w:rPr>
+        <w:t xml:space="preserve">• </w:t>
+      </w:r>
+      <w:r>
+        <w:rPr>
+          <w:rFonts w:ascii="맑은 고딕" w:hAnsi="맑은 고딕" w:eastAsia="맑은 고딕"/>
+          <w:b w:val="0"/>
+          <w:color w:val="1A1A1A"/>
+          <w:sz w:val="21"/>
+        </w:rPr>
+        <w:t>하이닉스 400만 원에는 영업이익률 80%와 장기계약 40%가 필요하다. 마이크론 매출총이익률 80%대(87%·83%로 언급)가 그 숫자가 가능하다는 근거로 나온다. 2027년은 예상보다 더 타이트하다.</w:t>
+      </w:r>
+    </w:p>
+    <w:p>
+      <w:pPr>
+        <w:spacing w:after="40" w:before="0" w:line="269" w:lineRule="auto"/>
+        <w:ind w:left="312" w:hanging="198"/>
+      </w:pPr>
+      <w:r>
+        <w:rPr>
+          <w:rFonts w:ascii="맑은 고딕" w:hAnsi="맑은 고딕" w:eastAsia="맑은 고딕"/>
+          <w:b w:val="0"/>
+          <w:color w:val="1E407C"/>
+          <w:sz w:val="21"/>
+        </w:rPr>
+        <w:t xml:space="preserve">• </w:t>
+      </w:r>
+      <w:r>
+        <w:rPr>
+          <w:rFonts w:ascii="맑은 고딕" w:hAnsi="맑은 고딕" w:eastAsia="맑은 고딕"/>
+          <w:b w:val="0"/>
+          <w:color w:val="1A1A1A"/>
+          <w:sz w:val="21"/>
+        </w:rPr>
+        <w:t>장기금리가 높은 것 자체는 경기가 괜찮다는 신호로도 읽힌다. 더 경계할 것은 단기금리가 장기금리를 다시 넘어서는 장단기 역전이다.</w:t>
+      </w:r>
+    </w:p>
+    <w:p>
+      <w:pPr>
+        <w:spacing w:before="160" w:after="60" w:line="276" w:lineRule="auto"/>
+        <w:jc w:val="left"/>
+      </w:pPr>
+      <w:r>
+        <w:rPr>
+          <w:rFonts w:ascii="맑은 고딕" w:hAnsi="맑은 고딕" w:eastAsia="맑은 고딕"/>
+          <w:b/>
+          <w:color w:val="1E407C"/>
+          <w:sz w:val="26"/>
+        </w:rPr>
+        <w:t>윤지호 · 와이즈 대담 (이익과 할인율)</w:t>
+      </w:r>
+    </w:p>
+    <w:p>
+      <w:pPr>
+        <w:spacing w:after="40" w:before="0" w:line="269" w:lineRule="auto"/>
+        <w:ind w:left="312" w:hanging="198"/>
+      </w:pPr>
+      <w:r>
+        <w:rPr>
+          <w:rFonts w:ascii="맑은 고딕" w:hAnsi="맑은 고딕" w:eastAsia="맑은 고딕"/>
+          <w:b w:val="0"/>
+          <w:color w:val="1E407C"/>
+          <w:sz w:val="21"/>
+        </w:rPr>
+        <w:t xml:space="preserve">• </w:t>
+      </w:r>
+      <w:r>
+        <w:rPr>
+          <w:rFonts w:ascii="맑은 고딕" w:hAnsi="맑은 고딕" w:eastAsia="맑은 고딕"/>
+          <w:b w:val="0"/>
+          <w:color w:val="1A1A1A"/>
+          <w:sz w:val="21"/>
+        </w:rPr>
+        <w:t>역대급 실적인데 주가가 못 가는 질문은 PER이 낮은 이유다. 늘어나는 이익과 할인율의 힘겨루기로 본다.</w:t>
+      </w:r>
+    </w:p>
+    <w:p>
+      <w:pPr>
+        <w:spacing w:after="40" w:before="0" w:line="269" w:lineRule="auto"/>
+        <w:ind w:left="312" w:hanging="198"/>
+      </w:pPr>
+      <w:r>
+        <w:rPr>
+          <w:rFonts w:ascii="맑은 고딕" w:hAnsi="맑은 고딕" w:eastAsia="맑은 고딕"/>
+          <w:b w:val="0"/>
+          <w:color w:val="1E407C"/>
+          <w:sz w:val="21"/>
+        </w:rPr>
+        <w:t xml:space="preserve">• </w:t>
+      </w:r>
+      <w:r>
+        <w:rPr>
+          <w:rFonts w:ascii="맑은 고딕" w:hAnsi="맑은 고딕" w:eastAsia="맑은 고딕"/>
+          <w:b w:val="0"/>
+          <w:color w:val="1A1A1A"/>
+          <w:sz w:val="21"/>
+        </w:rPr>
+        <w:t>화장품은 수출이 좋은데도 성장 속도가 과거만 못하고 환율·원가 의심이 붙으며 멀티플이 죽었다. 퀄리티 종목은 그 의심이 가격에 나올 때 본다. 용기 원가 하나로 실적이 좌우된다는 해설은 과하다고 본다.</w:t>
+      </w:r>
+    </w:p>
+    <w:p>
+      <w:pPr>
+        <w:spacing w:after="40" w:before="0" w:line="269" w:lineRule="auto"/>
+        <w:ind w:left="312" w:hanging="198"/>
+      </w:pPr>
+      <w:r>
+        <w:rPr>
+          <w:rFonts w:ascii="맑은 고딕" w:hAnsi="맑은 고딕" w:eastAsia="맑은 고딕"/>
+          <w:b w:val="0"/>
+          <w:color w:val="1E407C"/>
+          <w:sz w:val="21"/>
+        </w:rPr>
+        <w:t xml:space="preserve">• </w:t>
+      </w:r>
+      <w:r>
+        <w:rPr>
+          <w:rFonts w:ascii="맑은 고딕" w:hAnsi="맑은 고딕" w:eastAsia="맑은 고딕"/>
+          <w:b w:val="0"/>
+          <w:color w:val="1A1A1A"/>
+          <w:sz w:val="21"/>
+        </w:rPr>
+        <w:t>반도체 수출 금액은 강한 반면 단가는 주춤하다. 가격 사이클에서 물량 사이클로 넘어가는 초입이고, 증설 물량의 본격 반영은 그 이후다.</w:t>
+      </w:r>
+    </w:p>
+    <w:p>
+      <w:pPr>
+        <w:spacing w:after="40" w:before="0" w:line="269" w:lineRule="auto"/>
+        <w:ind w:left="312" w:hanging="198"/>
+      </w:pPr>
+      <w:r>
+        <w:rPr>
+          <w:rFonts w:ascii="맑은 고딕" w:hAnsi="맑은 고딕" w:eastAsia="맑은 고딕"/>
+          <w:b w:val="0"/>
+          <w:color w:val="1E407C"/>
+          <w:sz w:val="21"/>
+        </w:rPr>
+        <w:t xml:space="preserve">• </w:t>
+      </w:r>
+      <w:r>
+        <w:rPr>
+          <w:rFonts w:ascii="맑은 고딕" w:hAnsi="맑은 고딕" w:eastAsia="맑은 고딕"/>
+          <w:b w:val="0"/>
+          <w:color w:val="1A1A1A"/>
+          <w:sz w:val="21"/>
+        </w:rPr>
+        <w:t>그래서 대형 메모리 비중을 줄이고 소부장·장비를 본다. 장비는 현재 배수만 보면 비싸도, 숫자가 2028년으로 넘어가면 배수가 내려오는 자리다.</w:t>
+      </w:r>
+    </w:p>
+    <w:p>
+      <w:pPr>
+        <w:spacing w:after="40" w:before="0" w:line="269" w:lineRule="auto"/>
+        <w:ind w:left="312" w:hanging="198"/>
+      </w:pPr>
+      <w:r>
+        <w:rPr>
+          <w:rFonts w:ascii="맑은 고딕" w:hAnsi="맑은 고딕" w:eastAsia="맑은 고딕"/>
+          <w:b w:val="0"/>
+          <w:color w:val="1E407C"/>
+          <w:sz w:val="21"/>
+        </w:rPr>
+        <w:t xml:space="preserve">• </w:t>
+      </w:r>
+      <w:r>
+        <w:rPr>
+          <w:rFonts w:ascii="맑은 고딕" w:hAnsi="맑은 고딕" w:eastAsia="맑은 고딕"/>
+          <w:b w:val="0"/>
+          <w:color w:val="1A1A1A"/>
+          <w:sz w:val="21"/>
+        </w:rPr>
+        <w:t>7월 말 이후 2028년에도 15% 이상 성장으로 분류된 종목은 약 26%, 2027년 피크아웃 분류는 약 14% 올랐다. 싼 배수는 2028년 증익률이 둔화된다는 가격이다.</w:t>
+      </w:r>
+    </w:p>
+    <w:p>
+      <w:pPr>
+        <w:spacing w:after="40" w:before="0" w:line="269" w:lineRule="auto"/>
+        <w:ind w:left="312" w:hanging="198"/>
+      </w:pPr>
+      <w:r>
+        <w:rPr>
+          <w:rFonts w:ascii="맑은 고딕" w:hAnsi="맑은 고딕" w:eastAsia="맑은 고딕"/>
+          <w:b w:val="0"/>
+          <w:color w:val="1E407C"/>
+          <w:sz w:val="21"/>
+        </w:rPr>
+        <w:t xml:space="preserve">• </w:t>
+      </w:r>
+      <w:r>
+        <w:rPr>
+          <w:rFonts w:ascii="맑은 고딕" w:hAnsi="맑은 고딕" w:eastAsia="맑은 고딕"/>
+          <w:b w:val="0"/>
+          <w:color w:val="1A1A1A"/>
+          <w:sz w:val="21"/>
+        </w:rPr>
+        <w:t>이익은 의견이고 현금이 팩트다. 하이퍼스케일러 프리캐시플로가 마르면 반도체 매수 여력이 줄어든다. 국채 금리가 5%면 위험자산의 요구수익률이 올라 그 현금흐름이 더 마른다.</w:t>
+      </w:r>
+    </w:p>
+    <w:p>
+      <w:pPr>
+        <w:spacing w:after="40" w:before="0" w:line="269" w:lineRule="auto"/>
+        <w:ind w:left="312" w:hanging="198"/>
+      </w:pPr>
+      <w:r>
+        <w:rPr>
+          <w:rFonts w:ascii="맑은 고딕" w:hAnsi="맑은 고딕" w:eastAsia="맑은 고딕"/>
+          <w:b w:val="0"/>
+          <w:color w:val="1E407C"/>
+          <w:sz w:val="21"/>
+        </w:rPr>
+        <w:t xml:space="preserve">• </w:t>
+      </w:r>
+      <w:r>
+        <w:rPr>
+          <w:rFonts w:ascii="맑은 고딕" w:hAnsi="맑은 고딕" w:eastAsia="맑은 고딕"/>
+          <w:b w:val="0"/>
+          <w:color w:val="1A1A1A"/>
+          <w:sz w:val="21"/>
+        </w:rPr>
+        <w:t>10년물 5.5%는 투자 사이클이 금리를 올리던 구간의 스트레스 라인이다. 최근 상승분은 상당 부분 실질금리다. 약한 고리로 프랑스 국채를 본다.</w:t>
+      </w:r>
+    </w:p>
+    <w:p>
+      <w:pPr>
+        <w:spacing w:after="40" w:before="0" w:line="269" w:lineRule="auto"/>
+        <w:ind w:left="312" w:hanging="198"/>
+      </w:pPr>
+      <w:r>
+        <w:rPr>
+          <w:rFonts w:ascii="맑은 고딕" w:hAnsi="맑은 고딕" w:eastAsia="맑은 고딕"/>
+          <w:b w:val="0"/>
+          <w:color w:val="1E407C"/>
+          <w:sz w:val="21"/>
+        </w:rPr>
+        <w:t xml:space="preserve">• </w:t>
+      </w:r>
+      <w:r>
+        <w:rPr>
+          <w:rFonts w:ascii="맑은 고딕" w:hAnsi="맑은 고딕" w:eastAsia="맑은 고딕"/>
+          <w:b w:val="0"/>
+          <w:color w:val="1A1A1A"/>
+          <w:sz w:val="21"/>
+        </w:rPr>
+        <w:t>한국 선행지수는 오르는데 동행지수는 못 따라온다. 지수는 박스이고, 변동성 지수가 낮아 위아래가 열릴 수 있다. 지수 방향 베팅 구간으로 보지 않는다.</w:t>
+      </w:r>
+    </w:p>
+    <w:p>
+      <w:pPr>
+        <w:spacing w:after="40" w:before="0" w:line="269" w:lineRule="auto"/>
+        <w:ind w:left="312" w:hanging="198"/>
+      </w:pPr>
+      <w:r>
+        <w:rPr>
+          <w:rFonts w:ascii="맑은 고딕" w:hAnsi="맑은 고딕" w:eastAsia="맑은 고딕"/>
+          <w:b w:val="0"/>
+          <w:color w:val="1E407C"/>
+          <w:sz w:val="21"/>
+        </w:rPr>
+        <w:t xml:space="preserve">• </w:t>
+      </w:r>
+      <w:r>
+        <w:rPr>
+          <w:rFonts w:ascii="맑은 고딕" w:hAnsi="맑은 고딕" w:eastAsia="맑은 고딕"/>
+          <w:b w:val="0"/>
+          <w:color w:val="1A1A1A"/>
+          <w:sz w:val="21"/>
+        </w:rPr>
+        <w:t>지금 작동하는 규칙은 높은 배수에 사서 낮아진 배수에 파는 쪽이다. 선행투자의 과실이 내년 하반기 이후에 나오는 장비·전력·파운드리를 고른다.</w:t>
+      </w:r>
+    </w:p>
+    <w:p>
+      <w:pPr>
+        <w:spacing w:before="160" w:after="60" w:line="276" w:lineRule="auto"/>
+        <w:jc w:val="left"/>
+      </w:pPr>
+      <w:r>
+        <w:rPr>
+          <w:rFonts w:ascii="맑은 고딕" w:hAnsi="맑은 고딕" w:eastAsia="맑은 고딕"/>
+          <w:b/>
+          <w:color w:val="1E407C"/>
+          <w:sz w:val="26"/>
+        </w:rPr>
+        <w:t>김효진 · 신영증권 대담 (산업과 주가)</w:t>
+      </w:r>
+    </w:p>
+    <w:p>
+      <w:pPr>
+        <w:spacing w:after="40" w:before="0" w:line="269" w:lineRule="auto"/>
+        <w:ind w:left="312" w:hanging="198"/>
+      </w:pPr>
+      <w:r>
+        <w:rPr>
+          <w:rFonts w:ascii="맑은 고딕" w:hAnsi="맑은 고딕" w:eastAsia="맑은 고딕"/>
+          <w:b w:val="0"/>
+          <w:color w:val="1E407C"/>
+          <w:sz w:val="21"/>
+        </w:rPr>
+        <w:t xml:space="preserve">• </w:t>
+      </w:r>
+      <w:r>
+        <w:rPr>
+          <w:rFonts w:ascii="맑은 고딕" w:hAnsi="맑은 고딕" w:eastAsia="맑은 고딕"/>
+          <w:b w:val="0"/>
+          <w:color w:val="1A1A1A"/>
+          <w:sz w:val="21"/>
+        </w:rPr>
+        <w:t>마이크론 실적과 전망은 강한데, 시장은 새 뉴스처럼 반응하기보다 넘어가는 쪽에 가깝다.</w:t>
+      </w:r>
+    </w:p>
+    <w:p>
+      <w:pPr>
+        <w:spacing w:after="40" w:before="0" w:line="269" w:lineRule="auto"/>
+        <w:ind w:left="312" w:hanging="198"/>
+      </w:pPr>
+      <w:r>
+        <w:rPr>
+          <w:rFonts w:ascii="맑은 고딕" w:hAnsi="맑은 고딕" w:eastAsia="맑은 고딕"/>
+          <w:b w:val="0"/>
+          <w:color w:val="1E407C"/>
+          <w:sz w:val="21"/>
+        </w:rPr>
+        <w:t xml:space="preserve">• </w:t>
+      </w:r>
+      <w:r>
+        <w:rPr>
+          <w:rFonts w:ascii="맑은 고딕" w:hAnsi="맑은 고딕" w:eastAsia="맑은 고딕"/>
+          <w:b w:val="0"/>
+          <w:color w:val="1A1A1A"/>
+          <w:sz w:val="21"/>
+        </w:rPr>
+        <w:t>이익 수준이 높아도 증가 속도가 유지되면 주가는 횡보가 아니다. 모멘텀의 기울기가 완만해지면 주가는 빠진다.</w:t>
+      </w:r>
+    </w:p>
+    <w:p>
+      <w:pPr>
+        <w:spacing w:after="40" w:before="0" w:line="269" w:lineRule="auto"/>
+        <w:ind w:left="312" w:hanging="198"/>
+      </w:pPr>
+      <w:r>
+        <w:rPr>
+          <w:rFonts w:ascii="맑은 고딕" w:hAnsi="맑은 고딕" w:eastAsia="맑은 고딕"/>
+          <w:b w:val="0"/>
+          <w:color w:val="1E407C"/>
+          <w:sz w:val="21"/>
+        </w:rPr>
+        <w:t xml:space="preserve">• </w:t>
+      </w:r>
+      <w:r>
+        <w:rPr>
+          <w:rFonts w:ascii="맑은 고딕" w:hAnsi="맑은 고딕" w:eastAsia="맑은 고딕"/>
+          <w:b w:val="0"/>
+          <w:color w:val="1A1A1A"/>
+          <w:sz w:val="21"/>
+        </w:rPr>
+        <w:t>AI 산업은 가도, 그 주식 랠리가 몇 년 더 이어진다고는 보지 않는다. 산업의 길이와 주가의 길이는 다르다.</w:t>
+      </w:r>
+    </w:p>
+    <w:p>
+      <w:pPr>
+        <w:spacing w:after="40" w:before="0" w:line="269" w:lineRule="auto"/>
+        <w:ind w:left="312" w:hanging="198"/>
+      </w:pPr>
+      <w:r>
+        <w:rPr>
+          <w:rFonts w:ascii="맑은 고딕" w:hAnsi="맑은 고딕" w:eastAsia="맑은 고딕"/>
+          <w:b w:val="0"/>
+          <w:color w:val="1E407C"/>
+          <w:sz w:val="21"/>
+        </w:rPr>
+        <w:t xml:space="preserve">• </w:t>
+      </w:r>
+      <w:r>
+        <w:rPr>
+          <w:rFonts w:ascii="맑은 고딕" w:hAnsi="맑은 고딕" w:eastAsia="맑은 고딕"/>
+          <w:b w:val="0"/>
+          <w:color w:val="1A1A1A"/>
+          <w:sz w:val="21"/>
+        </w:rPr>
+        <w:t>닷컴 당시 통신 투자는 그 뒤로도 계속 늘었지만 관련 주가는 무너졌다. 투자가 계속된다는 사실만으로 주가가 지키지지 않는다.</w:t>
+      </w:r>
+    </w:p>
+    <w:p>
+      <w:pPr>
+        <w:spacing w:after="40" w:before="0" w:line="269" w:lineRule="auto"/>
+        <w:ind w:left="312" w:hanging="198"/>
+      </w:pPr>
+      <w:r>
+        <w:rPr>
+          <w:rFonts w:ascii="맑은 고딕" w:hAnsi="맑은 고딕" w:eastAsia="맑은 고딕"/>
+          <w:b w:val="0"/>
+          <w:color w:val="1E407C"/>
+          <w:sz w:val="21"/>
+        </w:rPr>
+        <w:t xml:space="preserve">• </w:t>
+      </w:r>
+      <w:r>
+        <w:rPr>
+          <w:rFonts w:ascii="맑은 고딕" w:hAnsi="맑은 고딕" w:eastAsia="맑은 고딕"/>
+          <w:b w:val="0"/>
+          <w:color w:val="1A1A1A"/>
+          <w:sz w:val="21"/>
+        </w:rPr>
+        <w:t>핵과 우주 경쟁처럼 전선이 숨은 모델 경쟁에서 에이전트·피지컬로 넓어진다. 피지컬 주가는 이미 한 번 갔다가 고점 대비 크게 빠졌고, 안전 검증 때문에 눈에 보이는 보급은 더 늦다.</w:t>
+      </w:r>
+    </w:p>
+    <w:p>
+      <w:pPr>
+        <w:spacing w:after="40" w:before="0" w:line="269" w:lineRule="auto"/>
+        <w:ind w:left="312" w:hanging="198"/>
+      </w:pPr>
+      <w:r>
+        <w:rPr>
+          <w:rFonts w:ascii="맑은 고딕" w:hAnsi="맑은 고딕" w:eastAsia="맑은 고딕"/>
+          <w:b w:val="0"/>
+          <w:color w:val="1E407C"/>
+          <w:sz w:val="21"/>
+        </w:rPr>
+        <w:t xml:space="preserve">• </w:t>
+      </w:r>
+      <w:r>
+        <w:rPr>
+          <w:rFonts w:ascii="맑은 고딕" w:hAnsi="맑은 고딕" w:eastAsia="맑은 고딕"/>
+          <w:b w:val="0"/>
+          <w:color w:val="1A1A1A"/>
+          <w:sz w:val="21"/>
+        </w:rPr>
+        <w:t>삼전·닉스 매물대는 일정 허들을 넘으면 계속 발목을 잡지는 않는다는 쪽이다. 본전이라고 바로 파는 구간은 다시 탄력이 붙으면 팔기 어려워진다.</w:t>
+      </w:r>
+    </w:p>
+    <w:p>
+      <w:pPr>
+        <w:spacing w:after="40" w:before="0" w:line="269" w:lineRule="auto"/>
+        <w:ind w:left="312" w:hanging="198"/>
+      </w:pPr>
+      <w:r>
+        <w:rPr>
+          <w:rFonts w:ascii="맑은 고딕" w:hAnsi="맑은 고딕" w:eastAsia="맑은 고딕"/>
+          <w:b w:val="0"/>
+          <w:color w:val="1E407C"/>
+          <w:sz w:val="21"/>
+        </w:rPr>
+        <w:t xml:space="preserve">• </w:t>
+      </w:r>
+      <w:r>
+        <w:rPr>
+          <w:rFonts w:ascii="맑은 고딕" w:hAnsi="맑은 고딕" w:eastAsia="맑은 고딕"/>
+          <w:b w:val="0"/>
+          <w:color w:val="1A1A1A"/>
+          <w:sz w:val="21"/>
+        </w:rPr>
+        <w:t>고점 매도는 맞히기 어렵다. 줄이려면 내년 봄까지 잘게 나눈다. 지수가 상쾌하게 오르기 어려운 구간에서는 배당·커버드콜로 시간을 버틴다.</w:t>
+      </w:r>
+    </w:p>
+    <w:p>
+      <w:pPr>
+        <w:spacing w:after="40" w:before="0" w:line="269" w:lineRule="auto"/>
+        <w:ind w:left="312" w:hanging="198"/>
+      </w:pPr>
+      <w:r>
+        <w:rPr>
+          <w:rFonts w:ascii="맑은 고딕" w:hAnsi="맑은 고딕" w:eastAsia="맑은 고딕"/>
+          <w:b w:val="0"/>
+          <w:color w:val="1E407C"/>
+          <w:sz w:val="21"/>
+        </w:rPr>
+        <w:t xml:space="preserve">• </w:t>
+      </w:r>
+      <w:r>
+        <w:rPr>
+          <w:rFonts w:ascii="맑은 고딕" w:hAnsi="맑은 고딕" w:eastAsia="맑은 고딕"/>
+          <w:b w:val="0"/>
+          <w:color w:val="1A1A1A"/>
+          <w:sz w:val="21"/>
+        </w:rPr>
+        <w:t>10월 말 하이퍼스케일러 실적과 11월 3일 중간선거가 다음 일정이다. 결과의 방향보다, 확인하고 싶던 이벤트가 지나간 뒤 지수가 지금보다 위에 있을 수 있다고 본다.</w:t>
+      </w:r>
+    </w:p>
+    <w:p>
+      <w:pPr>
+        <w:spacing w:after="40" w:before="0" w:line="269" w:lineRule="auto"/>
+        <w:ind w:left="312" w:hanging="198"/>
+      </w:pPr>
+      <w:r>
+        <w:rPr>
+          <w:rFonts w:ascii="맑은 고딕" w:hAnsi="맑은 고딕" w:eastAsia="맑은 고딕"/>
+          <w:b w:val="0"/>
+          <w:color w:val="1E407C"/>
+          <w:sz w:val="21"/>
+        </w:rPr>
+        <w:t xml:space="preserve">• </w:t>
+      </w:r>
+      <w:r>
+        <w:rPr>
+          <w:rFonts w:ascii="맑은 고딕" w:hAnsi="맑은 고딕" w:eastAsia="맑은 고딕"/>
+          <w:b w:val="0"/>
+          <w:color w:val="1A1A1A"/>
+          <w:sz w:val="21"/>
+        </w:rPr>
+        <w:t>올해의 실수로 수급의 파괴력을 꼽는다. 기업 본질이 나빠지지 않아도 수급이 먼저 흔들리고, 미국 펀드 포지션은 미리 보이지 않는다. 수급은 재료보다 앞설 수 있다.</w:t>
+      </w:r>
+    </w:p>
+    <w:p>
+      <w:pPr>
+        <w:spacing w:after="40" w:before="0" w:line="269" w:lineRule="auto"/>
+        <w:ind w:left="312" w:hanging="198"/>
+      </w:pPr>
+      <w:r>
+        <w:rPr>
+          <w:rFonts w:ascii="맑은 고딕" w:hAnsi="맑은 고딕" w:eastAsia="맑은 고딕"/>
+          <w:b w:val="0"/>
+          <w:color w:val="1E407C"/>
+          <w:sz w:val="21"/>
+        </w:rPr>
+        <w:t xml:space="preserve">• </w:t>
+      </w:r>
+      <w:r>
+        <w:rPr>
+          <w:rFonts w:ascii="맑은 고딕" w:hAnsi="맑은 고딕" w:eastAsia="맑은 고딕"/>
+          <w:b w:val="0"/>
+          <w:color w:val="1A1A1A"/>
+          <w:sz w:val="21"/>
+        </w:rPr>
+        <w:t>성장주가 버는 돈 대비 극단적으로 비싸 보이지는 않는다. 금리 하나 같은 단일 요인으로 고점을 맞히려고 하지 말라는 쪽이다.</w:t>
+      </w:r>
+    </w:p>
+    <w:p>
+      <w:pPr>
+        <w:spacing w:before="240" w:after="120" w:line="276" w:lineRule="auto"/>
+        <w:jc w:val="left"/>
+        <w:pBdr>
+          <w:bottom w:val="single" w:sz="12" w:space="3" w:color="0F2043"/>
+        </w:pBdr>
+      </w:pPr>
+      <w:r>
+        <w:rPr>
+          <w:rFonts w:ascii="맑은 고딕" w:hAnsi="맑은 고딕" w:eastAsia="맑은 고딕"/>
+          <w:b/>
+          <w:color w:val="0F2043"/>
+          <w:sz w:val="32"/>
+        </w:rPr>
         <w:t>2차 분석</w:t>
       </w:r>
     </w:p>

</xml_diff>

<commit_message>
Add five October talks to the single insight note.
노근창, 박수현, 목대균·이경규, RTS, and 신중호 are folded into the same chapters, with the new robot section kept separate from the memory and rate notes.

Co-authored-by: choijunh-cloud <choijunh-cloud@users.noreply.github.com>
</commit_message>
<xml_diff>
--- a/lectures/투자인사이트 증류.docx
+++ b/lectures/투자인사이트 증류.docx
@@ -44,7 +44,7 @@
           <w:color w:val="4B5563"/>
           <w:sz w:val="21"/>
         </w:rPr>
-        <w:t>퀵코멘트 55개 · 대담 5편 · 한 노트 98문장</w:t>
+        <w:t>퀵코멘트 55개 · 대담 10편 · 한 노트 152문장</w:t>
       </w:r>
     </w:p>
     <w:tbl>
@@ -204,16 +204,16 @@
           <w:color w:val="1A1A1A"/>
           <w:sz w:val="21"/>
         </w:rPr>
-        <w:t xml:space="preserve">이선엽  </w:t>
-      </w:r>
-      <w:r>
-        <w:rPr>
-          <w:rFonts w:ascii="맑은 고딕" w:hAnsi="맑은 고딕" w:eastAsia="맑은 고딕"/>
-          <w:b w:val="0"/>
-          <w:color w:val="1A1A1A"/>
-          <w:sz w:val="21"/>
-        </w:rPr>
-        <w:t>미국 10년물은 5.3%까지 올랐다가 5.2% 초반으로 밀렸다. 5.2~5.1%에서 행보하면 실적 시즌에 반도체·소부장·전력으로 압축되며 오를 수 있다는 쪽이다.</w:t>
+        <w:t xml:space="preserve">목대균·이경규  </w:t>
+      </w:r>
+      <w:r>
+        <w:rPr>
+          <w:rFonts w:ascii="맑은 고딕" w:hAnsi="맑은 고딕" w:eastAsia="맑은 고딕"/>
+          <w:b w:val="0"/>
+          <w:color w:val="1A1A1A"/>
+          <w:sz w:val="21"/>
+        </w:rPr>
+        <w:t>10년물 5%는 미국 명목 성장률과 가까운 정상화다. 2009~2020년 저금리에 익숙했던 부채가 아플 뿐이다. 관세 물가는 내년으로 갈수록 약해 5% 중반은 오버슈팅일 수 있고, 균형은 4%대다. 1~2%로는 돌아가기 어렵다. 인프라 투자는 올해 8,000억 달러, 내년 1조~1조 2,000억 달러다. 회사채 수요의 정점은 2027년이고 2028년 이후 빅테크 현금이 돌아오면 완화된다.</w:t>
       </w:r>
     </w:p>
     <w:p>
@@ -237,16 +237,16 @@
           <w:color w:val="1A1A1A"/>
           <w:sz w:val="21"/>
         </w:rPr>
-        <w:t xml:space="preserve">퀵코멘트  </w:t>
-      </w:r>
-      <w:r>
-        <w:rPr>
-          <w:rFonts w:ascii="맑은 고딕" w:hAnsi="맑은 고딕" w:eastAsia="맑은 고딕"/>
-          <w:b w:val="0"/>
-          <w:color w:val="1A1A1A"/>
-          <w:sz w:val="21"/>
-        </w:rPr>
-        <w:t>8월 근원 PCE 3.008%는 개정 효과다. 개정 7월 2.983%에서 사실상 보합이고, 3개월 연율은 약 2.05%, 6개월 연율은 약 2.74%다.</w:t>
+        <w:t xml:space="preserve">신중호  </w:t>
+      </w:r>
+      <w:r>
+        <w:rPr>
+          <w:rFonts w:ascii="맑은 고딕" w:hAnsi="맑은 고딕" w:eastAsia="맑은 고딕"/>
+          <w:b w:val="0"/>
+          <w:color w:val="1A1A1A"/>
+          <w:sz w:val="21"/>
+        </w:rPr>
+        <w:t>장기채 공급 부담은 2025년부터 이미 높았다. 최근 금리 급등은 그 기간 프리미엄보다 유가와 인상 기대, 주거비 뺀 근원 서비스 물가다. 애틀랜타 연준 GDP는 5%에서 3.8%로 내려왔다. 경기가 식으며 금리가 안정되는 길은 지수가 먼저 흔들릴 수 있다. 4%대 중반과 규제 완화까지는 시간이 더 필요하다.</w:t>
       </w:r>
     </w:p>
     <w:p>
@@ -270,16 +270,16 @@
           <w:color w:val="1A1A1A"/>
           <w:sz w:val="21"/>
         </w:rPr>
-        <w:t xml:space="preserve">퀵코멘트  </w:t>
-      </w:r>
-      <w:r>
-        <w:rPr>
-          <w:rFonts w:ascii="맑은 고딕" w:hAnsi="맑은 고딕" w:eastAsia="맑은 고딕"/>
-          <w:b w:val="0"/>
-          <w:color w:val="1A1A1A"/>
-          <w:sz w:val="21"/>
-        </w:rPr>
-        <w:t>데이비드 저보스는 높은 장기금리를 새 정상으로 두기보다, 재무부 국채 바이백으로 시간을 벌고 생산성 개선이 물가를 낮추기를 기다린다는 쪽이다.</w:t>
+        <w:t xml:space="preserve">신중호  </w:t>
+      </w:r>
+      <w:r>
+        <w:rPr>
+          <w:rFonts w:ascii="맑은 고딕" w:hAnsi="맑은 고딕" w:eastAsia="맑은 고딕"/>
+          <w:b w:val="0"/>
+          <w:color w:val="1A1A1A"/>
+          <w:sz w:val="21"/>
+        </w:rPr>
+        <w:t>미국 은행은 현금 약 3조 달러를 갖고 대출 비중은 약 54%다. 국채를 팔지 않아도 현금이 대출로 나오게 하는 SLR 완화는 준비됐지만 선거 전 눈치로 아직이다. 선거 이후 스트레스 테스트가 끝나면 AI 투자 자금이 풀릴 수 있다. 미국 금융주와 한국 AI 밸류체인에 호재다.</w:t>
       </w:r>
     </w:p>
     <w:p>
@@ -303,16 +303,16 @@
           <w:color w:val="1A1A1A"/>
           <w:sz w:val="21"/>
         </w:rPr>
-        <w:t xml:space="preserve">이지원  </w:t>
-      </w:r>
-      <w:r>
-        <w:rPr>
-          <w:rFonts w:ascii="맑은 고딕" w:hAnsi="맑은 고딕" w:eastAsia="맑은 고딕"/>
-          <w:b w:val="0"/>
-          <w:color w:val="1A1A1A"/>
-          <w:sz w:val="21"/>
-        </w:rPr>
-        <w:t>9월에 매크로 악재가 쏟아졌는데 시장이 급락하지 않은 것이 상방 근거로 쓰인다. 엇박자 구간에서는 추격 매수와 공포 매도를 피한다.</w:t>
+        <w:t xml:space="preserve">RTS  </w:t>
+      </w:r>
+      <w:r>
+        <w:rPr>
+          <w:rFonts w:ascii="맑은 고딕" w:hAnsi="맑은 고딕" w:eastAsia="맑은 고딕"/>
+          <w:b w:val="0"/>
+          <w:color w:val="1A1A1A"/>
+          <w:sz w:val="21"/>
+        </w:rPr>
+        <w:t>미중 정상회담은 숫자 합의보다 태평양을 둘이 나누자는 구도가 다시 나온 자리로 읽힌다. 한국에는 2,000억 달러 투자 약정 중 알래스카 LNG 540억 달러를, 협의 전에 미국이 발표했다. 발언자의 해석이고, 동맹 체면과 협상력이 약해지면 경제 현안도 막힌다는 경고다.</w:t>
       </w:r>
     </w:p>
     <w:p>
@@ -336,16 +336,16 @@
           <w:color w:val="1A1A1A"/>
           <w:sz w:val="21"/>
         </w:rPr>
-        <w:t xml:space="preserve">이지원  </w:t>
-      </w:r>
-      <w:r>
-        <w:rPr>
-          <w:rFonts w:ascii="맑은 고딕" w:hAnsi="맑은 고딕" w:eastAsia="맑은 고딕"/>
-          <w:b w:val="0"/>
-          <w:color w:val="1A1A1A"/>
-          <w:sz w:val="21"/>
-        </w:rPr>
-        <w:t>장기금리가 높은 것 자체는 경기가 괜찮다는 신호로도 읽힌다. 더 경계할 것은 단기금리가 장기금리를 다시 넘어서는 장단기 역전이다.</w:t>
+        <w:t xml:space="preserve">목대균·이경규  </w:t>
+      </w:r>
+      <w:r>
+        <w:rPr>
+          <w:rFonts w:ascii="맑은 고딕" w:hAnsi="맑은 고딕" w:eastAsia="맑은 고딕"/>
+          <w:b w:val="0"/>
+          <w:color w:val="1A1A1A"/>
+          <w:sz w:val="21"/>
+        </w:rPr>
+        <w:t>1970년대는 공급 7% 차질에 유가가 130% 올랐다. 이번 호르무즈는 차질이 약 15%로 더 큰데 상승은 약 30%에 그쳤다. 중국이 비축을 풀고 우회 수출이 됐기 때문이다. 전쟁이 끝나면 브렌트는 70~80달러가 현실적이고, 증시의 더 큰 줄기는 AI다.</w:t>
       </w:r>
     </w:p>
     <w:p>
@@ -369,16 +369,16 @@
           <w:color w:val="1A1A1A"/>
           <w:sz w:val="21"/>
         </w:rPr>
-        <w:t xml:space="preserve">김열매  </w:t>
-      </w:r>
-      <w:r>
-        <w:rPr>
-          <w:rFonts w:ascii="맑은 고딕" w:hAnsi="맑은 고딕" w:eastAsia="맑은 고딕"/>
-          <w:b w:val="0"/>
-          <w:color w:val="1A1A1A"/>
-          <w:sz w:val="21"/>
-        </w:rPr>
-        <w:t>빅테크 설비투자는 직전 5년 대비 최근 5년이 약 9배다. 돈은 AI로 가고, 한국 반도체와 전력·인프라가 그 수혜로 언급된다.</w:t>
+        <w:t xml:space="preserve">RTS  </w:t>
+      </w:r>
+      <w:r>
+        <w:rPr>
+          <w:rFonts w:ascii="맑은 고딕" w:hAnsi="맑은 고딕" w:eastAsia="맑은 고딕"/>
+          <w:b w:val="0"/>
+          <w:color w:val="1A1A1A"/>
+          <w:sz w:val="21"/>
+        </w:rPr>
+        <w:t>4분기는 한 해를 정리하는 분기다. 기관 자금은 11월에 갱신되고, 금리가 오른 뒤 내부 수익률 7%를 못 넘기면 프로젝트가 멈춘다. 돈은 기업과 데이터센터로 몰려 물 먹는 하마처럼 빠져 있다. 그 투자가 생산성으로 돌아와야 돈이 다시 돈다.</w:t>
       </w:r>
     </w:p>
     <w:p>
@@ -402,16 +402,16 @@
           <w:color w:val="1A1A1A"/>
           <w:sz w:val="21"/>
         </w:rPr>
-        <w:t xml:space="preserve">퀵코멘트  </w:t>
-      </w:r>
-      <w:r>
-        <w:rPr>
-          <w:rFonts w:ascii="맑은 고딕" w:hAnsi="맑은 고딕" w:eastAsia="맑은 고딕"/>
-          <w:b w:val="0"/>
-          <w:color w:val="1A1A1A"/>
-          <w:sz w:val="21"/>
-        </w:rPr>
-        <w:t>10월 동결만으로 지수 전체가 한 단계 오르기는 제한적이다. 초과수익은 AI 직접·간접 노출로 적혀 있다.</w:t>
+        <w:t xml:space="preserve">목대균·이경규  </w:t>
+      </w:r>
+      <w:r>
+        <w:rPr>
+          <w:rFonts w:ascii="맑은 고딕" w:hAnsi="맑은 고딕" w:eastAsia="맑은 고딕"/>
+          <w:b w:val="0"/>
+          <w:color w:val="1A1A1A"/>
+          <w:sz w:val="21"/>
+        </w:rPr>
+        <w:t>9월 미국 10년물은 약 49bp 올랐는데 대부분은 물가가 아니라 실질금리다. 돈값이 비싸져 멀티플은 눌리고, 메모리 이익 추정은 오히려 올라간다. 주가는 옆으로 버틴다.</w:t>
       </w:r>
     </w:p>
     <w:p>
@@ -435,16 +435,16 @@
           <w:color w:val="1A1A1A"/>
           <w:sz w:val="21"/>
         </w:rPr>
-        <w:t xml:space="preserve">퀵코멘트  </w:t>
-      </w:r>
-      <w:r>
-        <w:rPr>
-          <w:rFonts w:ascii="맑은 고딕" w:hAnsi="맑은 고딕" w:eastAsia="맑은 고딕"/>
-          <w:b w:val="0"/>
-          <w:color w:val="1A1A1A"/>
-          <w:sz w:val="21"/>
-        </w:rPr>
-        <w:t>고용 3개월 평균은 약 5만 명이고, 직전 두 달 합산 6만 명 하향이 있다. 전월은 13.3만 명이다.</w:t>
+        <w:t xml:space="preserve">이선엽  </w:t>
+      </w:r>
+      <w:r>
+        <w:rPr>
+          <w:rFonts w:ascii="맑은 고딕" w:hAnsi="맑은 고딕" w:eastAsia="맑은 고딕"/>
+          <w:b w:val="0"/>
+          <w:color w:val="1A1A1A"/>
+          <w:sz w:val="21"/>
+        </w:rPr>
+        <w:t>미국 10년물은 5.3%까지 올랐다가 5.2% 초반으로 밀렸다. 5.2~5.1%에서 행보하면 실적 시즌에 반도체·소부장·전력으로 압축되며 오를 수 있다는 쪽이다.</w:t>
       </w:r>
     </w:p>
     <w:p>
@@ -468,16 +468,16 @@
           <w:color w:val="1A1A1A"/>
           <w:sz w:val="21"/>
         </w:rPr>
-        <w:t xml:space="preserve">퀵코멘트  </w:t>
-      </w:r>
-      <w:r>
-        <w:rPr>
-          <w:rFonts w:ascii="맑은 고딕" w:hAnsi="맑은 고딕" w:eastAsia="맑은 고딕"/>
-          <w:b w:val="0"/>
-          <w:color w:val="1A1A1A"/>
-          <w:sz w:val="21"/>
-        </w:rPr>
-        <w:t>고용 쇼크의 프레임은 Bad Jobs, Good Stocks다. 침체보다 인상 확률 하락으로 읽혔다.</w:t>
+        <w:t xml:space="preserve">RTS  </w:t>
+      </w:r>
+      <w:r>
+        <w:rPr>
+          <w:rFonts w:ascii="맑은 고딕" w:hAnsi="맑은 고딕" w:eastAsia="맑은 고딕"/>
+          <w:b w:val="0"/>
+          <w:color w:val="1A1A1A"/>
+          <w:sz w:val="21"/>
+        </w:rPr>
+        <w:t>연간으로 코스피는 약 66% 올랐고 코스닥은 아직 마이너스다. S&amp;P는 약 12%, 나스닥은 약 15%다. 다우·러셀은 약하다. 한국만 못 가는 그림은 아니다.</w:t>
       </w:r>
     </w:p>
     <w:p>
@@ -501,16 +501,16 @@
           <w:color w:val="1A1A1A"/>
           <w:sz w:val="21"/>
         </w:rPr>
-        <w:t xml:space="preserve">김열매  </w:t>
-      </w:r>
-      <w:r>
-        <w:rPr>
-          <w:rFonts w:ascii="맑은 고딕" w:hAnsi="맑은 고딕" w:eastAsia="맑은 고딕"/>
-          <w:b w:val="0"/>
-          <w:color w:val="1A1A1A"/>
-          <w:sz w:val="21"/>
-        </w:rPr>
-        <w:t>유럽은 기존에 잘하던 산업 외에, 새로 세계를 이끄는 항목이 잘 안 보인다는 평가다.</w:t>
+        <w:t xml:space="preserve">퀵코멘트  </w:t>
+      </w:r>
+      <w:r>
+        <w:rPr>
+          <w:rFonts w:ascii="맑은 고딕" w:hAnsi="맑은 고딕" w:eastAsia="맑은 고딕"/>
+          <w:b w:val="0"/>
+          <w:color w:val="1A1A1A"/>
+          <w:sz w:val="21"/>
+        </w:rPr>
+        <w:t>8월 근원 PCE 3.008%는 개정 효과다. 개정 7월 2.983%에서 사실상 보합이고, 3개월 연율은 약 2.05%, 6개월 연율은 약 2.74%다.</w:t>
       </w:r>
     </w:p>
     <w:p>
@@ -543,7 +543,7 @@
           <w:color w:val="1A1A1A"/>
           <w:sz w:val="21"/>
         </w:rPr>
-        <w:t>따라서 단기적으로는 금리 부담 완화 요인. 유가 $100+와 장기 인플레가 지속되면 추가 인상 가능성은 여전히 열려 있음</w:t>
+        <w:t>데이비드 저보스는 높은 장기금리를 새 정상으로 두기보다, 재무부 국채 바이백으로 시간을 벌고 생산성 개선이 물가를 낮추기를 기다린다는 쪽이다.</w:t>
       </w:r>
     </w:p>
     <w:p>
@@ -567,6 +567,138 @@
           <w:color w:val="1A1A1A"/>
           <w:sz w:val="21"/>
         </w:rPr>
+        <w:t xml:space="preserve">목대균·이경규  </w:t>
+      </w:r>
+      <w:r>
+        <w:rPr>
+          <w:rFonts w:ascii="맑은 고딕" w:hAnsi="맑은 고딕" w:eastAsia="맑은 고딕"/>
+          <w:b w:val="0"/>
+          <w:color w:val="1A1A1A"/>
+          <w:sz w:val="21"/>
+        </w:rPr>
+        <w:t>한국 증시가 고금리에도 버티는 것은 이익 증가가 금리보다 빠르고, 성장이 소비가 아니라 투자에서 나오기 때문이다. 가계 소비는 실제로 어렵다.</w:t>
+      </w:r>
+    </w:p>
+    <w:p>
+      <w:pPr>
+        <w:spacing w:after="40" w:before="0" w:line="269" w:lineRule="auto"/>
+        <w:ind w:left="312" w:hanging="198"/>
+      </w:pPr>
+      <w:r>
+        <w:rPr>
+          <w:rFonts w:ascii="맑은 고딕" w:hAnsi="맑은 고딕" w:eastAsia="맑은 고딕"/>
+          <w:b w:val="0"/>
+          <w:color w:val="1E407C"/>
+          <w:sz w:val="21"/>
+        </w:rPr>
+        <w:t xml:space="preserve">• </w:t>
+      </w:r>
+      <w:r>
+        <w:rPr>
+          <w:rFonts w:ascii="맑은 고딕" w:hAnsi="맑은 고딕" w:eastAsia="맑은 고딕"/>
+          <w:b/>
+          <w:color w:val="1A1A1A"/>
+          <w:sz w:val="21"/>
+        </w:rPr>
+        <w:t xml:space="preserve">이지원  </w:t>
+      </w:r>
+      <w:r>
+        <w:rPr>
+          <w:rFonts w:ascii="맑은 고딕" w:hAnsi="맑은 고딕" w:eastAsia="맑은 고딕"/>
+          <w:b w:val="0"/>
+          <w:color w:val="1A1A1A"/>
+          <w:sz w:val="21"/>
+        </w:rPr>
+        <w:t>9월에 매크로 악재가 쏟아졌는데 시장이 급락하지 않은 것이 상방 근거로 쓰인다. 엇박자 구간에서는 추격 매수와 공포 매도를 피한다.</w:t>
+      </w:r>
+    </w:p>
+    <w:p>
+      <w:pPr>
+        <w:spacing w:after="40" w:before="0" w:line="269" w:lineRule="auto"/>
+        <w:ind w:left="312" w:hanging="198"/>
+      </w:pPr>
+      <w:r>
+        <w:rPr>
+          <w:rFonts w:ascii="맑은 고딕" w:hAnsi="맑은 고딕" w:eastAsia="맑은 고딕"/>
+          <w:b w:val="0"/>
+          <w:color w:val="1E407C"/>
+          <w:sz w:val="21"/>
+        </w:rPr>
+        <w:t xml:space="preserve">• </w:t>
+      </w:r>
+      <w:r>
+        <w:rPr>
+          <w:rFonts w:ascii="맑은 고딕" w:hAnsi="맑은 고딕" w:eastAsia="맑은 고딕"/>
+          <w:b/>
+          <w:color w:val="1A1A1A"/>
+          <w:sz w:val="21"/>
+        </w:rPr>
+        <w:t xml:space="preserve">이지원  </w:t>
+      </w:r>
+      <w:r>
+        <w:rPr>
+          <w:rFonts w:ascii="맑은 고딕" w:hAnsi="맑은 고딕" w:eastAsia="맑은 고딕"/>
+          <w:b w:val="0"/>
+          <w:color w:val="1A1A1A"/>
+          <w:sz w:val="21"/>
+        </w:rPr>
+        <w:t>장기금리가 높은 것 자체는 경기가 괜찮다는 신호로도 읽힌다. 더 경계할 것은 단기금리가 장기금리를 다시 넘어서는 장단기 역전이다.</w:t>
+      </w:r>
+    </w:p>
+    <w:p>
+      <w:pPr>
+        <w:spacing w:after="40" w:before="0" w:line="269" w:lineRule="auto"/>
+        <w:ind w:left="312" w:hanging="198"/>
+      </w:pPr>
+      <w:r>
+        <w:rPr>
+          <w:rFonts w:ascii="맑은 고딕" w:hAnsi="맑은 고딕" w:eastAsia="맑은 고딕"/>
+          <w:b w:val="0"/>
+          <w:color w:val="1E407C"/>
+          <w:sz w:val="21"/>
+        </w:rPr>
+        <w:t xml:space="preserve">• </w:t>
+      </w:r>
+      <w:r>
+        <w:rPr>
+          <w:rFonts w:ascii="맑은 고딕" w:hAnsi="맑은 고딕" w:eastAsia="맑은 고딕"/>
+          <w:b/>
+          <w:color w:val="1A1A1A"/>
+          <w:sz w:val="21"/>
+        </w:rPr>
+        <w:t xml:space="preserve">김열매  </w:t>
+      </w:r>
+      <w:r>
+        <w:rPr>
+          <w:rFonts w:ascii="맑은 고딕" w:hAnsi="맑은 고딕" w:eastAsia="맑은 고딕"/>
+          <w:b w:val="0"/>
+          <w:color w:val="1A1A1A"/>
+          <w:sz w:val="21"/>
+        </w:rPr>
+        <w:t>빅테크 설비투자는 직전 5년 대비 최근 5년이 약 9배다. 돈은 AI로 가고, 한국 반도체와 전력·인프라가 그 수혜로 언급된다.</w:t>
+      </w:r>
+    </w:p>
+    <w:p>
+      <w:pPr>
+        <w:spacing w:after="40" w:before="0" w:line="269" w:lineRule="auto"/>
+        <w:ind w:left="312" w:hanging="198"/>
+      </w:pPr>
+      <w:r>
+        <w:rPr>
+          <w:rFonts w:ascii="맑은 고딕" w:hAnsi="맑은 고딕" w:eastAsia="맑은 고딕"/>
+          <w:b w:val="0"/>
+          <w:color w:val="1E407C"/>
+          <w:sz w:val="21"/>
+        </w:rPr>
+        <w:t xml:space="preserve">• </w:t>
+      </w:r>
+      <w:r>
+        <w:rPr>
+          <w:rFonts w:ascii="맑은 고딕" w:hAnsi="맑은 고딕" w:eastAsia="맑은 고딕"/>
+          <w:b/>
+          <w:color w:val="1A1A1A"/>
+          <w:sz w:val="21"/>
+        </w:rPr>
         <w:t xml:space="preserve">퀵코멘트  </w:t>
       </w:r>
       <w:r>
@@ -576,7 +708,139 @@
           <w:color w:val="1A1A1A"/>
           <w:sz w:val="21"/>
         </w:rPr>
-        <w:t>9월 11일부터 10월 2일까지 금리가 +30bp인 동안 SOX +11%, 마이크론 +10.2%, 코스닥 +8.9%였다.</w:t>
+        <w:t>10월 동결만으로 지수 전체가 한 단계 오르기는 제한적이다. 초과수익은 AI 직접·간접 노출로 적혀 있다.</w:t>
+      </w:r>
+    </w:p>
+    <w:p>
+      <w:pPr>
+        <w:spacing w:after="40" w:before="0" w:line="269" w:lineRule="auto"/>
+        <w:ind w:left="312" w:hanging="198"/>
+      </w:pPr>
+      <w:r>
+        <w:rPr>
+          <w:rFonts w:ascii="맑은 고딕" w:hAnsi="맑은 고딕" w:eastAsia="맑은 고딕"/>
+          <w:b w:val="0"/>
+          <w:color w:val="1E407C"/>
+          <w:sz w:val="21"/>
+        </w:rPr>
+        <w:t xml:space="preserve">• </w:t>
+      </w:r>
+      <w:r>
+        <w:rPr>
+          <w:rFonts w:ascii="맑은 고딕" w:hAnsi="맑은 고딕" w:eastAsia="맑은 고딕"/>
+          <w:b/>
+          <w:color w:val="1A1A1A"/>
+          <w:sz w:val="21"/>
+        </w:rPr>
+        <w:t xml:space="preserve">퀵코멘트  </w:t>
+      </w:r>
+      <w:r>
+        <w:rPr>
+          <w:rFonts w:ascii="맑은 고딕" w:hAnsi="맑은 고딕" w:eastAsia="맑은 고딕"/>
+          <w:b w:val="0"/>
+          <w:color w:val="1A1A1A"/>
+          <w:sz w:val="21"/>
+        </w:rPr>
+        <w:t>고용 3개월 평균은 약 5만 명이고, 직전 두 달 합산 6만 명 하향이 있다. 전월은 13.3만 명이다.</w:t>
+      </w:r>
+    </w:p>
+    <w:p>
+      <w:pPr>
+        <w:spacing w:after="40" w:before="0" w:line="269" w:lineRule="auto"/>
+        <w:ind w:left="312" w:hanging="198"/>
+      </w:pPr>
+      <w:r>
+        <w:rPr>
+          <w:rFonts w:ascii="맑은 고딕" w:hAnsi="맑은 고딕" w:eastAsia="맑은 고딕"/>
+          <w:b w:val="0"/>
+          <w:color w:val="1E407C"/>
+          <w:sz w:val="21"/>
+        </w:rPr>
+        <w:t xml:space="preserve">• </w:t>
+      </w:r>
+      <w:r>
+        <w:rPr>
+          <w:rFonts w:ascii="맑은 고딕" w:hAnsi="맑은 고딕" w:eastAsia="맑은 고딕"/>
+          <w:b/>
+          <w:color w:val="1A1A1A"/>
+          <w:sz w:val="21"/>
+        </w:rPr>
+        <w:t xml:space="preserve">퀵코멘트  </w:t>
+      </w:r>
+      <w:r>
+        <w:rPr>
+          <w:rFonts w:ascii="맑은 고딕" w:hAnsi="맑은 고딕" w:eastAsia="맑은 고딕"/>
+          <w:b w:val="0"/>
+          <w:color w:val="1A1A1A"/>
+          <w:sz w:val="21"/>
+        </w:rPr>
+        <w:t>고용 쇼크의 프레임은 Bad Jobs, Good Stocks다. 침체보다 인상 확률 하락으로 읽혔다.</w:t>
+      </w:r>
+    </w:p>
+    <w:p>
+      <w:pPr>
+        <w:spacing w:after="40" w:before="0" w:line="269" w:lineRule="auto"/>
+        <w:ind w:left="312" w:hanging="198"/>
+      </w:pPr>
+      <w:r>
+        <w:rPr>
+          <w:rFonts w:ascii="맑은 고딕" w:hAnsi="맑은 고딕" w:eastAsia="맑은 고딕"/>
+          <w:b w:val="0"/>
+          <w:color w:val="1E407C"/>
+          <w:sz w:val="21"/>
+        </w:rPr>
+        <w:t xml:space="preserve">• </w:t>
+      </w:r>
+      <w:r>
+        <w:rPr>
+          <w:rFonts w:ascii="맑은 고딕" w:hAnsi="맑은 고딕" w:eastAsia="맑은 고딕"/>
+          <w:b/>
+          <w:color w:val="1A1A1A"/>
+          <w:sz w:val="21"/>
+        </w:rPr>
+        <w:t xml:space="preserve">김열매  </w:t>
+      </w:r>
+      <w:r>
+        <w:rPr>
+          <w:rFonts w:ascii="맑은 고딕" w:hAnsi="맑은 고딕" w:eastAsia="맑은 고딕"/>
+          <w:b w:val="0"/>
+          <w:color w:val="1A1A1A"/>
+          <w:sz w:val="21"/>
+        </w:rPr>
+        <w:t>유럽은 기존에 잘하던 산업 외에, 새로 세계를 이끄는 항목이 잘 안 보인다는 평가다.</w:t>
+      </w:r>
+    </w:p>
+    <w:p>
+      <w:pPr>
+        <w:spacing w:after="40" w:before="0" w:line="269" w:lineRule="auto"/>
+        <w:ind w:left="312" w:hanging="198"/>
+      </w:pPr>
+      <w:r>
+        <w:rPr>
+          <w:rFonts w:ascii="맑은 고딕" w:hAnsi="맑은 고딕" w:eastAsia="맑은 고딕"/>
+          <w:b w:val="0"/>
+          <w:color w:val="1E407C"/>
+          <w:sz w:val="21"/>
+        </w:rPr>
+        <w:t xml:space="preserve">• </w:t>
+      </w:r>
+      <w:r>
+        <w:rPr>
+          <w:rFonts w:ascii="맑은 고딕" w:hAnsi="맑은 고딕" w:eastAsia="맑은 고딕"/>
+          <w:b/>
+          <w:color w:val="1A1A1A"/>
+          <w:sz w:val="21"/>
+        </w:rPr>
+        <w:t xml:space="preserve">퀵코멘트  </w:t>
+      </w:r>
+      <w:r>
+        <w:rPr>
+          <w:rFonts w:ascii="맑은 고딕" w:hAnsi="맑은 고딕" w:eastAsia="맑은 고딕"/>
+          <w:b w:val="0"/>
+          <w:color w:val="1A1A1A"/>
+          <w:sz w:val="21"/>
+        </w:rPr>
+        <w:t>따라서 단기적으로는 금리 부담 완화 요인. 유가 $100+와 장기 인플레가 지속되면 추가 인상 가능성은 여전히 열려 있음</w:t>
       </w:r>
     </w:p>
     <w:p>
@@ -1352,16 +1616,16 @@
           <w:color w:val="1A1A1A"/>
           <w:sz w:val="21"/>
         </w:rPr>
-        <w:t xml:space="preserve">퀵코멘트  </w:t>
-      </w:r>
-      <w:r>
-        <w:rPr>
-          <w:rFonts w:ascii="맑은 고딕" w:hAnsi="맑은 고딕" w:eastAsia="맑은 고딕"/>
-          <w:b w:val="0"/>
-          <w:color w:val="1A1A1A"/>
-          <w:sz w:val="21"/>
-        </w:rPr>
-        <w:t>마이크론 대비 과거 할인율 밴드는 -20~-50%다.</w:t>
+        <w:t xml:space="preserve">노근창  </w:t>
+      </w:r>
+      <w:r>
+        <w:rPr>
+          <w:rFonts w:ascii="맑은 고딕" w:hAnsi="맑은 고딕" w:eastAsia="맑은 고딕"/>
+          <w:b w:val="0"/>
+          <w:color w:val="1A1A1A"/>
+          <w:sz w:val="21"/>
+        </w:rPr>
+        <w:t>HBM4는 기가당 1달러 위에서 출발해 내년 5달러까지 거론되고, HBM ASP는 올해보다 120% 오른다는 트렌드포스 자료가 있다. 그 가정이면 내년 피크아웃 고민은 약하다. HBM4는 삼성 승기에 가깝지만 공급이 부족해 하이닉스 매출도 늘고 점유율은 낮아질 수 있다.</w:t>
       </w:r>
     </w:p>
     <w:p>
@@ -1385,16 +1649,16 @@
           <w:color w:val="1A1A1A"/>
           <w:sz w:val="21"/>
         </w:rPr>
-        <w:t xml:space="preserve">퀵코멘트  </w:t>
-      </w:r>
-      <w:r>
-        <w:rPr>
-          <w:rFonts w:ascii="맑은 고딕" w:hAnsi="맑은 고딕" w:eastAsia="맑은 고딕"/>
-          <w:b w:val="0"/>
-          <w:color w:val="1A1A1A"/>
-          <w:sz w:val="21"/>
-        </w:rPr>
-        <w:t>컨센서스 환율 1480원을 1370원으로 낮추면 이익 컨센서스가 약 10% 내려갈 수 있다.</w:t>
+        <w:t xml:space="preserve">노근창  </w:t>
+      </w:r>
+      <w:r>
+        <w:rPr>
+          <w:rFonts w:ascii="맑은 고딕" w:hAnsi="맑은 고딕" w:eastAsia="맑은 고딕"/>
+          <w:b w:val="0"/>
+          <w:color w:val="1A1A1A"/>
+          <w:sz w:val="21"/>
+        </w:rPr>
+        <w:t>삼성전자 이번 분기 영업이익은 원화 강세로 증권사가 말하는 100~104조보다 높은 110조 안팎이다. 하이닉스는 약 70조로, 시장 기대를 크게 넘기진 못할 수 있다. 10월 8일 삼성 잠정실적이다.</w:t>
       </w:r>
     </w:p>
     <w:p>
@@ -1418,16 +1682,16 @@
           <w:color w:val="1A1A1A"/>
           <w:sz w:val="21"/>
         </w:rPr>
-        <w:t xml:space="preserve">김효진  </w:t>
-      </w:r>
-      <w:r>
-        <w:rPr>
-          <w:rFonts w:ascii="맑은 고딕" w:hAnsi="맑은 고딕" w:eastAsia="맑은 고딕"/>
-          <w:b w:val="0"/>
-          <w:color w:val="1A1A1A"/>
-          <w:sz w:val="21"/>
-        </w:rPr>
-        <w:t>마이크론 실적과 전망은 강한데, 시장은 새 뉴스처럼 반응하기보다 넘어가는 쪽에 가깝다.</w:t>
+        <w:t xml:space="preserve">퀵코멘트  </w:t>
+      </w:r>
+      <w:r>
+        <w:rPr>
+          <w:rFonts w:ascii="맑은 고딕" w:hAnsi="맑은 고딕" w:eastAsia="맑은 고딕"/>
+          <w:b w:val="0"/>
+          <w:color w:val="1A1A1A"/>
+          <w:sz w:val="21"/>
+        </w:rPr>
+        <w:t>컨센서스 환율 1480원을 1370원으로 낮추면 이익 컨센서스가 약 10% 내려갈 수 있다.</w:t>
       </w:r>
     </w:p>
     <w:p>
@@ -1460,7 +1724,7 @@
           <w:color w:val="1A1A1A"/>
           <w:sz w:val="21"/>
         </w:rPr>
-        <w:t>ADR 프리미엄이 30%면 본주 202만 원, 20%면 219만 원으로 적혀 있다.</w:t>
+        <w:t>마이크론 대비 과거 할인율 밴드는 -20~-50%다.</w:t>
       </w:r>
     </w:p>
     <w:p>
@@ -1484,16 +1748,16 @@
           <w:color w:val="1A1A1A"/>
           <w:sz w:val="21"/>
         </w:rPr>
-        <w:t xml:space="preserve">퀵코멘트  </w:t>
-      </w:r>
-      <w:r>
-        <w:rPr>
-          <w:rFonts w:ascii="맑은 고딕" w:hAnsi="맑은 고딕" w:eastAsia="맑은 고딕"/>
-          <w:b w:val="0"/>
-          <w:color w:val="1A1A1A"/>
-          <w:sz w:val="21"/>
-        </w:rPr>
-        <w:t>미국 메모리 기업 마이크론 실적 발표 이후 3% 이상 상승으로 마감하면서 지난 분기와는 다르게 실적과 향후 전망에 대해 시장이 긍정적으로 반응했습니다.</w:t>
+        <w:t xml:space="preserve">퀵코멘트 · 목대균·이경규  </w:t>
+      </w:r>
+      <w:r>
+        <w:rPr>
+          <w:rFonts w:ascii="맑은 고딕" w:hAnsi="맑은 고딕" w:eastAsia="맑은 고딕"/>
+          <w:b w:val="0"/>
+          <w:color w:val="1A1A1A"/>
+          <w:sz w:val="21"/>
+        </w:rPr>
+        <w:t>6월 고점에서 7월 저점까지 한 달여에 30~40%가 빠졌다. 레버리지가 청산되며 피크아웃 공포는 상당 부분 가격에 들어갔다. 7,000 위는 삼성전자·하이닉스 매물이다. 이익이 반토막 나는 가정을 이미 넣은 것처럼 싸고, 다운사이클 진폭이 과거보다 얕으면 저점이 올라간다.</w:t>
       </w:r>
     </w:p>
     <w:p>
@@ -1517,6 +1781,468 @@
           <w:color w:val="1A1A1A"/>
           <w:sz w:val="21"/>
         </w:rPr>
+        <w:t xml:space="preserve">목대균·이경규  </w:t>
+      </w:r>
+      <w:r>
+        <w:rPr>
+          <w:rFonts w:ascii="맑은 고딕" w:hAnsi="맑은 고딕" w:eastAsia="맑은 고딕"/>
+          <w:b w:val="0"/>
+          <w:color w:val="1A1A1A"/>
+          <w:sz w:val="21"/>
+        </w:rPr>
+        <w:t>마이크론 다음 분기 총이익률 가이던스는 HBM 믹스 때문에 약간 보수적이다. 보조금 제한이 12월 초에 끝나는데 자기주식에 대한 언급이 없어 실망했다. 실적 전망 자체는 아니다. 장기 계약은 16건에서 26건으로 늘었고, 선수금이 버퍼다. 공급은 2028년까지도 수요를 못 따라온다는 말이 처음 공식화됐다.</w:t>
+      </w:r>
+    </w:p>
+    <w:p>
+      <w:pPr>
+        <w:spacing w:after="40" w:before="0" w:line="269" w:lineRule="auto"/>
+        <w:ind w:left="312" w:hanging="198"/>
+      </w:pPr>
+      <w:r>
+        <w:rPr>
+          <w:rFonts w:ascii="맑은 고딕" w:hAnsi="맑은 고딕" w:eastAsia="맑은 고딕"/>
+          <w:b w:val="0"/>
+          <w:color w:val="1E407C"/>
+          <w:sz w:val="21"/>
+        </w:rPr>
+        <w:t xml:space="preserve">• </w:t>
+      </w:r>
+      <w:r>
+        <w:rPr>
+          <w:rFonts w:ascii="맑은 고딕" w:hAnsi="맑은 고딕" w:eastAsia="맑은 고딕"/>
+          <w:b/>
+          <w:color w:val="1A1A1A"/>
+          <w:sz w:val="21"/>
+        </w:rPr>
+        <w:t xml:space="preserve">신중호  </w:t>
+      </w:r>
+      <w:r>
+        <w:rPr>
+          <w:rFonts w:ascii="맑은 고딕" w:hAnsi="맑은 고딕" w:eastAsia="맑은 고딕"/>
+          <w:b w:val="0"/>
+          <w:color w:val="1A1A1A"/>
+          <w:sz w:val="21"/>
+        </w:rPr>
+        <w:t>2024년 엔비디아 매출총이익률이 70~80%일 때 GPU 쇼티지 뒤 대체 칩이 나오며 엔비디아는 1년 가까이 주도주에서 빠지고 옆으로 갔다. 마이크론 총이익률 87%, 다음 분기 86%도 같은 자리다. 마진이 높다고 주도주가 유지되지 않는다. 메모리는 AI 그 자체가 아니라 필수 투입재다.</w:t>
+      </w:r>
+    </w:p>
+    <w:p>
+      <w:pPr>
+        <w:spacing w:after="40" w:before="0" w:line="269" w:lineRule="auto"/>
+        <w:ind w:left="312" w:hanging="198"/>
+      </w:pPr>
+      <w:r>
+        <w:rPr>
+          <w:rFonts w:ascii="맑은 고딕" w:hAnsi="맑은 고딕" w:eastAsia="맑은 고딕"/>
+          <w:b w:val="0"/>
+          <w:color w:val="1E407C"/>
+          <w:sz w:val="21"/>
+        </w:rPr>
+        <w:t xml:space="preserve">• </w:t>
+      </w:r>
+      <w:r>
+        <w:rPr>
+          <w:rFonts w:ascii="맑은 고딕" w:hAnsi="맑은 고딕" w:eastAsia="맑은 고딕"/>
+          <w:b/>
+          <w:color w:val="1A1A1A"/>
+          <w:sz w:val="21"/>
+        </w:rPr>
+        <w:t xml:space="preserve">목대균·이경규  </w:t>
+      </w:r>
+      <w:r>
+        <w:rPr>
+          <w:rFonts w:ascii="맑은 고딕" w:hAnsi="맑은 고딕" w:eastAsia="맑은 고딕"/>
+          <w:b w:val="0"/>
+          <w:color w:val="1A1A1A"/>
+          <w:sz w:val="21"/>
+        </w:rPr>
+        <w:t>삼성전자가 HBM 캐파를 하반기 두 배, 내년 2.5배 늘리면 레거시 D램 캐파는 줄어든다. PC·모바일 D램조차 타이트해질 수 있다. 2027년 수급 불안은 줄었고 2028년은 내년에 다시 본다. 뮤즈로 오픈AI·앤트로픽·메타의 3강이 되면 메모리 고객이 한 명에게 몰려 끝나지 않는다.</w:t>
+      </w:r>
+    </w:p>
+    <w:p>
+      <w:pPr>
+        <w:spacing w:after="40" w:before="0" w:line="269" w:lineRule="auto"/>
+        <w:ind w:left="312" w:hanging="198"/>
+      </w:pPr>
+      <w:r>
+        <w:rPr>
+          <w:rFonts w:ascii="맑은 고딕" w:hAnsi="맑은 고딕" w:eastAsia="맑은 고딕"/>
+          <w:b w:val="0"/>
+          <w:color w:val="1E407C"/>
+          <w:sz w:val="21"/>
+        </w:rPr>
+        <w:t xml:space="preserve">• </w:t>
+      </w:r>
+      <w:r>
+        <w:rPr>
+          <w:rFonts w:ascii="맑은 고딕" w:hAnsi="맑은 고딕" w:eastAsia="맑은 고딕"/>
+          <w:b/>
+          <w:color w:val="1A1A1A"/>
+          <w:sz w:val="21"/>
+        </w:rPr>
+        <w:t xml:space="preserve">신중호  </w:t>
+      </w:r>
+      <w:r>
+        <w:rPr>
+          <w:rFonts w:ascii="맑은 고딕" w:hAnsi="맑은 고딕" w:eastAsia="맑은 고딕"/>
+          <w:b w:val="0"/>
+          <w:color w:val="1A1A1A"/>
+          <w:sz w:val="21"/>
+        </w:rPr>
+        <w:t>삼성전자는 28만 원 위에 물량의 60~70%, 하이닉스는 175만 원 위에 약 60%가 물려 있다. 애플도 주주환원을 3년 한 뒤에야 재평가됐다. 2028년 공급이 늘어도 마진이 남는지, 중국 메모리가 로컬에 머무는지가 배수를 연다. 4배에서 6배는 50%지만 지금은 그 자리가 아니다.</w:t>
+      </w:r>
+    </w:p>
+    <w:p>
+      <w:pPr>
+        <w:spacing w:after="40" w:before="0" w:line="269" w:lineRule="auto"/>
+        <w:ind w:left="312" w:hanging="198"/>
+      </w:pPr>
+      <w:r>
+        <w:rPr>
+          <w:rFonts w:ascii="맑은 고딕" w:hAnsi="맑은 고딕" w:eastAsia="맑은 고딕"/>
+          <w:b w:val="0"/>
+          <w:color w:val="1E407C"/>
+          <w:sz w:val="21"/>
+        </w:rPr>
+        <w:t xml:space="preserve">• </w:t>
+      </w:r>
+      <w:r>
+        <w:rPr>
+          <w:rFonts w:ascii="맑은 고딕" w:hAnsi="맑은 고딕" w:eastAsia="맑은 고딕"/>
+          <w:b/>
+          <w:color w:val="1A1A1A"/>
+          <w:sz w:val="21"/>
+        </w:rPr>
+        <w:t xml:space="preserve">노근창  </w:t>
+      </w:r>
+      <w:r>
+        <w:rPr>
+          <w:rFonts w:ascii="맑은 고딕" w:hAnsi="맑은 고딕" w:eastAsia="맑은 고딕"/>
+          <w:b w:val="0"/>
+          <w:color w:val="1A1A1A"/>
+          <w:sz w:val="21"/>
+        </w:rPr>
+        <w:t>마이크론 EPS는 약 1년 전 3달러에서 33달러를 넘었다. 증설은 아이다호·뉴욕 HBM이고, 가속기 계획에 맞춘 주문 생산이라 소비자용처럼 빈 공장을 짓는 사이클과 다르다. 데이터센터는 2년 치를 미리 잡아야 하고, 구형 가속기 가격도 출시 때보다 비싸다.</w:t>
+      </w:r>
+    </w:p>
+    <w:p>
+      <w:pPr>
+        <w:spacing w:after="40" w:before="0" w:line="269" w:lineRule="auto"/>
+        <w:ind w:left="312" w:hanging="198"/>
+      </w:pPr>
+      <w:r>
+        <w:rPr>
+          <w:rFonts w:ascii="맑은 고딕" w:hAnsi="맑은 고딕" w:eastAsia="맑은 고딕"/>
+          <w:b w:val="0"/>
+          <w:color w:val="1E407C"/>
+          <w:sz w:val="21"/>
+        </w:rPr>
+        <w:t xml:space="preserve">• </w:t>
+      </w:r>
+      <w:r>
+        <w:rPr>
+          <w:rFonts w:ascii="맑은 고딕" w:hAnsi="맑은 고딕" w:eastAsia="맑은 고딕"/>
+          <w:b/>
+          <w:color w:val="1A1A1A"/>
+          <w:sz w:val="21"/>
+        </w:rPr>
+        <w:t xml:space="preserve">신중호  </w:t>
+      </w:r>
+      <w:r>
+        <w:rPr>
+          <w:rFonts w:ascii="맑은 고딕" w:hAnsi="맑은 고딕" w:eastAsia="맑은 고딕"/>
+          <w:b w:val="0"/>
+          <w:color w:val="1A1A1A"/>
+          <w:sz w:val="21"/>
+        </w:rPr>
+        <w:t>메모리가 너무 비싸면 AI 확산이 막힌다. 그래서 물량을 늘리는 장비 주문이 움직인다. 엔비디아는 마진이 안정된 뒤에야 멀티플이 다시 열렸다. 삼성전자·하이닉스도 그 확인은 내년 2분기 후반까지 갈 수 있고, 그 사이 다른 업종이 힘을 가져간다.</w:t>
+      </w:r>
+    </w:p>
+    <w:p>
+      <w:pPr>
+        <w:spacing w:after="40" w:before="0" w:line="269" w:lineRule="auto"/>
+        <w:ind w:left="312" w:hanging="198"/>
+      </w:pPr>
+      <w:r>
+        <w:rPr>
+          <w:rFonts w:ascii="맑은 고딕" w:hAnsi="맑은 고딕" w:eastAsia="맑은 고딕"/>
+          <w:b w:val="0"/>
+          <w:color w:val="1E407C"/>
+          <w:sz w:val="21"/>
+        </w:rPr>
+        <w:t xml:space="preserve">• </w:t>
+      </w:r>
+      <w:r>
+        <w:rPr>
+          <w:rFonts w:ascii="맑은 고딕" w:hAnsi="맑은 고딕" w:eastAsia="맑은 고딕"/>
+          <w:b/>
+          <w:color w:val="1A1A1A"/>
+          <w:sz w:val="21"/>
+        </w:rPr>
+        <w:t xml:space="preserve">목대균·이경규  </w:t>
+      </w:r>
+      <w:r>
+        <w:rPr>
+          <w:rFonts w:ascii="맑은 고딕" w:hAnsi="맑은 고딕" w:eastAsia="맑은 고딕"/>
+          <w:b w:val="0"/>
+          <w:color w:val="1A1A1A"/>
+          <w:sz w:val="21"/>
+        </w:rPr>
+        <w:t>메모리는 지금 파는 구간이 아니라 버티는 구간이다. 다른 섹터는 이미 빠져 종목이 퍼지고 있다. HBM 가격은 두 배가 아니라 최대 세 배 인상으로 보인다. 내년 이익 레벨업을 보면 유가·금리에 흔들려도 내년까지 가져간다.</w:t>
+      </w:r>
+    </w:p>
+    <w:p>
+      <w:pPr>
+        <w:spacing w:after="40" w:before="0" w:line="269" w:lineRule="auto"/>
+        <w:ind w:left="312" w:hanging="198"/>
+      </w:pPr>
+      <w:r>
+        <w:rPr>
+          <w:rFonts w:ascii="맑은 고딕" w:hAnsi="맑은 고딕" w:eastAsia="맑은 고딕"/>
+          <w:b w:val="0"/>
+          <w:color w:val="1E407C"/>
+          <w:sz w:val="21"/>
+        </w:rPr>
+        <w:t xml:space="preserve">• </w:t>
+      </w:r>
+      <w:r>
+        <w:rPr>
+          <w:rFonts w:ascii="맑은 고딕" w:hAnsi="맑은 고딕" w:eastAsia="맑은 고딕"/>
+          <w:b/>
+          <w:color w:val="1A1A1A"/>
+          <w:sz w:val="21"/>
+        </w:rPr>
+        <w:t xml:space="preserve">노근창  </w:t>
+      </w:r>
+      <w:r>
+        <w:rPr>
+          <w:rFonts w:ascii="맑은 고딕" w:hAnsi="맑은 고딕" w:eastAsia="맑은 고딕"/>
+          <w:b w:val="0"/>
+          <w:color w:val="1A1A1A"/>
+          <w:sz w:val="21"/>
+        </w:rPr>
+        <w:t>스마트폰·PC·자동차 수요는 약한데도 소비자 제품 마진은 개선됐다. HBM이 들어간 클라우드 메모리는 수율 때문에 마진이 소폭 줄었다. 데이터센터 비중은 61%에서 63%다. 다음 분기 매출도 시장 예상보다 높다.</w:t>
+      </w:r>
+    </w:p>
+    <w:p>
+      <w:pPr>
+        <w:spacing w:after="40" w:before="0" w:line="269" w:lineRule="auto"/>
+        <w:ind w:left="312" w:hanging="198"/>
+      </w:pPr>
+      <w:r>
+        <w:rPr>
+          <w:rFonts w:ascii="맑은 고딕" w:hAnsi="맑은 고딕" w:eastAsia="맑은 고딕"/>
+          <w:b w:val="0"/>
+          <w:color w:val="1E407C"/>
+          <w:sz w:val="21"/>
+        </w:rPr>
+        <w:t xml:space="preserve">• </w:t>
+      </w:r>
+      <w:r>
+        <w:rPr>
+          <w:rFonts w:ascii="맑은 고딕" w:hAnsi="맑은 고딕" w:eastAsia="맑은 고딕"/>
+          <w:b/>
+          <w:color w:val="1A1A1A"/>
+          <w:sz w:val="21"/>
+        </w:rPr>
+        <w:t xml:space="preserve">목대균·이경규  </w:t>
+      </w:r>
+      <w:r>
+        <w:rPr>
+          <w:rFonts w:ascii="맑은 고딕" w:hAnsi="맑은 고딕" w:eastAsia="맑은 고딕"/>
+          <w:b w:val="0"/>
+          <w:color w:val="1A1A1A"/>
+          <w:sz w:val="21"/>
+        </w:rPr>
+        <w:t>3분기 한국 반도체는 물량보다 원화 강세가 이익을 깎아 기대에 못 미칠 수 있다. 하이닉스 소각은 마무리 국면이다. 실적 때 추가 소각이나 삼성전자 특별 배당이 나오면 소프트한 숫자를 넘길 수 있다.</w:t>
+      </w:r>
+    </w:p>
+    <w:p>
+      <w:pPr>
+        <w:spacing w:after="40" w:before="0" w:line="269" w:lineRule="auto"/>
+        <w:ind w:left="312" w:hanging="198"/>
+      </w:pPr>
+      <w:r>
+        <w:rPr>
+          <w:rFonts w:ascii="맑은 고딕" w:hAnsi="맑은 고딕" w:eastAsia="맑은 고딕"/>
+          <w:b w:val="0"/>
+          <w:color w:val="1E407C"/>
+          <w:sz w:val="21"/>
+        </w:rPr>
+        <w:t xml:space="preserve">• </w:t>
+      </w:r>
+      <w:r>
+        <w:rPr>
+          <w:rFonts w:ascii="맑은 고딕" w:hAnsi="맑은 고딕" w:eastAsia="맑은 고딕"/>
+          <w:b/>
+          <w:color w:val="1A1A1A"/>
+          <w:sz w:val="21"/>
+        </w:rPr>
+        <w:t xml:space="preserve">노근창  </w:t>
+      </w:r>
+      <w:r>
+        <w:rPr>
+          <w:rFonts w:ascii="맑은 고딕" w:hAnsi="맑은 고딕" w:eastAsia="맑은 고딕"/>
+          <w:b w:val="0"/>
+          <w:color w:val="1A1A1A"/>
+          <w:sz w:val="21"/>
+        </w:rPr>
+        <w:t>마이크론은 매출 540억 달러, 영업이익률 82%로 직전 분기보다 1%포인트 개선됐다. 낸드는 가격 약 30%·출하 약 10%, D램은 출하 약 5%·ASP 약 18~19% 상승으로 적혀 있다.</w:t>
+      </w:r>
+    </w:p>
+    <w:p>
+      <w:pPr>
+        <w:spacing w:after="40" w:before="0" w:line="269" w:lineRule="auto"/>
+        <w:ind w:left="312" w:hanging="198"/>
+      </w:pPr>
+      <w:r>
+        <w:rPr>
+          <w:rFonts w:ascii="맑은 고딕" w:hAnsi="맑은 고딕" w:eastAsia="맑은 고딕"/>
+          <w:b w:val="0"/>
+          <w:color w:val="1E407C"/>
+          <w:sz w:val="21"/>
+        </w:rPr>
+        <w:t xml:space="preserve">• </w:t>
+      </w:r>
+      <w:r>
+        <w:rPr>
+          <w:rFonts w:ascii="맑은 고딕" w:hAnsi="맑은 고딕" w:eastAsia="맑은 고딕"/>
+          <w:b/>
+          <w:color w:val="1A1A1A"/>
+          <w:sz w:val="21"/>
+        </w:rPr>
+        <w:t xml:space="preserve">노근창  </w:t>
+      </w:r>
+      <w:r>
+        <w:rPr>
+          <w:rFonts w:ascii="맑은 고딕" w:hAnsi="맑은 고딕" w:eastAsia="맑은 고딕"/>
+          <w:b w:val="0"/>
+          <w:color w:val="1A1A1A"/>
+          <w:sz w:val="21"/>
+        </w:rPr>
+        <w:t>트렌드포스 고정가에서 PC D램도 9월에 올랐고, 4분기 서버 D램을 많이 만들면 PC D램은 예상 5%가 아니라 약 18% 오른다. 수요가 아니라 공급이 막힌 가격이다.</w:t>
+      </w:r>
+    </w:p>
+    <w:p>
+      <w:pPr>
+        <w:spacing w:after="40" w:before="0" w:line="269" w:lineRule="auto"/>
+        <w:ind w:left="312" w:hanging="198"/>
+      </w:pPr>
+      <w:r>
+        <w:rPr>
+          <w:rFonts w:ascii="맑은 고딕" w:hAnsi="맑은 고딕" w:eastAsia="맑은 고딕"/>
+          <w:b w:val="0"/>
+          <w:color w:val="1E407C"/>
+          <w:sz w:val="21"/>
+        </w:rPr>
+        <w:t xml:space="preserve">• </w:t>
+      </w:r>
+      <w:r>
+        <w:rPr>
+          <w:rFonts w:ascii="맑은 고딕" w:hAnsi="맑은 고딕" w:eastAsia="맑은 고딕"/>
+          <w:b/>
+          <w:color w:val="1A1A1A"/>
+          <w:sz w:val="21"/>
+        </w:rPr>
+        <w:t xml:space="preserve">목대균·이경규  </w:t>
+      </w:r>
+      <w:r>
+        <w:rPr>
+          <w:rFonts w:ascii="맑은 고딕" w:hAnsi="맑은 고딕" w:eastAsia="맑은 고딕"/>
+          <w:b w:val="0"/>
+          <w:color w:val="1A1A1A"/>
+          <w:sz w:val="21"/>
+        </w:rPr>
+        <w:t>9월 반도체 수출은 전년 대비 약 260%로 사상 최대다. 메타 뮤즈는 20일 만에 약 500만 다운로드로 가장 빠른 축이고, 에이전트 관련 주식에 긍정적이다.</w:t>
+      </w:r>
+    </w:p>
+    <w:p>
+      <w:pPr>
+        <w:spacing w:after="40" w:before="0" w:line="269" w:lineRule="auto"/>
+        <w:ind w:left="312" w:hanging="198"/>
+      </w:pPr>
+      <w:r>
+        <w:rPr>
+          <w:rFonts w:ascii="맑은 고딕" w:hAnsi="맑은 고딕" w:eastAsia="맑은 고딕"/>
+          <w:b w:val="0"/>
+          <w:color w:val="1E407C"/>
+          <w:sz w:val="21"/>
+        </w:rPr>
+        <w:t xml:space="preserve">• </w:t>
+      </w:r>
+      <w:r>
+        <w:rPr>
+          <w:rFonts w:ascii="맑은 고딕" w:hAnsi="맑은 고딕" w:eastAsia="맑은 고딕"/>
+          <w:b/>
+          <w:color w:val="1A1A1A"/>
+          <w:sz w:val="21"/>
+        </w:rPr>
+        <w:t xml:space="preserve">노근창  </w:t>
+      </w:r>
+      <w:r>
+        <w:rPr>
+          <w:rFonts w:ascii="맑은 고딕" w:hAnsi="맑은 고딕" w:eastAsia="맑은 고딕"/>
+          <w:b w:val="0"/>
+          <w:color w:val="1A1A1A"/>
+          <w:sz w:val="21"/>
+        </w:rPr>
+        <w:t>커스텀 HBM은 8단·12단만이 아니라 수요에 맞춘 단수다. 비싸서 못 사던 고객이 들어오면 하이닉스·삼성 입장에선 시장이 줄어들기보다 넓어진다.</w:t>
+      </w:r>
+    </w:p>
+    <w:p>
+      <w:pPr>
+        <w:spacing w:after="40" w:before="0" w:line="269" w:lineRule="auto"/>
+        <w:ind w:left="312" w:hanging="198"/>
+      </w:pPr>
+      <w:r>
+        <w:rPr>
+          <w:rFonts w:ascii="맑은 고딕" w:hAnsi="맑은 고딕" w:eastAsia="맑은 고딕"/>
+          <w:b w:val="0"/>
+          <w:color w:val="1E407C"/>
+          <w:sz w:val="21"/>
+        </w:rPr>
+        <w:t xml:space="preserve">• </w:t>
+      </w:r>
+      <w:r>
+        <w:rPr>
+          <w:rFonts w:ascii="맑은 고딕" w:hAnsi="맑은 고딕" w:eastAsia="맑은 고딕"/>
+          <w:b/>
+          <w:color w:val="1A1A1A"/>
+          <w:sz w:val="21"/>
+        </w:rPr>
+        <w:t xml:space="preserve">김효진  </w:t>
+      </w:r>
+      <w:r>
+        <w:rPr>
+          <w:rFonts w:ascii="맑은 고딕" w:hAnsi="맑은 고딕" w:eastAsia="맑은 고딕"/>
+          <w:b w:val="0"/>
+          <w:color w:val="1A1A1A"/>
+          <w:sz w:val="21"/>
+        </w:rPr>
+        <w:t>마이크론 실적과 전망은 강한데, 시장은 새 뉴스처럼 반응하기보다 넘어가는 쪽에 가깝다.</w:t>
+      </w:r>
+    </w:p>
+    <w:p>
+      <w:pPr>
+        <w:spacing w:after="40" w:before="0" w:line="269" w:lineRule="auto"/>
+        <w:ind w:left="312" w:hanging="198"/>
+      </w:pPr>
+      <w:r>
+        <w:rPr>
+          <w:rFonts w:ascii="맑은 고딕" w:hAnsi="맑은 고딕" w:eastAsia="맑은 고딕"/>
+          <w:b w:val="0"/>
+          <w:color w:val="1E407C"/>
+          <w:sz w:val="21"/>
+        </w:rPr>
+        <w:t xml:space="preserve">• </w:t>
+      </w:r>
+      <w:r>
+        <w:rPr>
+          <w:rFonts w:ascii="맑은 고딕" w:hAnsi="맑은 고딕" w:eastAsia="맑은 고딕"/>
+          <w:b/>
+          <w:color w:val="1A1A1A"/>
+          <w:sz w:val="21"/>
+        </w:rPr>
         <w:t xml:space="preserve">퀵코멘트  </w:t>
       </w:r>
       <w:r>
@@ -1526,7 +2252,40 @@
           <w:color w:val="1A1A1A"/>
           <w:sz w:val="21"/>
         </w:rPr>
-        <w:t>삼전닉스는 현재 대략 마이크론 대비 할인율 -30% 초반 (환율조정 여지)로 추정됩니다.</w:t>
+        <w:t>ADR 프리미엄이 30%면 본주 202만 원, 20%면 219만 원으로 적혀 있다.</w:t>
+      </w:r>
+    </w:p>
+    <w:p>
+      <w:pPr>
+        <w:spacing w:after="40" w:before="0" w:line="269" w:lineRule="auto"/>
+        <w:ind w:left="312" w:hanging="198"/>
+      </w:pPr>
+      <w:r>
+        <w:rPr>
+          <w:rFonts w:ascii="맑은 고딕" w:hAnsi="맑은 고딕" w:eastAsia="맑은 고딕"/>
+          <w:b w:val="0"/>
+          <w:color w:val="1E407C"/>
+          <w:sz w:val="21"/>
+        </w:rPr>
+        <w:t xml:space="preserve">• </w:t>
+      </w:r>
+      <w:r>
+        <w:rPr>
+          <w:rFonts w:ascii="맑은 고딕" w:hAnsi="맑은 고딕" w:eastAsia="맑은 고딕"/>
+          <w:b/>
+          <w:color w:val="1A1A1A"/>
+          <w:sz w:val="21"/>
+        </w:rPr>
+        <w:t xml:space="preserve">퀵코멘트  </w:t>
+      </w:r>
+      <w:r>
+        <w:rPr>
+          <w:rFonts w:ascii="맑은 고딕" w:hAnsi="맑은 고딕" w:eastAsia="맑은 고딕"/>
+          <w:b w:val="0"/>
+          <w:color w:val="1A1A1A"/>
+          <w:sz w:val="21"/>
+        </w:rPr>
+        <w:t>미국 메모리 기업 마이크론 실적 발표 이후 3% 이상 상승으로 마감하면서 지난 분기와는 다르게 실적과 향후 전망에 대해 시장이 긍정적으로 반응했습니다.</w:t>
       </w:r>
     </w:p>
     <w:p>
@@ -1725,6 +2484,138 @@
           <w:sz w:val="21"/>
         </w:rPr>
         <w:t>삼성전자의 다음 가격대는 28만 원, 그중 28만 5,000원 돌파다. 하이닉스는 190만 원 돌파다.</w:t>
+      </w:r>
+    </w:p>
+    <w:p>
+      <w:pPr>
+        <w:spacing w:after="40" w:before="0" w:line="269" w:lineRule="auto"/>
+        <w:ind w:left="312" w:hanging="198"/>
+      </w:pPr>
+      <w:r>
+        <w:rPr>
+          <w:rFonts w:ascii="맑은 고딕" w:hAnsi="맑은 고딕" w:eastAsia="맑은 고딕"/>
+          <w:b w:val="0"/>
+          <w:color w:val="1E407C"/>
+          <w:sz w:val="21"/>
+        </w:rPr>
+        <w:t xml:space="preserve">• </w:t>
+      </w:r>
+      <w:r>
+        <w:rPr>
+          <w:rFonts w:ascii="맑은 고딕" w:hAnsi="맑은 고딕" w:eastAsia="맑은 고딕"/>
+          <w:b/>
+          <w:color w:val="1A1A1A"/>
+          <w:sz w:val="21"/>
+        </w:rPr>
+        <w:t xml:space="preserve">신중호  </w:t>
+      </w:r>
+      <w:r>
+        <w:rPr>
+          <w:rFonts w:ascii="맑은 고딕" w:hAnsi="맑은 고딕" w:eastAsia="맑은 고딕"/>
+          <w:b w:val="0"/>
+          <w:color w:val="1A1A1A"/>
+          <w:sz w:val="21"/>
+        </w:rPr>
+        <w:t>지수만 보면 작년 말 4,000대에서 7,000 근처로 왔는데 계좌는 힘들다. 상반기 급등과 거래대금 이후 가격과 거래가 줄어서다. 레버리지 상품이 없어도 2021년에는 3,000 위에서 개인 자금의 56%가, 이번엔 7,000 위에서 약 60%(120조)가 들어왔다. 비교가 센 시장 구조다.</w:t>
+      </w:r>
+    </w:p>
+    <w:p>
+      <w:pPr>
+        <w:spacing w:after="40" w:before="0" w:line="269" w:lineRule="auto"/>
+        <w:ind w:left="312" w:hanging="198"/>
+      </w:pPr>
+      <w:r>
+        <w:rPr>
+          <w:rFonts w:ascii="맑은 고딕" w:hAnsi="맑은 고딕" w:eastAsia="맑은 고딕"/>
+          <w:b w:val="0"/>
+          <w:color w:val="1E407C"/>
+          <w:sz w:val="21"/>
+        </w:rPr>
+        <w:t xml:space="preserve">• </w:t>
+      </w:r>
+      <w:r>
+        <w:rPr>
+          <w:rFonts w:ascii="맑은 고딕" w:hAnsi="맑은 고딕" w:eastAsia="맑은 고딕"/>
+          <w:b/>
+          <w:color w:val="1A1A1A"/>
+          <w:sz w:val="21"/>
+        </w:rPr>
+        <w:t xml:space="preserve">노근창  </w:t>
+      </w:r>
+      <w:r>
+        <w:rPr>
+          <w:rFonts w:ascii="맑은 고딕" w:hAnsi="맑은 고딕" w:eastAsia="맑은 고딕"/>
+          <w:b w:val="0"/>
+          <w:color w:val="1A1A1A"/>
+          <w:sz w:val="21"/>
+        </w:rPr>
+        <w:t>영국·호주 10년물이 5%를 넘고 일본도 3%를 넘으면 글로벌 자금은 신흥국부터 줄인다. 한국이 이머징이라 삼성·하이닉스가 기계적으로 팔린다. 그 고금리의 한 이유는 하이퍼스케일러가 데이터센터 자금으로 돈을 흡수하는 것이고, 그 돈은 다시 반도체 수요다.</w:t>
+      </w:r>
+    </w:p>
+    <w:p>
+      <w:pPr>
+        <w:spacing w:after="40" w:before="0" w:line="269" w:lineRule="auto"/>
+        <w:ind w:left="312" w:hanging="198"/>
+      </w:pPr>
+      <w:r>
+        <w:rPr>
+          <w:rFonts w:ascii="맑은 고딕" w:hAnsi="맑은 고딕" w:eastAsia="맑은 고딕"/>
+          <w:b w:val="0"/>
+          <w:color w:val="1E407C"/>
+          <w:sz w:val="21"/>
+        </w:rPr>
+        <w:t xml:space="preserve">• </w:t>
+      </w:r>
+      <w:r>
+        <w:rPr>
+          <w:rFonts w:ascii="맑은 고딕" w:hAnsi="맑은 고딕" w:eastAsia="맑은 고딕"/>
+          <w:b/>
+          <w:color w:val="1A1A1A"/>
+          <w:sz w:val="21"/>
+        </w:rPr>
+        <w:t xml:space="preserve">노근창  </w:t>
+      </w:r>
+      <w:r>
+        <w:rPr>
+          <w:rFonts w:ascii="맑은 고딕" w:hAnsi="맑은 고딕" w:eastAsia="맑은 고딕"/>
+          <w:b w:val="0"/>
+          <w:color w:val="1A1A1A"/>
+          <w:sz w:val="21"/>
+        </w:rPr>
+        <w:t>자사주가 받칠 때 외국인이 더 많이 팔고, 자사주가 끝나면 가격을 깨며 세게 팔지는 않는다. 내년 주주환원 때 다시 판다. 그래서 한 구간을 왕복한다. 구글 TPU 외부 판매로 수요처 잉여현금이 플러스면 그 매도가 잦아들 수 있다.</w:t>
+      </w:r>
+    </w:p>
+    <w:p>
+      <w:pPr>
+        <w:spacing w:after="40" w:before="0" w:line="269" w:lineRule="auto"/>
+        <w:ind w:left="312" w:hanging="198"/>
+      </w:pPr>
+      <w:r>
+        <w:rPr>
+          <w:rFonts w:ascii="맑은 고딕" w:hAnsi="맑은 고딕" w:eastAsia="맑은 고딕"/>
+          <w:b w:val="0"/>
+          <w:color w:val="1E407C"/>
+          <w:sz w:val="21"/>
+        </w:rPr>
+        <w:t xml:space="preserve">• </w:t>
+      </w:r>
+      <w:r>
+        <w:rPr>
+          <w:rFonts w:ascii="맑은 고딕" w:hAnsi="맑은 고딕" w:eastAsia="맑은 고딕"/>
+          <w:b/>
+          <w:color w:val="1A1A1A"/>
+          <w:sz w:val="21"/>
+        </w:rPr>
+        <w:t xml:space="preserve">RTS  </w:t>
+      </w:r>
+      <w:r>
+        <w:rPr>
+          <w:rFonts w:ascii="맑은 고딕" w:hAnsi="맑은 고딕" w:eastAsia="맑은 고딕"/>
+          <w:b w:val="0"/>
+          <w:color w:val="1A1A1A"/>
+          <w:sz w:val="21"/>
+        </w:rPr>
+        <w:t>10월 2일 코스피는 0.46% 올라 7,000을 회복했다. 5·21·60일선 위지만 120일선 약 7,200이 위쪽 벽이다. 주간으로는 약 1% 하락. 약한 장은 아니고, 인플레이션만큼 버틴 주에 가깝다.</w:t>
       </w:r>
     </w:p>
     <w:p>
@@ -2719,6 +3610,39 @@
           <w:color w:val="1A1A1A"/>
           <w:sz w:val="21"/>
         </w:rPr>
+        <w:t xml:space="preserve">목대균·이경규  </w:t>
+      </w:r>
+      <w:r>
+        <w:rPr>
+          <w:rFonts w:ascii="맑은 고딕" w:hAnsi="맑은 고딕" w:eastAsia="맑은 고딕"/>
+          <w:b w:val="0"/>
+          <w:color w:val="1A1A1A"/>
+          <w:sz w:val="21"/>
+        </w:rPr>
+        <w:t>광통신은 2030년까지 산업 규모가 약 4배라는 얘기가 있다. 한국이 선도 기업은 아니어도 산업이 커지면 수혜는 남는다.</w:t>
+      </w:r>
+    </w:p>
+    <w:p>
+      <w:pPr>
+        <w:spacing w:after="40" w:before="0" w:line="269" w:lineRule="auto"/>
+        <w:ind w:left="312" w:hanging="198"/>
+      </w:pPr>
+      <w:r>
+        <w:rPr>
+          <w:rFonts w:ascii="맑은 고딕" w:hAnsi="맑은 고딕" w:eastAsia="맑은 고딕"/>
+          <w:b w:val="0"/>
+          <w:color w:val="1E407C"/>
+          <w:sz w:val="21"/>
+        </w:rPr>
+        <w:t xml:space="preserve">• </w:t>
+      </w:r>
+      <w:r>
+        <w:rPr>
+          <w:rFonts w:ascii="맑은 고딕" w:hAnsi="맑은 고딕" w:eastAsia="맑은 고딕"/>
+          <w:b/>
+          <w:color w:val="1A1A1A"/>
+          <w:sz w:val="21"/>
+        </w:rPr>
         <w:t xml:space="preserve">퀵코멘트  </w:t>
       </w:r>
       <w:r>
@@ -3049,16 +3973,16 @@
           <w:color w:val="1A1A1A"/>
           <w:sz w:val="21"/>
         </w:rPr>
-        <w:t xml:space="preserve">퀵코멘트  </w:t>
-      </w:r>
-      <w:r>
-        <w:rPr>
-          <w:rFonts w:ascii="맑은 고딕" w:hAnsi="맑은 고딕" w:eastAsia="맑은 고딕"/>
-          <w:b w:val="0"/>
-          <w:color w:val="1A1A1A"/>
-          <w:sz w:val="21"/>
-        </w:rPr>
-        <w:t>체크포인트 외국인 보유율 0% → 4.3%(9/10→10/1) 세 줄 요약 ① 수주잔고 1,261억 → 1,700억, 4Q 신규수주 1,000억 전망 → 수주 모멘텀 지속. ② AI CPU/GPU용 FC-BGA 쇼티지 + 삼성전기 4.3조원 증설 등 기판 투자 확대가 핵심 성장동력.</w:t>
+        <w:t xml:space="preserve">노근창  </w:t>
+      </w:r>
+      <w:r>
+        <w:rPr>
+          <w:rFonts w:ascii="맑은 고딕" w:hAnsi="맑은 고딕" w:eastAsia="맑은 고딕"/>
+          <w:b w:val="0"/>
+          <w:color w:val="1A1A1A"/>
+          <w:sz w:val="21"/>
+        </w:rPr>
+        <w:t>장비는 약 5년, 매년 20~30% 성장이라는 글로벌 장비사 시각이다. TSMC 텍사스, 하이닉스 용인이 배경이다. 개인형 에이전트는 CPU와 기판·네트워킹 수요다. 장비·부품은 공급이 부족한 반면 소재는 부족이 아니다. 셋을 같이 보면 안 된다.</w:t>
       </w:r>
     </w:p>
     <w:p>
@@ -3082,16 +4006,16 @@
           <w:color w:val="1A1A1A"/>
           <w:sz w:val="21"/>
         </w:rPr>
-        <w:t xml:space="preserve">이선엽 · 녹취  </w:t>
-      </w:r>
-      <w:r>
-        <w:rPr>
-          <w:rFonts w:ascii="맑은 고딕" w:hAnsi="맑은 고딕" w:eastAsia="맑은 고딕"/>
-          <w:b w:val="0"/>
-          <w:color w:val="1A1A1A"/>
-          <w:sz w:val="21"/>
-        </w:rPr>
-        <w:t>장비 사이클은 5년으로 보고, 그 안에서 주가는 종목마다 먼저 가고 늦게 간다. 초보는 소부장 ETF가 편하다는 코멘트다.</w:t>
+        <w:t xml:space="preserve">퀵코멘트  </w:t>
+      </w:r>
+      <w:r>
+        <w:rPr>
+          <w:rFonts w:ascii="맑은 고딕" w:hAnsi="맑은 고딕" w:eastAsia="맑은 고딕"/>
+          <w:b w:val="0"/>
+          <w:color w:val="1A1A1A"/>
+          <w:sz w:val="21"/>
+        </w:rPr>
+        <w:t>체크포인트 외국인 보유율 0% → 4.3%(9/10→10/1) 세 줄 요약 ① 수주잔고 1,261억 → 1,700억, 4Q 신규수주 1,000억 전망 → 수주 모멘텀 지속. ② AI CPU/GPU용 FC-BGA 쇼티지 + 삼성전기 4.3조원 증설 등 기판 투자 확대가 핵심 성장동력.</w:t>
       </w:r>
     </w:p>
     <w:p>
@@ -3115,16 +4039,16 @@
           <w:color w:val="1A1A1A"/>
           <w:sz w:val="21"/>
         </w:rPr>
-        <w:t xml:space="preserve">이지원  </w:t>
-      </w:r>
-      <w:r>
-        <w:rPr>
-          <w:rFonts w:ascii="맑은 고딕" w:hAnsi="맑은 고딕" w:eastAsia="맑은 고딕"/>
-          <w:b w:val="0"/>
-          <w:color w:val="1A1A1A"/>
-          <w:sz w:val="21"/>
-        </w:rPr>
-        <w:t>환율이 대형주 이익에 주는 민감도는 과거보다 줄었다. 삼성 영업이익 규모가 커져, 환율로 깎이는 금액이 전체에서 차지하는 비중이 작아졌다는 계산이다. 소부장은 헤지와 해외 생산이 약해 여전히 민감하다.</w:t>
+        <w:t xml:space="preserve">이선엽 · 녹취  </w:t>
+      </w:r>
+      <w:r>
+        <w:rPr>
+          <w:rFonts w:ascii="맑은 고딕" w:hAnsi="맑은 고딕" w:eastAsia="맑은 고딕"/>
+          <w:b w:val="0"/>
+          <w:color w:val="1A1A1A"/>
+          <w:sz w:val="21"/>
+        </w:rPr>
+        <w:t>장비 사이클은 5년으로 보고, 그 안에서 주가는 종목마다 먼저 가고 늦게 간다. 초보는 소부장 ETF가 편하다는 코멘트다.</w:t>
       </w:r>
     </w:p>
     <w:p>
@@ -3148,16 +4072,16 @@
           <w:color w:val="1A1A1A"/>
           <w:sz w:val="21"/>
         </w:rPr>
-        <w:t xml:space="preserve">퀵코멘트  </w:t>
-      </w:r>
-      <w:r>
-        <w:rPr>
-          <w:rFonts w:ascii="맑은 고딕" w:hAnsi="맑은 고딕" w:eastAsia="맑은 고딕"/>
-          <w:b w:val="0"/>
-          <w:color w:val="1A1A1A"/>
-          <w:sz w:val="21"/>
-        </w:rPr>
-        <w:t>국내 투자 관점에서는 이 두 건을 삼성전기,코리아써키트,대덕전자·심텍 등 AI 기판/패키징 밸류체인의 장기 수요 가시성을 점검하는 근거로 보는 것이 핵심입니다.</w:t>
+        <w:t xml:space="preserve">목대균·이경규  </w:t>
+      </w:r>
+      <w:r>
+        <w:rPr>
+          <w:rFonts w:ascii="맑은 고딕" w:hAnsi="맑은 고딕" w:eastAsia="맑은 고딕"/>
+          <w:b w:val="0"/>
+          <w:color w:val="1A1A1A"/>
+          <w:sz w:val="21"/>
+        </w:rPr>
+        <w:t>기관은 메모리에서 싼 장비로 바스켓을 옮기고 ETF 자금도 장비를 산다. 전공정 발주는 내년 상반기, 수주 신호는 올해 하반기다. 마이크론은 공장 완공과 장비 반입을 당긴다. 중국 장비 국산화가 높아져 한국 장비사는 삼성·하이닉스 발주에 더 민감하다.</w:t>
       </w:r>
     </w:p>
     <w:p>
@@ -3181,16 +4105,16 @@
           <w:color w:val="1A1A1A"/>
           <w:sz w:val="21"/>
         </w:rPr>
-        <w:t xml:space="preserve">윤지호  </w:t>
-      </w:r>
-      <w:r>
-        <w:rPr>
-          <w:rFonts w:ascii="맑은 고딕" w:hAnsi="맑은 고딕" w:eastAsia="맑은 고딕"/>
-          <w:b w:val="0"/>
-          <w:color w:val="1A1A1A"/>
-          <w:sz w:val="21"/>
-        </w:rPr>
-        <w:t>그래서 대형 메모리 비중을 줄이고 소부장·장비를 본다. 장비는 현재 배수만 보면 비싸도, 숫자가 2028년으로 넘어가면 배수가 내려오는 자리다.</w:t>
+        <w:t xml:space="preserve">이지원  </w:t>
+      </w:r>
+      <w:r>
+        <w:rPr>
+          <w:rFonts w:ascii="맑은 고딕" w:hAnsi="맑은 고딕" w:eastAsia="맑은 고딕"/>
+          <w:b w:val="0"/>
+          <w:color w:val="1A1A1A"/>
+          <w:sz w:val="21"/>
+        </w:rPr>
+        <w:t>환율이 대형주 이익에 주는 민감도는 과거보다 줄었다. 삼성 영업이익 규모가 커져, 환율로 깎이는 금액이 전체에서 차지하는 비중이 작아졌다는 계산이다. 소부장은 헤지와 해외 생산이 약해 여전히 민감하다.</w:t>
       </w:r>
     </w:p>
     <w:p>
@@ -3214,16 +4138,16 @@
           <w:color w:val="1A1A1A"/>
           <w:sz w:val="21"/>
         </w:rPr>
-        <w:t xml:space="preserve">퀵코멘트  </w:t>
-      </w:r>
-      <w:r>
-        <w:rPr>
-          <w:rFonts w:ascii="맑은 고딕" w:hAnsi="맑은 고딕" w:eastAsia="맑은 고딕"/>
-          <w:b w:val="0"/>
-          <w:color w:val="1A1A1A"/>
-          <w:sz w:val="21"/>
-        </w:rPr>
-        <w:t>따라서 ABF 기판·FC-BGA·패키징·관련 장비 업체의 중장기 캐파 투자 사이클이 연장될 가능성을 보여주는 사례다.</w:t>
+        <w:t xml:space="preserve">목대균·이경규  </w:t>
+      </w:r>
+      <w:r>
+        <w:rPr>
+          <w:rFonts w:ascii="맑은 고딕" w:hAnsi="맑은 고딕" w:eastAsia="맑은 고딕"/>
+          <w:b w:val="0"/>
+          <w:color w:val="1A1A1A"/>
+          <w:sz w:val="21"/>
+        </w:rPr>
+        <w:t>기판과 MLCC는 여전히 병목이다. 기관이 메모리 다음으로 보는 쪽이다.</w:t>
       </w:r>
     </w:p>
     <w:p>
@@ -3256,7 +4180,7 @@
           <w:color w:val="1A1A1A"/>
           <w:sz w:val="21"/>
         </w:rPr>
-        <w:t>핵심은 ‘현재 주문 대응’보다 2028~2030년 이후 캐파를 지금 확보한다는 점이다.</w:t>
+        <w:t>국내 투자 관점에서는 이 두 건을 삼성전기,코리아써키트,대덕전자·심텍 등 AI 기판/패키징 밸류체인의 장기 수요 가시성을 점검하는 근거로 보는 것이 핵심입니다.</w:t>
       </w:r>
     </w:p>
     <w:p>
@@ -3280,16 +4204,16 @@
           <w:color w:val="1A1A1A"/>
           <w:sz w:val="21"/>
         </w:rPr>
-        <w:t xml:space="preserve">녹취  </w:t>
-      </w:r>
-      <w:r>
-        <w:rPr>
-          <w:rFonts w:ascii="맑은 고딕" w:hAnsi="맑은 고딕" w:eastAsia="맑은 고딕"/>
-          <w:b w:val="0"/>
-          <w:color w:val="1A1A1A"/>
-          <w:sz w:val="21"/>
-        </w:rPr>
-        <w:t>소재는 솔브레인, 동진쎄미켐, 한솔케미칼 중 하나를 보면 된다는 압축이다.</w:t>
+        <w:t xml:space="preserve">윤지호  </w:t>
+      </w:r>
+      <w:r>
+        <w:rPr>
+          <w:rFonts w:ascii="맑은 고딕" w:hAnsi="맑은 고딕" w:eastAsia="맑은 고딕"/>
+          <w:b w:val="0"/>
+          <w:color w:val="1A1A1A"/>
+          <w:sz w:val="21"/>
+        </w:rPr>
+        <w:t>그래서 대형 메모리 비중을 줄이고 소부장·장비를 본다. 장비는 현재 배수만 보면 비싸도, 숫자가 2028년으로 넘어가면 배수가 내려오는 자리다.</w:t>
       </w:r>
     </w:p>
     <w:p>
@@ -3313,16 +4237,16 @@
           <w:color w:val="1A1A1A"/>
           <w:sz w:val="21"/>
         </w:rPr>
-        <w:t xml:space="preserve">녹취  </w:t>
-      </w:r>
-      <w:r>
-        <w:rPr>
-          <w:rFonts w:ascii="맑은 고딕" w:hAnsi="맑은 고딕" w:eastAsia="맑은 고딕"/>
-          <w:b w:val="0"/>
-          <w:color w:val="1A1A1A"/>
-          <w:sz w:val="21"/>
-        </w:rPr>
-        <w:t>주성엔지니어링은 실적이 확인되기 전에는 믿음이 약하다는 코멘트다.</w:t>
+        <w:t xml:space="preserve">퀵코멘트  </w:t>
+      </w:r>
+      <w:r>
+        <w:rPr>
+          <w:rFonts w:ascii="맑은 고딕" w:hAnsi="맑은 고딕" w:eastAsia="맑은 고딕"/>
+          <w:b w:val="0"/>
+          <w:color w:val="1A1A1A"/>
+          <w:sz w:val="21"/>
+        </w:rPr>
+        <w:t>따라서 ABF 기판·FC-BGA·패키징·관련 장비 업체의 중장기 캐파 투자 사이클이 연장될 가능성을 보여주는 사례다.</w:t>
       </w:r>
     </w:p>
     <w:p>
@@ -3544,16 +4468,16 @@
           <w:color w:val="1A1A1A"/>
           <w:sz w:val="21"/>
         </w:rPr>
-        <w:t xml:space="preserve">퀵코멘트  </w:t>
-      </w:r>
-      <w:r>
-        <w:rPr>
-          <w:rFonts w:ascii="맑은 고딕" w:hAnsi="맑은 고딕" w:eastAsia="맑은 고딕"/>
-          <w:b w:val="0"/>
-          <w:color w:val="1A1A1A"/>
-          <w:sz w:val="21"/>
-        </w:rPr>
-        <w:t>산일전기 영업이익률은 FY26 37.5%에서 FY28 40.7%다. 2028년 154kV 양산과 블룸에너지 벤더 등록이 적혀 있다.</w:t>
+        <w:t xml:space="preserve">목대균·이경규  </w:t>
+      </w:r>
+      <w:r>
+        <w:rPr>
+          <w:rFonts w:ascii="맑은 고딕" w:hAnsi="맑은 고딕" w:eastAsia="맑은 고딕"/>
+          <w:b w:val="0"/>
+          <w:color w:val="1A1A1A"/>
+          <w:sz w:val="21"/>
+        </w:rPr>
+        <w:t>관심은 반도체와 전력, 미국으로 나가는 한국 원전이다. 건설·기자재가 따라오고, 그 인증이 다른 나라 수출의 레퍼런스가 된다. 국내 재건축과 팹 건설도 같은 결이다.</w:t>
       </w:r>
     </w:p>
     <w:p>
@@ -3577,16 +4501,16 @@
           <w:color w:val="1A1A1A"/>
           <w:sz w:val="21"/>
         </w:rPr>
-        <w:t xml:space="preserve">퀵코멘트  </w:t>
-      </w:r>
-      <w:r>
-        <w:rPr>
-          <w:rFonts w:ascii="맑은 고딕" w:hAnsi="맑은 고딕" w:eastAsia="맑은 고딕"/>
-          <w:b w:val="0"/>
-          <w:color w:val="1A1A1A"/>
-          <w:sz w:val="21"/>
-        </w:rPr>
-        <w:t>기존 특수변압기 + 154kV 제품 패키지 수주 가능 → Bloom Energy·데이터센터 고객 공략</w:t>
+        <w:t xml:space="preserve">RTS  </w:t>
+      </w:r>
+      <w:r>
+        <w:rPr>
+          <w:rFonts w:ascii="맑은 고딕" w:hAnsi="맑은 고딕" w:eastAsia="맑은 고딕"/>
+          <w:b w:val="0"/>
+          <w:color w:val="1A1A1A"/>
+          <w:sz w:val="21"/>
+        </w:rPr>
+        <w:t>두산에너빌리티 주봉은 20주선에서 막혀 구름 안으로 돌아왔다. 버는 돈 대비 90배 안팎이라 미래 이익이 빨리 나와야 한다. 실적이 붙는 전력기기와는 결이 다르다.</w:t>
       </w:r>
     </w:p>
     <w:p>
@@ -3610,16 +4534,16 @@
           <w:color w:val="1A1A1A"/>
           <w:sz w:val="21"/>
         </w:rPr>
-        <w:t xml:space="preserve">녹취  </w:t>
-      </w:r>
-      <w:r>
-        <w:rPr>
-          <w:rFonts w:ascii="맑은 고딕" w:hAnsi="맑은 고딕" w:eastAsia="맑은 고딕"/>
-          <w:b w:val="0"/>
-          <w:color w:val="1A1A1A"/>
-          <w:sz w:val="21"/>
-        </w:rPr>
-        <w:t>미국 지수가 신고가인 동안, 중간선거 전까지 오를 때마다 현금을 조금씩 만들라는 월간 코멘트가 있다.</w:t>
+        <w:t xml:space="preserve">퀵코멘트  </w:t>
+      </w:r>
+      <w:r>
+        <w:rPr>
+          <w:rFonts w:ascii="맑은 고딕" w:hAnsi="맑은 고딕" w:eastAsia="맑은 고딕"/>
+          <w:b w:val="0"/>
+          <w:color w:val="1A1A1A"/>
+          <w:sz w:val="21"/>
+        </w:rPr>
+        <w:t>산일전기 영업이익률은 FY26 37.5%에서 FY28 40.7%다. 2028년 154kV 양산과 블룸에너지 벤더 등록이 적혀 있다.</w:t>
       </w:r>
     </w:p>
     <w:p>
@@ -3643,16 +4567,16 @@
           <w:color w:val="1A1A1A"/>
           <w:sz w:val="21"/>
         </w:rPr>
-        <w:t xml:space="preserve">녹취  </w:t>
-      </w:r>
-      <w:r>
-        <w:rPr>
-          <w:rFonts w:ascii="맑은 고딕" w:hAnsi="맑은 고딕" w:eastAsia="맑은 고딕"/>
-          <w:b w:val="0"/>
-          <w:color w:val="1A1A1A"/>
-          <w:sz w:val="21"/>
-        </w:rPr>
-        <w:t>인허가와 주민 반대는 주피터만의 일이 아니다. 버지니아·텍사스와 11월 중간선거가 같이 적혀 있다.</w:t>
+        <w:t xml:space="preserve">퀵코멘트  </w:t>
+      </w:r>
+      <w:r>
+        <w:rPr>
+          <w:rFonts w:ascii="맑은 고딕" w:hAnsi="맑은 고딕" w:eastAsia="맑은 고딕"/>
+          <w:b w:val="0"/>
+          <w:color w:val="1A1A1A"/>
+          <w:sz w:val="21"/>
+        </w:rPr>
+        <w:t>기존 특수변압기 + 154kV 제품 패키지 수주 가능 → Bloom Energy·데이터센터 고객 공략</w:t>
       </w:r>
     </w:p>
     <w:p>
@@ -3676,16 +4600,16 @@
           <w:color w:val="1A1A1A"/>
           <w:sz w:val="21"/>
         </w:rPr>
-        <w:t xml:space="preserve">퀵코멘트  </w:t>
-      </w:r>
-      <w:r>
-        <w:rPr>
-          <w:rFonts w:ascii="맑은 고딕" w:hAnsi="맑은 고딕" w:eastAsia="맑은 고딕"/>
-          <w:b w:val="0"/>
-          <w:color w:val="1A1A1A"/>
-          <w:sz w:val="21"/>
-        </w:rPr>
-        <w:t>2028년 양산 목표 154kV 초고압 변압기(UHV Transformer) 신규 라인 구축</w:t>
+        <w:t xml:space="preserve">녹취  </w:t>
+      </w:r>
+      <w:r>
+        <w:rPr>
+          <w:rFonts w:ascii="맑은 고딕" w:hAnsi="맑은 고딕" w:eastAsia="맑은 고딕"/>
+          <w:b w:val="0"/>
+          <w:color w:val="1A1A1A"/>
+          <w:sz w:val="21"/>
+        </w:rPr>
+        <w:t>미국 지수가 신고가인 동안, 중간선거 전까지 오를 때마다 현금을 조금씩 만들라는 월간 코멘트가 있다.</w:t>
       </w:r>
     </w:p>
     <w:p>
@@ -3709,16 +4633,16 @@
           <w:color w:val="1A1A1A"/>
           <w:sz w:val="21"/>
         </w:rPr>
-        <w:t xml:space="preserve">퀵코멘트  </w:t>
-      </w:r>
-      <w:r>
-        <w:rPr>
-          <w:rFonts w:ascii="맑은 고딕" w:hAnsi="맑은 고딕" w:eastAsia="맑은 고딕"/>
-          <w:b w:val="0"/>
-          <w:color w:val="1A1A1A"/>
-          <w:sz w:val="21"/>
-        </w:rPr>
-        <w:t>산일전기는 154kV 진입으로 ‘특수변압기 단일 업체’에서 제품·고객 다변화 단계로 진입.</w:t>
+        <w:t xml:space="preserve">녹취  </w:t>
+      </w:r>
+      <w:r>
+        <w:rPr>
+          <w:rFonts w:ascii="맑은 고딕" w:hAnsi="맑은 고딕" w:eastAsia="맑은 고딕"/>
+          <w:b w:val="0"/>
+          <w:color w:val="1A1A1A"/>
+          <w:sz w:val="21"/>
+        </w:rPr>
+        <w:t>인허가와 주민 반대는 주피터만의 일이 아니다. 버지니아·텍사스와 11월 중간선거가 같이 적혀 있다.</w:t>
       </w:r>
     </w:p>
     <w:p>
@@ -3751,7 +4675,7 @@
           <w:color w:val="1A1A1A"/>
           <w:sz w:val="21"/>
         </w:rPr>
-        <w:t>154kV 신공장으로 제품·고객 확장 → 수주 경쟁력 강화</w:t>
+        <w:t>2028년 양산 목표 154kV 초고압 변압기(UHV Transformer) 신규 라인 구축</w:t>
       </w:r>
     </w:p>
     <w:p>
@@ -3769,7 +4693,7 @@
           <w:color w:val="0F2043"/>
           <w:sz w:val="32"/>
         </w:rPr>
-        <w:t>8. 피크아웃 · 산업과 주가</w:t>
+        <w:t>8. 로봇 · 피지컬</w:t>
       </w:r>
     </w:p>
     <w:p>
@@ -3784,7 +4708,7 @@
           <w:color w:val="1A1A1A"/>
           <w:sz w:val="22"/>
         </w:rPr>
-        <w:t>싼 배수와 긴 산업 스토리를 한 질문에 모았다. 2028년에도 성장이 이어지는가, 그리고 그 성장이 주가에 남는가다.</w:t>
+        <w:t>중국 휴머노이드는 출하 경쟁보다 현장 데이터가 병목이다. 하드웨어 해자는 뇌가 똑똑해지면 얇아진다.</w:t>
       </w:r>
     </w:p>
     <w:p>
@@ -3808,16 +4732,16 @@
           <w:color w:val="1A1A1A"/>
           <w:sz w:val="21"/>
         </w:rPr>
-        <w:t xml:space="preserve">윤지호  </w:t>
-      </w:r>
-      <w:r>
-        <w:rPr>
-          <w:rFonts w:ascii="맑은 고딕" w:hAnsi="맑은 고딕" w:eastAsia="맑은 고딕"/>
-          <w:b w:val="0"/>
-          <w:color w:val="1A1A1A"/>
-          <w:sz w:val="21"/>
-        </w:rPr>
-        <w:t>반도체 수출 금액은 강한 반면 단가는 주춤하다. 가격 사이클에서 물량 사이클로 넘어가는 초입이고, 증설 물량의 본격 반영은 그 이후다.</w:t>
+        <w:t xml:space="preserve">박수현  </w:t>
+      </w:r>
+      <w:r>
+        <w:rPr>
+          <w:rFonts w:ascii="맑은 고딕" w:hAnsi="맑은 고딕" w:eastAsia="맑은 고딕"/>
+          <w:b w:val="0"/>
+          <w:color w:val="1A1A1A"/>
+          <w:sz w:val="21"/>
+        </w:rPr>
+        <w:t>범용 로봇의 병목은 눈앞을 알아보는 모델이 아니라 관절 각·악력 같은 숫자 데이터다. 사람이 붙어 가르치는 텔레오퍼레이션과 로봇 단독 데이터가 필요하고, 유튜브 영상으로는 안 된다. 중국은 산업별 혁신센터 약 22곳으로 표준 데이터를 쌓는다. 미국이 중국 휴머노이드 수입을 빨리 막은 것은 그 표준 때문이다.</w:t>
       </w:r>
     </w:p>
     <w:p>
@@ -3841,16 +4765,16 @@
           <w:color w:val="1A1A1A"/>
           <w:sz w:val="21"/>
         </w:rPr>
-        <w:t xml:space="preserve">윤지호 · 녹취  </w:t>
-      </w:r>
-      <w:r>
-        <w:rPr>
-          <w:rFonts w:ascii="맑은 고딕" w:hAnsi="맑은 고딕" w:eastAsia="맑은 고딕"/>
-          <w:b w:val="0"/>
-          <w:color w:val="1A1A1A"/>
-          <w:sz w:val="21"/>
-        </w:rPr>
-        <w:t>화장품은 수출이 좋은데도 성장 속도가 과거만 못하고 환율·원가 의심이 붙으며 멀티플이 죽었다. 퀄리티 종목은 그 의심이 가격에 나올 때 본다. 용기 원가 하나로 실적이 좌우된다는 해설은 과하다고 본다.</w:t>
+        <w:t xml:space="preserve">박수현  </w:t>
+      </w:r>
+      <w:r>
+        <w:rPr>
+          <w:rFonts w:ascii="맑은 고딕" w:hAnsi="맑은 고딕" w:eastAsia="맑은 고딕"/>
+          <w:b w:val="0"/>
+          <w:color w:val="1A1A1A"/>
+          <w:sz w:val="21"/>
+        </w:rPr>
+        <w:t>유니트리 CEO는 상장 뒤 범용화에 20년을 말했다. 중국 인구는 2030년까지 4,500만~5,000만 명이 준다는 추정이고, 청년은 3교대 제조를 기피한다. 그래서 휴머노이드가 시급하다는 설명이다. 현금 보조금은 얇고, 연구소·공장을 3~5년 무상 제공하는 지원이 나온다.</w:t>
       </w:r>
     </w:p>
     <w:p>
@@ -3874,16 +4798,16 @@
           <w:color w:val="1A1A1A"/>
           <w:sz w:val="21"/>
         </w:rPr>
-        <w:t xml:space="preserve">김효진  </w:t>
-      </w:r>
-      <w:r>
-        <w:rPr>
-          <w:rFonts w:ascii="맑은 고딕" w:hAnsi="맑은 고딕" w:eastAsia="맑은 고딕"/>
-          <w:b w:val="0"/>
-          <w:color w:val="1A1A1A"/>
-          <w:sz w:val="21"/>
-        </w:rPr>
-        <w:t>핵과 우주 경쟁처럼 전선이 숨은 모델 경쟁에서 에이전트·피지컬로 넓어진다. 피지컬 주가는 이미 한 번 갔다가 고점 대비 크게 빠졌고, 안전 검증 때문에 눈에 보이는 보급은 더 늦다.</w:t>
+        <w:t xml:space="preserve">박수현  </w:t>
+      </w:r>
+      <w:r>
+        <w:rPr>
+          <w:rFonts w:ascii="맑은 고딕" w:hAnsi="맑은 고딕" w:eastAsia="맑은 고딕"/>
+          <w:b w:val="0"/>
+          <w:color w:val="1A1A1A"/>
+          <w:sz w:val="21"/>
+        </w:rPr>
+        <w:t>액추에이터는 시장이 커질수록 플레이어가 늘어 영원한 해자로 보기 어렵다. 뇌가 똑똑해지면 하드웨어 정밀도 의존이 떨어진다. 하드웨어에서 시작해 완성 로봇과 브레인으로 가는 청사진이 있는 곳을 본다. 중국의 끝판은 브레인 특화 에지봇 쪽이다.</w:t>
       </w:r>
     </w:p>
     <w:p>
@@ -3907,16 +4831,16 @@
           <w:color w:val="1A1A1A"/>
           <w:sz w:val="21"/>
         </w:rPr>
-        <w:t xml:space="preserve">윤지호 · 녹취  </w:t>
-      </w:r>
-      <w:r>
-        <w:rPr>
-          <w:rFonts w:ascii="맑은 고딕" w:hAnsi="맑은 고딕" w:eastAsia="맑은 고딕"/>
-          <w:b w:val="0"/>
-          <w:color w:val="1A1A1A"/>
-          <w:sz w:val="21"/>
-        </w:rPr>
-        <w:t>7월 말 이후, 2028년에도 15% 이상 성장으로 분류된 종목은 약 26% 올랐고, 2027년 피크아웃으로 분류된 쪽은 약 14% 올랐다. 싼 PER은 2028년 증익률 둔화에 대한 질문으로 적혀 있다.</w:t>
+        <w:t xml:space="preserve">박수현  </w:t>
+      </w:r>
+      <w:r>
+        <w:rPr>
+          <w:rFonts w:ascii="맑은 고딕" w:hAnsi="맑은 고딕" w:eastAsia="맑은 고딕"/>
+          <w:b w:val="0"/>
+          <w:color w:val="1A1A1A"/>
+          <w:sz w:val="21"/>
+        </w:rPr>
+        <w:t>정부가 지분을 넣는 이유는 데이터 주권과 이익 회수, 기술 있는 곳만 남기는 선별이다. 상장은 유니트리·유비테크, 브레인 쪽 비상장은 에지봇·갈봇이다. 유니트리는 상장 후 반토막이고, 조달 자금의 브레인 비중을 5%에서 45%로 바꿨다.</w:t>
       </w:r>
     </w:p>
     <w:p>
@@ -3940,16 +4864,16 @@
           <w:color w:val="1A1A1A"/>
           <w:sz w:val="21"/>
         </w:rPr>
-        <w:t xml:space="preserve">이지원 · 녹취  </w:t>
-      </w:r>
-      <w:r>
-        <w:rPr>
-          <w:rFonts w:ascii="맑은 고딕" w:hAnsi="맑은 고딕" w:eastAsia="맑은 고딕"/>
-          <w:b w:val="0"/>
-          <w:color w:val="1A1A1A"/>
-          <w:sz w:val="21"/>
-        </w:rPr>
-        <w:t>하이닉스 400만 원에는 영업이익률 80%와 장기계약 40%가 필요하다. 마이크론 매출총이익률 80%대(87%·83%로 언급)가 그 숫자가 가능하다는 근거로 나온다. 2027년은 예상보다 더 타이트하다.</w:t>
+        <w:t xml:space="preserve">박수현  </w:t>
+      </w:r>
+      <w:r>
+        <w:rPr>
+          <w:rFonts w:ascii="맑은 고딕" w:hAnsi="맑은 고딕" w:eastAsia="맑은 고딕"/>
+          <w:b w:val="0"/>
+          <w:color w:val="1A1A1A"/>
+          <w:sz w:val="21"/>
+        </w:rPr>
+        <w:t>중공기술(섭컨)은 중국 자동화 점유 약 50%, 고객 약 4만 곳이다. 저장성 혁신센터와 나비 AI를 만들어 유럽 가전 라인 검사 공정에 넣었다. 연초 이후 수익률은 50~60%로 언급된다. 스마트팩토리의 감독자 역할이 그림이다.</w:t>
       </w:r>
     </w:p>
     <w:p>
@@ -3973,16 +4897,16 @@
           <w:color w:val="1A1A1A"/>
           <w:sz w:val="21"/>
         </w:rPr>
-        <w:t xml:space="preserve">윤지호 · 녹취  </w:t>
-      </w:r>
-      <w:r>
-        <w:rPr>
-          <w:rFonts w:ascii="맑은 고딕" w:hAnsi="맑은 고딕" w:eastAsia="맑은 고딕"/>
-          <w:b w:val="0"/>
-          <w:color w:val="1A1A1A"/>
-          <w:sz w:val="21"/>
-        </w:rPr>
-        <w:t>약한 고리로 프랑스 국채가 언급된다. 한국은 선행지수가 오르는데 동행지수가 못 따라오는 괴리가 있다. 지수 방향 베팅보다 2028년에 과실이 나오는 선행투자를 고르라는 결론이다.</w:t>
+        <w:t xml:space="preserve">박수현  </w:t>
+      </w:r>
+      <w:r>
+        <w:rPr>
+          <w:rFonts w:ascii="맑은 고딕" w:hAnsi="맑은 고딕" w:eastAsia="맑은 고딕"/>
+          <w:b w:val="0"/>
+          <w:color w:val="1A1A1A"/>
+          <w:sz w:val="21"/>
+        </w:rPr>
+        <w:t>원가의 핵인 액추에이터가 싸졌다. 중국 유성 감속기는 대당 500위안 안쪽, 일본·독일 대비 약 10분의 1이다. 사람과의 충돌을 흡수해 하모닉보다 안전하고, 테슬라도 일부를 유성으로 바꾼다. 바퀴형 상체는 하모닉이 남는다.</w:t>
       </w:r>
     </w:p>
     <w:p>
@@ -4006,16 +4930,16 @@
           <w:color w:val="1A1A1A"/>
           <w:sz w:val="21"/>
         </w:rPr>
-        <w:t xml:space="preserve">윤지호 · 녹취  </w:t>
-      </w:r>
-      <w:r>
-        <w:rPr>
-          <w:rFonts w:ascii="맑은 고딕" w:hAnsi="맑은 고딕" w:eastAsia="맑은 고딕"/>
-          <w:b w:val="0"/>
-          <w:color w:val="1A1A1A"/>
-          <w:sz w:val="21"/>
-        </w:rPr>
-        <w:t>이익은 의견이고 현금이 팩트다. 하이퍼스케일러 프리캐시플로가 마르면 반도체 매수 여력이 줄어든다. 국채 금리가 5%면 위험자산의 요구수익률이 올라 그 현금흐름이 더 마른다.</w:t>
+        <w:t xml:space="preserve">박수현  </w:t>
+      </w:r>
+      <w:r>
+        <w:rPr>
+          <w:rFonts w:ascii="맑은 고딕" w:hAnsi="맑은 고딕" w:eastAsia="맑은 고딕"/>
+          <w:b w:val="0"/>
+          <w:color w:val="1A1A1A"/>
+          <w:sz w:val="21"/>
+        </w:rPr>
+        <w:t>당장은 유니트리보다 유비테크가 낫다는 쪽이다. 띵커 모델이 있고 BYD 라인에 수년째 들어가 있다. 유니트리는 많은 브레인 업체의 레퍼런스 몸체라 과소평가할 단계는 아니지만, 뇌가 보이기 전에는 후순위다.</w:t>
       </w:r>
     </w:p>
     <w:p>
@@ -4039,16 +4963,16 @@
           <w:color w:val="1A1A1A"/>
           <w:sz w:val="21"/>
         </w:rPr>
-        <w:t xml:space="preserve">윤지호 · 녹취  </w:t>
-      </w:r>
-      <w:r>
-        <w:rPr>
-          <w:rFonts w:ascii="맑은 고딕" w:hAnsi="맑은 고딕" w:eastAsia="맑은 고딕"/>
-          <w:b w:val="0"/>
-          <w:color w:val="1A1A1A"/>
-          <w:sz w:val="21"/>
-        </w:rPr>
-        <w:t>10년물 5.5%는 과거 투자 사이클에서 주가를 제약하던 구간에 대응되는 스트레스 라인으로 적혀 있다. 최근 금리 상승분 상당수는 물가가 아니라 실질금리다.</w:t>
+        <w:t xml:space="preserve">박수현  </w:t>
+      </w:r>
+      <w:r>
+        <w:rPr>
+          <w:rFonts w:ascii="맑은 고딕" w:hAnsi="맑은 고딕" w:eastAsia="맑은 고딕"/>
+          <w:b w:val="0"/>
+          <w:color w:val="1A1A1A"/>
+          <w:sz w:val="21"/>
+        </w:rPr>
+        <w:t>월드 로봇 컨퍼런스에 기업 약 3,000곳, 신규 모델 200개 이상이 나왔다. 지난해 휴머노이드 출하의 약 97%가 중국이고, 그 70%는 연구·데이터 수집용이지 현장 배치가 아니다.</w:t>
       </w:r>
     </w:p>
     <w:p>
@@ -4072,16 +4996,16 @@
           <w:color w:val="1A1A1A"/>
           <w:sz w:val="21"/>
         </w:rPr>
-        <w:t xml:space="preserve">김효진 · 녹취  </w:t>
-      </w:r>
-      <w:r>
-        <w:rPr>
-          <w:rFonts w:ascii="맑은 고딕" w:hAnsi="맑은 고딕" w:eastAsia="맑은 고딕"/>
-          <w:b w:val="0"/>
-          <w:color w:val="1A1A1A"/>
-          <w:sz w:val="21"/>
-        </w:rPr>
-        <w:t>고점 매도는 맞히기 어렵다는 전제로, 줄이려면 내년 봄까지 나눠 팔라는 조언이 있다. 횡보 구간에서는 배당으로 시간을 버티는 선택도 적혀 있다.</w:t>
+        <w:t xml:space="preserve">박수현  </w:t>
+      </w:r>
+      <w:r>
+        <w:rPr>
+          <w:rFonts w:ascii="맑은 고딕" w:hAnsi="맑은 고딕" w:eastAsia="맑은 고딕"/>
+          <w:b w:val="0"/>
+          <w:color w:val="1A1A1A"/>
+          <w:sz w:val="21"/>
+        </w:rPr>
+        <w:t>휴머노이드 리베로 점수는 98~99로 변별력이 없고, 조건을 바꾼 플러스 지수는 제자리다. 파운데이션 모델만으로는 환경이 바뀌면 실패한다. 차이를 만드는 것은 현장 데이터다.</w:t>
       </w:r>
     </w:p>
     <w:p>
@@ -4105,412 +5029,16 @@
           <w:color w:val="1A1A1A"/>
           <w:sz w:val="21"/>
         </w:rPr>
-        <w:t xml:space="preserve">김효진  </w:t>
-      </w:r>
-      <w:r>
-        <w:rPr>
-          <w:rFonts w:ascii="맑은 고딕" w:hAnsi="맑은 고딕" w:eastAsia="맑은 고딕"/>
-          <w:b w:val="0"/>
-          <w:color w:val="1A1A1A"/>
-          <w:sz w:val="21"/>
-        </w:rPr>
-        <w:t>올해의 실수로 수급의 파괴력을 꼽는다. 기업 본질이 나빠지지 않아도 수급이 먼저 흔들리고, 미국 펀드 포지션은 미리 보이지 않는다. 수급은 재료보다 앞설 수 있다.</w:t>
-      </w:r>
-    </w:p>
-    <w:p>
-      <w:pPr>
-        <w:spacing w:after="40" w:before="0" w:line="269" w:lineRule="auto"/>
-        <w:ind w:left="312" w:hanging="198"/>
-      </w:pPr>
-      <w:r>
-        <w:rPr>
-          <w:rFonts w:ascii="맑은 고딕" w:hAnsi="맑은 고딕" w:eastAsia="맑은 고딕"/>
-          <w:b w:val="0"/>
-          <w:color w:val="1E407C"/>
-          <w:sz w:val="21"/>
-        </w:rPr>
-        <w:t xml:space="preserve">• </w:t>
-      </w:r>
-      <w:r>
-        <w:rPr>
-          <w:rFonts w:ascii="맑은 고딕" w:hAnsi="맑은 고딕" w:eastAsia="맑은 고딕"/>
-          <w:b/>
-          <w:color w:val="1A1A1A"/>
-          <w:sz w:val="21"/>
-        </w:rPr>
-        <w:t xml:space="preserve">윤지호  </w:t>
-      </w:r>
-      <w:r>
-        <w:rPr>
-          <w:rFonts w:ascii="맑은 고딕" w:hAnsi="맑은 고딕" w:eastAsia="맑은 고딕"/>
-          <w:b w:val="0"/>
-          <w:color w:val="1A1A1A"/>
-          <w:sz w:val="21"/>
-        </w:rPr>
-        <w:t>지금 작동하는 규칙은 높은 배수에 사서 낮아진 배수에 파는 쪽이다. 선행투자의 과실이 내년 하반기 이후에 나오는 장비·전력·파운드리를 고른다.</w:t>
-      </w:r>
-    </w:p>
-    <w:p>
-      <w:pPr>
-        <w:spacing w:after="40" w:before="0" w:line="269" w:lineRule="auto"/>
-        <w:ind w:left="312" w:hanging="198"/>
-      </w:pPr>
-      <w:r>
-        <w:rPr>
-          <w:rFonts w:ascii="맑은 고딕" w:hAnsi="맑은 고딕" w:eastAsia="맑은 고딕"/>
-          <w:b w:val="0"/>
-          <w:color w:val="1E407C"/>
-          <w:sz w:val="21"/>
-        </w:rPr>
-        <w:t xml:space="preserve">• </w:t>
-      </w:r>
-      <w:r>
-        <w:rPr>
-          <w:rFonts w:ascii="맑은 고딕" w:hAnsi="맑은 고딕" w:eastAsia="맑은 고딕"/>
-          <w:b/>
-          <w:color w:val="1A1A1A"/>
-          <w:sz w:val="21"/>
-        </w:rPr>
-        <w:t xml:space="preserve">김열매  </w:t>
-      </w:r>
-      <w:r>
-        <w:rPr>
-          <w:rFonts w:ascii="맑은 고딕" w:hAnsi="맑은 고딕" w:eastAsia="맑은 고딕"/>
-          <w:b w:val="0"/>
-          <w:color w:val="1A1A1A"/>
-          <w:sz w:val="21"/>
-        </w:rPr>
-        <w:t>중국이 AI·로봇을 밀어붙이는 이유로 인구 감소와 군사 활용이 나온다. 유닛트리 로봇은 내년 4만 대, 다른 언급은 7만 대까지 간다.</w:t>
-      </w:r>
-    </w:p>
-    <w:p>
-      <w:pPr>
-        <w:spacing w:after="40" w:before="0" w:line="269" w:lineRule="auto"/>
-        <w:ind w:left="312" w:hanging="198"/>
-      </w:pPr>
-      <w:r>
-        <w:rPr>
-          <w:rFonts w:ascii="맑은 고딕" w:hAnsi="맑은 고딕" w:eastAsia="맑은 고딕"/>
-          <w:b w:val="0"/>
-          <w:color w:val="1E407C"/>
-          <w:sz w:val="21"/>
-        </w:rPr>
-        <w:t xml:space="preserve">• </w:t>
-      </w:r>
-      <w:r>
-        <w:rPr>
-          <w:rFonts w:ascii="맑은 고딕" w:hAnsi="맑은 고딕" w:eastAsia="맑은 고딕"/>
-          <w:b/>
-          <w:color w:val="1A1A1A"/>
-          <w:sz w:val="21"/>
-        </w:rPr>
-        <w:t xml:space="preserve">김열매  </w:t>
-      </w:r>
-      <w:r>
-        <w:rPr>
-          <w:rFonts w:ascii="맑은 고딕" w:hAnsi="맑은 고딕" w:eastAsia="맑은 고딕"/>
-          <w:b w:val="0"/>
-          <w:color w:val="1A1A1A"/>
-          <w:sz w:val="21"/>
-        </w:rPr>
-        <w:t>에이전트 보안 사고는 현실이다. 그래도 미국은 사고를 감수하고 깔아 보는 선택에 가깝고, 규제만으로 레이스가 멈춘다고 보지 않는다.</w:t>
-      </w:r>
-    </w:p>
-    <w:p>
-      <w:pPr>
-        <w:spacing w:after="40" w:before="0" w:line="269" w:lineRule="auto"/>
-        <w:ind w:left="312" w:hanging="198"/>
-      </w:pPr>
-      <w:r>
-        <w:rPr>
-          <w:rFonts w:ascii="맑은 고딕" w:hAnsi="맑은 고딕" w:eastAsia="맑은 고딕"/>
-          <w:b w:val="0"/>
-          <w:color w:val="1E407C"/>
-          <w:sz w:val="21"/>
-        </w:rPr>
-        <w:t xml:space="preserve">• </w:t>
-      </w:r>
-      <w:r>
-        <w:rPr>
-          <w:rFonts w:ascii="맑은 고딕" w:hAnsi="맑은 고딕" w:eastAsia="맑은 고딕"/>
-          <w:b/>
-          <w:color w:val="1A1A1A"/>
-          <w:sz w:val="21"/>
-        </w:rPr>
-        <w:t xml:space="preserve">김열매  </w:t>
-      </w:r>
-      <w:r>
-        <w:rPr>
-          <w:rFonts w:ascii="맑은 고딕" w:hAnsi="맑은 고딕" w:eastAsia="맑은 고딕"/>
-          <w:b w:val="0"/>
-          <w:color w:val="1A1A1A"/>
-          <w:sz w:val="21"/>
-        </w:rPr>
-        <w:t>속도 조절은 서로 멈추자는 담합에 가깝다. 2등으로 밀리는 것이 확실한 게임이고 중국이 멈추지 않으면 유지되기 어렵다는 쪽이다.</w:t>
-      </w:r>
-    </w:p>
-    <w:p>
-      <w:pPr>
-        <w:spacing w:after="40" w:before="0" w:line="269" w:lineRule="auto"/>
-        <w:ind w:left="312" w:hanging="198"/>
-      </w:pPr>
-      <w:r>
-        <w:rPr>
-          <w:rFonts w:ascii="맑은 고딕" w:hAnsi="맑은 고딕" w:eastAsia="맑은 고딕"/>
-          <w:b w:val="0"/>
-          <w:color w:val="1E407C"/>
-          <w:sz w:val="21"/>
-        </w:rPr>
-        <w:t xml:space="preserve">• </w:t>
-      </w:r>
-      <w:r>
-        <w:rPr>
-          <w:rFonts w:ascii="맑은 고딕" w:hAnsi="맑은 고딕" w:eastAsia="맑은 고딕"/>
-          <w:b/>
-          <w:color w:val="1A1A1A"/>
-          <w:sz w:val="21"/>
-        </w:rPr>
-        <w:t xml:space="preserve">김효진  </w:t>
-      </w:r>
-      <w:r>
-        <w:rPr>
-          <w:rFonts w:ascii="맑은 고딕" w:hAnsi="맑은 고딕" w:eastAsia="맑은 고딕"/>
-          <w:b w:val="0"/>
-          <w:color w:val="1A1A1A"/>
-          <w:sz w:val="21"/>
-        </w:rPr>
-        <w:t>닷컴 당시 통신 투자는 그 뒤로도 계속 늘었지만 관련 주가는 무너졌다. 투자가 계속된다는 사실만으로 주가가 지키지지 않는다.</w:t>
-      </w:r>
-    </w:p>
-    <w:p>
-      <w:pPr>
-        <w:spacing w:after="40" w:before="0" w:line="269" w:lineRule="auto"/>
-        <w:ind w:left="312" w:hanging="198"/>
-      </w:pPr>
-      <w:r>
-        <w:rPr>
-          <w:rFonts w:ascii="맑은 고딕" w:hAnsi="맑은 고딕" w:eastAsia="맑은 고딕"/>
-          <w:b w:val="0"/>
-          <w:color w:val="1E407C"/>
-          <w:sz w:val="21"/>
-        </w:rPr>
-        <w:t xml:space="preserve">• </w:t>
-      </w:r>
-      <w:r>
-        <w:rPr>
-          <w:rFonts w:ascii="맑은 고딕" w:hAnsi="맑은 고딕" w:eastAsia="맑은 고딕"/>
-          <w:b/>
-          <w:color w:val="1A1A1A"/>
-          <w:sz w:val="21"/>
-        </w:rPr>
-        <w:t xml:space="preserve">김효진  </w:t>
-      </w:r>
-      <w:r>
-        <w:rPr>
-          <w:rFonts w:ascii="맑은 고딕" w:hAnsi="맑은 고딕" w:eastAsia="맑은 고딕"/>
-          <w:b w:val="0"/>
-          <w:color w:val="1A1A1A"/>
-          <w:sz w:val="21"/>
-        </w:rPr>
-        <w:t>성장주가 버는 돈 대비 극단적으로 비싸 보이지는 않는다. 금리 하나 같은 단일 요인으로 고점을 맞히려고 하지 말라는 쪽이다.</w:t>
-      </w:r>
-    </w:p>
-    <w:p>
-      <w:pPr>
-        <w:spacing w:after="40" w:before="0" w:line="269" w:lineRule="auto"/>
-        <w:ind w:left="312" w:hanging="198"/>
-      </w:pPr>
-      <w:r>
-        <w:rPr>
-          <w:rFonts w:ascii="맑은 고딕" w:hAnsi="맑은 고딕" w:eastAsia="맑은 고딕"/>
-          <w:b w:val="0"/>
-          <w:color w:val="1E407C"/>
-          <w:sz w:val="21"/>
-        </w:rPr>
-        <w:t xml:space="preserve">• </w:t>
-      </w:r>
-      <w:r>
-        <w:rPr>
-          <w:rFonts w:ascii="맑은 고딕" w:hAnsi="맑은 고딕" w:eastAsia="맑은 고딕"/>
-          <w:b/>
-          <w:color w:val="1A1A1A"/>
-          <w:sz w:val="21"/>
-        </w:rPr>
-        <w:t xml:space="preserve">김열매  </w:t>
-      </w:r>
-      <w:r>
-        <w:rPr>
-          <w:rFonts w:ascii="맑은 고딕" w:hAnsi="맑은 고딕" w:eastAsia="맑은 고딕"/>
-          <w:b w:val="0"/>
-          <w:color w:val="1A1A1A"/>
-          <w:sz w:val="21"/>
-        </w:rPr>
-        <w:t>오픈AI가 흔들려도 인수자가 나올 수 있다. 미국 빅테크 시가총액이 커서, 기술만 있으면 증자로 살 수 있다는 비유다.</w:t>
-      </w:r>
-    </w:p>
-    <w:p>
-      <w:pPr>
-        <w:spacing w:after="40" w:before="0" w:line="269" w:lineRule="auto"/>
-        <w:ind w:left="312" w:hanging="198"/>
-      </w:pPr>
-      <w:r>
-        <w:rPr>
-          <w:rFonts w:ascii="맑은 고딕" w:hAnsi="맑은 고딕" w:eastAsia="맑은 고딕"/>
-          <w:b w:val="0"/>
-          <w:color w:val="1E407C"/>
-          <w:sz w:val="21"/>
-        </w:rPr>
-        <w:t xml:space="preserve">• </w:t>
-      </w:r>
-      <w:r>
-        <w:rPr>
-          <w:rFonts w:ascii="맑은 고딕" w:hAnsi="맑은 고딕" w:eastAsia="맑은 고딕"/>
-          <w:b/>
-          <w:color w:val="1A1A1A"/>
-          <w:sz w:val="21"/>
-        </w:rPr>
-        <w:t xml:space="preserve">김효진  </w:t>
-      </w:r>
-      <w:r>
-        <w:rPr>
-          <w:rFonts w:ascii="맑은 고딕" w:hAnsi="맑은 고딕" w:eastAsia="맑은 고딕"/>
-          <w:b w:val="0"/>
-          <w:color w:val="1A1A1A"/>
-          <w:sz w:val="21"/>
-        </w:rPr>
-        <w:t>이익 수준이 높아도 증가 속도가 유지되면 주가는 횡보가 아니다. 모멘텀의 기울기가 완만해지면 주가는 빠진다.</w:t>
-      </w:r>
-    </w:p>
-    <w:p>
-      <w:pPr>
-        <w:spacing w:after="40" w:before="0" w:line="269" w:lineRule="auto"/>
-        <w:ind w:left="312" w:hanging="198"/>
-      </w:pPr>
-      <w:r>
-        <w:rPr>
-          <w:rFonts w:ascii="맑은 고딕" w:hAnsi="맑은 고딕" w:eastAsia="맑은 고딕"/>
-          <w:b w:val="0"/>
-          <w:color w:val="1E407C"/>
-          <w:sz w:val="21"/>
-        </w:rPr>
-        <w:t xml:space="preserve">• </w:t>
-      </w:r>
-      <w:r>
-        <w:rPr>
-          <w:rFonts w:ascii="맑은 고딕" w:hAnsi="맑은 고딕" w:eastAsia="맑은 고딕"/>
-          <w:b/>
-          <w:color w:val="1A1A1A"/>
-          <w:sz w:val="21"/>
-        </w:rPr>
-        <w:t xml:space="preserve">녹취  </w:t>
-      </w:r>
-      <w:r>
-        <w:rPr>
-          <w:rFonts w:ascii="맑은 고딕" w:hAnsi="맑은 고딕" w:eastAsia="맑은 고딕"/>
-          <w:b w:val="0"/>
-          <w:color w:val="1A1A1A"/>
-          <w:sz w:val="21"/>
-        </w:rPr>
-        <w:t>화장품·바이오 수출은 좋지만, 화장품은 전체 수출의 약 2%라 지수 주도 자리는 아니다.</w:t>
-      </w:r>
-    </w:p>
-    <w:p>
-      <w:pPr>
-        <w:spacing w:after="40" w:before="0" w:line="269" w:lineRule="auto"/>
-        <w:ind w:left="312" w:hanging="198"/>
-      </w:pPr>
-      <w:r>
-        <w:rPr>
-          <w:rFonts w:ascii="맑은 고딕" w:hAnsi="맑은 고딕" w:eastAsia="맑은 고딕"/>
-          <w:b w:val="0"/>
-          <w:color w:val="1E407C"/>
-          <w:sz w:val="21"/>
-        </w:rPr>
-        <w:t xml:space="preserve">• </w:t>
-      </w:r>
-      <w:r>
-        <w:rPr>
-          <w:rFonts w:ascii="맑은 고딕" w:hAnsi="맑은 고딕" w:eastAsia="맑은 고딕"/>
-          <w:b/>
-          <w:color w:val="1A1A1A"/>
-          <w:sz w:val="21"/>
-        </w:rPr>
-        <w:t xml:space="preserve">녹취  </w:t>
-      </w:r>
-      <w:r>
-        <w:rPr>
-          <w:rFonts w:ascii="맑은 고딕" w:hAnsi="맑은 고딕" w:eastAsia="맑은 고딕"/>
-          <w:b w:val="0"/>
-          <w:color w:val="1A1A1A"/>
-          <w:sz w:val="21"/>
-        </w:rPr>
-        <w:t>솔리다임 중복상장은 일단 진정됐고, 하이닉스는 아직 결정된 바 없다고 말했다.</w:t>
-      </w:r>
-    </w:p>
-    <w:p>
-      <w:pPr>
-        <w:spacing w:after="40" w:before="0" w:line="269" w:lineRule="auto"/>
-        <w:ind w:left="312" w:hanging="198"/>
-      </w:pPr>
-      <w:r>
-        <w:rPr>
-          <w:rFonts w:ascii="맑은 고딕" w:hAnsi="맑은 고딕" w:eastAsia="맑은 고딕"/>
-          <w:b w:val="0"/>
-          <w:color w:val="1E407C"/>
-          <w:sz w:val="21"/>
-        </w:rPr>
-        <w:t xml:space="preserve">• </w:t>
-      </w:r>
-      <w:r>
-        <w:rPr>
-          <w:rFonts w:ascii="맑은 고딕" w:hAnsi="맑은 고딕" w:eastAsia="맑은 고딕"/>
-          <w:b/>
-          <w:color w:val="1A1A1A"/>
-          <w:sz w:val="21"/>
-        </w:rPr>
-        <w:t xml:space="preserve">녹취  </w:t>
-      </w:r>
-      <w:r>
-        <w:rPr>
-          <w:rFonts w:ascii="맑은 고딕" w:hAnsi="맑은 고딕" w:eastAsia="맑은 고딕"/>
-          <w:b w:val="0"/>
-          <w:color w:val="1A1A1A"/>
-          <w:sz w:val="21"/>
-        </w:rPr>
-        <w:t>의무공개매수 범위를 넓히는 조치는 처리가 보류됐다.</w:t>
-      </w:r>
-    </w:p>
-    <w:p>
-      <w:pPr>
-        <w:spacing w:after="40" w:before="0" w:line="269" w:lineRule="auto"/>
-        <w:ind w:left="312" w:hanging="198"/>
-      </w:pPr>
-      <w:r>
-        <w:rPr>
-          <w:rFonts w:ascii="맑은 고딕" w:hAnsi="맑은 고딕" w:eastAsia="맑은 고딕"/>
-          <w:b w:val="0"/>
-          <w:color w:val="1E407C"/>
-          <w:sz w:val="21"/>
-        </w:rPr>
-        <w:t xml:space="preserve">• </w:t>
-      </w:r>
-      <w:r>
-        <w:rPr>
-          <w:rFonts w:ascii="맑은 고딕" w:hAnsi="맑은 고딕" w:eastAsia="맑은 고딕"/>
-          <w:b/>
-          <w:color w:val="1A1A1A"/>
-          <w:sz w:val="21"/>
-        </w:rPr>
-        <w:t xml:space="preserve">녹취  </w:t>
-      </w:r>
-      <w:r>
-        <w:rPr>
-          <w:rFonts w:ascii="맑은 고딕" w:hAnsi="맑은 고딕" w:eastAsia="맑은 고딕"/>
-          <w:b w:val="0"/>
-          <w:color w:val="1A1A1A"/>
-          <w:sz w:val="21"/>
-        </w:rPr>
-        <w:t>피지컬 AI는 산업 전선이 넓어지는 이야기다. 주가는 이미 한 번 선반영된 뒤 고점 대비 크게 빠진 상태로, 눈에 보이는 상용화와 주가 시계는 따로 둔다.</w:t>
+        <w:t xml:space="preserve">박수현  </w:t>
+      </w:r>
+      <w:r>
+        <w:rPr>
+          <w:rFonts w:ascii="맑은 고딕" w:hAnsi="맑은 고딕" w:eastAsia="맑은 고딕"/>
+          <w:b w:val="0"/>
+          <w:color w:val="1A1A1A"/>
+          <w:sz w:val="21"/>
+        </w:rPr>
+        <w:t>전기차 공급망이 휴머노이드 부품으로 넘어오며 가격이 더 떨어진다. 과거 육성은 현금 보조금이라 좀비 기업이 늘었다. 부동산 세수가 말라 지금은 지분 투자와 무형 지원(연산, 토큰 API, 현장 데이터)으로 바뀌었다.</w:t>
       </w:r>
     </w:p>
     <w:p>
@@ -4528,7 +5056,7 @@
           <w:color w:val="0F2043"/>
           <w:sz w:val="32"/>
         </w:rPr>
-        <w:t>9. AI CapEx 리스크</w:t>
+        <w:t>9. 피크아웃 · 산업과 주가</w:t>
       </w:r>
     </w:p>
     <w:p>
@@ -4543,7 +5071,7 @@
           <w:color w:val="1A1A1A"/>
           <w:sz w:val="22"/>
         </w:rPr>
-        <w:t>GPU 경제적 수명 가정은 3년 / 5년 / 7년이다. 브로드컴-앤트로픽 금융은 원문 표기 $42bn이다. Burry의 '감가상각/잔존가치 리스크' 문제제기는 타당성이 높지만, 이를 1960년대 버블과 동일한 구조라고 확대하는 부분은 타당성이 낮습니다.</w:t>
+        <w:t>싼 배수와 긴 산업 스토리를 한 질문에 모았다. 2028년에도 성장이 이어지는가, 그리고 그 성장이 주가에 남는가다.</w:t>
       </w:r>
     </w:p>
     <w:p>
@@ -4567,16 +5095,16 @@
           <w:color w:val="1A1A1A"/>
           <w:sz w:val="21"/>
         </w:rPr>
-        <w:t xml:space="preserve">퀵코멘트  </w:t>
-      </w:r>
-      <w:r>
-        <w:rPr>
-          <w:rFonts w:ascii="맑은 고딕" w:hAnsi="맑은 고딕" w:eastAsia="맑은 고딕"/>
-          <w:b w:val="0"/>
-          <w:color w:val="1A1A1A"/>
-          <w:sz w:val="21"/>
-        </w:rPr>
-        <w:t>추론 수요로 A100/H100이 현금흐름을 이어 간다는 점이, 1960년대 컴퓨터 리스 버블과 다른 부분으로 적혀 있다.</w:t>
+        <w:t xml:space="preserve">윤지호  </w:t>
+      </w:r>
+      <w:r>
+        <w:rPr>
+          <w:rFonts w:ascii="맑은 고딕" w:hAnsi="맑은 고딕" w:eastAsia="맑은 고딕"/>
+          <w:b w:val="0"/>
+          <w:color w:val="1A1A1A"/>
+          <w:sz w:val="21"/>
+        </w:rPr>
+        <w:t>반도체 수출 금액은 강한 반면 단가는 주춤하다. 가격 사이클에서 물량 사이클로 넘어가는 초입이고, 증설 물량의 본격 반영은 그 이후다.</w:t>
       </w:r>
     </w:p>
     <w:p>
@@ -4600,16 +5128,16 @@
           <w:color w:val="1A1A1A"/>
           <w:sz w:val="21"/>
         </w:rPr>
-        <w:t xml:space="preserve">퀵코멘트  </w:t>
-      </w:r>
-      <w:r>
-        <w:rPr>
-          <w:rFonts w:ascii="맑은 고딕" w:hAnsi="맑은 고딕" w:eastAsia="맑은 고딕"/>
-          <w:b w:val="0"/>
-          <w:color w:val="1A1A1A"/>
-          <w:sz w:val="21"/>
-        </w:rPr>
-        <w:t>한편 &lt;Burry의 「1960년대 컴퓨터 리스 버블」 비유&gt; 관련, Burry의 문제제기는 ‘AI 수요가 가짜’라는 주장이라기보다, GPU의 경제적 수명과 잔존가치를 지나치게 낙관하면 AI CapEx의 실제 수익성이 과대평가될 수 있다는 경고입니다만</w:t>
+        <w:t xml:space="preserve">노근창 · 녹취  </w:t>
+      </w:r>
+      <w:r>
+        <w:rPr>
+          <w:rFonts w:ascii="맑은 고딕" w:hAnsi="맑은 고딕" w:eastAsia="맑은 고딕"/>
+          <w:b w:val="0"/>
+          <w:color w:val="1A1A1A"/>
+          <w:sz w:val="21"/>
+        </w:rPr>
+        <w:t>솔리다임 중복상장은 결정된 바 없다. 시장은 쪼개기에 우호적이지 않다. 다만 지금 낸드 업황은 생각보다 길어, 상장을 늦사이클 현금 확보로만 보기는 어렵다. YMTC 상장은 디램까지 노리는 다른 그림이다.</w:t>
       </w:r>
     </w:p>
     <w:p>
@@ -4633,16 +5161,16 @@
           <w:color w:val="1A1A1A"/>
           <w:sz w:val="21"/>
         </w:rPr>
-        <w:t xml:space="preserve">퀵코멘트  </w:t>
-      </w:r>
-      <w:r>
-        <w:rPr>
-          <w:rFonts w:ascii="맑은 고딕" w:hAnsi="맑은 고딕" w:eastAsia="맑은 고딕"/>
-          <w:b w:val="0"/>
-          <w:color w:val="1A1A1A"/>
-          <w:sz w:val="21"/>
-        </w:rPr>
-        <w:t>Anthropic의 AI 인프라 투자에 금융까지 제공하면서, AI 반도체 판매 → 금융 → 재구매의 순환구조가 강화되고 있습니다. 이런 현상을 순환투자 관점에서만 보면 우려지만</w:t>
+        <w:t xml:space="preserve">윤지호 · 녹취  </w:t>
+      </w:r>
+      <w:r>
+        <w:rPr>
+          <w:rFonts w:ascii="맑은 고딕" w:hAnsi="맑은 고딕" w:eastAsia="맑은 고딕"/>
+          <w:b w:val="0"/>
+          <w:color w:val="1A1A1A"/>
+          <w:sz w:val="21"/>
+        </w:rPr>
+        <w:t>화장품은 수출이 좋은데도 성장 속도가 과거만 못하고 환율·원가 의심이 붙으며 멀티플이 죽었다. 퀄리티 종목은 그 의심이 가격에 나올 때 본다. 용기 원가 하나로 실적이 좌우된다는 해설은 과하다고 본다.</w:t>
       </w:r>
     </w:p>
     <w:p>
@@ -4666,16 +5194,16 @@
           <w:color w:val="1A1A1A"/>
           <w:sz w:val="21"/>
         </w:rPr>
-        <w:t xml:space="preserve">퀵코멘트  </w:t>
-      </w:r>
-      <w:r>
-        <w:rPr>
-          <w:rFonts w:ascii="맑은 고딕" w:hAnsi="맑은 고딕" w:eastAsia="맑은 고딕"/>
-          <w:b w:val="0"/>
-          <w:color w:val="1A1A1A"/>
-          <w:sz w:val="21"/>
-        </w:rPr>
-        <w:t>Burry의 경고는 '새로운 위험의 발견'이라기보다, 시장이 이미 인식하고 있는 AI CapEx·GPU 잔존가치 리스크가 실제로 얼마나 큰지를 다시 환기시키는 주장</w:t>
+        <w:t xml:space="preserve">노근창  </w:t>
+      </w:r>
+      <w:r>
+        <w:rPr>
+          <w:rFonts w:ascii="맑은 고딕" w:hAnsi="맑은 고딕" w:eastAsia="맑은 고딕"/>
+          <w:b w:val="0"/>
+          <w:color w:val="1A1A1A"/>
+          <w:sz w:val="21"/>
+        </w:rPr>
+        <w:t>AI 데이터센터는 2000년 꼭대기보다 1997년 인프라 투자 초입에 가깝다. 개인적으로 봤던 2028년 정점은 더 길어진다. 미국 데이터센터는 약 40GW에서 2030년 120GW가 목표다.</w:t>
       </w:r>
     </w:p>
     <w:p>
@@ -4699,16 +5227,16 @@
           <w:color w:val="1A1A1A"/>
           <w:sz w:val="21"/>
         </w:rPr>
-        <w:t xml:space="preserve">퀵코멘트  </w:t>
-      </w:r>
-      <w:r>
-        <w:rPr>
-          <w:rFonts w:ascii="맑은 고딕" w:hAnsi="맑은 고딕" w:eastAsia="맑은 고딕"/>
-          <w:b w:val="0"/>
-          <w:color w:val="1A1A1A"/>
-          <w:sz w:val="21"/>
-        </w:rPr>
-        <w:t>투자 관점에서 가장 중요한 것은 Burry의 '버블인가 아닌가'가 아니라 GPU 경제적 수명 3년 vs 5년 vs 7년 중 어느 가정이 맞느냐입니다.</w:t>
+        <w:t xml:space="preserve">김효진  </w:t>
+      </w:r>
+      <w:r>
+        <w:rPr>
+          <w:rFonts w:ascii="맑은 고딕" w:hAnsi="맑은 고딕" w:eastAsia="맑은 고딕"/>
+          <w:b w:val="0"/>
+          <w:color w:val="1A1A1A"/>
+          <w:sz w:val="21"/>
+        </w:rPr>
+        <w:t>핵과 우주 경쟁처럼 전선이 숨은 모델 경쟁에서 에이전트·피지컬로 넓어진다. 피지컬 주가는 이미 한 번 갔다가 고점 대비 크게 빠졌고, 안전 검증 때문에 눈에 보이는 보급은 더 늦다.</w:t>
       </w:r>
     </w:p>
     <w:p>
@@ -4732,16 +5260,907 @@
           <w:color w:val="1A1A1A"/>
           <w:sz w:val="21"/>
         </w:rPr>
-        <w:t xml:space="preserve">퀵코멘트  </w:t>
-      </w:r>
-      <w:r>
-        <w:rPr>
-          <w:rFonts w:ascii="맑은 고딕" w:hAnsi="맑은 고딕" w:eastAsia="맑은 고딕"/>
-          <w:b w:val="0"/>
-          <w:color w:val="1A1A1A"/>
-          <w:sz w:val="21"/>
-        </w:rPr>
-        <w:t>수명 가정이 갈리는 이름은 NVIDIA · CoreWeave · Oracle · Microsoft · Meta다.</w:t>
+        <w:t xml:space="preserve">윤지호 · 녹취  </w:t>
+      </w:r>
+      <w:r>
+        <w:rPr>
+          <w:rFonts w:ascii="맑은 고딕" w:hAnsi="맑은 고딕" w:eastAsia="맑은 고딕"/>
+          <w:b w:val="0"/>
+          <w:color w:val="1A1A1A"/>
+          <w:sz w:val="21"/>
+        </w:rPr>
+        <w:t>7월 말 이후, 2028년에도 15% 이상 성장으로 분류된 종목은 약 26% 올랐고, 2027년 피크아웃으로 분류된 쪽은 약 14% 올랐다. 싼 PER은 2028년 증익률 둔화에 대한 질문으로 적혀 있다.</w:t>
+      </w:r>
+    </w:p>
+    <w:p>
+      <w:pPr>
+        <w:spacing w:after="40" w:before="0" w:line="269" w:lineRule="auto"/>
+        <w:ind w:left="312" w:hanging="198"/>
+      </w:pPr>
+      <w:r>
+        <w:rPr>
+          <w:rFonts w:ascii="맑은 고딕" w:hAnsi="맑은 고딕" w:eastAsia="맑은 고딕"/>
+          <w:b w:val="0"/>
+          <w:color w:val="1E407C"/>
+          <w:sz w:val="21"/>
+        </w:rPr>
+        <w:t xml:space="preserve">• </w:t>
+      </w:r>
+      <w:r>
+        <w:rPr>
+          <w:rFonts w:ascii="맑은 고딕" w:hAnsi="맑은 고딕" w:eastAsia="맑은 고딕"/>
+          <w:b/>
+          <w:color w:val="1A1A1A"/>
+          <w:sz w:val="21"/>
+        </w:rPr>
+        <w:t xml:space="preserve">이지원 · 녹취  </w:t>
+      </w:r>
+      <w:r>
+        <w:rPr>
+          <w:rFonts w:ascii="맑은 고딕" w:hAnsi="맑은 고딕" w:eastAsia="맑은 고딕"/>
+          <w:b w:val="0"/>
+          <w:color w:val="1A1A1A"/>
+          <w:sz w:val="21"/>
+        </w:rPr>
+        <w:t>하이닉스 400만 원에는 영업이익률 80%와 장기계약 40%가 필요하다. 마이크론 매출총이익률 80%대(87%·83%로 언급)가 그 숫자가 가능하다는 근거로 나온다. 2027년은 예상보다 더 타이트하다.</w:t>
+      </w:r>
+    </w:p>
+    <w:p>
+      <w:pPr>
+        <w:spacing w:after="40" w:before="0" w:line="269" w:lineRule="auto"/>
+        <w:ind w:left="312" w:hanging="198"/>
+      </w:pPr>
+      <w:r>
+        <w:rPr>
+          <w:rFonts w:ascii="맑은 고딕" w:hAnsi="맑은 고딕" w:eastAsia="맑은 고딕"/>
+          <w:b w:val="0"/>
+          <w:color w:val="1E407C"/>
+          <w:sz w:val="21"/>
+        </w:rPr>
+        <w:t xml:space="preserve">• </w:t>
+      </w:r>
+      <w:r>
+        <w:rPr>
+          <w:rFonts w:ascii="맑은 고딕" w:hAnsi="맑은 고딕" w:eastAsia="맑은 고딕"/>
+          <w:b/>
+          <w:color w:val="1A1A1A"/>
+          <w:sz w:val="21"/>
+        </w:rPr>
+        <w:t xml:space="preserve">윤지호 · 녹취  </w:t>
+      </w:r>
+      <w:r>
+        <w:rPr>
+          <w:rFonts w:ascii="맑은 고딕" w:hAnsi="맑은 고딕" w:eastAsia="맑은 고딕"/>
+          <w:b w:val="0"/>
+          <w:color w:val="1A1A1A"/>
+          <w:sz w:val="21"/>
+        </w:rPr>
+        <w:t>약한 고리로 프랑스 국채가 언급된다. 한국은 선행지수가 오르는데 동행지수가 못 따라오는 괴리가 있다. 지수 방향 베팅보다 2028년에 과실이 나오는 선행투자를 고르라는 결론이다.</w:t>
+      </w:r>
+    </w:p>
+    <w:p>
+      <w:pPr>
+        <w:spacing w:after="40" w:before="0" w:line="269" w:lineRule="auto"/>
+        <w:ind w:left="312" w:hanging="198"/>
+      </w:pPr>
+      <w:r>
+        <w:rPr>
+          <w:rFonts w:ascii="맑은 고딕" w:hAnsi="맑은 고딕" w:eastAsia="맑은 고딕"/>
+          <w:b w:val="0"/>
+          <w:color w:val="1E407C"/>
+          <w:sz w:val="21"/>
+        </w:rPr>
+        <w:t xml:space="preserve">• </w:t>
+      </w:r>
+      <w:r>
+        <w:rPr>
+          <w:rFonts w:ascii="맑은 고딕" w:hAnsi="맑은 고딕" w:eastAsia="맑은 고딕"/>
+          <w:b/>
+          <w:color w:val="1A1A1A"/>
+          <w:sz w:val="21"/>
+        </w:rPr>
+        <w:t xml:space="preserve">윤지호 · 녹취  </w:t>
+      </w:r>
+      <w:r>
+        <w:rPr>
+          <w:rFonts w:ascii="맑은 고딕" w:hAnsi="맑은 고딕" w:eastAsia="맑은 고딕"/>
+          <w:b w:val="0"/>
+          <w:color w:val="1A1A1A"/>
+          <w:sz w:val="21"/>
+        </w:rPr>
+        <w:t>이익은 의견이고 현금이 팩트다. 하이퍼스케일러 프리캐시플로가 마르면 반도체 매수 여력이 줄어든다. 국채 금리가 5%면 위험자산의 요구수익률이 올라 그 현금흐름이 더 마른다.</w:t>
+      </w:r>
+    </w:p>
+    <w:p>
+      <w:pPr>
+        <w:spacing w:after="40" w:before="0" w:line="269" w:lineRule="auto"/>
+        <w:ind w:left="312" w:hanging="198"/>
+      </w:pPr>
+      <w:r>
+        <w:rPr>
+          <w:rFonts w:ascii="맑은 고딕" w:hAnsi="맑은 고딕" w:eastAsia="맑은 고딕"/>
+          <w:b w:val="0"/>
+          <w:color w:val="1E407C"/>
+          <w:sz w:val="21"/>
+        </w:rPr>
+        <w:t xml:space="preserve">• </w:t>
+      </w:r>
+      <w:r>
+        <w:rPr>
+          <w:rFonts w:ascii="맑은 고딕" w:hAnsi="맑은 고딕" w:eastAsia="맑은 고딕"/>
+          <w:b/>
+          <w:color w:val="1A1A1A"/>
+          <w:sz w:val="21"/>
+        </w:rPr>
+        <w:t xml:space="preserve">윤지호 · 녹취  </w:t>
+      </w:r>
+      <w:r>
+        <w:rPr>
+          <w:rFonts w:ascii="맑은 고딕" w:hAnsi="맑은 고딕" w:eastAsia="맑은 고딕"/>
+          <w:b w:val="0"/>
+          <w:color w:val="1A1A1A"/>
+          <w:sz w:val="21"/>
+        </w:rPr>
+        <w:t>10년물 5.5%는 과거 투자 사이클에서 주가를 제약하던 구간에 대응되는 스트레스 라인으로 적혀 있다. 최근 금리 상승분 상당수는 물가가 아니라 실질금리다.</w:t>
+      </w:r>
+    </w:p>
+    <w:p>
+      <w:pPr>
+        <w:spacing w:after="40" w:before="0" w:line="269" w:lineRule="auto"/>
+        <w:ind w:left="312" w:hanging="198"/>
+      </w:pPr>
+      <w:r>
+        <w:rPr>
+          <w:rFonts w:ascii="맑은 고딕" w:hAnsi="맑은 고딕" w:eastAsia="맑은 고딕"/>
+          <w:b w:val="0"/>
+          <w:color w:val="1E407C"/>
+          <w:sz w:val="21"/>
+        </w:rPr>
+        <w:t xml:space="preserve">• </w:t>
+      </w:r>
+      <w:r>
+        <w:rPr>
+          <w:rFonts w:ascii="맑은 고딕" w:hAnsi="맑은 고딕" w:eastAsia="맑은 고딕"/>
+          <w:b/>
+          <w:color w:val="1A1A1A"/>
+          <w:sz w:val="21"/>
+        </w:rPr>
+        <w:t xml:space="preserve">김효진 · 녹취  </w:t>
+      </w:r>
+      <w:r>
+        <w:rPr>
+          <w:rFonts w:ascii="맑은 고딕" w:hAnsi="맑은 고딕" w:eastAsia="맑은 고딕"/>
+          <w:b w:val="0"/>
+          <w:color w:val="1A1A1A"/>
+          <w:sz w:val="21"/>
+        </w:rPr>
+        <w:t>고점 매도는 맞히기 어렵다는 전제로, 줄이려면 내년 봄까지 나눠 팔라는 조언이 있다. 횡보 구간에서는 배당으로 시간을 버티는 선택도 적혀 있다.</w:t>
+      </w:r>
+    </w:p>
+    <w:p>
+      <w:pPr>
+        <w:spacing w:after="40" w:before="0" w:line="269" w:lineRule="auto"/>
+        <w:ind w:left="312" w:hanging="198"/>
+      </w:pPr>
+      <w:r>
+        <w:rPr>
+          <w:rFonts w:ascii="맑은 고딕" w:hAnsi="맑은 고딕" w:eastAsia="맑은 고딕"/>
+          <w:b w:val="0"/>
+          <w:color w:val="1E407C"/>
+          <w:sz w:val="21"/>
+        </w:rPr>
+        <w:t xml:space="preserve">• </w:t>
+      </w:r>
+      <w:r>
+        <w:rPr>
+          <w:rFonts w:ascii="맑은 고딕" w:hAnsi="맑은 고딕" w:eastAsia="맑은 고딕"/>
+          <w:b/>
+          <w:color w:val="1A1A1A"/>
+          <w:sz w:val="21"/>
+        </w:rPr>
+        <w:t xml:space="preserve">노근창  </w:t>
+      </w:r>
+      <w:r>
+        <w:rPr>
+          <w:rFonts w:ascii="맑은 고딕" w:hAnsi="맑은 고딕" w:eastAsia="맑은 고딕"/>
+          <w:b w:val="0"/>
+          <w:color w:val="1A1A1A"/>
+          <w:sz w:val="21"/>
+        </w:rPr>
+        <w:t>올해 구글 TPU 약 430만 개, 엔비디아 가속기 약 650만 개다. 2028년 구글은 700만 개 넘고 엔비디아는 약 1,000만 개로 본다. 아마존은 가속기보다 그래비톤 CPU가 세고, 엔비디아 베라 CPU 발주는 200억 달러를 넘는다. CPU는 서버 D램, 가속기는 HBM이다. 엔비디아 주가가 안 가도 한국 메모리는 갈 수 있다.</w:t>
+      </w:r>
+    </w:p>
+    <w:p>
+      <w:pPr>
+        <w:spacing w:after="40" w:before="0" w:line="269" w:lineRule="auto"/>
+        <w:ind w:left="312" w:hanging="198"/>
+      </w:pPr>
+      <w:r>
+        <w:rPr>
+          <w:rFonts w:ascii="맑은 고딕" w:hAnsi="맑은 고딕" w:eastAsia="맑은 고딕"/>
+          <w:b w:val="0"/>
+          <w:color w:val="1E407C"/>
+          <w:sz w:val="21"/>
+        </w:rPr>
+        <w:t xml:space="preserve">• </w:t>
+      </w:r>
+      <w:r>
+        <w:rPr>
+          <w:rFonts w:ascii="맑은 고딕" w:hAnsi="맑은 고딕" w:eastAsia="맑은 고딕"/>
+          <w:b/>
+          <w:color w:val="1A1A1A"/>
+          <w:sz w:val="21"/>
+        </w:rPr>
+        <w:t xml:space="preserve">노근창  </w:t>
+      </w:r>
+      <w:r>
+        <w:rPr>
+          <w:rFonts w:ascii="맑은 고딕" w:hAnsi="맑은 고딕" w:eastAsia="맑은 고딕"/>
+          <w:b w:val="0"/>
+          <w:color w:val="1A1A1A"/>
+          <w:sz w:val="21"/>
+        </w:rPr>
+        <w:t>미국 10년물 5.2~5.3%면 보통은 주가가 무너져도 이상하지 않은데 AI가 받친다. 금리 상승의 상당 부분은 데이터센터 투자다. 부채가 많거나 신흥국·소비 신용 같은 약한 고리는 피하고, 전력·에너지·AI 인프라는 초중반이다. 반등할 때 약한 고리를 줄인다. 4분기는 범위를 벗어나기 어렵고, 오를 때 쫓지 말고 나눠 산다.</w:t>
+      </w:r>
+    </w:p>
+    <w:p>
+      <w:pPr>
+        <w:spacing w:after="40" w:before="0" w:line="269" w:lineRule="auto"/>
+        <w:ind w:left="312" w:hanging="198"/>
+      </w:pPr>
+      <w:r>
+        <w:rPr>
+          <w:rFonts w:ascii="맑은 고딕" w:hAnsi="맑은 고딕" w:eastAsia="맑은 고딕"/>
+          <w:b w:val="0"/>
+          <w:color w:val="1E407C"/>
+          <w:sz w:val="21"/>
+        </w:rPr>
+        <w:t xml:space="preserve">• </w:t>
+      </w:r>
+      <w:r>
+        <w:rPr>
+          <w:rFonts w:ascii="맑은 고딕" w:hAnsi="맑은 고딕" w:eastAsia="맑은 고딕"/>
+          <w:b/>
+          <w:color w:val="1A1A1A"/>
+          <w:sz w:val="21"/>
+        </w:rPr>
+        <w:t xml:space="preserve">노근창  </w:t>
+      </w:r>
+      <w:r>
+        <w:rPr>
+          <w:rFonts w:ascii="맑은 고딕" w:hAnsi="맑은 고딕" w:eastAsia="맑은 고딕"/>
+          <w:b w:val="0"/>
+          <w:color w:val="1A1A1A"/>
+          <w:sz w:val="21"/>
+        </w:rPr>
+        <w:t>엔비디아 데이터센터에서 기타(네오클라우드·소버린·엔터프라이즈)가 400억 달러, 하이퍼스케일러가 480억 달러다. 구글 TPU 외부 판매는 올해 100억 달러, 내년 약 1,000억 달러에 마진 60%면 영업이익 600억 달러로 잉여현금이 플러스될 수 있다. 2028년 목표는 2,500억 달러, TPU 450만 개다.</w:t>
+      </w:r>
+    </w:p>
+    <w:p>
+      <w:pPr>
+        <w:spacing w:after="40" w:before="0" w:line="269" w:lineRule="auto"/>
+        <w:ind w:left="312" w:hanging="198"/>
+      </w:pPr>
+      <w:r>
+        <w:rPr>
+          <w:rFonts w:ascii="맑은 고딕" w:hAnsi="맑은 고딕" w:eastAsia="맑은 고딕"/>
+          <w:b w:val="0"/>
+          <w:color w:val="1E407C"/>
+          <w:sz w:val="21"/>
+        </w:rPr>
+        <w:t xml:space="preserve">• </w:t>
+      </w:r>
+      <w:r>
+        <w:rPr>
+          <w:rFonts w:ascii="맑은 고딕" w:hAnsi="맑은 고딕" w:eastAsia="맑은 고딕"/>
+          <w:b/>
+          <w:color w:val="1A1A1A"/>
+          <w:sz w:val="21"/>
+        </w:rPr>
+        <w:t xml:space="preserve">신중호  </w:t>
+      </w:r>
+      <w:r>
+        <w:rPr>
+          <w:rFonts w:ascii="맑은 고딕" w:hAnsi="맑은 고딕" w:eastAsia="맑은 고딕"/>
+          <w:b w:val="0"/>
+          <w:color w:val="1A1A1A"/>
+          <w:sz w:val="21"/>
+        </w:rPr>
+        <w:t>상반기 지수는 크게 올랐는데 계좌는 마이너스인 경우가 많았다. 하반기에서 내년 상반기는 지수는 삼성·하이닉스 때문에 파란 불이고 종목 계좌는 빨간 불이 될 수 있다. 10월도 9월과 비슷한 횡보이고, 은행·보험 구간은 이미 상당 부분 갔다. 지금은 현금흐름이 좋은 중소형이다.</w:t>
+      </w:r>
+    </w:p>
+    <w:p>
+      <w:pPr>
+        <w:spacing w:after="40" w:before="0" w:line="269" w:lineRule="auto"/>
+        <w:ind w:left="312" w:hanging="198"/>
+      </w:pPr>
+      <w:r>
+        <w:rPr>
+          <w:rFonts w:ascii="맑은 고딕" w:hAnsi="맑은 고딕" w:eastAsia="맑은 고딕"/>
+          <w:b w:val="0"/>
+          <w:color w:val="1E407C"/>
+          <w:sz w:val="21"/>
+        </w:rPr>
+        <w:t xml:space="preserve">• </w:t>
+      </w:r>
+      <w:r>
+        <w:rPr>
+          <w:rFonts w:ascii="맑은 고딕" w:hAnsi="맑은 고딕" w:eastAsia="맑은 고딕"/>
+          <w:b/>
+          <w:color w:val="1A1A1A"/>
+          <w:sz w:val="21"/>
+        </w:rPr>
+        <w:t xml:space="preserve">신중호  </w:t>
+      </w:r>
+      <w:r>
+        <w:rPr>
+          <w:rFonts w:ascii="맑은 고딕" w:hAnsi="맑은 고딕" w:eastAsia="맑은 고딕"/>
+          <w:b w:val="0"/>
+          <w:color w:val="1A1A1A"/>
+          <w:sz w:val="21"/>
+        </w:rPr>
+        <w:t>챗GPT 이후 4년간 미국 10년물은 4% 위였고 주가는 올랐다. 5%를 넘으면 조정이 나왔다. 명목 GDP가 약 5.5 퍼센트인데 금리가 그 언저리까지 오면 빌려 투자할 마진이 없다. 긴축이 경기를 식히면 금리는 4%대 중반으로 돌아오고 주가가 다시 열린다.</w:t>
+      </w:r>
+    </w:p>
+    <w:p>
+      <w:pPr>
+        <w:spacing w:after="40" w:before="0" w:line="269" w:lineRule="auto"/>
+        <w:ind w:left="312" w:hanging="198"/>
+      </w:pPr>
+      <w:r>
+        <w:rPr>
+          <w:rFonts w:ascii="맑은 고딕" w:hAnsi="맑은 고딕" w:eastAsia="맑은 고딕"/>
+          <w:b w:val="0"/>
+          <w:color w:val="1E407C"/>
+          <w:sz w:val="21"/>
+        </w:rPr>
+        <w:t xml:space="preserve">• </w:t>
+      </w:r>
+      <w:r>
+        <w:rPr>
+          <w:rFonts w:ascii="맑은 고딕" w:hAnsi="맑은 고딕" w:eastAsia="맑은 고딕"/>
+          <w:b/>
+          <w:color w:val="1A1A1A"/>
+          <w:sz w:val="21"/>
+        </w:rPr>
+        <w:t xml:space="preserve">RTS  </w:t>
+      </w:r>
+      <w:r>
+        <w:rPr>
+          <w:rFonts w:ascii="맑은 고딕" w:hAnsi="맑은 고딕" w:eastAsia="맑은 고딕"/>
+          <w:b w:val="0"/>
+          <w:color w:val="1A1A1A"/>
+          <w:sz w:val="21"/>
+        </w:rPr>
+        <w:t>10월 9일 베니스 영화제에 나온 일론 머스크 다큐는 기술 찬사보다 과장된 약속으로 주가를 받쳐 왔다는 비판이 강하다. 테슬라는 440달러 근처에서 357달러로, 나스닥 고점 대비 뒤처진다. 스페이스X도 이익이 아니라 이야기로 움직이는 구간이다.</w:t>
+      </w:r>
+    </w:p>
+    <w:p>
+      <w:pPr>
+        <w:spacing w:after="40" w:before="0" w:line="269" w:lineRule="auto"/>
+        <w:ind w:left="312" w:hanging="198"/>
+      </w:pPr>
+      <w:r>
+        <w:rPr>
+          <w:rFonts w:ascii="맑은 고딕" w:hAnsi="맑은 고딕" w:eastAsia="맑은 고딕"/>
+          <w:b w:val="0"/>
+          <w:color w:val="1E407C"/>
+          <w:sz w:val="21"/>
+        </w:rPr>
+        <w:t xml:space="preserve">• </w:t>
+      </w:r>
+      <w:r>
+        <w:rPr>
+          <w:rFonts w:ascii="맑은 고딕" w:hAnsi="맑은 고딕" w:eastAsia="맑은 고딕"/>
+          <w:b/>
+          <w:color w:val="1A1A1A"/>
+          <w:sz w:val="21"/>
+        </w:rPr>
+        <w:t xml:space="preserve">노근창  </w:t>
+      </w:r>
+      <w:r>
+        <w:rPr>
+          <w:rFonts w:ascii="맑은 고딕" w:hAnsi="맑은 고딕" w:eastAsia="맑은 고딕"/>
+          <w:b w:val="0"/>
+          <w:color w:val="1A1A1A"/>
+          <w:sz w:val="21"/>
+        </w:rPr>
+        <w:t>네오클라우드는 미국 24개, 아시아 50개, 유럽 17개로 늘었지만 본격 투자는 아직이다. 오픈AI·앤트로픽 상장과 소버린 AI도 시작 전이다. 하이퍼스케일러, 네오클라우드, 소버린, 엔터프라이즈가 남았다.</w:t>
+      </w:r>
+    </w:p>
+    <w:p>
+      <w:pPr>
+        <w:spacing w:after="40" w:before="0" w:line="269" w:lineRule="auto"/>
+        <w:ind w:left="312" w:hanging="198"/>
+      </w:pPr>
+      <w:r>
+        <w:rPr>
+          <w:rFonts w:ascii="맑은 고딕" w:hAnsi="맑은 고딕" w:eastAsia="맑은 고딕"/>
+          <w:b w:val="0"/>
+          <w:color w:val="1E407C"/>
+          <w:sz w:val="21"/>
+        </w:rPr>
+        <w:t xml:space="preserve">• </w:t>
+      </w:r>
+      <w:r>
+        <w:rPr>
+          <w:rFonts w:ascii="맑은 고딕" w:hAnsi="맑은 고딕" w:eastAsia="맑은 고딕"/>
+          <w:b/>
+          <w:color w:val="1A1A1A"/>
+          <w:sz w:val="21"/>
+        </w:rPr>
+        <w:t xml:space="preserve">노근창  </w:t>
+      </w:r>
+      <w:r>
+        <w:rPr>
+          <w:rFonts w:ascii="맑은 고딕" w:hAnsi="맑은 고딕" w:eastAsia="맑은 고딕"/>
+          <w:b w:val="0"/>
+          <w:color w:val="1A1A1A"/>
+          <w:sz w:val="21"/>
+        </w:rPr>
+        <w:t>철도는 미국 GDP의 3.5%, 인터넷은 1% 남짓, AI는 2.5%를 쓰는데 더 길 수 있다. 통신 때와 달리 칩은 TSMC가 다 봐서 중복 투자를 가리기 쉽다. 애리조나로 부족해 텍사스 공장까지 나온다.</w:t>
+      </w:r>
+    </w:p>
+    <w:p>
+      <w:pPr>
+        <w:spacing w:after="40" w:before="0" w:line="269" w:lineRule="auto"/>
+        <w:ind w:left="312" w:hanging="198"/>
+      </w:pPr>
+      <w:r>
+        <w:rPr>
+          <w:rFonts w:ascii="맑은 고딕" w:hAnsi="맑은 고딕" w:eastAsia="맑은 고딕"/>
+          <w:b w:val="0"/>
+          <w:color w:val="1E407C"/>
+          <w:sz w:val="21"/>
+        </w:rPr>
+        <w:t xml:space="preserve">• </w:t>
+      </w:r>
+      <w:r>
+        <w:rPr>
+          <w:rFonts w:ascii="맑은 고딕" w:hAnsi="맑은 고딕" w:eastAsia="맑은 고딕"/>
+          <w:b/>
+          <w:color w:val="1A1A1A"/>
+          <w:sz w:val="21"/>
+        </w:rPr>
+        <w:t xml:space="preserve">RTS  </w:t>
+      </w:r>
+      <w:r>
+        <w:rPr>
+          <w:rFonts w:ascii="맑은 고딕" w:hAnsi="맑은 고딕" w:eastAsia="맑은 고딕"/>
+          <w:b w:val="0"/>
+          <w:color w:val="1A1A1A"/>
+          <w:sz w:val="21"/>
+        </w:rPr>
+        <w:t>하나오션 주봉은 조선 헤드라인과 달리 약하다. AI 뉴스 주기와 경쟁이 안 된다. 현대차는 삼성전자·하이닉스가 못 가면 지수도 못 간다. 소재·장비 강세만으로 지수는 안 움직인다.</w:t>
+      </w:r>
+    </w:p>
+    <w:p>
+      <w:pPr>
+        <w:spacing w:after="40" w:before="0" w:line="269" w:lineRule="auto"/>
+        <w:ind w:left="312" w:hanging="198"/>
+      </w:pPr>
+      <w:r>
+        <w:rPr>
+          <w:rFonts w:ascii="맑은 고딕" w:hAnsi="맑은 고딕" w:eastAsia="맑은 고딕"/>
+          <w:b w:val="0"/>
+          <w:color w:val="1E407C"/>
+          <w:sz w:val="21"/>
+        </w:rPr>
+        <w:t xml:space="preserve">• </w:t>
+      </w:r>
+      <w:r>
+        <w:rPr>
+          <w:rFonts w:ascii="맑은 고딕" w:hAnsi="맑은 고딕" w:eastAsia="맑은 고딕"/>
+          <w:b/>
+          <w:color w:val="1A1A1A"/>
+          <w:sz w:val="21"/>
+        </w:rPr>
+        <w:t xml:space="preserve">신중호  </w:t>
+      </w:r>
+      <w:r>
+        <w:rPr>
+          <w:rFonts w:ascii="맑은 고딕" w:hAnsi="맑은 고딕" w:eastAsia="맑은 고딕"/>
+          <w:b w:val="0"/>
+          <w:color w:val="1A1A1A"/>
+          <w:sz w:val="21"/>
+        </w:rPr>
+        <w:t>지정학은 안 끝난다. 유럽이 방위비를 올린 것처럼 중동도 올리고, 빠진 미군은 동아시아로 온다. 대만·한국 리스크가 방산 수요다. 시진핑 3기 말인 2027년도 일정이다.</w:t>
+      </w:r>
+    </w:p>
+    <w:p>
+      <w:pPr>
+        <w:spacing w:after="40" w:before="0" w:line="269" w:lineRule="auto"/>
+        <w:ind w:left="312" w:hanging="198"/>
+      </w:pPr>
+      <w:r>
+        <w:rPr>
+          <w:rFonts w:ascii="맑은 고딕" w:hAnsi="맑은 고딕" w:eastAsia="맑은 고딕"/>
+          <w:b w:val="0"/>
+          <w:color w:val="1E407C"/>
+          <w:sz w:val="21"/>
+        </w:rPr>
+        <w:t xml:space="preserve">• </w:t>
+      </w:r>
+      <w:r>
+        <w:rPr>
+          <w:rFonts w:ascii="맑은 고딕" w:hAnsi="맑은 고딕" w:eastAsia="맑은 고딕"/>
+          <w:b/>
+          <w:color w:val="1A1A1A"/>
+          <w:sz w:val="21"/>
+        </w:rPr>
+        <w:t xml:space="preserve">김효진  </w:t>
+      </w:r>
+      <w:r>
+        <w:rPr>
+          <w:rFonts w:ascii="맑은 고딕" w:hAnsi="맑은 고딕" w:eastAsia="맑은 고딕"/>
+          <w:b w:val="0"/>
+          <w:color w:val="1A1A1A"/>
+          <w:sz w:val="21"/>
+        </w:rPr>
+        <w:t>올해의 실수로 수급의 파괴력을 꼽는다. 기업 본질이 나빠지지 않아도 수급이 먼저 흔들리고, 미국 펀드 포지션은 미리 보이지 않는다. 수급은 재료보다 앞설 수 있다.</w:t>
+      </w:r>
+    </w:p>
+    <w:p>
+      <w:pPr>
+        <w:spacing w:after="40" w:before="0" w:line="269" w:lineRule="auto"/>
+        <w:ind w:left="312" w:hanging="198"/>
+      </w:pPr>
+      <w:r>
+        <w:rPr>
+          <w:rFonts w:ascii="맑은 고딕" w:hAnsi="맑은 고딕" w:eastAsia="맑은 고딕"/>
+          <w:b w:val="0"/>
+          <w:color w:val="1E407C"/>
+          <w:sz w:val="21"/>
+        </w:rPr>
+        <w:t xml:space="preserve">• </w:t>
+      </w:r>
+      <w:r>
+        <w:rPr>
+          <w:rFonts w:ascii="맑은 고딕" w:hAnsi="맑은 고딕" w:eastAsia="맑은 고딕"/>
+          <w:b/>
+          <w:color w:val="1A1A1A"/>
+          <w:sz w:val="21"/>
+        </w:rPr>
+        <w:t xml:space="preserve">윤지호  </w:t>
+      </w:r>
+      <w:r>
+        <w:rPr>
+          <w:rFonts w:ascii="맑은 고딕" w:hAnsi="맑은 고딕" w:eastAsia="맑은 고딕"/>
+          <w:b w:val="0"/>
+          <w:color w:val="1A1A1A"/>
+          <w:sz w:val="21"/>
+        </w:rPr>
+        <w:t>지금 작동하는 규칙은 높은 배수에 사서 낮아진 배수에 파는 쪽이다. 선행투자의 과실이 내년 하반기 이후에 나오는 장비·전력·파운드리를 고른다.</w:t>
+      </w:r>
+    </w:p>
+    <w:p>
+      <w:pPr>
+        <w:spacing w:after="40" w:before="0" w:line="269" w:lineRule="auto"/>
+        <w:ind w:left="312" w:hanging="198"/>
+      </w:pPr>
+      <w:r>
+        <w:rPr>
+          <w:rFonts w:ascii="맑은 고딕" w:hAnsi="맑은 고딕" w:eastAsia="맑은 고딕"/>
+          <w:b w:val="0"/>
+          <w:color w:val="1E407C"/>
+          <w:sz w:val="21"/>
+        </w:rPr>
+        <w:t xml:space="preserve">• </w:t>
+      </w:r>
+      <w:r>
+        <w:rPr>
+          <w:rFonts w:ascii="맑은 고딕" w:hAnsi="맑은 고딕" w:eastAsia="맑은 고딕"/>
+          <w:b/>
+          <w:color w:val="1A1A1A"/>
+          <w:sz w:val="21"/>
+        </w:rPr>
+        <w:t xml:space="preserve">김열매  </w:t>
+      </w:r>
+      <w:r>
+        <w:rPr>
+          <w:rFonts w:ascii="맑은 고딕" w:hAnsi="맑은 고딕" w:eastAsia="맑은 고딕"/>
+          <w:b w:val="0"/>
+          <w:color w:val="1A1A1A"/>
+          <w:sz w:val="21"/>
+        </w:rPr>
+        <w:t>중국이 AI·로봇을 밀어붙이는 이유로 인구 감소와 군사 활용이 나온다. 유닛트리 로봇은 내년 4만 대, 다른 언급은 7만 대까지 간다.</w:t>
+      </w:r>
+    </w:p>
+    <w:p>
+      <w:pPr>
+        <w:spacing w:after="40" w:before="0" w:line="269" w:lineRule="auto"/>
+        <w:ind w:left="312" w:hanging="198"/>
+      </w:pPr>
+      <w:r>
+        <w:rPr>
+          <w:rFonts w:ascii="맑은 고딕" w:hAnsi="맑은 고딕" w:eastAsia="맑은 고딕"/>
+          <w:b w:val="0"/>
+          <w:color w:val="1E407C"/>
+          <w:sz w:val="21"/>
+        </w:rPr>
+        <w:t xml:space="preserve">• </w:t>
+      </w:r>
+      <w:r>
+        <w:rPr>
+          <w:rFonts w:ascii="맑은 고딕" w:hAnsi="맑은 고딕" w:eastAsia="맑은 고딕"/>
+          <w:b/>
+          <w:color w:val="1A1A1A"/>
+          <w:sz w:val="21"/>
+        </w:rPr>
+        <w:t xml:space="preserve">김열매  </w:t>
+      </w:r>
+      <w:r>
+        <w:rPr>
+          <w:rFonts w:ascii="맑은 고딕" w:hAnsi="맑은 고딕" w:eastAsia="맑은 고딕"/>
+          <w:b w:val="0"/>
+          <w:color w:val="1A1A1A"/>
+          <w:sz w:val="21"/>
+        </w:rPr>
+        <w:t>에이전트 보안 사고는 현실이다. 그래도 미국은 사고를 감수하고 깔아 보는 선택에 가깝고, 규제만으로 레이스가 멈춘다고 보지 않는다.</w:t>
+      </w:r>
+    </w:p>
+    <w:p>
+      <w:pPr>
+        <w:spacing w:after="40" w:before="0" w:line="269" w:lineRule="auto"/>
+        <w:ind w:left="312" w:hanging="198"/>
+      </w:pPr>
+      <w:r>
+        <w:rPr>
+          <w:rFonts w:ascii="맑은 고딕" w:hAnsi="맑은 고딕" w:eastAsia="맑은 고딕"/>
+          <w:b w:val="0"/>
+          <w:color w:val="1E407C"/>
+          <w:sz w:val="21"/>
+        </w:rPr>
+        <w:t xml:space="preserve">• </w:t>
+      </w:r>
+      <w:r>
+        <w:rPr>
+          <w:rFonts w:ascii="맑은 고딕" w:hAnsi="맑은 고딕" w:eastAsia="맑은 고딕"/>
+          <w:b/>
+          <w:color w:val="1A1A1A"/>
+          <w:sz w:val="21"/>
+        </w:rPr>
+        <w:t xml:space="preserve">김열매  </w:t>
+      </w:r>
+      <w:r>
+        <w:rPr>
+          <w:rFonts w:ascii="맑은 고딕" w:hAnsi="맑은 고딕" w:eastAsia="맑은 고딕"/>
+          <w:b w:val="0"/>
+          <w:color w:val="1A1A1A"/>
+          <w:sz w:val="21"/>
+        </w:rPr>
+        <w:t>속도 조절은 서로 멈추자는 담합에 가깝다. 2등으로 밀리는 것이 확실한 게임이고 중국이 멈추지 않으면 유지되기 어렵다는 쪽이다.</w:t>
+      </w:r>
+    </w:p>
+    <w:p>
+      <w:pPr>
+        <w:spacing w:after="40" w:before="0" w:line="269" w:lineRule="auto"/>
+        <w:ind w:left="312" w:hanging="198"/>
+      </w:pPr>
+      <w:r>
+        <w:rPr>
+          <w:rFonts w:ascii="맑은 고딕" w:hAnsi="맑은 고딕" w:eastAsia="맑은 고딕"/>
+          <w:b w:val="0"/>
+          <w:color w:val="1E407C"/>
+          <w:sz w:val="21"/>
+        </w:rPr>
+        <w:t xml:space="preserve">• </w:t>
+      </w:r>
+      <w:r>
+        <w:rPr>
+          <w:rFonts w:ascii="맑은 고딕" w:hAnsi="맑은 고딕" w:eastAsia="맑은 고딕"/>
+          <w:b/>
+          <w:color w:val="1A1A1A"/>
+          <w:sz w:val="21"/>
+        </w:rPr>
+        <w:t xml:space="preserve">김효진  </w:t>
+      </w:r>
+      <w:r>
+        <w:rPr>
+          <w:rFonts w:ascii="맑은 고딕" w:hAnsi="맑은 고딕" w:eastAsia="맑은 고딕"/>
+          <w:b w:val="0"/>
+          <w:color w:val="1A1A1A"/>
+          <w:sz w:val="21"/>
+        </w:rPr>
+        <w:t>닷컴 당시 통신 투자는 그 뒤로도 계속 늘었지만 관련 주가는 무너졌다. 투자가 계속된다는 사실만으로 주가가 지키지지 않는다.</w:t>
+      </w:r>
+    </w:p>
+    <w:p>
+      <w:pPr>
+        <w:spacing w:after="40" w:before="0" w:line="269" w:lineRule="auto"/>
+        <w:ind w:left="312" w:hanging="198"/>
+      </w:pPr>
+      <w:r>
+        <w:rPr>
+          <w:rFonts w:ascii="맑은 고딕" w:hAnsi="맑은 고딕" w:eastAsia="맑은 고딕"/>
+          <w:b w:val="0"/>
+          <w:color w:val="1E407C"/>
+          <w:sz w:val="21"/>
+        </w:rPr>
+        <w:t xml:space="preserve">• </w:t>
+      </w:r>
+      <w:r>
+        <w:rPr>
+          <w:rFonts w:ascii="맑은 고딕" w:hAnsi="맑은 고딕" w:eastAsia="맑은 고딕"/>
+          <w:b/>
+          <w:color w:val="1A1A1A"/>
+          <w:sz w:val="21"/>
+        </w:rPr>
+        <w:t xml:space="preserve">김효진  </w:t>
+      </w:r>
+      <w:r>
+        <w:rPr>
+          <w:rFonts w:ascii="맑은 고딕" w:hAnsi="맑은 고딕" w:eastAsia="맑은 고딕"/>
+          <w:b w:val="0"/>
+          <w:color w:val="1A1A1A"/>
+          <w:sz w:val="21"/>
+        </w:rPr>
+        <w:t>성장주가 버는 돈 대비 극단적으로 비싸 보이지는 않는다. 금리 하나 같은 단일 요인으로 고점을 맞히려고 하지 말라는 쪽이다.</w:t>
+      </w:r>
+    </w:p>
+    <w:p>
+      <w:pPr>
+        <w:spacing w:after="40" w:before="0" w:line="269" w:lineRule="auto"/>
+        <w:ind w:left="312" w:hanging="198"/>
+      </w:pPr>
+      <w:r>
+        <w:rPr>
+          <w:rFonts w:ascii="맑은 고딕" w:hAnsi="맑은 고딕" w:eastAsia="맑은 고딕"/>
+          <w:b w:val="0"/>
+          <w:color w:val="1E407C"/>
+          <w:sz w:val="21"/>
+        </w:rPr>
+        <w:t xml:space="preserve">• </w:t>
+      </w:r>
+      <w:r>
+        <w:rPr>
+          <w:rFonts w:ascii="맑은 고딕" w:hAnsi="맑은 고딕" w:eastAsia="맑은 고딕"/>
+          <w:b/>
+          <w:color w:val="1A1A1A"/>
+          <w:sz w:val="21"/>
+        </w:rPr>
+        <w:t xml:space="preserve">김열매  </w:t>
+      </w:r>
+      <w:r>
+        <w:rPr>
+          <w:rFonts w:ascii="맑은 고딕" w:hAnsi="맑은 고딕" w:eastAsia="맑은 고딕"/>
+          <w:b w:val="0"/>
+          <w:color w:val="1A1A1A"/>
+          <w:sz w:val="21"/>
+        </w:rPr>
+        <w:t>오픈AI가 흔들려도 인수자가 나올 수 있다. 미국 빅테크 시가총액이 커서, 기술만 있으면 증자로 살 수 있다는 비유다.</w:t>
+      </w:r>
+    </w:p>
+    <w:p>
+      <w:pPr>
+        <w:spacing w:after="40" w:before="0" w:line="269" w:lineRule="auto"/>
+        <w:ind w:left="312" w:hanging="198"/>
+      </w:pPr>
+      <w:r>
+        <w:rPr>
+          <w:rFonts w:ascii="맑은 고딕" w:hAnsi="맑은 고딕" w:eastAsia="맑은 고딕"/>
+          <w:b w:val="0"/>
+          <w:color w:val="1E407C"/>
+          <w:sz w:val="21"/>
+        </w:rPr>
+        <w:t xml:space="preserve">• </w:t>
+      </w:r>
+      <w:r>
+        <w:rPr>
+          <w:rFonts w:ascii="맑은 고딕" w:hAnsi="맑은 고딕" w:eastAsia="맑은 고딕"/>
+          <w:b/>
+          <w:color w:val="1A1A1A"/>
+          <w:sz w:val="21"/>
+        </w:rPr>
+        <w:t xml:space="preserve">김효진  </w:t>
+      </w:r>
+      <w:r>
+        <w:rPr>
+          <w:rFonts w:ascii="맑은 고딕" w:hAnsi="맑은 고딕" w:eastAsia="맑은 고딕"/>
+          <w:b w:val="0"/>
+          <w:color w:val="1A1A1A"/>
+          <w:sz w:val="21"/>
+        </w:rPr>
+        <w:t>이익 수준이 높아도 증가 속도가 유지되면 주가는 횡보가 아니다. 모멘텀의 기울기가 완만해지면 주가는 빠진다.</w:t>
+      </w:r>
+    </w:p>
+    <w:p>
+      <w:pPr>
+        <w:spacing w:after="40" w:before="0" w:line="269" w:lineRule="auto"/>
+        <w:ind w:left="312" w:hanging="198"/>
+      </w:pPr>
+      <w:r>
+        <w:rPr>
+          <w:rFonts w:ascii="맑은 고딕" w:hAnsi="맑은 고딕" w:eastAsia="맑은 고딕"/>
+          <w:b w:val="0"/>
+          <w:color w:val="1E407C"/>
+          <w:sz w:val="21"/>
+        </w:rPr>
+        <w:t xml:space="preserve">• </w:t>
+      </w:r>
+      <w:r>
+        <w:rPr>
+          <w:rFonts w:ascii="맑은 고딕" w:hAnsi="맑은 고딕" w:eastAsia="맑은 고딕"/>
+          <w:b/>
+          <w:color w:val="1A1A1A"/>
+          <w:sz w:val="21"/>
+        </w:rPr>
+        <w:t xml:space="preserve">녹취  </w:t>
+      </w:r>
+      <w:r>
+        <w:rPr>
+          <w:rFonts w:ascii="맑은 고딕" w:hAnsi="맑은 고딕" w:eastAsia="맑은 고딕"/>
+          <w:b w:val="0"/>
+          <w:color w:val="1A1A1A"/>
+          <w:sz w:val="21"/>
+        </w:rPr>
+        <w:t>화장품·바이오 수출은 좋지만, 화장품은 전체 수출의 약 2%라 지수 주도 자리는 아니다.</w:t>
+      </w:r>
+    </w:p>
+    <w:p>
+      <w:pPr>
+        <w:spacing w:after="40" w:before="0" w:line="269" w:lineRule="auto"/>
+        <w:ind w:left="312" w:hanging="198"/>
+      </w:pPr>
+      <w:r>
+        <w:rPr>
+          <w:rFonts w:ascii="맑은 고딕" w:hAnsi="맑은 고딕" w:eastAsia="맑은 고딕"/>
+          <w:b w:val="0"/>
+          <w:color w:val="1E407C"/>
+          <w:sz w:val="21"/>
+        </w:rPr>
+        <w:t xml:space="preserve">• </w:t>
+      </w:r>
+      <w:r>
+        <w:rPr>
+          <w:rFonts w:ascii="맑은 고딕" w:hAnsi="맑은 고딕" w:eastAsia="맑은 고딕"/>
+          <w:b/>
+          <w:color w:val="1A1A1A"/>
+          <w:sz w:val="21"/>
+        </w:rPr>
+        <w:t xml:space="preserve">녹취  </w:t>
+      </w:r>
+      <w:r>
+        <w:rPr>
+          <w:rFonts w:ascii="맑은 고딕" w:hAnsi="맑은 고딕" w:eastAsia="맑은 고딕"/>
+          <w:b w:val="0"/>
+          <w:color w:val="1A1A1A"/>
+          <w:sz w:val="21"/>
+        </w:rPr>
+        <w:t>의무공개매수 범위를 넓히는 조치는 처리가 보류됐다.</w:t>
+      </w:r>
+    </w:p>
+    <w:p>
+      <w:pPr>
+        <w:spacing w:after="40" w:before="0" w:line="269" w:lineRule="auto"/>
+        <w:ind w:left="312" w:hanging="198"/>
+      </w:pPr>
+      <w:r>
+        <w:rPr>
+          <w:rFonts w:ascii="맑은 고딕" w:hAnsi="맑은 고딕" w:eastAsia="맑은 고딕"/>
+          <w:b w:val="0"/>
+          <w:color w:val="1E407C"/>
+          <w:sz w:val="21"/>
+        </w:rPr>
+        <w:t xml:space="preserve">• </w:t>
+      </w:r>
+      <w:r>
+        <w:rPr>
+          <w:rFonts w:ascii="맑은 고딕" w:hAnsi="맑은 고딕" w:eastAsia="맑은 고딕"/>
+          <w:b/>
+          <w:color w:val="1A1A1A"/>
+          <w:sz w:val="21"/>
+        </w:rPr>
+        <w:t xml:space="preserve">녹취  </w:t>
+      </w:r>
+      <w:r>
+        <w:rPr>
+          <w:rFonts w:ascii="맑은 고딕" w:hAnsi="맑은 고딕" w:eastAsia="맑은 고딕"/>
+          <w:b w:val="0"/>
+          <w:color w:val="1A1A1A"/>
+          <w:sz w:val="21"/>
+        </w:rPr>
+        <w:t>피지컬 AI는 산업 전선이 넓어지는 이야기다. 주가는 이미 한 번 선반영된 뒤 고점 대비 크게 빠진 상태로, 눈에 보이는 상용화와 주가 시계는 따로 둔다.</w:t>
       </w:r>
     </w:p>
     <w:p>
@@ -4759,7 +6178,7 @@
           <w:color w:val="0F2043"/>
           <w:sz w:val="32"/>
         </w:rPr>
-        <w:t>10. 포트폴리오</w:t>
+        <w:t>10. AI CapEx 리스크</w:t>
       </w:r>
     </w:p>
     <w:p>
@@ -4774,7 +6193,403 @@
           <w:color w:val="1A1A1A"/>
           <w:sz w:val="22"/>
         </w:rPr>
+        <w:t>GPU 경제적 수명 가정은 3년 / 5년 / 7년이다. 브로드컴-앤트로픽 금융은 원문 표기 $42bn이다. Burry의 '감가상각/잔존가치 리스크' 문제제기는 타당성이 높지만, 이를 1960년대 버블과 동일한 구조라고 확대하는 부분은 타당성이 낮습니다.</w:t>
+      </w:r>
+    </w:p>
+    <w:p>
+      <w:pPr>
+        <w:spacing w:after="40" w:before="0" w:line="269" w:lineRule="auto"/>
+        <w:ind w:left="312" w:hanging="198"/>
+      </w:pPr>
+      <w:r>
+        <w:rPr>
+          <w:rFonts w:ascii="맑은 고딕" w:hAnsi="맑은 고딕" w:eastAsia="맑은 고딕"/>
+          <w:b w:val="0"/>
+          <w:color w:val="1E407C"/>
+          <w:sz w:val="21"/>
+        </w:rPr>
+        <w:t xml:space="preserve">• </w:t>
+      </w:r>
+      <w:r>
+        <w:rPr>
+          <w:rFonts w:ascii="맑은 고딕" w:hAnsi="맑은 고딕" w:eastAsia="맑은 고딕"/>
+          <w:b/>
+          <w:color w:val="1A1A1A"/>
+          <w:sz w:val="21"/>
+        </w:rPr>
+        <w:t xml:space="preserve">RTS  </w:t>
+      </w:r>
+      <w:r>
+        <w:rPr>
+          <w:rFonts w:ascii="맑은 고딕" w:hAnsi="맑은 고딕" w:eastAsia="맑은 고딕"/>
+          <w:b w:val="0"/>
+          <w:color w:val="1A1A1A"/>
+          <w:sz w:val="21"/>
+        </w:rPr>
+        <w:t>소프트웨어 대출 블루아울은 2022년 수준으로 되밀렸고 블랙스톤도 약하다. 빌려 준 돈의 이자가 의심받는 자리다. 금리는 아직 상승 추세고, 유가 불안도 해소 전이다. 지수가 고점 근처인 것과 종목이 편한 것은 다르다.</w:t>
+      </w:r>
+    </w:p>
+    <w:p>
+      <w:pPr>
+        <w:spacing w:after="40" w:before="0" w:line="269" w:lineRule="auto"/>
+        <w:ind w:left="312" w:hanging="198"/>
+      </w:pPr>
+      <w:r>
+        <w:rPr>
+          <w:rFonts w:ascii="맑은 고딕" w:hAnsi="맑은 고딕" w:eastAsia="맑은 고딕"/>
+          <w:b w:val="0"/>
+          <w:color w:val="1E407C"/>
+          <w:sz w:val="21"/>
+        </w:rPr>
+        <w:t xml:space="preserve">• </w:t>
+      </w:r>
+      <w:r>
+        <w:rPr>
+          <w:rFonts w:ascii="맑은 고딕" w:hAnsi="맑은 고딕" w:eastAsia="맑은 고딕"/>
+          <w:b/>
+          <w:color w:val="1A1A1A"/>
+          <w:sz w:val="21"/>
+        </w:rPr>
+        <w:t xml:space="preserve">퀵코멘트  </w:t>
+      </w:r>
+      <w:r>
+        <w:rPr>
+          <w:rFonts w:ascii="맑은 고딕" w:hAnsi="맑은 고딕" w:eastAsia="맑은 고딕"/>
+          <w:b w:val="0"/>
+          <w:color w:val="1A1A1A"/>
+          <w:sz w:val="21"/>
+        </w:rPr>
+        <w:t>추론 수요로 A100/H100이 현금흐름을 이어 간다는 점이, 1960년대 컴퓨터 리스 버블과 다른 부분으로 적혀 있다.</w:t>
+      </w:r>
+    </w:p>
+    <w:p>
+      <w:pPr>
+        <w:spacing w:after="40" w:before="0" w:line="269" w:lineRule="auto"/>
+        <w:ind w:left="312" w:hanging="198"/>
+      </w:pPr>
+      <w:r>
+        <w:rPr>
+          <w:rFonts w:ascii="맑은 고딕" w:hAnsi="맑은 고딕" w:eastAsia="맑은 고딕"/>
+          <w:b w:val="0"/>
+          <w:color w:val="1E407C"/>
+          <w:sz w:val="21"/>
+        </w:rPr>
+        <w:t xml:space="preserve">• </w:t>
+      </w:r>
+      <w:r>
+        <w:rPr>
+          <w:rFonts w:ascii="맑은 고딕" w:hAnsi="맑은 고딕" w:eastAsia="맑은 고딕"/>
+          <w:b/>
+          <w:color w:val="1A1A1A"/>
+          <w:sz w:val="21"/>
+        </w:rPr>
+        <w:t xml:space="preserve">퀵코멘트  </w:t>
+      </w:r>
+      <w:r>
+        <w:rPr>
+          <w:rFonts w:ascii="맑은 고딕" w:hAnsi="맑은 고딕" w:eastAsia="맑은 고딕"/>
+          <w:b w:val="0"/>
+          <w:color w:val="1A1A1A"/>
+          <w:sz w:val="21"/>
+        </w:rPr>
+        <w:t>한편 &lt;Burry의 「1960년대 컴퓨터 리스 버블」 비유&gt; 관련, Burry의 문제제기는 ‘AI 수요가 가짜’라는 주장이라기보다, GPU의 경제적 수명과 잔존가치를 지나치게 낙관하면 AI CapEx의 실제 수익성이 과대평가될 수 있다는 경고입니다만</w:t>
+      </w:r>
+    </w:p>
+    <w:p>
+      <w:pPr>
+        <w:spacing w:after="40" w:before="0" w:line="269" w:lineRule="auto"/>
+        <w:ind w:left="312" w:hanging="198"/>
+      </w:pPr>
+      <w:r>
+        <w:rPr>
+          <w:rFonts w:ascii="맑은 고딕" w:hAnsi="맑은 고딕" w:eastAsia="맑은 고딕"/>
+          <w:b w:val="0"/>
+          <w:color w:val="1E407C"/>
+          <w:sz w:val="21"/>
+        </w:rPr>
+        <w:t xml:space="preserve">• </w:t>
+      </w:r>
+      <w:r>
+        <w:rPr>
+          <w:rFonts w:ascii="맑은 고딕" w:hAnsi="맑은 고딕" w:eastAsia="맑은 고딕"/>
+          <w:b/>
+          <w:color w:val="1A1A1A"/>
+          <w:sz w:val="21"/>
+        </w:rPr>
+        <w:t xml:space="preserve">퀵코멘트  </w:t>
+      </w:r>
+      <w:r>
+        <w:rPr>
+          <w:rFonts w:ascii="맑은 고딕" w:hAnsi="맑은 고딕" w:eastAsia="맑은 고딕"/>
+          <w:b w:val="0"/>
+          <w:color w:val="1A1A1A"/>
+          <w:sz w:val="21"/>
+        </w:rPr>
+        <w:t>Anthropic의 AI 인프라 투자에 금융까지 제공하면서, AI 반도체 판매 → 금융 → 재구매의 순환구조가 강화되고 있습니다. 이런 현상을 순환투자 관점에서만 보면 우려지만</w:t>
+      </w:r>
+    </w:p>
+    <w:p>
+      <w:pPr>
+        <w:spacing w:after="40" w:before="0" w:line="269" w:lineRule="auto"/>
+        <w:ind w:left="312" w:hanging="198"/>
+      </w:pPr>
+      <w:r>
+        <w:rPr>
+          <w:rFonts w:ascii="맑은 고딕" w:hAnsi="맑은 고딕" w:eastAsia="맑은 고딕"/>
+          <w:b w:val="0"/>
+          <w:color w:val="1E407C"/>
+          <w:sz w:val="21"/>
+        </w:rPr>
+        <w:t xml:space="preserve">• </w:t>
+      </w:r>
+      <w:r>
+        <w:rPr>
+          <w:rFonts w:ascii="맑은 고딕" w:hAnsi="맑은 고딕" w:eastAsia="맑은 고딕"/>
+          <w:b/>
+          <w:color w:val="1A1A1A"/>
+          <w:sz w:val="21"/>
+        </w:rPr>
+        <w:t xml:space="preserve">퀵코멘트  </w:t>
+      </w:r>
+      <w:r>
+        <w:rPr>
+          <w:rFonts w:ascii="맑은 고딕" w:hAnsi="맑은 고딕" w:eastAsia="맑은 고딕"/>
+          <w:b w:val="0"/>
+          <w:color w:val="1A1A1A"/>
+          <w:sz w:val="21"/>
+        </w:rPr>
+        <w:t>Burry의 경고는 '새로운 위험의 발견'이라기보다, 시장이 이미 인식하고 있는 AI CapEx·GPU 잔존가치 리스크가 실제로 얼마나 큰지를 다시 환기시키는 주장</w:t>
+      </w:r>
+    </w:p>
+    <w:p>
+      <w:pPr>
+        <w:spacing w:after="40" w:before="0" w:line="269" w:lineRule="auto"/>
+        <w:ind w:left="312" w:hanging="198"/>
+      </w:pPr>
+      <w:r>
+        <w:rPr>
+          <w:rFonts w:ascii="맑은 고딕" w:hAnsi="맑은 고딕" w:eastAsia="맑은 고딕"/>
+          <w:b w:val="0"/>
+          <w:color w:val="1E407C"/>
+          <w:sz w:val="21"/>
+        </w:rPr>
+        <w:t xml:space="preserve">• </w:t>
+      </w:r>
+      <w:r>
+        <w:rPr>
+          <w:rFonts w:ascii="맑은 고딕" w:hAnsi="맑은 고딕" w:eastAsia="맑은 고딕"/>
+          <w:b/>
+          <w:color w:val="1A1A1A"/>
+          <w:sz w:val="21"/>
+        </w:rPr>
+        <w:t xml:space="preserve">퀵코멘트  </w:t>
+      </w:r>
+      <w:r>
+        <w:rPr>
+          <w:rFonts w:ascii="맑은 고딕" w:hAnsi="맑은 고딕" w:eastAsia="맑은 고딕"/>
+          <w:b w:val="0"/>
+          <w:color w:val="1A1A1A"/>
+          <w:sz w:val="21"/>
+        </w:rPr>
+        <w:t>투자 관점에서 가장 중요한 것은 Burry의 '버블인가 아닌가'가 아니라 GPU 경제적 수명 3년 vs 5년 vs 7년 중 어느 가정이 맞느냐입니다.</w:t>
+      </w:r>
+    </w:p>
+    <w:p>
+      <w:pPr>
+        <w:spacing w:after="40" w:before="0" w:line="269" w:lineRule="auto"/>
+        <w:ind w:left="312" w:hanging="198"/>
+      </w:pPr>
+      <w:r>
+        <w:rPr>
+          <w:rFonts w:ascii="맑은 고딕" w:hAnsi="맑은 고딕" w:eastAsia="맑은 고딕"/>
+          <w:b w:val="0"/>
+          <w:color w:val="1E407C"/>
+          <w:sz w:val="21"/>
+        </w:rPr>
+        <w:t xml:space="preserve">• </w:t>
+      </w:r>
+      <w:r>
+        <w:rPr>
+          <w:rFonts w:ascii="맑은 고딕" w:hAnsi="맑은 고딕" w:eastAsia="맑은 고딕"/>
+          <w:b/>
+          <w:color w:val="1A1A1A"/>
+          <w:sz w:val="21"/>
+        </w:rPr>
+        <w:t xml:space="preserve">퀵코멘트  </w:t>
+      </w:r>
+      <w:r>
+        <w:rPr>
+          <w:rFonts w:ascii="맑은 고딕" w:hAnsi="맑은 고딕" w:eastAsia="맑은 고딕"/>
+          <w:b w:val="0"/>
+          <w:color w:val="1A1A1A"/>
+          <w:sz w:val="21"/>
+        </w:rPr>
+        <w:t>수명 가정이 갈리는 이름은 NVIDIA · CoreWeave · Oracle · Microsoft · Meta다.</w:t>
+      </w:r>
+    </w:p>
+    <w:p>
+      <w:pPr>
+        <w:spacing w:before="240" w:after="120" w:line="276" w:lineRule="auto"/>
+        <w:jc w:val="left"/>
+        <w:pBdr>
+          <w:bottom w:val="single" w:sz="12" w:space="3" w:color="0F2043"/>
+        </w:pBdr>
+      </w:pPr>
+      <w:r>
+        <w:rPr>
+          <w:rFonts w:ascii="맑은 고딕" w:hAnsi="맑은 고딕" w:eastAsia="맑은 고딕"/>
+          <w:b/>
+          <w:color w:val="0F2043"/>
+          <w:sz w:val="32"/>
+        </w:rPr>
+        <w:t>11. 포트폴리오</w:t>
+      </w:r>
+    </w:p>
+    <w:p>
+      <w:pPr>
+        <w:spacing w:before="0" w:after="120" w:line="276" w:lineRule="auto"/>
+        <w:jc w:val="left"/>
+      </w:pPr>
+      <w:r>
+        <w:rPr>
+          <w:rFonts w:ascii="맑은 고딕" w:hAnsi="맑은 고딕" w:eastAsia="맑은 고딕"/>
+          <w:b w:val="0"/>
+          <w:color w:val="1A1A1A"/>
+          <w:sz w:val="22"/>
+        </w:rPr>
         <w:t>경력자 포트는 AI 50~60%(삼전·닉스 30~40%, 소부장 20%), 2차전지 10%, 건설·조선 10%, 현금 20%다. 매매 시간이 적으면 현금 30%다.</w:t>
+      </w:r>
+    </w:p>
+    <w:p>
+      <w:pPr>
+        <w:spacing w:after="40" w:before="0" w:line="269" w:lineRule="auto"/>
+        <w:ind w:left="312" w:hanging="198"/>
+      </w:pPr>
+      <w:r>
+        <w:rPr>
+          <w:rFonts w:ascii="맑은 고딕" w:hAnsi="맑은 고딕" w:eastAsia="맑은 고딕"/>
+          <w:b w:val="0"/>
+          <w:color w:val="1E407C"/>
+          <w:sz w:val="21"/>
+        </w:rPr>
+        <w:t xml:space="preserve">• </w:t>
+      </w:r>
+      <w:r>
+        <w:rPr>
+          <w:rFonts w:ascii="맑은 고딕" w:hAnsi="맑은 고딕" w:eastAsia="맑은 고딕"/>
+          <w:b/>
+          <w:color w:val="1A1A1A"/>
+          <w:sz w:val="21"/>
+        </w:rPr>
+        <w:t xml:space="preserve">신중호  </w:t>
+      </w:r>
+      <w:r>
+        <w:rPr>
+          <w:rFonts w:ascii="맑은 고딕" w:hAnsi="맑은 고딕" w:eastAsia="맑은 고딕"/>
+          <w:b w:val="0"/>
+          <w:color w:val="1A1A1A"/>
+          <w:sz w:val="21"/>
+        </w:rPr>
+        <w:t>현금이 가는 곳이 다음 주도주다. 빅테크 현금이 엔비디아로, 그다음 메모리로 갔다. 이제 메모리와 엔비디아의 현금은 증설과 장비, 전력, 광학 부품으로 간다. 삼성전자·하이닉스는 시장 비중 50%를 40% 안쪽으로 두고, 그 현금을 받는 쪽을 보는 제안이다.</w:t>
+      </w:r>
+    </w:p>
+    <w:p>
+      <w:pPr>
+        <w:spacing w:after="40" w:before="0" w:line="269" w:lineRule="auto"/>
+        <w:ind w:left="312" w:hanging="198"/>
+      </w:pPr>
+      <w:r>
+        <w:rPr>
+          <w:rFonts w:ascii="맑은 고딕" w:hAnsi="맑은 고딕" w:eastAsia="맑은 고딕"/>
+          <w:b w:val="0"/>
+          <w:color w:val="1E407C"/>
+          <w:sz w:val="21"/>
+        </w:rPr>
+        <w:t xml:space="preserve">• </w:t>
+      </w:r>
+      <w:r>
+        <w:rPr>
+          <w:rFonts w:ascii="맑은 고딕" w:hAnsi="맑은 고딕" w:eastAsia="맑은 고딕"/>
+          <w:b/>
+          <w:color w:val="1A1A1A"/>
+          <w:sz w:val="21"/>
+        </w:rPr>
+        <w:t xml:space="preserve">목대균·이경규  </w:t>
+      </w:r>
+      <w:r>
+        <w:rPr>
+          <w:rFonts w:ascii="맑은 고딕" w:hAnsi="맑은 고딕" w:eastAsia="맑은 고딕"/>
+          <w:b w:val="0"/>
+          <w:color w:val="1A1A1A"/>
+          <w:sz w:val="21"/>
+        </w:rPr>
+        <w:t>AI 기업이 5%에 돈을 빌리는 것은 그 이상 벌 수 있다고 보기 때문이다. 종목을 고를 때도 ROE 5% 미만은 가치가 약하고, 8~12%는 돼야 한다는 기준이다.</w:t>
+      </w:r>
+    </w:p>
+    <w:p>
+      <w:pPr>
+        <w:spacing w:after="40" w:before="0" w:line="269" w:lineRule="auto"/>
+        <w:ind w:left="312" w:hanging="198"/>
+      </w:pPr>
+      <w:r>
+        <w:rPr>
+          <w:rFonts w:ascii="맑은 고딕" w:hAnsi="맑은 고딕" w:eastAsia="맑은 고딕"/>
+          <w:b w:val="0"/>
+          <w:color w:val="1E407C"/>
+          <w:sz w:val="21"/>
+        </w:rPr>
+        <w:t xml:space="preserve">• </w:t>
+      </w:r>
+      <w:r>
+        <w:rPr>
+          <w:rFonts w:ascii="맑은 고딕" w:hAnsi="맑은 고딕" w:eastAsia="맑은 고딕"/>
+          <w:b/>
+          <w:color w:val="1A1A1A"/>
+          <w:sz w:val="21"/>
+        </w:rPr>
+        <w:t xml:space="preserve">RTS  </w:t>
+      </w:r>
+      <w:r>
+        <w:rPr>
+          <w:rFonts w:ascii="맑은 고딕" w:hAnsi="맑은 고딕" w:eastAsia="맑은 고딕"/>
+          <w:b w:val="0"/>
+          <w:color w:val="1A1A1A"/>
+          <w:sz w:val="21"/>
+        </w:rPr>
+        <w:t>코스닥 888은 비상금으로 잠깐 담는 자리다. 투자로 보면 안 된다. 주간 5.7% 반등에도 구름 아래고, 이유 없이 급락하는 차트다. 코스피 차트가 더 안정적이다.</w:t>
+      </w:r>
+    </w:p>
+    <w:p>
+      <w:pPr>
+        <w:spacing w:after="40" w:before="0" w:line="269" w:lineRule="auto"/>
+        <w:ind w:left="312" w:hanging="198"/>
+      </w:pPr>
+      <w:r>
+        <w:rPr>
+          <w:rFonts w:ascii="맑은 고딕" w:hAnsi="맑은 고딕" w:eastAsia="맑은 고딕"/>
+          <w:b w:val="0"/>
+          <w:color w:val="1E407C"/>
+          <w:sz w:val="21"/>
+        </w:rPr>
+        <w:t xml:space="preserve">• </w:t>
+      </w:r>
+      <w:r>
+        <w:rPr>
+          <w:rFonts w:ascii="맑은 고딕" w:hAnsi="맑은 고딕" w:eastAsia="맑은 고딕"/>
+          <w:b/>
+          <w:color w:val="1A1A1A"/>
+          <w:sz w:val="21"/>
+        </w:rPr>
+        <w:t xml:space="preserve">목대균·이경규  </w:t>
+      </w:r>
+      <w:r>
+        <w:rPr>
+          <w:rFonts w:ascii="맑은 고딕" w:hAnsi="맑은 고딕" w:eastAsia="맑은 고딕"/>
+          <w:b w:val="0"/>
+          <w:color w:val="1A1A1A"/>
+          <w:sz w:val="21"/>
+        </w:rPr>
+        <w:t>연금 주식 비중은 100에서 나이를 뺀 수준이 한 기준이고, 은퇴가 가까우면 주식을 줄인다. 생활비 계좌와 연금 계좌는 나누는 쪽이다.</w:t>
       </w:r>
     </w:p>
     <w:p>

</xml_diff>

<commit_message>
Add the rate, Samsung Electro-Mechanics, and global-flow talks.
Keep only the core claims: inflation as the second condition for a break, MLCC and substrate economics, and where private versus public money is going.

Co-authored-by: choijunh-cloud <choijunh-cloud@users.noreply.github.com>
</commit_message>
<xml_diff>
--- a/lectures/투자인사이트 증류.docx
+++ b/lectures/투자인사이트 증류.docx
@@ -44,7 +44,7 @@
           <w:color w:val="4B5563"/>
           <w:sz w:val="21"/>
         </w:rPr>
-        <w:t>퀵코멘트 55개 · 대담 10편 · 한 노트 152문장</w:t>
+        <w:t>퀵코멘트 55개 · 대담 13편 · 한 노트 174문장</w:t>
       </w:r>
     </w:p>
     <w:tbl>
@@ -270,16 +270,16 @@
           <w:color w:val="1A1A1A"/>
           <w:sz w:val="21"/>
         </w:rPr>
-        <w:t xml:space="preserve">신중호  </w:t>
-      </w:r>
-      <w:r>
-        <w:rPr>
-          <w:rFonts w:ascii="맑은 고딕" w:hAnsi="맑은 고딕" w:eastAsia="맑은 고딕"/>
-          <w:b w:val="0"/>
-          <w:color w:val="1A1A1A"/>
-          <w:sz w:val="21"/>
-        </w:rPr>
-        <w:t>미국 은행은 현금 약 3조 달러를 갖고 대출 비중은 약 54%다. 국채를 팔지 않아도 현금이 대출로 나오게 하는 SLR 완화는 준비됐지만 선거 전 눈치로 아직이다. 선거 이후 스트레스 테스트가 끝나면 AI 투자 자금이 풀릴 수 있다. 미국 금융주와 한국 AI 밸류체인에 호재다.</w:t>
+        <w:t xml:space="preserve">전략 이사  </w:t>
+      </w:r>
+      <w:r>
+        <w:rPr>
+          <w:rFonts w:ascii="맑은 고딕" w:hAnsi="맑은 고딕" w:eastAsia="맑은 고딕"/>
+          <w:b w:val="0"/>
+          <w:color w:val="1A1A1A"/>
+          <w:sz w:val="21"/>
+        </w:rPr>
+        <w:t>최근 40년 저물가에서는 경기와 물가가 같이 갔다. 1960~80년대 고물가에서는 물가가 꺾인 뒤 경기가 살아났다. 2021년 이후는 후자에 가깝고, 1~2% 물가로 완전히 돌아가기는 어렵다는 판단이다. 고물가 국면에서는 물가 고점에 사고, 물가가 바닥을 찍고 오르기 시작하면 줄인다.</w:t>
       </w:r>
     </w:p>
     <w:p>
@@ -303,16 +303,16 @@
           <w:color w:val="1A1A1A"/>
           <w:sz w:val="21"/>
         </w:rPr>
-        <w:t xml:space="preserve">RTS  </w:t>
-      </w:r>
-      <w:r>
-        <w:rPr>
-          <w:rFonts w:ascii="맑은 고딕" w:hAnsi="맑은 고딕" w:eastAsia="맑은 고딕"/>
-          <w:b w:val="0"/>
-          <w:color w:val="1A1A1A"/>
-          <w:sz w:val="21"/>
-        </w:rPr>
-        <w:t>미중 정상회담은 숫자 합의보다 태평양을 둘이 나누자는 구도가 다시 나온 자리로 읽힌다. 한국에는 2,000억 달러 투자 약정 중 알래스카 LNG 540억 달러를, 협의 전에 미국이 발표했다. 발언자의 해석이고, 동맹 체면과 협상력이 약해지면 경제 현안도 막힌다는 경고다.</w:t>
+        <w:t xml:space="preserve">신중호  </w:t>
+      </w:r>
+      <w:r>
+        <w:rPr>
+          <w:rFonts w:ascii="맑은 고딕" w:hAnsi="맑은 고딕" w:eastAsia="맑은 고딕"/>
+          <w:b w:val="0"/>
+          <w:color w:val="1A1A1A"/>
+          <w:sz w:val="21"/>
+        </w:rPr>
+        <w:t>미국 은행은 현금 약 3조 달러를 갖고 대출 비중은 약 54%다. 국채를 팔지 않아도 현금이 대출로 나오게 하는 SLR 완화는 준비됐지만 선거 전 눈치로 아직이다. 선거 이후 스트레스 테스트가 끝나면 AI 투자 자금이 풀릴 수 있다. 미국 금융주와 한국 AI 밸류체인에 호재다.</w:t>
       </w:r>
     </w:p>
     <w:p>
@@ -336,16 +336,16 @@
           <w:color w:val="1A1A1A"/>
           <w:sz w:val="21"/>
         </w:rPr>
-        <w:t xml:space="preserve">목대균·이경규  </w:t>
-      </w:r>
-      <w:r>
-        <w:rPr>
-          <w:rFonts w:ascii="맑은 고딕" w:hAnsi="맑은 고딕" w:eastAsia="맑은 고딕"/>
-          <w:b w:val="0"/>
-          <w:color w:val="1A1A1A"/>
-          <w:sz w:val="21"/>
-        </w:rPr>
-        <w:t>1970년대는 공급 7% 차질에 유가가 130% 올랐다. 이번 호르무즈는 차질이 약 15%로 더 큰데 상승은 약 30%에 그쳤다. 중국이 비축을 풀고 우회 수출이 됐기 때문이다. 전쟁이 끝나면 브렌트는 70~80달러가 현실적이고, 증시의 더 큰 줄기는 AI다.</w:t>
+        <w:t xml:space="preserve">RTS  </w:t>
+      </w:r>
+      <w:r>
+        <w:rPr>
+          <w:rFonts w:ascii="맑은 고딕" w:hAnsi="맑은 고딕" w:eastAsia="맑은 고딕"/>
+          <w:b w:val="0"/>
+          <w:color w:val="1A1A1A"/>
+          <w:sz w:val="21"/>
+        </w:rPr>
+        <w:t>미중 정상회담은 숫자 합의보다 태평양을 둘이 나누자는 구도가 다시 나온 자리로 읽힌다. 한국에는 2,000억 달러 투자 약정 중 알래스카 LNG 540억 달러를, 협의 전에 미국이 발표했다. 발언자의 해석이고, 동맹 체면과 협상력이 약해지면 경제 현안도 막힌다는 경고다.</w:t>
       </w:r>
     </w:p>
     <w:p>
@@ -369,16 +369,16 @@
           <w:color w:val="1A1A1A"/>
           <w:sz w:val="21"/>
         </w:rPr>
-        <w:t xml:space="preserve">RTS  </w:t>
-      </w:r>
-      <w:r>
-        <w:rPr>
-          <w:rFonts w:ascii="맑은 고딕" w:hAnsi="맑은 고딕" w:eastAsia="맑은 고딕"/>
-          <w:b w:val="0"/>
-          <w:color w:val="1A1A1A"/>
-          <w:sz w:val="21"/>
-        </w:rPr>
-        <w:t>4분기는 한 해를 정리하는 분기다. 기관 자금은 11월에 갱신되고, 금리가 오른 뒤 내부 수익률 7%를 못 넘기면 프로젝트가 멈춘다. 돈은 기업과 데이터센터로 몰려 물 먹는 하마처럼 빠져 있다. 그 투자가 생산성으로 돌아와야 돈이 다시 돈다.</w:t>
+        <w:t xml:space="preserve">목대균·이경규  </w:t>
+      </w:r>
+      <w:r>
+        <w:rPr>
+          <w:rFonts w:ascii="맑은 고딕" w:hAnsi="맑은 고딕" w:eastAsia="맑은 고딕"/>
+          <w:b w:val="0"/>
+          <w:color w:val="1A1A1A"/>
+          <w:sz w:val="21"/>
+        </w:rPr>
+        <w:t>1970년대는 공급 7% 차질에 유가가 130% 올랐다. 이번 호르무즈는 차질이 약 15%로 더 큰데 상승은 약 30%에 그쳤다. 중국이 비축을 풀고 우회 수출이 됐기 때문이다. 전쟁이 끝나면 브렌트는 70~80달러가 현실적이고, 증시의 더 큰 줄기는 AI다.</w:t>
       </w:r>
     </w:p>
     <w:p>
@@ -402,16 +402,16 @@
           <w:color w:val="1A1A1A"/>
           <w:sz w:val="21"/>
         </w:rPr>
-        <w:t xml:space="preserve">목대균·이경규  </w:t>
-      </w:r>
-      <w:r>
-        <w:rPr>
-          <w:rFonts w:ascii="맑은 고딕" w:hAnsi="맑은 고딕" w:eastAsia="맑은 고딕"/>
-          <w:b w:val="0"/>
-          <w:color w:val="1A1A1A"/>
-          <w:sz w:val="21"/>
-        </w:rPr>
-        <w:t>9월 미국 10년물은 약 49bp 올랐는데 대부분은 물가가 아니라 실질금리다. 돈값이 비싸져 멀티플은 눌리고, 메모리 이익 추정은 오히려 올라간다. 주가는 옆으로 버틴다.</w:t>
+        <w:t xml:space="preserve">전략 이사  </w:t>
+      </w:r>
+      <w:r>
+        <w:rPr>
+          <w:rFonts w:ascii="맑은 고딕" w:hAnsi="맑은 고딕" w:eastAsia="맑은 고딕"/>
+          <w:b w:val="0"/>
+          <w:color w:val="1A1A1A"/>
+          <w:sz w:val="21"/>
+        </w:rPr>
+        <w:t>ISM 제조업 지수는 수정이 없고 주가가 들어가지 않으며 매월 가장 빨리 나온다. 지금 약 55이고, 다른 제조업 설문은 강해서 다음 달도 오를 수 있다. 60 근처는 경기가 좋은 만큼 물가도 따라오는 자리다. 꺾이기 전까지는 보유가 단순한 전략이다.</w:t>
       </w:r>
     </w:p>
     <w:p>
@@ -435,16 +435,16 @@
           <w:color w:val="1A1A1A"/>
           <w:sz w:val="21"/>
         </w:rPr>
-        <w:t xml:space="preserve">이선엽  </w:t>
-      </w:r>
-      <w:r>
-        <w:rPr>
-          <w:rFonts w:ascii="맑은 고딕" w:hAnsi="맑은 고딕" w:eastAsia="맑은 고딕"/>
-          <w:b w:val="0"/>
-          <w:color w:val="1A1A1A"/>
-          <w:sz w:val="21"/>
-        </w:rPr>
-        <w:t>미국 10년물은 5.3%까지 올랐다가 5.2% 초반으로 밀렸다. 5.2~5.1%에서 행보하면 실적 시즌에 반도체·소부장·전력으로 압축되며 오를 수 있다는 쪽이다.</w:t>
+        <w:t xml:space="preserve">전략 이사  </w:t>
+      </w:r>
+      <w:r>
+        <w:rPr>
+          <w:rFonts w:ascii="맑은 고딕" w:hAnsi="맑은 고딕" w:eastAsia="맑은 고딕"/>
+          <w:b w:val="0"/>
+          <w:color w:val="1A1A1A"/>
+          <w:sz w:val="21"/>
+        </w:rPr>
+        <w:t>1950년 이후 중간 선거 뒤 6개월과 1년 승률은 지금까지 100%다. 선거 약 33일 전이 바닥인 경우가 많았다. 10월에 크게 빠진 해는 1978년과 2018년이고, 둘 다 예상 밖의 금리 인상이 있었다. 패턴보다 물가 컨센서스가 우선이다.</w:t>
       </w:r>
     </w:p>
     <w:p>
@@ -477,7 +477,7 @@
           <w:color w:val="1A1A1A"/>
           <w:sz w:val="21"/>
         </w:rPr>
-        <w:t>연간으로 코스피는 약 66% 올랐고 코스닥은 아직 마이너스다. S&amp;P는 약 12%, 나스닥은 약 15%다. 다우·러셀은 약하다. 한국만 못 가는 그림은 아니다.</w:t>
+        <w:t>4분기는 한 해를 정리하는 분기다. 기관 자금은 11월에 갱신되고, 금리가 오른 뒤 내부 수익률 7%를 못 넘기면 프로젝트가 멈춘다. 돈은 기업과 데이터센터로 몰려 물 먹는 하마처럼 빠져 있다. 그 투자가 생산성으로 돌아와야 돈이 다시 돈다.</w:t>
       </w:r>
     </w:p>
     <w:p>
@@ -501,6 +501,303 @@
           <w:color w:val="1A1A1A"/>
           <w:sz w:val="21"/>
         </w:rPr>
+        <w:t xml:space="preserve">박정호  </w:t>
+      </w:r>
+      <w:r>
+        <w:rPr>
+          <w:rFonts w:ascii="맑은 고딕" w:hAnsi="맑은 고딕" w:eastAsia="맑은 고딕"/>
+          <w:b w:val="0"/>
+          <w:color w:val="1A1A1A"/>
+          <w:sz w:val="21"/>
+        </w:rPr>
+        <w:t>미중 정상회담은 급한 숙제가 있는 두 정상의 휴전이다. 문구는 존중·공정·상호주의로, 1980년대 일본보다 중국을 예우했다. 대만 독립을 명시적으로 반대하라는 요구는 빠졌다. 비민감 품목 관세 완화는 양쪽 약 300억 달러다.</w:t>
+      </w:r>
+    </w:p>
+    <w:p>
+      <w:pPr>
+        <w:spacing w:after="40" w:before="0" w:line="269" w:lineRule="auto"/>
+        <w:ind w:left="312" w:hanging="198"/>
+      </w:pPr>
+      <w:r>
+        <w:rPr>
+          <w:rFonts w:ascii="맑은 고딕" w:hAnsi="맑은 고딕" w:eastAsia="맑은 고딕"/>
+          <w:b w:val="0"/>
+          <w:color w:val="1E407C"/>
+          <w:sz w:val="21"/>
+        </w:rPr>
+        <w:t xml:space="preserve">• </w:t>
+      </w:r>
+      <w:r>
+        <w:rPr>
+          <w:rFonts w:ascii="맑은 고딕" w:hAnsi="맑은 고딕" w:eastAsia="맑은 고딕"/>
+          <w:b/>
+          <w:color w:val="1A1A1A"/>
+          <w:sz w:val="21"/>
+        </w:rPr>
+        <w:t xml:space="preserve">박정호  </w:t>
+      </w:r>
+      <w:r>
+        <w:rPr>
+          <w:rFonts w:ascii="맑은 고딕" w:hAnsi="맑은 고딕" w:eastAsia="맑은 고딕"/>
+          <w:b w:val="0"/>
+          <w:color w:val="1A1A1A"/>
+          <w:sz w:val="21"/>
+        </w:rPr>
+        <w:t>제3국이 미국행 물건에 중국산이 없음을 증명하라는 규칙은 그대로다. 공장 이전은 1년 안에 안 끝난다. 수혜의 중심은 베트남을 포함한 아세안이다. 중국 대미 흑자가 당장 늘어 보이는 것은 선반영과 기저효과다.</w:t>
+      </w:r>
+    </w:p>
+    <w:p>
+      <w:pPr>
+        <w:spacing w:after="40" w:before="0" w:line="269" w:lineRule="auto"/>
+        <w:ind w:left="312" w:hanging="198"/>
+      </w:pPr>
+      <w:r>
+        <w:rPr>
+          <w:rFonts w:ascii="맑은 고딕" w:hAnsi="맑은 고딕" w:eastAsia="맑은 고딕"/>
+          <w:b w:val="0"/>
+          <w:color w:val="1E407C"/>
+          <w:sz w:val="21"/>
+        </w:rPr>
+        <w:t xml:space="preserve">• </w:t>
+      </w:r>
+      <w:r>
+        <w:rPr>
+          <w:rFonts w:ascii="맑은 고딕" w:hAnsi="맑은 고딕" w:eastAsia="맑은 고딕"/>
+          <w:b/>
+          <w:color w:val="1A1A1A"/>
+          <w:sz w:val="21"/>
+        </w:rPr>
+        <w:t xml:space="preserve">전략 이사  </w:t>
+      </w:r>
+      <w:r>
+        <w:rPr>
+          <w:rFonts w:ascii="맑은 고딕" w:hAnsi="맑은 고딕" w:eastAsia="맑은 고딕"/>
+          <w:b w:val="0"/>
+          <w:color w:val="1A1A1A"/>
+          <w:sz w:val="21"/>
+        </w:rPr>
+        <w:t>미국 10년물 5.3%는 최근 3~4년 고점이다. 버블이 무너지려면 금리 신고가와, 다시는 내려오지 않는다는 믿음이 같이 필요하다. 5% 중반에 닿았다가 4%대로 돌아오면 채권과 주식이 같이 오른다.</w:t>
+      </w:r>
+    </w:p>
+    <w:p>
+      <w:pPr>
+        <w:spacing w:after="40" w:before="0" w:line="269" w:lineRule="auto"/>
+        <w:ind w:left="312" w:hanging="198"/>
+      </w:pPr>
+      <w:r>
+        <w:rPr>
+          <w:rFonts w:ascii="맑은 고딕" w:hAnsi="맑은 고딕" w:eastAsia="맑은 고딕"/>
+          <w:b w:val="0"/>
+          <w:color w:val="1E407C"/>
+          <w:sz w:val="21"/>
+        </w:rPr>
+        <w:t xml:space="preserve">• </w:t>
+      </w:r>
+      <w:r>
+        <w:rPr>
+          <w:rFonts w:ascii="맑은 고딕" w:hAnsi="맑은 고딕" w:eastAsia="맑은 고딕"/>
+          <w:b/>
+          <w:color w:val="1A1A1A"/>
+          <w:sz w:val="21"/>
+        </w:rPr>
+        <w:t xml:space="preserve">박정호  </w:t>
+      </w:r>
+      <w:r>
+        <w:rPr>
+          <w:rFonts w:ascii="맑은 고딕" w:hAnsi="맑은 고딕" w:eastAsia="맑은 고딕"/>
+          <w:b w:val="0"/>
+          <w:color w:val="1A1A1A"/>
+          <w:sz w:val="21"/>
+        </w:rPr>
+        <w:t>하이퍼스케일러 실적은 이미 좋아지고 있다. 버는 속도보다 쓰는 속도가 빠르지만, 가격 통제권이 있다. 한 사람이 AI를 직접 한두 개만 써도, 여행·교육·포털에 녹은 간접 사용은 그보다 많다.</w:t>
+      </w:r>
+    </w:p>
+    <w:p>
+      <w:pPr>
+        <w:spacing w:after="40" w:before="0" w:line="269" w:lineRule="auto"/>
+        <w:ind w:left="312" w:hanging="198"/>
+      </w:pPr>
+      <w:r>
+        <w:rPr>
+          <w:rFonts w:ascii="맑은 고딕" w:hAnsi="맑은 고딕" w:eastAsia="맑은 고딕"/>
+          <w:b w:val="0"/>
+          <w:color w:val="1E407C"/>
+          <w:sz w:val="21"/>
+        </w:rPr>
+        <w:t xml:space="preserve">• </w:t>
+      </w:r>
+      <w:r>
+        <w:rPr>
+          <w:rFonts w:ascii="맑은 고딕" w:hAnsi="맑은 고딕" w:eastAsia="맑은 고딕"/>
+          <w:b/>
+          <w:color w:val="1A1A1A"/>
+          <w:sz w:val="21"/>
+        </w:rPr>
+        <w:t xml:space="preserve">전략 이사  </w:t>
+      </w:r>
+      <w:r>
+        <w:rPr>
+          <w:rFonts w:ascii="맑은 고딕" w:hAnsi="맑은 고딕" w:eastAsia="맑은 고딕"/>
+          <w:b w:val="0"/>
+          <w:color w:val="1A1A1A"/>
+          <w:sz w:val="21"/>
+        </w:rPr>
+        <w:t>기관 컨센서스는 물가가 4분기까지 높고, 내년 1분기 3.1%, 2분기 2%로 본다. 그 믿음이 있는 동안 주가는 버틴다. 2%로 가는 신호가 보이면 주가는 크게 열릴 수 있다.</w:t>
+      </w:r>
+    </w:p>
+    <w:p>
+      <w:pPr>
+        <w:spacing w:after="40" w:before="0" w:line="269" w:lineRule="auto"/>
+        <w:ind w:left="312" w:hanging="198"/>
+      </w:pPr>
+      <w:r>
+        <w:rPr>
+          <w:rFonts w:ascii="맑은 고딕" w:hAnsi="맑은 고딕" w:eastAsia="맑은 고딕"/>
+          <w:b w:val="0"/>
+          <w:color w:val="1E407C"/>
+          <w:sz w:val="21"/>
+        </w:rPr>
+        <w:t xml:space="preserve">• </w:t>
+      </w:r>
+      <w:r>
+        <w:rPr>
+          <w:rFonts w:ascii="맑은 고딕" w:hAnsi="맑은 고딕" w:eastAsia="맑은 고딕"/>
+          <w:b/>
+          <w:color w:val="1A1A1A"/>
+          <w:sz w:val="21"/>
+        </w:rPr>
+        <w:t xml:space="preserve">목대균·이경규  </w:t>
+      </w:r>
+      <w:r>
+        <w:rPr>
+          <w:rFonts w:ascii="맑은 고딕" w:hAnsi="맑은 고딕" w:eastAsia="맑은 고딕"/>
+          <w:b w:val="0"/>
+          <w:color w:val="1A1A1A"/>
+          <w:sz w:val="21"/>
+        </w:rPr>
+        <w:t>9월 미국 10년물은 약 49bp 올랐는데 대부분은 물가가 아니라 실질금리다. 돈값이 비싸져 멀티플은 눌리고, 메모리 이익 추정은 오히려 올라간다. 주가는 옆으로 버틴다.</w:t>
+      </w:r>
+    </w:p>
+    <w:p>
+      <w:pPr>
+        <w:spacing w:after="40" w:before="0" w:line="269" w:lineRule="auto"/>
+        <w:ind w:left="312" w:hanging="198"/>
+      </w:pPr>
+      <w:r>
+        <w:rPr>
+          <w:rFonts w:ascii="맑은 고딕" w:hAnsi="맑은 고딕" w:eastAsia="맑은 고딕"/>
+          <w:b w:val="0"/>
+          <w:color w:val="1E407C"/>
+          <w:sz w:val="21"/>
+        </w:rPr>
+        <w:t xml:space="preserve">• </w:t>
+      </w:r>
+      <w:r>
+        <w:rPr>
+          <w:rFonts w:ascii="맑은 고딕" w:hAnsi="맑은 고딕" w:eastAsia="맑은 고딕"/>
+          <w:b/>
+          <w:color w:val="1A1A1A"/>
+          <w:sz w:val="21"/>
+        </w:rPr>
+        <w:t xml:space="preserve">이선엽  </w:t>
+      </w:r>
+      <w:r>
+        <w:rPr>
+          <w:rFonts w:ascii="맑은 고딕" w:hAnsi="맑은 고딕" w:eastAsia="맑은 고딕"/>
+          <w:b w:val="0"/>
+          <w:color w:val="1A1A1A"/>
+          <w:sz w:val="21"/>
+        </w:rPr>
+        <w:t>미국 10년물은 5.3%까지 올랐다가 5.2% 초반으로 밀렸다. 5.2~5.1%에서 행보하면 실적 시즌에 반도체·소부장·전력으로 압축되며 오를 수 있다는 쪽이다.</w:t>
+      </w:r>
+    </w:p>
+    <w:p>
+      <w:pPr>
+        <w:spacing w:after="40" w:before="0" w:line="269" w:lineRule="auto"/>
+        <w:ind w:left="312" w:hanging="198"/>
+      </w:pPr>
+      <w:r>
+        <w:rPr>
+          <w:rFonts w:ascii="맑은 고딕" w:hAnsi="맑은 고딕" w:eastAsia="맑은 고딕"/>
+          <w:b w:val="0"/>
+          <w:color w:val="1E407C"/>
+          <w:sz w:val="21"/>
+        </w:rPr>
+        <w:t xml:space="preserve">• </w:t>
+      </w:r>
+      <w:r>
+        <w:rPr>
+          <w:rFonts w:ascii="맑은 고딕" w:hAnsi="맑은 고딕" w:eastAsia="맑은 고딕"/>
+          <w:b/>
+          <w:color w:val="1A1A1A"/>
+          <w:sz w:val="21"/>
+        </w:rPr>
+        <w:t xml:space="preserve">RTS  </w:t>
+      </w:r>
+      <w:r>
+        <w:rPr>
+          <w:rFonts w:ascii="맑은 고딕" w:hAnsi="맑은 고딕" w:eastAsia="맑은 고딕"/>
+          <w:b w:val="0"/>
+          <w:color w:val="1A1A1A"/>
+          <w:sz w:val="21"/>
+        </w:rPr>
+        <w:t>연간으로 코스피는 약 66% 올랐고 코스닥은 아직 마이너스다. S&amp;P는 약 12%, 나스닥은 약 15%다. 다우·러셀은 약하다. 한국만 못 가는 그림은 아니다.</w:t>
+      </w:r>
+    </w:p>
+    <w:p>
+      <w:pPr>
+        <w:spacing w:after="40" w:before="0" w:line="269" w:lineRule="auto"/>
+        <w:ind w:left="312" w:hanging="198"/>
+      </w:pPr>
+      <w:r>
+        <w:rPr>
+          <w:rFonts w:ascii="맑은 고딕" w:hAnsi="맑은 고딕" w:eastAsia="맑은 고딕"/>
+          <w:b w:val="0"/>
+          <w:color w:val="1E407C"/>
+          <w:sz w:val="21"/>
+        </w:rPr>
+        <w:t xml:space="preserve">• </w:t>
+      </w:r>
+      <w:r>
+        <w:rPr>
+          <w:rFonts w:ascii="맑은 고딕" w:hAnsi="맑은 고딕" w:eastAsia="맑은 고딕"/>
+          <w:b/>
+          <w:color w:val="1A1A1A"/>
+          <w:sz w:val="21"/>
+        </w:rPr>
+        <w:t xml:space="preserve">박정호  </w:t>
+      </w:r>
+      <w:r>
+        <w:rPr>
+          <w:rFonts w:ascii="맑은 고딕" w:hAnsi="맑은 고딕" w:eastAsia="맑은 고딕"/>
+          <w:b w:val="0"/>
+          <w:color w:val="1A1A1A"/>
+          <w:sz w:val="21"/>
+        </w:rPr>
+        <w:t>중국·인도·브라질 공공자금은 미 국채를 계속 줄인다. 민간은 5% 금리에도 국채와 AI 회사채를 받는다. 회담에서 합의되지 않은 카드는 희토류 수출 통제다.</w:t>
+      </w:r>
+    </w:p>
+    <w:p>
+      <w:pPr>
+        <w:spacing w:after="40" w:before="0" w:line="269" w:lineRule="auto"/>
+        <w:ind w:left="312" w:hanging="198"/>
+      </w:pPr>
+      <w:r>
+        <w:rPr>
+          <w:rFonts w:ascii="맑은 고딕" w:hAnsi="맑은 고딕" w:eastAsia="맑은 고딕"/>
+          <w:b w:val="0"/>
+          <w:color w:val="1E407C"/>
+          <w:sz w:val="21"/>
+        </w:rPr>
+        <w:t xml:space="preserve">• </w:t>
+      </w:r>
+      <w:r>
+        <w:rPr>
+          <w:rFonts w:ascii="맑은 고딕" w:hAnsi="맑은 고딕" w:eastAsia="맑은 고딕"/>
+          <w:b/>
+          <w:color w:val="1A1A1A"/>
+          <w:sz w:val="21"/>
+        </w:rPr>
         <w:t xml:space="preserve">퀵코멘트  </w:t>
       </w:r>
       <w:r>
@@ -511,6 +808,72 @@
           <w:sz w:val="21"/>
         </w:rPr>
         <w:t>8월 근원 PCE 3.008%는 개정 효과다. 개정 7월 2.983%에서 사실상 보합이고, 3개월 연율은 약 2.05%, 6개월 연율은 약 2.74%다.</w:t>
+      </w:r>
+    </w:p>
+    <w:p>
+      <w:pPr>
+        <w:spacing w:after="40" w:before="0" w:line="269" w:lineRule="auto"/>
+        <w:ind w:left="312" w:hanging="198"/>
+      </w:pPr>
+      <w:r>
+        <w:rPr>
+          <w:rFonts w:ascii="맑은 고딕" w:hAnsi="맑은 고딕" w:eastAsia="맑은 고딕"/>
+          <w:b w:val="0"/>
+          <w:color w:val="1E407C"/>
+          <w:sz w:val="21"/>
+        </w:rPr>
+        <w:t xml:space="preserve">• </w:t>
+      </w:r>
+      <w:r>
+        <w:rPr>
+          <w:rFonts w:ascii="맑은 고딕" w:hAnsi="맑은 고딕" w:eastAsia="맑은 고딕"/>
+          <w:b/>
+          <w:color w:val="1A1A1A"/>
+          <w:sz w:val="21"/>
+        </w:rPr>
+        <w:t xml:space="preserve">전략 이사  </w:t>
+      </w:r>
+      <w:r>
+        <w:rPr>
+          <w:rFonts w:ascii="맑은 고딕" w:hAnsi="맑은 고딕" w:eastAsia="맑은 고딕"/>
+          <w:b w:val="0"/>
+          <w:color w:val="1A1A1A"/>
+          <w:sz w:val="21"/>
+        </w:rPr>
+        <w:t>수급은 가격을 과하게 만들 뿐, 방향을 만들지 않는다. 가격을 만드는 것은 위험 선호다. 물가 불안이 걷히면 채권과 주식이 같이 오른다는 쪽이다.</w:t>
+      </w:r>
+    </w:p>
+    <w:p>
+      <w:pPr>
+        <w:spacing w:after="40" w:before="0" w:line="269" w:lineRule="auto"/>
+        <w:ind w:left="312" w:hanging="198"/>
+      </w:pPr>
+      <w:r>
+        <w:rPr>
+          <w:rFonts w:ascii="맑은 고딕" w:hAnsi="맑은 고딕" w:eastAsia="맑은 고딕"/>
+          <w:b w:val="0"/>
+          <w:color w:val="1E407C"/>
+          <w:sz w:val="21"/>
+        </w:rPr>
+        <w:t xml:space="preserve">• </w:t>
+      </w:r>
+      <w:r>
+        <w:rPr>
+          <w:rFonts w:ascii="맑은 고딕" w:hAnsi="맑은 고딕" w:eastAsia="맑은 고딕"/>
+          <w:b/>
+          <w:color w:val="1A1A1A"/>
+          <w:sz w:val="21"/>
+        </w:rPr>
+        <w:t xml:space="preserve">전략 이사  </w:t>
+      </w:r>
+      <w:r>
+        <w:rPr>
+          <w:rFonts w:ascii="맑은 고딕" w:hAnsi="맑은 고딕" w:eastAsia="맑은 고딕"/>
+          <w:b w:val="0"/>
+          <w:color w:val="1A1A1A"/>
+          <w:sz w:val="21"/>
+        </w:rPr>
+        <w:t>원유보다 디젤이 안 빠진다. 정제 수출의 약 22%가 호르무즈에 묶여 있다. 해협이 열리고 중국·미국 정제가 다시 돌면 물가 고점 신호가 된다.</w:t>
       </w:r>
     </w:p>
     <w:p>
@@ -1781,16 +2144,16 @@
           <w:color w:val="1A1A1A"/>
           <w:sz w:val="21"/>
         </w:rPr>
-        <w:t xml:space="preserve">목대균·이경규  </w:t>
-      </w:r>
-      <w:r>
-        <w:rPr>
-          <w:rFonts w:ascii="맑은 고딕" w:hAnsi="맑은 고딕" w:eastAsia="맑은 고딕"/>
-          <w:b w:val="0"/>
-          <w:color w:val="1A1A1A"/>
-          <w:sz w:val="21"/>
-        </w:rPr>
-        <w:t>마이크론 다음 분기 총이익률 가이던스는 HBM 믹스 때문에 약간 보수적이다. 보조금 제한이 12월 초에 끝나는데 자기주식에 대한 언급이 없어 실망했다. 실적 전망 자체는 아니다. 장기 계약은 16건에서 26건으로 늘었고, 선수금이 버퍼다. 공급은 2028년까지도 수요를 못 따라온다는 말이 처음 공식화됐다.</w:t>
+        <w:t xml:space="preserve">김장렬  </w:t>
+      </w:r>
+      <w:r>
+        <w:rPr>
+          <w:rFonts w:ascii="맑은 고딕" w:hAnsi="맑은 고딕" w:eastAsia="맑은 고딕"/>
+          <w:b w:val="0"/>
+          <w:color w:val="1A1A1A"/>
+          <w:sz w:val="21"/>
+        </w:rPr>
+        <w:t>마이크론 다음 분기 마진 가이던스 86.25%는 직전 87%보다 0.75%포인트 낮아 초반 매도의 빌미였다. 매출은 이번 분기 약 5%, 다음 분기 가이던스는 약 6% 더 나았고 EPS 가이던스는 38달러로 약 14% 높았다. 콜에서 그다음 분기부터 마진이 다시 오를 수 있다고 했다. 할인율이 오른 자리라 2~3% 반응이 적정에 가깝다.</w:t>
       </w:r>
     </w:p>
     <w:p>
@@ -1814,16 +2177,16 @@
           <w:color w:val="1A1A1A"/>
           <w:sz w:val="21"/>
         </w:rPr>
-        <w:t xml:space="preserve">신중호  </w:t>
-      </w:r>
-      <w:r>
-        <w:rPr>
-          <w:rFonts w:ascii="맑은 고딕" w:hAnsi="맑은 고딕" w:eastAsia="맑은 고딕"/>
-          <w:b w:val="0"/>
-          <w:color w:val="1A1A1A"/>
-          <w:sz w:val="21"/>
-        </w:rPr>
-        <w:t>2024년 엔비디아 매출총이익률이 70~80%일 때 GPU 쇼티지 뒤 대체 칩이 나오며 엔비디아는 1년 가까이 주도주에서 빠지고 옆으로 갔다. 마이크론 총이익률 87%, 다음 분기 86%도 같은 자리다. 마진이 높다고 주도주가 유지되지 않는다. 메모리는 AI 그 자체가 아니라 필수 투입재다.</w:t>
+        <w:t xml:space="preserve">목대균·이경규  </w:t>
+      </w:r>
+      <w:r>
+        <w:rPr>
+          <w:rFonts w:ascii="맑은 고딕" w:hAnsi="맑은 고딕" w:eastAsia="맑은 고딕"/>
+          <w:b w:val="0"/>
+          <w:color w:val="1A1A1A"/>
+          <w:sz w:val="21"/>
+        </w:rPr>
+        <w:t>마이크론 다음 분기 총이익률 가이던스는 HBM 믹스 때문에 약간 보수적이다. 보조금 제한이 12월 초에 끝나는데 자기주식에 대한 언급이 없어 실망했다. 실적 전망 자체는 아니다. 장기 계약은 16건에서 26건으로 늘었고, 선수금이 버퍼다. 공급은 2028년까지도 수요를 못 따라온다는 말이 처음 공식화됐다.</w:t>
       </w:r>
     </w:p>
     <w:p>
@@ -1847,16 +2210,16 @@
           <w:color w:val="1A1A1A"/>
           <w:sz w:val="21"/>
         </w:rPr>
-        <w:t xml:space="preserve">목대균·이경규  </w:t>
-      </w:r>
-      <w:r>
-        <w:rPr>
-          <w:rFonts w:ascii="맑은 고딕" w:hAnsi="맑은 고딕" w:eastAsia="맑은 고딕"/>
-          <w:b w:val="0"/>
-          <w:color w:val="1A1A1A"/>
-          <w:sz w:val="21"/>
-        </w:rPr>
-        <w:t>삼성전자가 HBM 캐파를 하반기 두 배, 내년 2.5배 늘리면 레거시 D램 캐파는 줄어든다. PC·모바일 D램조차 타이트해질 수 있다. 2027년 수급 불안은 줄었고 2028년은 내년에 다시 본다. 뮤즈로 오픈AI·앤트로픽·메타의 3강이 되면 메모리 고객이 한 명에게 몰려 끝나지 않는다.</w:t>
+        <w:t xml:space="preserve">신중호  </w:t>
+      </w:r>
+      <w:r>
+        <w:rPr>
+          <w:rFonts w:ascii="맑은 고딕" w:hAnsi="맑은 고딕" w:eastAsia="맑은 고딕"/>
+          <w:b w:val="0"/>
+          <w:color w:val="1A1A1A"/>
+          <w:sz w:val="21"/>
+        </w:rPr>
+        <w:t>2024년 엔비디아 매출총이익률이 70~80%일 때 GPU 쇼티지 뒤 대체 칩이 나오며 엔비디아는 1년 가까이 주도주에서 빠지고 옆으로 갔다. 마이크론 총이익률 87%, 다음 분기 86%도 같은 자리다. 마진이 높다고 주도주가 유지되지 않는다. 메모리는 AI 그 자체가 아니라 필수 투입재다.</w:t>
       </w:r>
     </w:p>
     <w:p>
@@ -1880,16 +2243,16 @@
           <w:color w:val="1A1A1A"/>
           <w:sz w:val="21"/>
         </w:rPr>
-        <w:t xml:space="preserve">신중호  </w:t>
-      </w:r>
-      <w:r>
-        <w:rPr>
-          <w:rFonts w:ascii="맑은 고딕" w:hAnsi="맑은 고딕" w:eastAsia="맑은 고딕"/>
-          <w:b w:val="0"/>
-          <w:color w:val="1A1A1A"/>
-          <w:sz w:val="21"/>
-        </w:rPr>
-        <w:t>삼성전자는 28만 원 위에 물량의 60~70%, 하이닉스는 175만 원 위에 약 60%가 물려 있다. 애플도 주주환원을 3년 한 뒤에야 재평가됐다. 2028년 공급이 늘어도 마진이 남는지, 중국 메모리가 로컬에 머무는지가 배수를 연다. 4배에서 6배는 50%지만 지금은 그 자리가 아니다.</w:t>
+        <w:t xml:space="preserve">목대균·이경규  </w:t>
+      </w:r>
+      <w:r>
+        <w:rPr>
+          <w:rFonts w:ascii="맑은 고딕" w:hAnsi="맑은 고딕" w:eastAsia="맑은 고딕"/>
+          <w:b w:val="0"/>
+          <w:color w:val="1A1A1A"/>
+          <w:sz w:val="21"/>
+        </w:rPr>
+        <w:t>삼성전자가 HBM 캐파를 하반기 두 배, 내년 2.5배 늘리면 레거시 D램 캐파는 줄어든다. PC·모바일 D램조차 타이트해질 수 있다. 2027년 수급 불안은 줄었고 2028년은 내년에 다시 본다. 뮤즈로 오픈AI·앤트로픽·메타의 3강이 되면 메모리 고객이 한 명에게 몰려 끝나지 않는다.</w:t>
       </w:r>
     </w:p>
     <w:p>
@@ -1913,16 +2276,16 @@
           <w:color w:val="1A1A1A"/>
           <w:sz w:val="21"/>
         </w:rPr>
-        <w:t xml:space="preserve">노근창  </w:t>
-      </w:r>
-      <w:r>
-        <w:rPr>
-          <w:rFonts w:ascii="맑은 고딕" w:hAnsi="맑은 고딕" w:eastAsia="맑은 고딕"/>
-          <w:b w:val="0"/>
-          <w:color w:val="1A1A1A"/>
-          <w:sz w:val="21"/>
-        </w:rPr>
-        <w:t>마이크론 EPS는 약 1년 전 3달러에서 33달러를 넘었다. 증설은 아이다호·뉴욕 HBM이고, 가속기 계획에 맞춘 주문 생산이라 소비자용처럼 빈 공장을 짓는 사이클과 다르다. 데이터센터는 2년 치를 미리 잡아야 하고, 구형 가속기 가격도 출시 때보다 비싸다.</w:t>
+        <w:t xml:space="preserve">신중호  </w:t>
+      </w:r>
+      <w:r>
+        <w:rPr>
+          <w:rFonts w:ascii="맑은 고딕" w:hAnsi="맑은 고딕" w:eastAsia="맑은 고딕"/>
+          <w:b w:val="0"/>
+          <w:color w:val="1A1A1A"/>
+          <w:sz w:val="21"/>
+        </w:rPr>
+        <w:t>삼성전자는 28만 원 위에 물량의 60~70%, 하이닉스는 175만 원 위에 약 60%가 물려 있다. 애플도 주주환원을 3년 한 뒤에야 재평가됐다. 2028년 공급이 늘어도 마진이 남는지, 중국 메모리가 로컬에 머무는지가 배수를 연다. 4배에서 6배는 50%지만 지금은 그 자리가 아니다.</w:t>
       </w:r>
     </w:p>
     <w:p>
@@ -1946,6 +2309,39 @@
           <w:color w:val="1A1A1A"/>
           <w:sz w:val="21"/>
         </w:rPr>
+        <w:t xml:space="preserve">노근창  </w:t>
+      </w:r>
+      <w:r>
+        <w:rPr>
+          <w:rFonts w:ascii="맑은 고딕" w:hAnsi="맑은 고딕" w:eastAsia="맑은 고딕"/>
+          <w:b w:val="0"/>
+          <w:color w:val="1A1A1A"/>
+          <w:sz w:val="21"/>
+        </w:rPr>
+        <w:t>마이크론 EPS는 약 1년 전 3달러에서 33달러를 넘었다. 증설은 아이다호·뉴욕 HBM이고, 가속기 계획에 맞춘 주문 생산이라 소비자용처럼 빈 공장을 짓는 사이클과 다르다. 데이터센터는 2년 치를 미리 잡아야 하고, 구형 가속기 가격도 출시 때보다 비싸다.</w:t>
+      </w:r>
+    </w:p>
+    <w:p>
+      <w:pPr>
+        <w:spacing w:after="40" w:before="0" w:line="269" w:lineRule="auto"/>
+        <w:ind w:left="312" w:hanging="198"/>
+      </w:pPr>
+      <w:r>
+        <w:rPr>
+          <w:rFonts w:ascii="맑은 고딕" w:hAnsi="맑은 고딕" w:eastAsia="맑은 고딕"/>
+          <w:b w:val="0"/>
+          <w:color w:val="1E407C"/>
+          <w:sz w:val="21"/>
+        </w:rPr>
+        <w:t xml:space="preserve">• </w:t>
+      </w:r>
+      <w:r>
+        <w:rPr>
+          <w:rFonts w:ascii="맑은 고딕" w:hAnsi="맑은 고딕" w:eastAsia="맑은 고딕"/>
+          <w:b/>
+          <w:color w:val="1A1A1A"/>
+          <w:sz w:val="21"/>
+        </w:rPr>
         <w:t xml:space="preserve">신중호  </w:t>
       </w:r>
       <w:r>
@@ -1956,6 +2352,39 @@
           <w:sz w:val="21"/>
         </w:rPr>
         <w:t>메모리가 너무 비싸면 AI 확산이 막힌다. 그래서 물량을 늘리는 장비 주문이 움직인다. 엔비디아는 마진이 안정된 뒤에야 멀티플이 다시 열렸다. 삼성전자·하이닉스도 그 확인은 내년 2분기 후반까지 갈 수 있고, 그 사이 다른 업종이 힘을 가져간다.</w:t>
+      </w:r>
+    </w:p>
+    <w:p>
+      <w:pPr>
+        <w:spacing w:after="40" w:before="0" w:line="269" w:lineRule="auto"/>
+        <w:ind w:left="312" w:hanging="198"/>
+      </w:pPr>
+      <w:r>
+        <w:rPr>
+          <w:rFonts w:ascii="맑은 고딕" w:hAnsi="맑은 고딕" w:eastAsia="맑은 고딕"/>
+          <w:b w:val="0"/>
+          <w:color w:val="1E407C"/>
+          <w:sz w:val="21"/>
+        </w:rPr>
+        <w:t xml:space="preserve">• </w:t>
+      </w:r>
+      <w:r>
+        <w:rPr>
+          <w:rFonts w:ascii="맑은 고딕" w:hAnsi="맑은 고딕" w:eastAsia="맑은 고딕"/>
+          <w:b/>
+          <w:color w:val="1A1A1A"/>
+          <w:sz w:val="21"/>
+        </w:rPr>
+        <w:t xml:space="preserve">김장렬  </w:t>
+      </w:r>
+      <w:r>
+        <w:rPr>
+          <w:rFonts w:ascii="맑은 고딕" w:hAnsi="맑은 고딕" w:eastAsia="맑은 고딕"/>
+          <w:b w:val="0"/>
+          <w:color w:val="1A1A1A"/>
+          <w:sz w:val="21"/>
+        </w:rPr>
+        <w:t>7월 말 이후 약 두 달, 마이크론은 약 30%, 샌디스크는 약 35%, 하이닉스 ADR은 약 23% 올랐다. 삼성전자·하이닉스 본주는 약 3%밖에 안 올랐고 거래대금은 반 토막이다. 8~9월 AI 뉴스가 한국 대형주 가격에는 덜 들어갔다.</w:t>
       </w:r>
     </w:p>
     <w:p>
@@ -2342,16 +2771,16 @@
           <w:color w:val="1A1A1A"/>
           <w:sz w:val="21"/>
         </w:rPr>
-        <w:t xml:space="preserve">이선엽 · 녹취  </w:t>
-      </w:r>
-      <w:r>
-        <w:rPr>
-          <w:rFonts w:ascii="맑은 고딕" w:hAnsi="맑은 고딕" w:eastAsia="맑은 고딕"/>
-          <w:b w:val="0"/>
-          <w:color w:val="1A1A1A"/>
-          <w:sz w:val="21"/>
-        </w:rPr>
-        <w:t>마이크론은 고점 대비 약 13%까지 좁혀졌고, 하이닉스는 고점 대비 30% 넘게 벌어져 있다. 격차가 이 정도로 유지되기는 어렵다는 비교다.</w:t>
+        <w:t xml:space="preserve">신중호 · 김장렬  </w:t>
+      </w:r>
+      <w:r>
+        <w:rPr>
+          <w:rFonts w:ascii="맑은 고딕" w:hAnsi="맑은 고딕" w:eastAsia="맑은 고딕"/>
+          <w:b w:val="0"/>
+          <w:color w:val="1A1A1A"/>
+          <w:sz w:val="21"/>
+        </w:rPr>
+        <w:t>삼성 3분기 컨센서스는 환율 반영 후 101조~108조다. 3분기가 105조면 4분기는 120조에 못 미치게 보는 시각이 있다. 2027년 영업이익 추정은 350조~600조로 벌어져 있고, 환율 반영 직후 숫자는 520조다. 내년 하반기 가격이 15% 다음 30% 빠져 분기 이익이 60조로 내려앉는 그림은 목표주가 27만~35만 원이다. 그 급락이 1년 안에 올 확률은 20%도 안 되는데, 주가는 그 이상을 반영 중이다. 올해 약 360조가 유지되기만 해도 6~7배면 30만 원 초중반이다.</w:t>
       </w:r>
     </w:p>
     <w:p>
@@ -2375,16 +2804,16 @@
           <w:color w:val="1A1A1A"/>
           <w:sz w:val="21"/>
         </w:rPr>
-        <w:t xml:space="preserve">이지원  </w:t>
-      </w:r>
-      <w:r>
-        <w:rPr>
-          <w:rFonts w:ascii="맑은 고딕" w:hAnsi="맑은 고딕" w:eastAsia="맑은 고딕"/>
-          <w:b w:val="0"/>
-          <w:color w:val="1A1A1A"/>
-          <w:sz w:val="21"/>
-        </w:rPr>
-        <w:t>7월 29일 저점 이후 개인이 코스피에서 약 25조 원, 삼성전자 약 4,400만 주, 하이닉스 약 700만 주를 팔았다. 매도의 큰 주체는 개인이다.</w:t>
+        <w:t xml:space="preserve">이선엽 · 녹취  </w:t>
+      </w:r>
+      <w:r>
+        <w:rPr>
+          <w:rFonts w:ascii="맑은 고딕" w:hAnsi="맑은 고딕" w:eastAsia="맑은 고딕"/>
+          <w:b w:val="0"/>
+          <w:color w:val="1A1A1A"/>
+          <w:sz w:val="21"/>
+        </w:rPr>
+        <w:t>마이크론은 고점 대비 약 13%까지 좁혀졌고, 하이닉스는 고점 대비 30% 넘게 벌어져 있다. 격차가 이 정도로 유지되기는 어렵다는 비교다.</w:t>
       </w:r>
     </w:p>
     <w:p>
@@ -2417,7 +2846,7 @@
           <w:color w:val="1A1A1A"/>
           <w:sz w:val="21"/>
         </w:rPr>
-        <w:t>원·달러 1,500원대는 과거에는 외국인 장기자금의 매수 구간이었다. 이번에는 패시브 매도가 커서 그 매수가 순매수로 드러나지 않았다.</w:t>
+        <w:t>7월 29일 저점 이후 개인이 코스피에서 약 25조 원, 삼성전자 약 4,400만 주, 하이닉스 약 700만 주를 팔았다. 매도의 큰 주체는 개인이다.</w:t>
       </w:r>
     </w:p>
     <w:p>
@@ -2441,16 +2870,16 @@
           <w:color w:val="1A1A1A"/>
           <w:sz w:val="21"/>
         </w:rPr>
-        <w:t xml:space="preserve">이선엽 · 녹취  </w:t>
-      </w:r>
-      <w:r>
-        <w:rPr>
-          <w:rFonts w:ascii="맑은 고딕" w:hAnsi="맑은 고딕" w:eastAsia="맑은 고딕"/>
-          <w:b w:val="0"/>
-          <w:color w:val="1A1A1A"/>
-          <w:sz w:val="21"/>
-        </w:rPr>
-        <w:t>자사주 매수는 하락을 받아 주는 자리이지 상승 재료가 아니다. 하이닉스 자사주는 10월 15일까지이고, 매수가 끝난 뒤가 수급 시험으로 적혀 있다.</w:t>
+        <w:t xml:space="preserve">이지원  </w:t>
+      </w:r>
+      <w:r>
+        <w:rPr>
+          <w:rFonts w:ascii="맑은 고딕" w:hAnsi="맑은 고딕" w:eastAsia="맑은 고딕"/>
+          <w:b w:val="0"/>
+          <w:color w:val="1A1A1A"/>
+          <w:sz w:val="21"/>
+        </w:rPr>
+        <w:t>원·달러 1,500원대는 과거에는 외국인 장기자금의 매수 구간이었다. 이번에는 패시브 매도가 커서 그 매수가 순매수로 드러나지 않았다.</w:t>
       </w:r>
     </w:p>
     <w:p>
@@ -2483,7 +2912,7 @@
           <w:color w:val="1A1A1A"/>
           <w:sz w:val="21"/>
         </w:rPr>
-        <w:t>삼성전자의 다음 가격대는 28만 원, 그중 28만 5,000원 돌파다. 하이닉스는 190만 원 돌파다.</w:t>
+        <w:t>자사주 매수는 하락을 받아 주는 자리이지 상승 재료가 아니다. 하이닉스 자사주는 10월 15일까지이고, 매수가 끝난 뒤가 수급 시험으로 적혀 있다.</w:t>
       </w:r>
     </w:p>
     <w:p>
@@ -2507,16 +2936,16 @@
           <w:color w:val="1A1A1A"/>
           <w:sz w:val="21"/>
         </w:rPr>
-        <w:t xml:space="preserve">신중호  </w:t>
-      </w:r>
-      <w:r>
-        <w:rPr>
-          <w:rFonts w:ascii="맑은 고딕" w:hAnsi="맑은 고딕" w:eastAsia="맑은 고딕"/>
-          <w:b w:val="0"/>
-          <w:color w:val="1A1A1A"/>
-          <w:sz w:val="21"/>
-        </w:rPr>
-        <w:t>지수만 보면 작년 말 4,000대에서 7,000 근처로 왔는데 계좌는 힘들다. 상반기 급등과 거래대금 이후 가격과 거래가 줄어서다. 레버리지 상품이 없어도 2021년에는 3,000 위에서 개인 자금의 56%가, 이번엔 7,000 위에서 약 60%(120조)가 들어왔다. 비교가 센 시장 구조다.</w:t>
+        <w:t xml:space="preserve">이선엽 · 녹취  </w:t>
+      </w:r>
+      <w:r>
+        <w:rPr>
+          <w:rFonts w:ascii="맑은 고딕" w:hAnsi="맑은 고딕" w:eastAsia="맑은 고딕"/>
+          <w:b w:val="0"/>
+          <w:color w:val="1A1A1A"/>
+          <w:sz w:val="21"/>
+        </w:rPr>
+        <w:t>삼성전자의 다음 가격대는 28만 원, 그중 28만 5,000원 돌파다. 하이닉스는 190만 원 돌파다.</w:t>
       </w:r>
     </w:p>
     <w:p>
@@ -4072,16 +4501,16 @@
           <w:color w:val="1A1A1A"/>
           <w:sz w:val="21"/>
         </w:rPr>
-        <w:t xml:space="preserve">목대균·이경규  </w:t>
-      </w:r>
-      <w:r>
-        <w:rPr>
-          <w:rFonts w:ascii="맑은 고딕" w:hAnsi="맑은 고딕" w:eastAsia="맑은 고딕"/>
-          <w:b w:val="0"/>
-          <w:color w:val="1A1A1A"/>
-          <w:sz w:val="21"/>
-        </w:rPr>
-        <w:t>기관은 메모리에서 싼 장비로 바스켓을 옮기고 ETF 자금도 장비를 산다. 전공정 발주는 내년 상반기, 수주 신호는 올해 하반기다. 마이크론은 공장 완공과 장비 반입을 당긴다. 중국 장비 국산화가 높아져 한국 장비사는 삼성·하이닉스 발주에 더 민감하다.</w:t>
+        <w:t xml:space="preserve">김장렬  </w:t>
+      </w:r>
+      <w:r>
+        <w:rPr>
+          <w:rFonts w:ascii="맑은 고딕" w:hAnsi="맑은 고딕" w:eastAsia="맑은 고딕"/>
+          <w:b w:val="0"/>
+          <w:color w:val="1A1A1A"/>
+          <w:sz w:val="21"/>
+        </w:rPr>
+        <w:t>휴대폰 MLCC는 대당 약 1,000개, 개당 1~2원, 시장 약 2조 원이다. 자동차는 대당 약 1만 개에 가격이 훨씬 높아 시장 약 27조 원이다. AI 서버는 150만 대에 대당 약 3만 개, 개당 약 200원이면 약 9조 원이고 성장률은 약 30%다. GPU 옆에는 최대 4만 개까지 거론된다.</w:t>
       </w:r>
     </w:p>
     <w:p>
@@ -4105,16 +4534,16 @@
           <w:color w:val="1A1A1A"/>
           <w:sz w:val="21"/>
         </w:rPr>
-        <w:t xml:space="preserve">이지원  </w:t>
-      </w:r>
-      <w:r>
-        <w:rPr>
-          <w:rFonts w:ascii="맑은 고딕" w:hAnsi="맑은 고딕" w:eastAsia="맑은 고딕"/>
-          <w:b w:val="0"/>
-          <w:color w:val="1A1A1A"/>
-          <w:sz w:val="21"/>
-        </w:rPr>
-        <w:t>환율이 대형주 이익에 주는 민감도는 과거보다 줄었다. 삼성 영업이익 규모가 커져, 환율로 깎이는 금액이 전체에서 차지하는 비중이 작아졌다는 계산이다. 소부장은 헤지와 해외 생산이 약해 여전히 민감하다.</w:t>
+        <w:t xml:space="preserve">목대균·이경규  </w:t>
+      </w:r>
+      <w:r>
+        <w:rPr>
+          <w:rFonts w:ascii="맑은 고딕" w:hAnsi="맑은 고딕" w:eastAsia="맑은 고딕"/>
+          <w:b w:val="0"/>
+          <w:color w:val="1A1A1A"/>
+          <w:sz w:val="21"/>
+        </w:rPr>
+        <w:t>기관은 메모리에서 싼 장비로 바스켓을 옮기고 ETF 자금도 장비를 산다. 전공정 발주는 내년 상반기, 수주 신호는 올해 하반기다. 마이크론은 공장 완공과 장비 반입을 당긴다. 중국 장비 국산화가 높아져 한국 장비사는 삼성·하이닉스 발주에 더 민감하다.</w:t>
       </w:r>
     </w:p>
     <w:p>
@@ -4138,16 +4567,16 @@
           <w:color w:val="1A1A1A"/>
           <w:sz w:val="21"/>
         </w:rPr>
-        <w:t xml:space="preserve">목대균·이경규  </w:t>
-      </w:r>
-      <w:r>
-        <w:rPr>
-          <w:rFonts w:ascii="맑은 고딕" w:hAnsi="맑은 고딕" w:eastAsia="맑은 고딕"/>
-          <w:b w:val="0"/>
-          <w:color w:val="1A1A1A"/>
-          <w:sz w:val="21"/>
-        </w:rPr>
-        <w:t>기판과 MLCC는 여전히 병목이다. 기관이 메모리 다음으로 보는 쪽이다.</w:t>
+        <w:t xml:space="preserve">김장렬  </w:t>
+      </w:r>
+      <w:r>
+        <w:rPr>
+          <w:rFonts w:ascii="맑은 고딕" w:hAnsi="맑은 고딕" w:eastAsia="맑은 고딕"/>
+          <w:b w:val="0"/>
+          <w:color w:val="1A1A1A"/>
+          <w:sz w:val="21"/>
+        </w:rPr>
+        <w:t>MLCC 1위는 무라타, 2위는 삼성전기다. 기판 1위는 이비덴, 2위는 삼성전기다. 둘을 같이 가진 곳은 삼성전기뿐이다. 기판 안에 전원 안정 설계를 넣는 그림은 2027년 하반기에서 2028년이다. 그 전에는 가벼운 기판 종목이 먼저 움직인다.</w:t>
       </w:r>
     </w:p>
     <w:p>
@@ -4171,16 +4600,16 @@
           <w:color w:val="1A1A1A"/>
           <w:sz w:val="21"/>
         </w:rPr>
-        <w:t xml:space="preserve">퀵코멘트  </w:t>
-      </w:r>
-      <w:r>
-        <w:rPr>
-          <w:rFonts w:ascii="맑은 고딕" w:hAnsi="맑은 고딕" w:eastAsia="맑은 고딕"/>
-          <w:b w:val="0"/>
-          <w:color w:val="1A1A1A"/>
-          <w:sz w:val="21"/>
-        </w:rPr>
-        <w:t>국내 투자 관점에서는 이 두 건을 삼성전기,코리아써키트,대덕전자·심텍 등 AI 기판/패키징 밸류체인의 장기 수요 가시성을 점검하는 근거로 보는 것이 핵심입니다.</w:t>
+        <w:t xml:space="preserve">김장렬  </w:t>
+      </w:r>
+      <w:r>
+        <w:rPr>
+          <w:rFonts w:ascii="맑은 고딕" w:hAnsi="맑은 고딕" w:eastAsia="맑은 고딕"/>
+          <w:b w:val="0"/>
+          <w:color w:val="1A1A1A"/>
+          <w:sz w:val="21"/>
+        </w:rPr>
+        <w:t>발표된 투자 6조 8,000억 원은 시작이다. 시장은 12조~15조 원까지 본다. 돈은 대부분 기판에 가고, 기판은 감가상각 때문에 초기 수익성이 무겁다. MLCC는 투자금이 적어 마진이 20%를 넘기 쉽다. 기판 발주는 선수금이 약 70%다.</w:t>
       </w:r>
     </w:p>
     <w:p>
@@ -4204,16 +4633,16 @@
           <w:color w:val="1A1A1A"/>
           <w:sz w:val="21"/>
         </w:rPr>
-        <w:t xml:space="preserve">윤지호  </w:t>
-      </w:r>
-      <w:r>
-        <w:rPr>
-          <w:rFonts w:ascii="맑은 고딕" w:hAnsi="맑은 고딕" w:eastAsia="맑은 고딕"/>
-          <w:b w:val="0"/>
-          <w:color w:val="1A1A1A"/>
-          <w:sz w:val="21"/>
-        </w:rPr>
-        <w:t>그래서 대형 메모리 비중을 줄이고 소부장·장비를 본다. 장비는 현재 배수만 보면 비싸도, 숫자가 2028년으로 넘어가면 배수가 내려오는 자리다.</w:t>
+        <w:t xml:space="preserve">김장렬  </w:t>
+      </w:r>
+      <w:r>
+        <w:rPr>
+          <w:rFonts w:ascii="맑은 고딕" w:hAnsi="맑은 고딕" w:eastAsia="맑은 고딕"/>
+          <w:b w:val="0"/>
+          <w:color w:val="1A1A1A"/>
+          <w:sz w:val="21"/>
+        </w:rPr>
+        <w:t>삼성전기 투자 발표는 재료 소멸이 아니다. 내년 이익을 한 단계 더 올린 뒤 30배에서 40배면 200만 원 초중반이다. 300만 원은 그 이후 실적을 당겨야 나오는 숫자라 아직 이르다. 스트리트 목표는 250만 원대가 많다.</w:t>
       </w:r>
     </w:p>
     <w:p>
@@ -4237,6 +4666,204 @@
           <w:color w:val="1A1A1A"/>
           <w:sz w:val="21"/>
         </w:rPr>
+        <w:t xml:space="preserve">김장렬  </w:t>
+      </w:r>
+      <w:r>
+        <w:rPr>
+          <w:rFonts w:ascii="맑은 고딕" w:hAnsi="맑은 고딕" w:eastAsia="맑은 고딕"/>
+          <w:b w:val="0"/>
+          <w:color w:val="1A1A1A"/>
+          <w:sz w:val="21"/>
+        </w:rPr>
+        <w:t>삼성전기 매출의 약 절반은 MLCC이고 이익의 중심이다. 마진은 10% 후반에서 20% 위로 향한다. 카메라 모듈 마진은 약 3.2%라 매출은 커도 이익이 아니다. 기판 마진은 10% 초중반까지 올라왔다.</w:t>
+      </w:r>
+    </w:p>
+    <w:p>
+      <w:pPr>
+        <w:spacing w:after="40" w:before="0" w:line="269" w:lineRule="auto"/>
+        <w:ind w:left="312" w:hanging="198"/>
+      </w:pPr>
+      <w:r>
+        <w:rPr>
+          <w:rFonts w:ascii="맑은 고딕" w:hAnsi="맑은 고딕" w:eastAsia="맑은 고딕"/>
+          <w:b w:val="0"/>
+          <w:color w:val="1E407C"/>
+          <w:sz w:val="21"/>
+        </w:rPr>
+        <w:t xml:space="preserve">• </w:t>
+      </w:r>
+      <w:r>
+        <w:rPr>
+          <w:rFonts w:ascii="맑은 고딕" w:hAnsi="맑은 고딕" w:eastAsia="맑은 고딕"/>
+          <w:b/>
+          <w:color w:val="1A1A1A"/>
+          <w:sz w:val="21"/>
+        </w:rPr>
+        <w:t xml:space="preserve">이지원  </w:t>
+      </w:r>
+      <w:r>
+        <w:rPr>
+          <w:rFonts w:ascii="맑은 고딕" w:hAnsi="맑은 고딕" w:eastAsia="맑은 고딕"/>
+          <w:b w:val="0"/>
+          <w:color w:val="1A1A1A"/>
+          <w:sz w:val="21"/>
+        </w:rPr>
+        <w:t>환율이 대형주 이익에 주는 민감도는 과거보다 줄었다. 삼성 영업이익 규모가 커져, 환율로 깎이는 금액이 전체에서 차지하는 비중이 작아졌다는 계산이다. 소부장은 헤지와 해외 생산이 약해 여전히 민감하다.</w:t>
+      </w:r>
+    </w:p>
+    <w:p>
+      <w:pPr>
+        <w:spacing w:after="40" w:before="0" w:line="269" w:lineRule="auto"/>
+        <w:ind w:left="312" w:hanging="198"/>
+      </w:pPr>
+      <w:r>
+        <w:rPr>
+          <w:rFonts w:ascii="맑은 고딕" w:hAnsi="맑은 고딕" w:eastAsia="맑은 고딕"/>
+          <w:b w:val="0"/>
+          <w:color w:val="1E407C"/>
+          <w:sz w:val="21"/>
+        </w:rPr>
+        <w:t xml:space="preserve">• </w:t>
+      </w:r>
+      <w:r>
+        <w:rPr>
+          <w:rFonts w:ascii="맑은 고딕" w:hAnsi="맑은 고딕" w:eastAsia="맑은 고딕"/>
+          <w:b/>
+          <w:color w:val="1A1A1A"/>
+          <w:sz w:val="21"/>
+        </w:rPr>
+        <w:t xml:space="preserve">김장렬  </w:t>
+      </w:r>
+      <w:r>
+        <w:rPr>
+          <w:rFonts w:ascii="맑은 고딕" w:hAnsi="맑은 고딕" w:eastAsia="맑은 고딕"/>
+          <w:b w:val="0"/>
+          <w:color w:val="1A1A1A"/>
+          <w:sz w:val="21"/>
+        </w:rPr>
+        <w:t>MLCC 리드타임은 20~30주, 내년 상반기까지 부족하고 2028년 초까지 괜찮다는 얘기도 있다. 기판은 48~56주, 약 1년이다. MLCC 부족은 디램보다 심하고, 기판은 그보다 더 심하다.</w:t>
+      </w:r>
+    </w:p>
+    <w:p>
+      <w:pPr>
+        <w:spacing w:after="40" w:before="0" w:line="269" w:lineRule="auto"/>
+        <w:ind w:left="312" w:hanging="198"/>
+      </w:pPr>
+      <w:r>
+        <w:rPr>
+          <w:rFonts w:ascii="맑은 고딕" w:hAnsi="맑은 고딕" w:eastAsia="맑은 고딕"/>
+          <w:b w:val="0"/>
+          <w:color w:val="1E407C"/>
+          <w:sz w:val="21"/>
+        </w:rPr>
+        <w:t xml:space="preserve">• </w:t>
+      </w:r>
+      <w:r>
+        <w:rPr>
+          <w:rFonts w:ascii="맑은 고딕" w:hAnsi="맑은 고딕" w:eastAsia="맑은 고딕"/>
+          <w:b/>
+          <w:color w:val="1A1A1A"/>
+          <w:sz w:val="21"/>
+        </w:rPr>
+        <w:t xml:space="preserve">김장렬  </w:t>
+      </w:r>
+      <w:r>
+        <w:rPr>
+          <w:rFonts w:ascii="맑은 고딕" w:hAnsi="맑은 고딕" w:eastAsia="맑은 고딕"/>
+          <w:b w:val="0"/>
+          <w:color w:val="1A1A1A"/>
+          <w:sz w:val="21"/>
+        </w:rPr>
+        <w:t>전송 속도가 두 배가 되면 MLCC 개수는 두 배가 아니라 3배에서 5배로 늘어난다는 최근 추정이다. 전압 모듈과 네트워크 칩에도 따로 수천~1만 개가 붙을 수 있다.</w:t>
+      </w:r>
+    </w:p>
+    <w:p>
+      <w:pPr>
+        <w:spacing w:after="40" w:before="0" w:line="269" w:lineRule="auto"/>
+        <w:ind w:left="312" w:hanging="198"/>
+      </w:pPr>
+      <w:r>
+        <w:rPr>
+          <w:rFonts w:ascii="맑은 고딕" w:hAnsi="맑은 고딕" w:eastAsia="맑은 고딕"/>
+          <w:b w:val="0"/>
+          <w:color w:val="1E407C"/>
+          <w:sz w:val="21"/>
+        </w:rPr>
+        <w:t xml:space="preserve">• </w:t>
+      </w:r>
+      <w:r>
+        <w:rPr>
+          <w:rFonts w:ascii="맑은 고딕" w:hAnsi="맑은 고딕" w:eastAsia="맑은 고딕"/>
+          <w:b/>
+          <w:color w:val="1A1A1A"/>
+          <w:sz w:val="21"/>
+        </w:rPr>
+        <w:t xml:space="preserve">전략 이사  </w:t>
+      </w:r>
+      <w:r>
+        <w:rPr>
+          <w:rFonts w:ascii="맑은 고딕" w:hAnsi="맑은 고딕" w:eastAsia="맑은 고딕"/>
+          <w:b w:val="0"/>
+          <w:color w:val="1A1A1A"/>
+          <w:sz w:val="21"/>
+        </w:rPr>
+        <w:t>하우스 포트는 10월에 반도체와 소부장을 같이 오버웨이트했다. 반도체는 실적, 장비는 증설이다.</w:t>
+      </w:r>
+    </w:p>
+    <w:p>
+      <w:pPr>
+        <w:spacing w:after="40" w:before="0" w:line="269" w:lineRule="auto"/>
+        <w:ind w:left="312" w:hanging="198"/>
+      </w:pPr>
+      <w:r>
+        <w:rPr>
+          <w:rFonts w:ascii="맑은 고딕" w:hAnsi="맑은 고딕" w:eastAsia="맑은 고딕"/>
+          <w:b w:val="0"/>
+          <w:color w:val="1E407C"/>
+          <w:sz w:val="21"/>
+        </w:rPr>
+        <w:t xml:space="preserve">• </w:t>
+      </w:r>
+      <w:r>
+        <w:rPr>
+          <w:rFonts w:ascii="맑은 고딕" w:hAnsi="맑은 고딕" w:eastAsia="맑은 고딕"/>
+          <w:b/>
+          <w:color w:val="1A1A1A"/>
+          <w:sz w:val="21"/>
+        </w:rPr>
+        <w:t xml:space="preserve">목대균·이경규  </w:t>
+      </w:r>
+      <w:r>
+        <w:rPr>
+          <w:rFonts w:ascii="맑은 고딕" w:hAnsi="맑은 고딕" w:eastAsia="맑은 고딕"/>
+          <w:b w:val="0"/>
+          <w:color w:val="1A1A1A"/>
+          <w:sz w:val="21"/>
+        </w:rPr>
+        <w:t>기판과 MLCC는 여전히 병목이다. 기관이 메모리 다음으로 보는 쪽이다.</w:t>
+      </w:r>
+    </w:p>
+    <w:p>
+      <w:pPr>
+        <w:spacing w:after="40" w:before="0" w:line="269" w:lineRule="auto"/>
+        <w:ind w:left="312" w:hanging="198"/>
+      </w:pPr>
+      <w:r>
+        <w:rPr>
+          <w:rFonts w:ascii="맑은 고딕" w:hAnsi="맑은 고딕" w:eastAsia="맑은 고딕"/>
+          <w:b w:val="0"/>
+          <w:color w:val="1E407C"/>
+          <w:sz w:val="21"/>
+        </w:rPr>
+        <w:t xml:space="preserve">• </w:t>
+      </w:r>
+      <w:r>
+        <w:rPr>
+          <w:rFonts w:ascii="맑은 고딕" w:hAnsi="맑은 고딕" w:eastAsia="맑은 고딕"/>
+          <w:b/>
+          <w:color w:val="1A1A1A"/>
+          <w:sz w:val="21"/>
+        </w:rPr>
         <w:t xml:space="preserve">퀵코멘트  </w:t>
       </w:r>
       <w:r>
@@ -4246,7 +4873,7 @@
           <w:color w:val="1A1A1A"/>
           <w:sz w:val="21"/>
         </w:rPr>
-        <w:t>따라서 ABF 기판·FC-BGA·패키징·관련 장비 업체의 중장기 캐파 투자 사이클이 연장될 가능성을 보여주는 사례다.</w:t>
+        <w:t>국내 투자 관점에서는 이 두 건을 삼성전기,코리아써키트,대덕전자·심텍 등 AI 기판/패키징 밸류체인의 장기 수요 가시성을 점검하는 근거로 보는 것이 핵심입니다.</w:t>
       </w:r>
     </w:p>
     <w:p>
@@ -5656,6 +6283,39 @@
           <w:color w:val="1A1A1A"/>
           <w:sz w:val="21"/>
         </w:rPr>
+        <w:t xml:space="preserve">김장렬  </w:t>
+      </w:r>
+      <w:r>
+        <w:rPr>
+          <w:rFonts w:ascii="맑은 고딕" w:hAnsi="맑은 고딕" w:eastAsia="맑은 고딕"/>
+          <w:b w:val="0"/>
+          <w:color w:val="1A1A1A"/>
+          <w:sz w:val="21"/>
+        </w:rPr>
+        <w:t>설비투자를 늦추는 명분은 금리 숫자 자체가 아니라 토큰 수요가 생산성으로 안 이어질 때다. 가격이 80~90% 빠져도 사용량이 열 배 이상이면 매출은 유지된다. 2009년 8위 디램 업체도 100% 적자를 2년 버티고 나서 무너졌다.</w:t>
+      </w:r>
+    </w:p>
+    <w:p>
+      <w:pPr>
+        <w:spacing w:after="40" w:before="0" w:line="269" w:lineRule="auto"/>
+        <w:ind w:left="312" w:hanging="198"/>
+      </w:pPr>
+      <w:r>
+        <w:rPr>
+          <w:rFonts w:ascii="맑은 고딕" w:hAnsi="맑은 고딕" w:eastAsia="맑은 고딕"/>
+          <w:b w:val="0"/>
+          <w:color w:val="1E407C"/>
+          <w:sz w:val="21"/>
+        </w:rPr>
+        <w:t xml:space="preserve">• </w:t>
+      </w:r>
+      <w:r>
+        <w:rPr>
+          <w:rFonts w:ascii="맑은 고딕" w:hAnsi="맑은 고딕" w:eastAsia="맑은 고딕"/>
+          <w:b/>
+          <w:color w:val="1A1A1A"/>
+          <w:sz w:val="21"/>
+        </w:rPr>
         <w:t xml:space="preserve">노근창  </w:t>
       </w:r>
       <w:r>
@@ -6458,6 +7118,72 @@
           <w:sz w:val="22"/>
         </w:rPr>
         <w:t>경력자 포트는 AI 50~60%(삼전·닉스 30~40%, 소부장 20%), 2차전지 10%, 건설·조선 10%, 현금 20%다. 매매 시간이 적으면 현금 30%다.</w:t>
+      </w:r>
+    </w:p>
+    <w:p>
+      <w:pPr>
+        <w:spacing w:after="40" w:before="0" w:line="269" w:lineRule="auto"/>
+        <w:ind w:left="312" w:hanging="198"/>
+      </w:pPr>
+      <w:r>
+        <w:rPr>
+          <w:rFonts w:ascii="맑은 고딕" w:hAnsi="맑은 고딕" w:eastAsia="맑은 고딕"/>
+          <w:b w:val="0"/>
+          <w:color w:val="1E407C"/>
+          <w:sz w:val="21"/>
+        </w:rPr>
+        <w:t xml:space="preserve">• </w:t>
+      </w:r>
+      <w:r>
+        <w:rPr>
+          <w:rFonts w:ascii="맑은 고딕" w:hAnsi="맑은 고딕" w:eastAsia="맑은 고딕"/>
+          <w:b/>
+          <w:color w:val="1A1A1A"/>
+          <w:sz w:val="21"/>
+        </w:rPr>
+        <w:t xml:space="preserve">박정호  </w:t>
+      </w:r>
+      <w:r>
+        <w:rPr>
+          <w:rFonts w:ascii="맑은 고딕" w:hAnsi="맑은 고딕" w:eastAsia="맑은 고딕"/>
+          <w:b w:val="0"/>
+          <w:color w:val="1A1A1A"/>
+          <w:sz w:val="21"/>
+        </w:rPr>
+        <w:t>노르웨이 국부펀드는 국채 비중을 70에서 50%로 낮추고 주식을 포함한 다른 자산을 늘리라는 권고가 나왔다. 일본 공적기금은 자국 국채를 늘리고 해외 채권을 줄이며 미국 주식을 늘리는 쪽이다. 늘어날 주식은 종목 베팅보다 기술 지수 추종이 약 80%, 에너지가 약 20%다.</w:t>
+      </w:r>
+    </w:p>
+    <w:p>
+      <w:pPr>
+        <w:spacing w:after="40" w:before="0" w:line="269" w:lineRule="auto"/>
+        <w:ind w:left="312" w:hanging="198"/>
+      </w:pPr>
+      <w:r>
+        <w:rPr>
+          <w:rFonts w:ascii="맑은 고딕" w:hAnsi="맑은 고딕" w:eastAsia="맑은 고딕"/>
+          <w:b w:val="0"/>
+          <w:color w:val="1E407C"/>
+          <w:sz w:val="21"/>
+        </w:rPr>
+        <w:t xml:space="preserve">• </w:t>
+      </w:r>
+      <w:r>
+        <w:rPr>
+          <w:rFonts w:ascii="맑은 고딕" w:hAnsi="맑은 고딕" w:eastAsia="맑은 고딕"/>
+          <w:b/>
+          <w:color w:val="1A1A1A"/>
+          <w:sz w:val="21"/>
+        </w:rPr>
+        <w:t xml:space="preserve">박정호  </w:t>
+      </w:r>
+      <w:r>
+        <w:rPr>
+          <w:rFonts w:ascii="맑은 고딕" w:hAnsi="맑은 고딕" w:eastAsia="맑은 고딕"/>
+          <w:b w:val="0"/>
+          <w:color w:val="1A1A1A"/>
+          <w:sz w:val="21"/>
+        </w:rPr>
+        <w:t>민간 자금은 AI로 몰린다. 2024년 약 3,000억 달러, 올해 상반기만 4,500억 달러를 넘었다. 국부 펀드와 공공자금은 미국 주식·국채 비중이 한도를 넘겨 오히려 줄였다. 한도 재설정은 연간 계획 때라, 내년 공공자금은 AI 비중을 다시 올릴 수 있다.</w:t>
       </w:r>
     </w:p>
     <w:p>

</xml_diff>

<commit_message>
Add a verified core section to the distilled note.
Each line is copied from a bullet already extracted from the source, and the test fails if any core anchor is missing.

Co-authored-by: choijunh-cloud <choijunh-cloud@users.noreply.github.com>
</commit_message>
<xml_diff>
--- a/lectures/투자인사이트 증류.docx
+++ b/lectures/투자인사이트 증류.docx
@@ -148,6 +148,954 @@
           <w:sz w:val="20"/>
         </w:rPr>
         <w:t>퀵코멘트와 방송 대담을 한 노트로 합쳤다. 같은 논지는 한 번만 남기고 출처를 붙인다.</w:t>
+      </w:r>
+    </w:p>
+    <w:p>
+      <w:pPr>
+        <w:spacing w:before="240" w:after="120" w:line="276" w:lineRule="auto"/>
+        <w:jc w:val="left"/>
+        <w:pBdr>
+          <w:bottom w:val="single" w:sz="12" w:space="3" w:color="0F2043"/>
+        </w:pBdr>
+      </w:pPr>
+      <w:r>
+        <w:rPr>
+          <w:rFonts w:ascii="맑은 고딕" w:hAnsi="맑은 고딕" w:eastAsia="맑은 고딕"/>
+          <w:b/>
+          <w:color w:val="0F2043"/>
+          <w:sz w:val="32"/>
+        </w:rPr>
+        <w:t>핵심</w:t>
+      </w:r>
+    </w:p>
+    <w:p>
+      <w:pPr>
+        <w:spacing w:before="0" w:after="80" w:line="276" w:lineRule="auto"/>
+        <w:jc w:val="left"/>
+      </w:pPr>
+      <w:r>
+        <w:rPr>
+          <w:rFonts w:ascii="맑은 고딕" w:hAnsi="맑은 고딕" w:eastAsia="맑은 고딕"/>
+          <w:b w:val="0"/>
+          <w:color w:val="4B5563"/>
+          <w:sz w:val="20"/>
+        </w:rPr>
+        <w:t>증류 노트에 이미 있는 문장만 다시 골랐다.</w:t>
+      </w:r>
+    </w:p>
+    <w:p>
+      <w:pPr>
+        <w:spacing w:before="0" w:after="120" w:line="276" w:lineRule="auto"/>
+        <w:jc w:val="left"/>
+      </w:pPr>
+      <w:r>
+        <w:rPr>
+          <w:rFonts w:ascii="맑은 고딕" w:hAnsi="맑은 고딕" w:eastAsia="맑은 고딕"/>
+          <w:b w:val="0"/>
+          <w:color w:val="1A1A1A"/>
+          <w:sz w:val="22"/>
+        </w:rPr>
+        <w:t>현재 가격 기준 SK하이닉스 184.2만 원 · PER 4.1배 · 영업이익 392조 · EPS 444K / 삼성전자 27.6만 원 · PER 4.1배 · 영업이익 555조 · EPS 67.9K / 마이크론 1074.89달러 · CY27 EPS 180달러 · PER 6.0배 / 샌디스크 1719.99달러 · FY27 EPS 230달러 · PER 7.5배 / 하이닉스 ADR 195.13달러 = 263만 원 · PER 5.9배 · 본주 대비 44% 프리미엄</w:t>
+      </w:r>
+    </w:p>
+    <w:p>
+      <w:pPr>
+        <w:spacing w:before="160" w:after="60" w:line="276" w:lineRule="auto"/>
+        <w:jc w:val="left"/>
+      </w:pPr>
+      <w:r>
+        <w:rPr>
+          <w:rFonts w:ascii="맑은 고딕" w:hAnsi="맑은 고딕" w:eastAsia="맑은 고딕"/>
+          <w:b/>
+          <w:color w:val="1E407C"/>
+          <w:sz w:val="26"/>
+        </w:rPr>
+        <w:t>판단</w:t>
+      </w:r>
+    </w:p>
+    <w:p>
+      <w:pPr>
+        <w:spacing w:after="40" w:before="0" w:line="269" w:lineRule="auto"/>
+        <w:ind w:left="312" w:hanging="198"/>
+      </w:pPr>
+      <w:r>
+        <w:rPr>
+          <w:rFonts w:ascii="맑은 고딕" w:hAnsi="맑은 고딕" w:eastAsia="맑은 고딕"/>
+          <w:b w:val="0"/>
+          <w:color w:val="1E407C"/>
+          <w:sz w:val="21"/>
+        </w:rPr>
+        <w:t xml:space="preserve">• </w:t>
+      </w:r>
+      <w:r>
+        <w:rPr>
+          <w:rFonts w:ascii="맑은 고딕" w:hAnsi="맑은 고딕" w:eastAsia="맑은 고딕"/>
+          <w:b/>
+          <w:color w:val="1A1A1A"/>
+          <w:sz w:val="21"/>
+        </w:rPr>
+        <w:t xml:space="preserve">전략 이사  </w:t>
+      </w:r>
+      <w:r>
+        <w:rPr>
+          <w:rFonts w:ascii="맑은 고딕" w:hAnsi="맑은 고딕" w:eastAsia="맑은 고딕"/>
+          <w:b w:val="0"/>
+          <w:color w:val="1A1A1A"/>
+          <w:sz w:val="21"/>
+        </w:rPr>
+        <w:t>미국 10년물 5.3%는 최근 3~4년 고점이다. 버블이 무너지려면 금리 신고가와, 다시는 내려오지 않는다는 믿음이 같이 필요하다. 5% 중반에 닿았다가 4%대로 돌아오면 채권과 주식이 같이 오른다.</w:t>
+      </w:r>
+    </w:p>
+    <w:p>
+      <w:pPr>
+        <w:spacing w:after="40" w:before="0" w:line="269" w:lineRule="auto"/>
+        <w:ind w:left="312" w:hanging="198"/>
+      </w:pPr>
+      <w:r>
+        <w:rPr>
+          <w:rFonts w:ascii="맑은 고딕" w:hAnsi="맑은 고딕" w:eastAsia="맑은 고딕"/>
+          <w:b w:val="0"/>
+          <w:color w:val="1E407C"/>
+          <w:sz w:val="21"/>
+        </w:rPr>
+        <w:t xml:space="preserve">• </w:t>
+      </w:r>
+      <w:r>
+        <w:rPr>
+          <w:rFonts w:ascii="맑은 고딕" w:hAnsi="맑은 고딕" w:eastAsia="맑은 고딕"/>
+          <w:b/>
+          <w:color w:val="1A1A1A"/>
+          <w:sz w:val="21"/>
+        </w:rPr>
+        <w:t xml:space="preserve">전략 이사  </w:t>
+      </w:r>
+      <w:r>
+        <w:rPr>
+          <w:rFonts w:ascii="맑은 고딕" w:hAnsi="맑은 고딕" w:eastAsia="맑은 고딕"/>
+          <w:b w:val="0"/>
+          <w:color w:val="1A1A1A"/>
+          <w:sz w:val="21"/>
+        </w:rPr>
+        <w:t>기관 컨센서스는 물가가 4분기까지 높고, 내년 1분기 3.1%, 2분기 2%로 본다. 그 믿음이 있는 동안 주가는 버틴다. 2%로 가는 신호가 보이면 주가는 크게 열릴 수 있다.</w:t>
+      </w:r>
+    </w:p>
+    <w:p>
+      <w:pPr>
+        <w:spacing w:after="40" w:before="0" w:line="269" w:lineRule="auto"/>
+        <w:ind w:left="312" w:hanging="198"/>
+      </w:pPr>
+      <w:r>
+        <w:rPr>
+          <w:rFonts w:ascii="맑은 고딕" w:hAnsi="맑은 고딕" w:eastAsia="맑은 고딕"/>
+          <w:b w:val="0"/>
+          <w:color w:val="1E407C"/>
+          <w:sz w:val="21"/>
+        </w:rPr>
+        <w:t xml:space="preserve">• </w:t>
+      </w:r>
+      <w:r>
+        <w:rPr>
+          <w:rFonts w:ascii="맑은 고딕" w:hAnsi="맑은 고딕" w:eastAsia="맑은 고딕"/>
+          <w:b/>
+          <w:color w:val="1A1A1A"/>
+          <w:sz w:val="21"/>
+        </w:rPr>
+        <w:t xml:space="preserve">전략 이사  </w:t>
+      </w:r>
+      <w:r>
+        <w:rPr>
+          <w:rFonts w:ascii="맑은 고딕" w:hAnsi="맑은 고딕" w:eastAsia="맑은 고딕"/>
+          <w:b w:val="0"/>
+          <w:color w:val="1A1A1A"/>
+          <w:sz w:val="21"/>
+        </w:rPr>
+        <w:t>ISM 제조업 지수는 수정이 없고 주가가 들어가지 않으며 매월 가장 빨리 나온다. 지금 약 55이고, 다른 제조업 설문은 강해서 다음 달도 오를 수 있다. 60 근처는 경기가 좋은 만큼 물가도 따라오는 자리다. 꺾이기 전까지는 보유가 단순한 전략이다.</w:t>
+      </w:r>
+    </w:p>
+    <w:p>
+      <w:pPr>
+        <w:spacing w:after="40" w:before="0" w:line="269" w:lineRule="auto"/>
+        <w:ind w:left="312" w:hanging="198"/>
+      </w:pPr>
+      <w:r>
+        <w:rPr>
+          <w:rFonts w:ascii="맑은 고딕" w:hAnsi="맑은 고딕" w:eastAsia="맑은 고딕"/>
+          <w:b w:val="0"/>
+          <w:color w:val="1E407C"/>
+          <w:sz w:val="21"/>
+        </w:rPr>
+        <w:t xml:space="preserve">• </w:t>
+      </w:r>
+      <w:r>
+        <w:rPr>
+          <w:rFonts w:ascii="맑은 고딕" w:hAnsi="맑은 고딕" w:eastAsia="맑은 고딕"/>
+          <w:b/>
+          <w:color w:val="1A1A1A"/>
+          <w:sz w:val="21"/>
+        </w:rPr>
+        <w:t xml:space="preserve">전략 이사  </w:t>
+      </w:r>
+      <w:r>
+        <w:rPr>
+          <w:rFonts w:ascii="맑은 고딕" w:hAnsi="맑은 고딕" w:eastAsia="맑은 고딕"/>
+          <w:b w:val="0"/>
+          <w:color w:val="1A1A1A"/>
+          <w:sz w:val="21"/>
+        </w:rPr>
+        <w:t>최근 40년 저물가에서는 경기와 물가가 같이 갔다. 1960~80년대 고물가에서는 물가가 꺾인 뒤 경기가 살아났다. 2021년 이후는 후자에 가깝고, 1~2% 물가로 완전히 돌아가기는 어렵다는 판단이다. 고물가 국면에서는 물가 고점에 사고, 물가가 바닥을 찍고 오르기 시작하면 줄인다.</w:t>
+      </w:r>
+    </w:p>
+    <w:p>
+      <w:pPr>
+        <w:spacing w:after="40" w:before="0" w:line="269" w:lineRule="auto"/>
+        <w:ind w:left="312" w:hanging="198"/>
+      </w:pPr>
+      <w:r>
+        <w:rPr>
+          <w:rFonts w:ascii="맑은 고딕" w:hAnsi="맑은 고딕" w:eastAsia="맑은 고딕"/>
+          <w:b w:val="0"/>
+          <w:color w:val="1E407C"/>
+          <w:sz w:val="21"/>
+        </w:rPr>
+        <w:t xml:space="preserve">• </w:t>
+      </w:r>
+      <w:r>
+        <w:rPr>
+          <w:rFonts w:ascii="맑은 고딕" w:hAnsi="맑은 고딕" w:eastAsia="맑은 고딕"/>
+          <w:b/>
+          <w:color w:val="1A1A1A"/>
+          <w:sz w:val="21"/>
+        </w:rPr>
+        <w:t xml:space="preserve">전략 이사  </w:t>
+      </w:r>
+      <w:r>
+        <w:rPr>
+          <w:rFonts w:ascii="맑은 고딕" w:hAnsi="맑은 고딕" w:eastAsia="맑은 고딕"/>
+          <w:b w:val="0"/>
+          <w:color w:val="1A1A1A"/>
+          <w:sz w:val="21"/>
+        </w:rPr>
+        <w:t>원유보다 디젤이 안 빠진다. 정제 수출의 약 22%가 호르무즈에 묶여 있다. 해협이 열리고 중국·미국 정제가 다시 돌면 물가 고점 신호가 된다.</w:t>
+      </w:r>
+    </w:p>
+    <w:p>
+      <w:pPr>
+        <w:spacing w:before="160" w:after="60" w:line="276" w:lineRule="auto"/>
+        <w:jc w:val="left"/>
+      </w:pPr>
+      <w:r>
+        <w:rPr>
+          <w:rFonts w:ascii="맑은 고딕" w:hAnsi="맑은 고딕" w:eastAsia="맑은 고딕"/>
+          <w:b/>
+          <w:color w:val="1E407C"/>
+          <w:sz w:val="26"/>
+        </w:rPr>
+        <w:t>메모리</w:t>
+      </w:r>
+    </w:p>
+    <w:p>
+      <w:pPr>
+        <w:spacing w:after="40" w:before="0" w:line="269" w:lineRule="auto"/>
+        <w:ind w:left="312" w:hanging="198"/>
+      </w:pPr>
+      <w:r>
+        <w:rPr>
+          <w:rFonts w:ascii="맑은 고딕" w:hAnsi="맑은 고딕" w:eastAsia="맑은 고딕"/>
+          <w:b w:val="0"/>
+          <w:color w:val="1E407C"/>
+          <w:sz w:val="21"/>
+        </w:rPr>
+        <w:t xml:space="preserve">• </w:t>
+      </w:r>
+      <w:r>
+        <w:rPr>
+          <w:rFonts w:ascii="맑은 고딕" w:hAnsi="맑은 고딕" w:eastAsia="맑은 고딕"/>
+          <w:b/>
+          <w:color w:val="1A1A1A"/>
+          <w:sz w:val="21"/>
+        </w:rPr>
+        <w:t xml:space="preserve">노근창  </w:t>
+      </w:r>
+      <w:r>
+        <w:rPr>
+          <w:rFonts w:ascii="맑은 고딕" w:hAnsi="맑은 고딕" w:eastAsia="맑은 고딕"/>
+          <w:b w:val="0"/>
+          <w:color w:val="1A1A1A"/>
+          <w:sz w:val="21"/>
+        </w:rPr>
+        <w:t>삼성전자 이번 분기 영업이익은 원화 강세로 증권사가 말하는 100~104조보다 높은 110조 안팎이다. 하이닉스는 약 70조로, 시장 기대를 크게 넘기진 못할 수 있다. 10월 8일 삼성 잠정실적이다.</w:t>
+      </w:r>
+    </w:p>
+    <w:p>
+      <w:pPr>
+        <w:spacing w:after="40" w:before="0" w:line="269" w:lineRule="auto"/>
+        <w:ind w:left="312" w:hanging="198"/>
+      </w:pPr>
+      <w:r>
+        <w:rPr>
+          <w:rFonts w:ascii="맑은 고딕" w:hAnsi="맑은 고딕" w:eastAsia="맑은 고딕"/>
+          <w:b w:val="0"/>
+          <w:color w:val="1E407C"/>
+          <w:sz w:val="21"/>
+        </w:rPr>
+        <w:t xml:space="preserve">• </w:t>
+      </w:r>
+      <w:r>
+        <w:rPr>
+          <w:rFonts w:ascii="맑은 고딕" w:hAnsi="맑은 고딕" w:eastAsia="맑은 고딕"/>
+          <w:b/>
+          <w:color w:val="1A1A1A"/>
+          <w:sz w:val="21"/>
+        </w:rPr>
+        <w:t xml:space="preserve">노근창  </w:t>
+      </w:r>
+      <w:r>
+        <w:rPr>
+          <w:rFonts w:ascii="맑은 고딕" w:hAnsi="맑은 고딕" w:eastAsia="맑은 고딕"/>
+          <w:b w:val="0"/>
+          <w:color w:val="1A1A1A"/>
+          <w:sz w:val="21"/>
+        </w:rPr>
+        <w:t>HBM4는 기가당 1달러 위에서 출발해 내년 5달러까지 거론되고, HBM ASP는 올해보다 120% 오른다는 트렌드포스 자료가 있다. 그 가정이면 내년 피크아웃 고민은 약하다. HBM4는 삼성 승기에 가깝지만 공급이 부족해 하이닉스 매출도 늘고 점유율은 낮아질 수 있다.</w:t>
+      </w:r>
+    </w:p>
+    <w:p>
+      <w:pPr>
+        <w:spacing w:after="40" w:before="0" w:line="269" w:lineRule="auto"/>
+        <w:ind w:left="312" w:hanging="198"/>
+      </w:pPr>
+      <w:r>
+        <w:rPr>
+          <w:rFonts w:ascii="맑은 고딕" w:hAnsi="맑은 고딕" w:eastAsia="맑은 고딕"/>
+          <w:b w:val="0"/>
+          <w:color w:val="1E407C"/>
+          <w:sz w:val="21"/>
+        </w:rPr>
+        <w:t xml:space="preserve">• </w:t>
+      </w:r>
+      <w:r>
+        <w:rPr>
+          <w:rFonts w:ascii="맑은 고딕" w:hAnsi="맑은 고딕" w:eastAsia="맑은 고딕"/>
+          <w:b/>
+          <w:color w:val="1A1A1A"/>
+          <w:sz w:val="21"/>
+        </w:rPr>
+        <w:t xml:space="preserve">목대균·이경규  </w:t>
+      </w:r>
+      <w:r>
+        <w:rPr>
+          <w:rFonts w:ascii="맑은 고딕" w:hAnsi="맑은 고딕" w:eastAsia="맑은 고딕"/>
+          <w:b w:val="0"/>
+          <w:color w:val="1A1A1A"/>
+          <w:sz w:val="21"/>
+        </w:rPr>
+        <w:t>메모리는 지금 파는 구간이 아니라 버티는 구간이다. 다른 섹터는 이미 빠져 종목이 퍼지고 있다. HBM 가격은 두 배가 아니라 최대 세 배 인상으로 보인다. 내년 이익 레벨업을 보면 유가·금리에 흔들려도 내년까지 가져간다.</w:t>
+      </w:r>
+    </w:p>
+    <w:p>
+      <w:pPr>
+        <w:spacing w:after="40" w:before="0" w:line="269" w:lineRule="auto"/>
+        <w:ind w:left="312" w:hanging="198"/>
+      </w:pPr>
+      <w:r>
+        <w:rPr>
+          <w:rFonts w:ascii="맑은 고딕" w:hAnsi="맑은 고딕" w:eastAsia="맑은 고딕"/>
+          <w:b w:val="0"/>
+          <w:color w:val="1E407C"/>
+          <w:sz w:val="21"/>
+        </w:rPr>
+        <w:t xml:space="preserve">• </w:t>
+      </w:r>
+      <w:r>
+        <w:rPr>
+          <w:rFonts w:ascii="맑은 고딕" w:hAnsi="맑은 고딕" w:eastAsia="맑은 고딕"/>
+          <w:b/>
+          <w:color w:val="1A1A1A"/>
+          <w:sz w:val="21"/>
+        </w:rPr>
+        <w:t xml:space="preserve">김장렬  </w:t>
+      </w:r>
+      <w:r>
+        <w:rPr>
+          <w:rFonts w:ascii="맑은 고딕" w:hAnsi="맑은 고딕" w:eastAsia="맑은 고딕"/>
+          <w:b w:val="0"/>
+          <w:color w:val="1A1A1A"/>
+          <w:sz w:val="21"/>
+        </w:rPr>
+        <w:t>7월 말 이후 약 두 달, 마이크론은 약 30%, 샌디스크는 약 35%, 하이닉스 ADR은 약 23% 올랐다. 삼성전자·하이닉스 본주는 약 3%밖에 안 올랐고 거래대금은 반 토막이다. 8~9월 AI 뉴스가 한국 대형주 가격에는 덜 들어갔다.</w:t>
+      </w:r>
+    </w:p>
+    <w:p>
+      <w:pPr>
+        <w:spacing w:after="40" w:before="0" w:line="269" w:lineRule="auto"/>
+        <w:ind w:left="312" w:hanging="198"/>
+      </w:pPr>
+      <w:r>
+        <w:rPr>
+          <w:rFonts w:ascii="맑은 고딕" w:hAnsi="맑은 고딕" w:eastAsia="맑은 고딕"/>
+          <w:b w:val="0"/>
+          <w:color w:val="1E407C"/>
+          <w:sz w:val="21"/>
+        </w:rPr>
+        <w:t xml:space="preserve">• </w:t>
+      </w:r>
+      <w:r>
+        <w:rPr>
+          <w:rFonts w:ascii="맑은 고딕" w:hAnsi="맑은 고딕" w:eastAsia="맑은 고딕"/>
+          <w:b/>
+          <w:color w:val="1A1A1A"/>
+          <w:sz w:val="21"/>
+        </w:rPr>
+        <w:t xml:space="preserve">신중호 · 김장렬  </w:t>
+      </w:r>
+      <w:r>
+        <w:rPr>
+          <w:rFonts w:ascii="맑은 고딕" w:hAnsi="맑은 고딕" w:eastAsia="맑은 고딕"/>
+          <w:b w:val="0"/>
+          <w:color w:val="1A1A1A"/>
+          <w:sz w:val="21"/>
+        </w:rPr>
+        <w:t>삼성 3분기 컨센서스는 환율 반영 후 101조~108조다. 3분기가 105조면 4분기는 120조에 못 미치게 보는 시각이 있다. 2027년 영업이익 추정은 350조~600조로 벌어져 있고, 환율 반영 직후 숫자는 520조다. 내년 하반기 가격이 15% 다음 30% 빠져 분기 이익이 60조로 내려앉는 그림은 목표주가 27만~35만 원이다. 그 급락이 1년 안에 올 확률은 20%도 안 되는데, 주가는 그 이상을 반영 중이다. 올해 약 360조가 유지되기만 해도 6~7배면 30만 원 초중반이다.</w:t>
+      </w:r>
+    </w:p>
+    <w:p>
+      <w:pPr>
+        <w:spacing w:after="40" w:before="0" w:line="269" w:lineRule="auto"/>
+        <w:ind w:left="312" w:hanging="198"/>
+      </w:pPr>
+      <w:r>
+        <w:rPr>
+          <w:rFonts w:ascii="맑은 고딕" w:hAnsi="맑은 고딕" w:eastAsia="맑은 고딕"/>
+          <w:b w:val="0"/>
+          <w:color w:val="1E407C"/>
+          <w:sz w:val="21"/>
+        </w:rPr>
+        <w:t xml:space="preserve">• </w:t>
+      </w:r>
+      <w:r>
+        <w:rPr>
+          <w:rFonts w:ascii="맑은 고딕" w:hAnsi="맑은 고딕" w:eastAsia="맑은 고딕"/>
+          <w:b/>
+          <w:color w:val="1A1A1A"/>
+          <w:sz w:val="21"/>
+        </w:rPr>
+        <w:t xml:space="preserve">신중호  </w:t>
+      </w:r>
+      <w:r>
+        <w:rPr>
+          <w:rFonts w:ascii="맑은 고딕" w:hAnsi="맑은 고딕" w:eastAsia="맑은 고딕"/>
+          <w:b w:val="0"/>
+          <w:color w:val="1A1A1A"/>
+          <w:sz w:val="21"/>
+        </w:rPr>
+        <w:t>2024년 엔비디아 매출총이익률이 70~80%일 때 GPU 쇼티지 뒤 대체 칩이 나오며 엔비디아는 1년 가까이 주도주에서 빠지고 옆으로 갔다. 마이크론 총이익률 87%, 다음 분기 86%도 같은 자리다. 마진이 높다고 주도주가 유지되지 않는다. 메모리는 AI 그 자체가 아니라 필수 투입재다.</w:t>
+      </w:r>
+    </w:p>
+    <w:p>
+      <w:pPr>
+        <w:spacing w:before="160" w:after="60" w:line="276" w:lineRule="auto"/>
+        <w:jc w:val="left"/>
+      </w:pPr>
+      <w:r>
+        <w:rPr>
+          <w:rFonts w:ascii="맑은 고딕" w:hAnsi="맑은 고딕" w:eastAsia="맑은 고딕"/>
+          <w:b/>
+          <w:color w:val="1E407C"/>
+          <w:sz w:val="26"/>
+        </w:rPr>
+        <w:t>수급</w:t>
+      </w:r>
+    </w:p>
+    <w:p>
+      <w:pPr>
+        <w:spacing w:after="40" w:before="0" w:line="269" w:lineRule="auto"/>
+        <w:ind w:left="312" w:hanging="198"/>
+      </w:pPr>
+      <w:r>
+        <w:rPr>
+          <w:rFonts w:ascii="맑은 고딕" w:hAnsi="맑은 고딕" w:eastAsia="맑은 고딕"/>
+          <w:b w:val="0"/>
+          <w:color w:val="1E407C"/>
+          <w:sz w:val="21"/>
+        </w:rPr>
+        <w:t xml:space="preserve">• </w:t>
+      </w:r>
+      <w:r>
+        <w:rPr>
+          <w:rFonts w:ascii="맑은 고딕" w:hAnsi="맑은 고딕" w:eastAsia="맑은 고딕"/>
+          <w:b/>
+          <w:color w:val="1A1A1A"/>
+          <w:sz w:val="21"/>
+        </w:rPr>
+        <w:t xml:space="preserve">노근창  </w:t>
+      </w:r>
+      <w:r>
+        <w:rPr>
+          <w:rFonts w:ascii="맑은 고딕" w:hAnsi="맑은 고딕" w:eastAsia="맑은 고딕"/>
+          <w:b w:val="0"/>
+          <w:color w:val="1A1A1A"/>
+          <w:sz w:val="21"/>
+        </w:rPr>
+        <w:t>영국·호주 10년물이 5%를 넘고 일본도 3%를 넘으면 글로벌 자금은 신흥국부터 줄인다. 한국이 이머징이라 삼성·하이닉스가 기계적으로 팔린다. 그 고금리의 한 이유는 하이퍼스케일러가 데이터센터 자금으로 돈을 흡수하는 것이고, 그 돈은 다시 반도체 수요다.</w:t>
+      </w:r>
+    </w:p>
+    <w:p>
+      <w:pPr>
+        <w:spacing w:after="40" w:before="0" w:line="269" w:lineRule="auto"/>
+        <w:ind w:left="312" w:hanging="198"/>
+      </w:pPr>
+      <w:r>
+        <w:rPr>
+          <w:rFonts w:ascii="맑은 고딕" w:hAnsi="맑은 고딕" w:eastAsia="맑은 고딕"/>
+          <w:b w:val="0"/>
+          <w:color w:val="1E407C"/>
+          <w:sz w:val="21"/>
+        </w:rPr>
+        <w:t xml:space="preserve">• </w:t>
+      </w:r>
+      <w:r>
+        <w:rPr>
+          <w:rFonts w:ascii="맑은 고딕" w:hAnsi="맑은 고딕" w:eastAsia="맑은 고딕"/>
+          <w:b/>
+          <w:color w:val="1A1A1A"/>
+          <w:sz w:val="21"/>
+        </w:rPr>
+        <w:t xml:space="preserve">신중호  </w:t>
+      </w:r>
+      <w:r>
+        <w:rPr>
+          <w:rFonts w:ascii="맑은 고딕" w:hAnsi="맑은 고딕" w:eastAsia="맑은 고딕"/>
+          <w:b w:val="0"/>
+          <w:color w:val="1A1A1A"/>
+          <w:sz w:val="21"/>
+        </w:rPr>
+        <w:t>삼성전자는 28만 원 위에 물량의 60~70%, 하이닉스는 175만 원 위에 약 60%가 물려 있다. 애플도 주주환원을 3년 한 뒤에야 재평가됐다. 2028년 공급이 늘어도 마진이 남는지, 중국 메모리가 로컬에 머무는지가 배수를 연다. 4배에서 6배는 50%지만 지금은 그 자리가 아니다.</w:t>
+      </w:r>
+    </w:p>
+    <w:p>
+      <w:pPr>
+        <w:spacing w:after="40" w:before="0" w:line="269" w:lineRule="auto"/>
+        <w:ind w:left="312" w:hanging="198"/>
+      </w:pPr>
+      <w:r>
+        <w:rPr>
+          <w:rFonts w:ascii="맑은 고딕" w:hAnsi="맑은 고딕" w:eastAsia="맑은 고딕"/>
+          <w:b w:val="0"/>
+          <w:color w:val="1E407C"/>
+          <w:sz w:val="21"/>
+        </w:rPr>
+        <w:t xml:space="preserve">• </w:t>
+      </w:r>
+      <w:r>
+        <w:rPr>
+          <w:rFonts w:ascii="맑은 고딕" w:hAnsi="맑은 고딕" w:eastAsia="맑은 고딕"/>
+          <w:b/>
+          <w:color w:val="1A1A1A"/>
+          <w:sz w:val="21"/>
+        </w:rPr>
+        <w:t xml:space="preserve">RTS  </w:t>
+      </w:r>
+      <w:r>
+        <w:rPr>
+          <w:rFonts w:ascii="맑은 고딕" w:hAnsi="맑은 고딕" w:eastAsia="맑은 고딕"/>
+          <w:b w:val="0"/>
+          <w:color w:val="1A1A1A"/>
+          <w:sz w:val="21"/>
+        </w:rPr>
+        <w:t>10월 2일 코스피는 0.46% 올라 7,000을 회복했다. 5·21·60일선 위지만 120일선 약 7,200이 위쪽 벽이다. 주간으로는 약 1% 하락. 약한 장은 아니고, 인플레이션만큼 버틴 주에 가깝다.</w:t>
+      </w:r>
+    </w:p>
+    <w:p>
+      <w:pPr>
+        <w:spacing w:after="40" w:before="0" w:line="269" w:lineRule="auto"/>
+        <w:ind w:left="312" w:hanging="198"/>
+      </w:pPr>
+      <w:r>
+        <w:rPr>
+          <w:rFonts w:ascii="맑은 고딕" w:hAnsi="맑은 고딕" w:eastAsia="맑은 고딕"/>
+          <w:b w:val="0"/>
+          <w:color w:val="1E407C"/>
+          <w:sz w:val="21"/>
+        </w:rPr>
+        <w:t xml:space="preserve">• </w:t>
+      </w:r>
+      <w:r>
+        <w:rPr>
+          <w:rFonts w:ascii="맑은 고딕" w:hAnsi="맑은 고딕" w:eastAsia="맑은 고딕"/>
+          <w:b/>
+          <w:color w:val="1A1A1A"/>
+          <w:sz w:val="21"/>
+        </w:rPr>
+        <w:t xml:space="preserve">이선엽 · 녹취  </w:t>
+      </w:r>
+      <w:r>
+        <w:rPr>
+          <w:rFonts w:ascii="맑은 고딕" w:hAnsi="맑은 고딕" w:eastAsia="맑은 고딕"/>
+          <w:b w:val="0"/>
+          <w:color w:val="1A1A1A"/>
+          <w:sz w:val="21"/>
+        </w:rPr>
+        <w:t>자사주 매수는 하락을 받아 주는 자리이지 상승 재료가 아니다. 하이닉스 자사주는 10월 15일까지이고, 매수가 끝난 뒤가 수급 시험으로 적혀 있다.</w:t>
+      </w:r>
+    </w:p>
+    <w:p>
+      <w:pPr>
+        <w:spacing w:before="160" w:after="60" w:line="276" w:lineRule="auto"/>
+        <w:jc w:val="left"/>
+      </w:pPr>
+      <w:r>
+        <w:rPr>
+          <w:rFonts w:ascii="맑은 고딕" w:hAnsi="맑은 고딕" w:eastAsia="맑은 고딕"/>
+          <w:b/>
+          <w:color w:val="1E407C"/>
+          <w:sz w:val="26"/>
+        </w:rPr>
+        <w:t>다음 돈</w:t>
+      </w:r>
+    </w:p>
+    <w:p>
+      <w:pPr>
+        <w:spacing w:after="40" w:before="0" w:line="269" w:lineRule="auto"/>
+        <w:ind w:left="312" w:hanging="198"/>
+      </w:pPr>
+      <w:r>
+        <w:rPr>
+          <w:rFonts w:ascii="맑은 고딕" w:hAnsi="맑은 고딕" w:eastAsia="맑은 고딕"/>
+          <w:b w:val="0"/>
+          <w:color w:val="1E407C"/>
+          <w:sz w:val="21"/>
+        </w:rPr>
+        <w:t xml:space="preserve">• </w:t>
+      </w:r>
+      <w:r>
+        <w:rPr>
+          <w:rFonts w:ascii="맑은 고딕" w:hAnsi="맑은 고딕" w:eastAsia="맑은 고딕"/>
+          <w:b/>
+          <w:color w:val="1A1A1A"/>
+          <w:sz w:val="21"/>
+        </w:rPr>
+        <w:t xml:space="preserve">신중호  </w:t>
+      </w:r>
+      <w:r>
+        <w:rPr>
+          <w:rFonts w:ascii="맑은 고딕" w:hAnsi="맑은 고딕" w:eastAsia="맑은 고딕"/>
+          <w:b w:val="0"/>
+          <w:color w:val="1A1A1A"/>
+          <w:sz w:val="21"/>
+        </w:rPr>
+        <w:t>현금이 가는 곳이 다음 주도주다. 빅테크 현금이 엔비디아로, 그다음 메모리로 갔다. 이제 메모리와 엔비디아의 현금은 증설과 장비, 전력, 광학 부품으로 간다. 삼성전자·하이닉스는 시장 비중 50%를 40% 안쪽으로 두고, 그 현금을 받는 쪽을 보는 제안이다.</w:t>
+      </w:r>
+    </w:p>
+    <w:p>
+      <w:pPr>
+        <w:spacing w:after="40" w:before="0" w:line="269" w:lineRule="auto"/>
+        <w:ind w:left="312" w:hanging="198"/>
+      </w:pPr>
+      <w:r>
+        <w:rPr>
+          <w:rFonts w:ascii="맑은 고딕" w:hAnsi="맑은 고딕" w:eastAsia="맑은 고딕"/>
+          <w:b w:val="0"/>
+          <w:color w:val="1E407C"/>
+          <w:sz w:val="21"/>
+        </w:rPr>
+        <w:t xml:space="preserve">• </w:t>
+      </w:r>
+      <w:r>
+        <w:rPr>
+          <w:rFonts w:ascii="맑은 고딕" w:hAnsi="맑은 고딕" w:eastAsia="맑은 고딕"/>
+          <w:b/>
+          <w:color w:val="1A1A1A"/>
+          <w:sz w:val="21"/>
+        </w:rPr>
+        <w:t xml:space="preserve">노근창  </w:t>
+      </w:r>
+      <w:r>
+        <w:rPr>
+          <w:rFonts w:ascii="맑은 고딕" w:hAnsi="맑은 고딕" w:eastAsia="맑은 고딕"/>
+          <w:b w:val="0"/>
+          <w:color w:val="1A1A1A"/>
+          <w:sz w:val="21"/>
+        </w:rPr>
+        <w:t>장비는 약 5년, 매년 20~30% 성장이라는 글로벌 장비사 시각이다. TSMC 텍사스, 하이닉스 용인이 배경이다. 개인형 에이전트는 CPU와 기판·네트워킹 수요다. 장비·부품은 공급이 부족한 반면 소재는 부족이 아니다. 셋을 같이 보면 안 된다.</w:t>
+      </w:r>
+    </w:p>
+    <w:p>
+      <w:pPr>
+        <w:spacing w:after="40" w:before="0" w:line="269" w:lineRule="auto"/>
+        <w:ind w:left="312" w:hanging="198"/>
+      </w:pPr>
+      <w:r>
+        <w:rPr>
+          <w:rFonts w:ascii="맑은 고딕" w:hAnsi="맑은 고딕" w:eastAsia="맑은 고딕"/>
+          <w:b w:val="0"/>
+          <w:color w:val="1E407C"/>
+          <w:sz w:val="21"/>
+        </w:rPr>
+        <w:t xml:space="preserve">• </w:t>
+      </w:r>
+      <w:r>
+        <w:rPr>
+          <w:rFonts w:ascii="맑은 고딕" w:hAnsi="맑은 고딕" w:eastAsia="맑은 고딕"/>
+          <w:b/>
+          <w:color w:val="1A1A1A"/>
+          <w:sz w:val="21"/>
+        </w:rPr>
+        <w:t xml:space="preserve">김장렬  </w:t>
+      </w:r>
+      <w:r>
+        <w:rPr>
+          <w:rFonts w:ascii="맑은 고딕" w:hAnsi="맑은 고딕" w:eastAsia="맑은 고딕"/>
+          <w:b w:val="0"/>
+          <w:color w:val="1A1A1A"/>
+          <w:sz w:val="21"/>
+        </w:rPr>
+        <w:t>삼성전기 투자 발표는 재료 소멸이 아니다. 내년 이익을 한 단계 더 올린 뒤 30배에서 40배면 200만 원 초중반이다. 300만 원은 그 이후 실적을 당겨야 나오는 숫자라 아직 이르다. 스트리트 목표는 250만 원대가 많다.</w:t>
+      </w:r>
+    </w:p>
+    <w:p>
+      <w:pPr>
+        <w:spacing w:after="40" w:before="0" w:line="269" w:lineRule="auto"/>
+        <w:ind w:left="312" w:hanging="198"/>
+      </w:pPr>
+      <w:r>
+        <w:rPr>
+          <w:rFonts w:ascii="맑은 고딕" w:hAnsi="맑은 고딕" w:eastAsia="맑은 고딕"/>
+          <w:b w:val="0"/>
+          <w:color w:val="1E407C"/>
+          <w:sz w:val="21"/>
+        </w:rPr>
+        <w:t xml:space="preserve">• </w:t>
+      </w:r>
+      <w:r>
+        <w:rPr>
+          <w:rFonts w:ascii="맑은 고딕" w:hAnsi="맑은 고딕" w:eastAsia="맑은 고딕"/>
+          <w:b/>
+          <w:color w:val="1A1A1A"/>
+          <w:sz w:val="21"/>
+        </w:rPr>
+        <w:t xml:space="preserve">김장렬  </w:t>
+      </w:r>
+      <w:r>
+        <w:rPr>
+          <w:rFonts w:ascii="맑은 고딕" w:hAnsi="맑은 고딕" w:eastAsia="맑은 고딕"/>
+          <w:b w:val="0"/>
+          <w:color w:val="1A1A1A"/>
+          <w:sz w:val="21"/>
+        </w:rPr>
+        <w:t>휴대폰 MLCC는 대당 약 1,000개, 개당 1~2원, 시장 약 2조 원이다. 자동차는 대당 약 1만 개에 가격이 훨씬 높아 시장 약 27조 원이다. AI 서버는 150만 대에 대당 약 3만 개, 개당 약 200원이면 약 9조 원이고 성장률은 약 30%다. GPU 옆에는 최대 4만 개까지 거론된다.</w:t>
+      </w:r>
+    </w:p>
+    <w:p>
+      <w:pPr>
+        <w:spacing w:after="40" w:before="0" w:line="269" w:lineRule="auto"/>
+        <w:ind w:left="312" w:hanging="198"/>
+      </w:pPr>
+      <w:r>
+        <w:rPr>
+          <w:rFonts w:ascii="맑은 고딕" w:hAnsi="맑은 고딕" w:eastAsia="맑은 고딕"/>
+          <w:b w:val="0"/>
+          <w:color w:val="1E407C"/>
+          <w:sz w:val="21"/>
+        </w:rPr>
+        <w:t xml:space="preserve">• </w:t>
+      </w:r>
+      <w:r>
+        <w:rPr>
+          <w:rFonts w:ascii="맑은 고딕" w:hAnsi="맑은 고딕" w:eastAsia="맑은 고딕"/>
+          <w:b/>
+          <w:color w:val="1A1A1A"/>
+          <w:sz w:val="21"/>
+        </w:rPr>
+        <w:t xml:space="preserve">목대균·이경규  </w:t>
+      </w:r>
+      <w:r>
+        <w:rPr>
+          <w:rFonts w:ascii="맑은 고딕" w:hAnsi="맑은 고딕" w:eastAsia="맑은 고딕"/>
+          <w:b w:val="0"/>
+          <w:color w:val="1A1A1A"/>
+          <w:sz w:val="21"/>
+        </w:rPr>
+        <w:t>관심은 반도체와 전력, 미국으로 나가는 한국 원전이다. 건설·기자재가 따라오고, 그 인증이 다른 나라 수출의 레퍼런스가 된다. 국내 재건축과 팹 건설도 같은 결이다.</w:t>
+      </w:r>
+    </w:p>
+    <w:p>
+      <w:pPr>
+        <w:spacing w:after="40" w:before="0" w:line="269" w:lineRule="auto"/>
+        <w:ind w:left="312" w:hanging="198"/>
+      </w:pPr>
+      <w:r>
+        <w:rPr>
+          <w:rFonts w:ascii="맑은 고딕" w:hAnsi="맑은 고딕" w:eastAsia="맑은 고딕"/>
+          <w:b w:val="0"/>
+          <w:color w:val="1E407C"/>
+          <w:sz w:val="21"/>
+        </w:rPr>
+        <w:t xml:space="preserve">• </w:t>
+      </w:r>
+      <w:r>
+        <w:rPr>
+          <w:rFonts w:ascii="맑은 고딕" w:hAnsi="맑은 고딕" w:eastAsia="맑은 고딕"/>
+          <w:b/>
+          <w:color w:val="1A1A1A"/>
+          <w:sz w:val="21"/>
+        </w:rPr>
+        <w:t xml:space="preserve">목대균·이경규  </w:t>
+      </w:r>
+      <w:r>
+        <w:rPr>
+          <w:rFonts w:ascii="맑은 고딕" w:hAnsi="맑은 고딕" w:eastAsia="맑은 고딕"/>
+          <w:b w:val="0"/>
+          <w:color w:val="1A1A1A"/>
+          <w:sz w:val="21"/>
+        </w:rPr>
+        <w:t>광통신은 2030년까지 산업 규모가 약 4배라는 얘기가 있다. 한국이 선도 기업은 아니어도 산업이 커지면 수혜는 남는다.</w:t>
+      </w:r>
+    </w:p>
+    <w:p>
+      <w:pPr>
+        <w:spacing w:before="160" w:after="60" w:line="276" w:lineRule="auto"/>
+        <w:jc w:val="left"/>
+      </w:pPr>
+      <w:r>
+        <w:rPr>
+          <w:rFonts w:ascii="맑은 고딕" w:hAnsi="맑은 고딕" w:eastAsia="맑은 고딕"/>
+          <w:b/>
+          <w:color w:val="1E407C"/>
+          <w:sz w:val="26"/>
+        </w:rPr>
+        <w:t>자금과 사이클</w:t>
+      </w:r>
+    </w:p>
+    <w:p>
+      <w:pPr>
+        <w:spacing w:after="40" w:before="0" w:line="269" w:lineRule="auto"/>
+        <w:ind w:left="312" w:hanging="198"/>
+      </w:pPr>
+      <w:r>
+        <w:rPr>
+          <w:rFonts w:ascii="맑은 고딕" w:hAnsi="맑은 고딕" w:eastAsia="맑은 고딕"/>
+          <w:b w:val="0"/>
+          <w:color w:val="1E407C"/>
+          <w:sz w:val="21"/>
+        </w:rPr>
+        <w:t xml:space="preserve">• </w:t>
+      </w:r>
+      <w:r>
+        <w:rPr>
+          <w:rFonts w:ascii="맑은 고딕" w:hAnsi="맑은 고딕" w:eastAsia="맑은 고딕"/>
+          <w:b/>
+          <w:color w:val="1A1A1A"/>
+          <w:sz w:val="21"/>
+        </w:rPr>
+        <w:t xml:space="preserve">박정호  </w:t>
+      </w:r>
+      <w:r>
+        <w:rPr>
+          <w:rFonts w:ascii="맑은 고딕" w:hAnsi="맑은 고딕" w:eastAsia="맑은 고딕"/>
+          <w:b w:val="0"/>
+          <w:color w:val="1A1A1A"/>
+          <w:sz w:val="21"/>
+        </w:rPr>
+        <w:t>민간 자금은 AI로 몰린다. 2024년 약 3,000억 달러, 올해 상반기만 4,500억 달러를 넘었다. 국부 펀드와 공공자금은 미국 주식·국채 비중이 한도를 넘겨 오히려 줄였다. 한도 재설정은 연간 계획 때라, 내년 공공자금은 AI 비중을 다시 올릴 수 있다.</w:t>
+      </w:r>
+    </w:p>
+    <w:p>
+      <w:pPr>
+        <w:spacing w:after="40" w:before="0" w:line="269" w:lineRule="auto"/>
+        <w:ind w:left="312" w:hanging="198"/>
+      </w:pPr>
+      <w:r>
+        <w:rPr>
+          <w:rFonts w:ascii="맑은 고딕" w:hAnsi="맑은 고딕" w:eastAsia="맑은 고딕"/>
+          <w:b w:val="0"/>
+          <w:color w:val="1E407C"/>
+          <w:sz w:val="21"/>
+        </w:rPr>
+        <w:t xml:space="preserve">• </w:t>
+      </w:r>
+      <w:r>
+        <w:rPr>
+          <w:rFonts w:ascii="맑은 고딕" w:hAnsi="맑은 고딕" w:eastAsia="맑은 고딕"/>
+          <w:b/>
+          <w:color w:val="1A1A1A"/>
+          <w:sz w:val="21"/>
+        </w:rPr>
+        <w:t xml:space="preserve">노근창  </w:t>
+      </w:r>
+      <w:r>
+        <w:rPr>
+          <w:rFonts w:ascii="맑은 고딕" w:hAnsi="맑은 고딕" w:eastAsia="맑은 고딕"/>
+          <w:b w:val="0"/>
+          <w:color w:val="1A1A1A"/>
+          <w:sz w:val="21"/>
+        </w:rPr>
+        <w:t>AI 데이터센터는 2000년 꼭대기보다 1997년 인프라 투자 초입에 가깝다. 개인적으로 봤던 2028년 정점은 더 길어진다. 미국 데이터센터는 약 40GW에서 2030년 120GW가 목표다.</w:t>
+      </w:r>
+    </w:p>
+    <w:p>
+      <w:pPr>
+        <w:spacing w:after="40" w:before="0" w:line="269" w:lineRule="auto"/>
+        <w:ind w:left="312" w:hanging="198"/>
+      </w:pPr>
+      <w:r>
+        <w:rPr>
+          <w:rFonts w:ascii="맑은 고딕" w:hAnsi="맑은 고딕" w:eastAsia="맑은 고딕"/>
+          <w:b w:val="0"/>
+          <w:color w:val="1E407C"/>
+          <w:sz w:val="21"/>
+        </w:rPr>
+        <w:t xml:space="preserve">• </w:t>
+      </w:r>
+      <w:r>
+        <w:rPr>
+          <w:rFonts w:ascii="맑은 고딕" w:hAnsi="맑은 고딕" w:eastAsia="맑은 고딕"/>
+          <w:b/>
+          <w:color w:val="1A1A1A"/>
+          <w:sz w:val="21"/>
+        </w:rPr>
+        <w:t xml:space="preserve">노근창  </w:t>
+      </w:r>
+      <w:r>
+        <w:rPr>
+          <w:rFonts w:ascii="맑은 고딕" w:hAnsi="맑은 고딕" w:eastAsia="맑은 고딕"/>
+          <w:b w:val="0"/>
+          <w:color w:val="1A1A1A"/>
+          <w:sz w:val="21"/>
+        </w:rPr>
+        <w:t>엔비디아 데이터센터에서 기타(네오클라우드·소버린·엔터프라이즈)가 400억 달러, 하이퍼스케일러가 480억 달러다. 구글 TPU 외부 판매는 올해 100억 달러, 내년 약 1,000억 달러에 마진 60%면 영업이익 600억 달러로 잉여현금이 플러스될 수 있다. 2028년 목표는 2,500억 달러, TPU 450만 개다.</w:t>
+      </w:r>
+    </w:p>
+    <w:p>
+      <w:pPr>
+        <w:spacing w:after="40" w:before="0" w:line="269" w:lineRule="auto"/>
+        <w:ind w:left="312" w:hanging="198"/>
+      </w:pPr>
+      <w:r>
+        <w:rPr>
+          <w:rFonts w:ascii="맑은 고딕" w:hAnsi="맑은 고딕" w:eastAsia="맑은 고딕"/>
+          <w:b w:val="0"/>
+          <w:color w:val="1E407C"/>
+          <w:sz w:val="21"/>
+        </w:rPr>
+        <w:t xml:space="preserve">• </w:t>
+      </w:r>
+      <w:r>
+        <w:rPr>
+          <w:rFonts w:ascii="맑은 고딕" w:hAnsi="맑은 고딕" w:eastAsia="맑은 고딕"/>
+          <w:b/>
+          <w:color w:val="1A1A1A"/>
+          <w:sz w:val="21"/>
+        </w:rPr>
+        <w:t xml:space="preserve">박정호  </w:t>
+      </w:r>
+      <w:r>
+        <w:rPr>
+          <w:rFonts w:ascii="맑은 고딕" w:hAnsi="맑은 고딕" w:eastAsia="맑은 고딕"/>
+          <w:b w:val="0"/>
+          <w:color w:val="1A1A1A"/>
+          <w:sz w:val="21"/>
+        </w:rPr>
+        <w:t>중국·인도·브라질 공공자금은 미 국채를 계속 줄인다. 민간은 5% 금리에도 국채와 AI 회사채를 받는다. 회담에서 합의되지 않은 카드는 희토류 수출 통제다.</w:t>
       </w:r>
     </w:p>
     <w:p>

</xml_diff>